<commit_message>
Deploying to gh-pages from @ Morrison-Lab/pds@412cd647a09dfaa9f42fc8205415cb724eb3af38 🚀
</commit_message>
<xml_diff>
--- a/probability-basics.docx
+++ b/probability-basics.docx
@@ -15,10 +15,10 @@
         <w:pStyle w:val="Date"/>
       </w:pPr>
       <w:r>
-        <w:t xml:space="preserve">Last modified: 2026-09-28 03:31:52 (PDT)</w:t>
+        <w:t xml:space="preserve">Last modified: 2026-09-28 11:09:35 (PDT)</w:t>
       </w:r>
     </w:p>
-    <w:bookmarkStart w:id="25" w:name="defining-probabilities"/>
+    <w:bookmarkStart w:id="33" w:name="defining-probabilities"/>
     <w:p>
       <w:pPr>
         <w:pStyle w:val="Heading2"/>
@@ -937,7 +937,7 @@
       </w:r>
     </w:p>
     <w:bookmarkEnd w:id="16"/>
-    <w:bookmarkStart w:id="17" w:name="def-probability"/>
+    <w:bookmarkStart w:id="17" w:name="def-mutually-exclusive"/>
     <w:p>
       <w:pPr>
         <w:pStyle w:val="BodyText"/>
@@ -947,7 +947,3155 @@
           <w:b/>
           <w:bCs/>
         </w:rPr>
-        <w:t xml:space="preserve">Definition 4 (Probability measure)</w:t>
+        <w:t xml:space="preserve">Definition 4 (Mutually exclusive events)</w:t>
+      </w:r>
+      <w:r>
+        <w:t xml:space="preserve"> </w:t>
+      </w:r>
+      <w:r>
+        <w:t xml:space="preserve">Finitely or countably many</w:t>
+      </w:r>
+      <w:r>
+        <w:t xml:space="preserve"> </w:t>
+      </w:r>
+      <w:hyperlink w:anchor="def-event">
+        <w:r>
+          <w:rPr>
+            <w:rStyle w:val="Hyperlink"/>
+          </w:rPr>
+          <w:t xml:space="preserve">events</w:t>
+        </w:r>
+      </w:hyperlink>
+      <w:r>
+        <w:t xml:space="preserve"> </w:t>
+      </w:r>
+      <m:oMath>
+        <m:sSub>
+          <m:e>
+            <m:r>
+              <m:t>A</m:t>
+            </m:r>
+          </m:e>
+          <m:sub>
+            <m:r>
+              <m:t>1</m:t>
+            </m:r>
+          </m:sub>
+        </m:sSub>
+        <m:r>
+          <m:rPr>
+            <m:sty m:val="p"/>
+          </m:rPr>
+          <m:t>,</m:t>
+        </m:r>
+        <m:sSub>
+          <m:e>
+            <m:r>
+              <m:t>A</m:t>
+            </m:r>
+          </m:e>
+          <m:sub>
+            <m:r>
+              <m:t>2</m:t>
+            </m:r>
+          </m:sub>
+        </m:sSub>
+        <m:r>
+          <m:rPr>
+            <m:sty m:val="p"/>
+          </m:rPr>
+          <m:t>,</m:t>
+        </m:r>
+        <m:r>
+          <m:rPr>
+            <m:sty m:val="p"/>
+          </m:rPr>
+          <m:t>…</m:t>
+        </m:r>
+      </m:oMath>
+      <w:r>
+        <w:t xml:space="preserve"> </w:t>
+      </w:r>
+      <w:r>
+        <w:t xml:space="preserve">are</w:t>
+      </w:r>
+      <w:r>
+        <w:t xml:space="preserve"> </w:t>
+      </w:r>
+      <w:r>
+        <w:rPr>
+          <w:b/>
+          <w:bCs/>
+        </w:rPr>
+        <w:t xml:space="preserve">mutually exclusive</w:t>
+      </w:r>
+      <w:r>
+        <w:t xml:space="preserve"> </w:t>
+      </w:r>
+      <w:r>
+        <w:t xml:space="preserve">(also called</w:t>
+      </w:r>
+      <w:r>
+        <w:t xml:space="preserve"> </w:t>
+      </w:r>
+      <w:r>
+        <w:rPr>
+          <w:b/>
+          <w:bCs/>
+        </w:rPr>
+        <w:t xml:space="preserve">disjoint</w:t>
+      </w:r>
+      <w:r>
+        <w:t xml:space="preserve">,</w:t>
+      </w:r>
+      <w:r>
+        <w:t xml:space="preserve"> </w:t>
+      </w:r>
+      <w:r>
+        <w:rPr>
+          <w:b/>
+          <w:bCs/>
+        </w:rPr>
+        <w:t xml:space="preserve">pairwise disjoint</w:t>
+      </w:r>
+      <w:r>
+        <w:t xml:space="preserve">, or</w:t>
+      </w:r>
+      <w:r>
+        <w:t xml:space="preserve"> </w:t>
+      </w:r>
+      <w:r>
+        <w:rPr>
+          <w:b/>
+          <w:bCs/>
+        </w:rPr>
+        <w:t xml:space="preserve">mutually disjoint</w:t>
+      </w:r>
+      <w:r>
+        <w:t xml:space="preserve">)</w:t>
+      </w:r>
+      <w:r>
+        <w:t xml:space="preserve"> </w:t>
+      </w:r>
+      <w:r>
+        <w:t xml:space="preserve">when no two of them share an outcome:</w:t>
+      </w:r>
+    </w:p>
+    <w:p>
+      <w:pPr>
+        <w:pStyle w:val="BodyText"/>
+      </w:pPr>
+      <m:oMathPara>
+        <m:oMathParaPr>
+          <m:jc m:val="center"/>
+        </m:oMathParaPr>
+        <m:oMath>
+          <m:sSub>
+            <m:e>
+              <m:r>
+                <m:t>A</m:t>
+              </m:r>
+            </m:e>
+            <m:sub>
+              <m:r>
+                <m:t>i</m:t>
+              </m:r>
+            </m:sub>
+          </m:sSub>
+          <m:r>
+            <m:rPr>
+              <m:sty m:val="p"/>
+            </m:rPr>
+            <m:t>∩</m:t>
+          </m:r>
+          <m:sSub>
+            <m:e>
+              <m:r>
+                <m:t>A</m:t>
+              </m:r>
+            </m:e>
+            <m:sub>
+              <m:r>
+                <m:t>j</m:t>
+              </m:r>
+            </m:sub>
+          </m:sSub>
+          <m:r>
+            <m:rPr>
+              <m:sty m:val="p"/>
+            </m:rPr>
+            <m:t>=</m:t>
+          </m:r>
+          <m:r>
+            <m:rPr>
+              <m:sty m:val="p"/>
+            </m:rPr>
+            <m:t>∅</m:t>
+          </m:r>
+          <m:r>
+            <m:t> </m:t>
+          </m:r>
+          <m:r>
+            <m:rPr>
+              <m:nor/>
+              <m:sty m:val="p"/>
+            </m:rPr>
+            <m:t>for all </m:t>
+          </m:r>
+          <m:r>
+            <m:t>i</m:t>
+          </m:r>
+          <m:r>
+            <m:rPr>
+              <m:sty m:val="p"/>
+            </m:rPr>
+            <m:t>≠</m:t>
+          </m:r>
+          <m:r>
+            <m:t>j</m:t>
+          </m:r>
+        </m:oMath>
+      </m:oMathPara>
+    </w:p>
+    <w:bookmarkEnd w:id="17"/>
+    <w:bookmarkStart w:id="18" w:name="exm-mutually-exclusive"/>
+    <w:p>
+      <w:pPr>
+        <w:pStyle w:val="FirstParagraph"/>
+      </w:pPr>
+      <w:r>
+        <w:rPr>
+          <w:b/>
+          <w:bCs/>
+        </w:rPr>
+        <w:t xml:space="preserve">Example 4 (Low and high rolls)</w:t>
+      </w:r>
+      <w:r>
+        <w:t xml:space="preserve"> </w:t>
+      </w:r>
+      <w:r>
+        <w:t xml:space="preserve">In</w:t>
+      </w:r>
+      <w:r>
+        <w:t xml:space="preserve"> </w:t>
+      </w:r>
+      <w:hyperlink w:anchor="exm-sample-space">
+        <w:r>
+          <w:rPr>
+            <w:rStyle w:val="Hyperlink"/>
+          </w:rPr>
+          <w:t xml:space="preserve">Example 1</w:t>
+        </w:r>
+      </w:hyperlink>
+      <w:r>
+        <w:t xml:space="preserve">,</w:t>
+      </w:r>
+      <w:r>
+        <w:t xml:space="preserve"> </w:t>
+      </w:r>
+      <w:r>
+        <w:t xml:space="preserve">the events</w:t>
+      </w:r>
+      <w:r>
+        <w:t xml:space="preserve"> </w:t>
+      </w:r>
+      <w:r>
+        <w:t xml:space="preserve">“the roll is at most 2”</w:t>
+      </w:r>
+      <w:r>
+        <w:t xml:space="preserve">,</w:t>
+      </w:r>
+      <w:r>
+        <w:t xml:space="preserve"> </w:t>
+      </w:r>
+      <m:oMath>
+        <m:r>
+          <m:t>​</m:t>
+        </m:r>
+        <m:d>
+          <m:dPr>
+            <m:begChr m:val="{"/>
+            <m:sepChr m:val=""/>
+            <m:endChr m:val="}"/>
+            <m:grow/>
+          </m:dPr>
+          <m:e>
+            <m:r>
+              <m:t>1</m:t>
+            </m:r>
+            <m:r>
+              <m:rPr>
+                <m:sty m:val="p"/>
+              </m:rPr>
+              <m:t>,</m:t>
+            </m:r>
+            <m:r>
+              <m:t>2</m:t>
+            </m:r>
+          </m:e>
+        </m:d>
+        <m:r>
+          <m:t>​</m:t>
+        </m:r>
+      </m:oMath>
+      <w:r>
+        <w:t xml:space="preserve">,</w:t>
+      </w:r>
+      <w:r>
+        <w:t xml:space="preserve"> </w:t>
+      </w:r>
+      <w:r>
+        <w:t xml:space="preserve">and</w:t>
+      </w:r>
+      <w:r>
+        <w:t xml:space="preserve"> </w:t>
+      </w:r>
+      <w:r>
+        <w:t xml:space="preserve">“the roll is at least 5”</w:t>
+      </w:r>
+      <w:r>
+        <w:t xml:space="preserve">,</w:t>
+      </w:r>
+      <w:r>
+        <w:t xml:space="preserve"> </w:t>
+      </w:r>
+      <m:oMath>
+        <m:r>
+          <m:t>​</m:t>
+        </m:r>
+        <m:d>
+          <m:dPr>
+            <m:begChr m:val="{"/>
+            <m:sepChr m:val=""/>
+            <m:endChr m:val="}"/>
+            <m:grow/>
+          </m:dPr>
+          <m:e>
+            <m:r>
+              <m:t>5</m:t>
+            </m:r>
+            <m:r>
+              <m:rPr>
+                <m:sty m:val="p"/>
+              </m:rPr>
+              <m:t>,</m:t>
+            </m:r>
+            <m:r>
+              <m:t>6</m:t>
+            </m:r>
+          </m:e>
+        </m:d>
+        <m:r>
+          <m:t>​</m:t>
+        </m:r>
+      </m:oMath>
+      <w:r>
+        <w:t xml:space="preserve">,</w:t>
+      </w:r>
+      <w:r>
+        <w:t xml:space="preserve"> </w:t>
+      </w:r>
+      <w:r>
+        <w:t xml:space="preserve">are mutually exclusive: no roll is in both.</w:t>
+      </w:r>
+      <w:r>
+        <w:t xml:space="preserve"> </w:t>
+      </w:r>
+      <w:r>
+        <w:t xml:space="preserve">The events</w:t>
+      </w:r>
+      <w:r>
+        <w:t xml:space="preserve"> </w:t>
+      </w:r>
+      <w:r>
+        <w:t xml:space="preserve">“the roll is even”</w:t>
+      </w:r>
+      <w:r>
+        <w:t xml:space="preserve">,</w:t>
+      </w:r>
+      <w:r>
+        <w:t xml:space="preserve"> </w:t>
+      </w:r>
+      <m:oMath>
+        <m:r>
+          <m:t>​</m:t>
+        </m:r>
+        <m:d>
+          <m:dPr>
+            <m:begChr m:val="{"/>
+            <m:sepChr m:val=""/>
+            <m:endChr m:val="}"/>
+            <m:grow/>
+          </m:dPr>
+          <m:e>
+            <m:r>
+              <m:t>2</m:t>
+            </m:r>
+            <m:r>
+              <m:rPr>
+                <m:sty m:val="p"/>
+              </m:rPr>
+              <m:t>,</m:t>
+            </m:r>
+            <m:r>
+              <m:t>4</m:t>
+            </m:r>
+            <m:r>
+              <m:rPr>
+                <m:sty m:val="p"/>
+              </m:rPr>
+              <m:t>,</m:t>
+            </m:r>
+            <m:r>
+              <m:t>6</m:t>
+            </m:r>
+          </m:e>
+        </m:d>
+        <m:r>
+          <m:t>​</m:t>
+        </m:r>
+      </m:oMath>
+      <w:r>
+        <w:t xml:space="preserve">,</w:t>
+      </w:r>
+      <w:r>
+        <w:t xml:space="preserve"> </w:t>
+      </w:r>
+      <w:r>
+        <w:t xml:space="preserve">and</w:t>
+      </w:r>
+      <w:r>
+        <w:t xml:space="preserve"> </w:t>
+      </w:r>
+      <w:r>
+        <w:t xml:space="preserve">“the roll is at most 2”</w:t>
+      </w:r>
+      <w:r>
+        <w:t xml:space="preserve">,</w:t>
+      </w:r>
+      <w:r>
+        <w:t xml:space="preserve"> </w:t>
+      </w:r>
+      <m:oMath>
+        <m:r>
+          <m:t>​</m:t>
+        </m:r>
+        <m:d>
+          <m:dPr>
+            <m:begChr m:val="{"/>
+            <m:sepChr m:val=""/>
+            <m:endChr m:val="}"/>
+            <m:grow/>
+          </m:dPr>
+          <m:e>
+            <m:r>
+              <m:t>1</m:t>
+            </m:r>
+            <m:r>
+              <m:rPr>
+                <m:sty m:val="p"/>
+              </m:rPr>
+              <m:t>,</m:t>
+            </m:r>
+            <m:r>
+              <m:t>2</m:t>
+            </m:r>
+          </m:e>
+        </m:d>
+        <m:r>
+          <m:t>​</m:t>
+        </m:r>
+      </m:oMath>
+      <w:r>
+        <w:t xml:space="preserve">,</w:t>
+      </w:r>
+      <w:r>
+        <w:t xml:space="preserve"> </w:t>
+      </w:r>
+      <w:r>
+        <w:t xml:space="preserve">are not mutually exclusive: a roll of 2 is in both.</w:t>
+      </w:r>
+    </w:p>
+    <w:bookmarkEnd w:id="18"/>
+    <w:bookmarkStart w:id="19" w:name="def-partition"/>
+    <w:p>
+      <w:pPr>
+        <w:pStyle w:val="BodyText"/>
+      </w:pPr>
+      <w:r>
+        <w:rPr>
+          <w:b/>
+          <w:bCs/>
+        </w:rPr>
+        <w:t xml:space="preserve">Definition 5 (Partition of an event)</w:t>
+      </w:r>
+      <w:r>
+        <w:t xml:space="preserve"> </w:t>
+      </w:r>
+      <w:r>
+        <w:t xml:space="preserve">A</w:t>
+      </w:r>
+      <w:r>
+        <w:t xml:space="preserve"> </w:t>
+      </w:r>
+      <w:r>
+        <w:rPr>
+          <w:b/>
+          <w:bCs/>
+        </w:rPr>
+        <w:t xml:space="preserve">partition</w:t>
+      </w:r>
+      <w:r>
+        <w:t xml:space="preserve"> </w:t>
+      </w:r>
+      <w:r>
+        <w:t xml:space="preserve">of an</w:t>
+      </w:r>
+      <w:r>
+        <w:t xml:space="preserve"> </w:t>
+      </w:r>
+      <w:hyperlink w:anchor="def-event">
+        <w:r>
+          <w:rPr>
+            <w:rStyle w:val="Hyperlink"/>
+          </w:rPr>
+          <w:t xml:space="preserve">event</w:t>
+        </w:r>
+      </w:hyperlink>
+      <w:r>
+        <w:t xml:space="preserve"> </w:t>
+      </w:r>
+      <m:oMath>
+        <m:r>
+          <m:t>A</m:t>
+        </m:r>
+      </m:oMath>
+      <w:r>
+        <w:t xml:space="preserve"> </w:t>
+      </w:r>
+      <w:r>
+        <w:t xml:space="preserve">is a finite or countably infinite collection of</w:t>
+      </w:r>
+      <w:r>
+        <w:t xml:space="preserve"> </w:t>
+      </w:r>
+      <w:hyperlink w:anchor="def-mutually-exclusive">
+        <w:r>
+          <w:rPr>
+            <w:rStyle w:val="Hyperlink"/>
+          </w:rPr>
+          <w:t xml:space="preserve">mutually exclusive</w:t>
+        </w:r>
+      </w:hyperlink>
+      <w:r>
+        <w:t xml:space="preserve"> </w:t>
+      </w:r>
+      <w:r>
+        <w:t xml:space="preserve">events</w:t>
+      </w:r>
+      <w:r>
+        <w:t xml:space="preserve"> </w:t>
+      </w:r>
+      <m:oMath>
+        <m:sSub>
+          <m:e>
+            <m:r>
+              <m:t>A</m:t>
+            </m:r>
+          </m:e>
+          <m:sub>
+            <m:r>
+              <m:t>1</m:t>
+            </m:r>
+          </m:sub>
+        </m:sSub>
+        <m:r>
+          <m:rPr>
+            <m:sty m:val="p"/>
+          </m:rPr>
+          <m:t>,</m:t>
+        </m:r>
+        <m:sSub>
+          <m:e>
+            <m:r>
+              <m:t>A</m:t>
+            </m:r>
+          </m:e>
+          <m:sub>
+            <m:r>
+              <m:t>2</m:t>
+            </m:r>
+          </m:sub>
+        </m:sSub>
+        <m:r>
+          <m:rPr>
+            <m:sty m:val="p"/>
+          </m:rPr>
+          <m:t>,</m:t>
+        </m:r>
+        <m:r>
+          <m:rPr>
+            <m:sty m:val="p"/>
+          </m:rPr>
+          <m:t>…</m:t>
+        </m:r>
+      </m:oMath>
+      <w:r>
+        <w:t xml:space="preserve"> </w:t>
+      </w:r>
+      <w:r>
+        <w:t xml:space="preserve">whose union is</w:t>
+      </w:r>
+      <w:r>
+        <w:t xml:space="preserve"> </w:t>
+      </w:r>
+      <m:oMath>
+        <m:r>
+          <m:t>A</m:t>
+        </m:r>
+      </m:oMath>
+      <w:r>
+        <w:t xml:space="preserve">:</w:t>
+      </w:r>
+    </w:p>
+    <w:p>
+      <w:pPr>
+        <w:pStyle w:val="BodyText"/>
+      </w:pPr>
+      <m:oMathPara>
+        <m:oMathParaPr>
+          <m:jc m:val="center"/>
+        </m:oMathParaPr>
+        <m:oMath>
+          <m:limLow>
+            <m:e>
+              <m:r>
+                <m:rPr>
+                  <m:sty m:val="p"/>
+                </m:rPr>
+                <m:t>⋃</m:t>
+              </m:r>
+            </m:e>
+            <m:lim>
+              <m:r>
+                <m:t>i</m:t>
+              </m:r>
+            </m:lim>
+          </m:limLow>
+          <m:sSub>
+            <m:e>
+              <m:r>
+                <m:t>A</m:t>
+              </m:r>
+            </m:e>
+            <m:sub>
+              <m:r>
+                <m:t>i</m:t>
+              </m:r>
+            </m:sub>
+          </m:sSub>
+          <m:r>
+            <m:rPr>
+              <m:sty m:val="p"/>
+            </m:rPr>
+            <m:t>=</m:t>
+          </m:r>
+          <m:r>
+            <m:t>A</m:t>
+          </m:r>
+        </m:oMath>
+      </m:oMathPara>
+    </w:p>
+    <w:p>
+      <w:pPr>
+        <w:pStyle w:val="FirstParagraph"/>
+      </w:pPr>
+      <w:r>
+        <w:t xml:space="preserve">A partition of the</w:t>
+      </w:r>
+      <w:r>
+        <w:t xml:space="preserve"> </w:t>
+      </w:r>
+      <w:hyperlink w:anchor="def-sample-space">
+        <w:r>
+          <w:rPr>
+            <w:rStyle w:val="Hyperlink"/>
+          </w:rPr>
+          <w:t xml:space="preserve">sample space</w:t>
+        </w:r>
+      </w:hyperlink>
+      <w:r>
+        <w:t xml:space="preserve"> </w:t>
+      </w:r>
+      <w:r>
+        <w:t xml:space="preserve">is the case</w:t>
+      </w:r>
+      <w:r>
+        <w:t xml:space="preserve"> </w:t>
+      </w:r>
+      <m:oMath>
+        <m:r>
+          <m:t>A</m:t>
+        </m:r>
+        <m:r>
+          <m:rPr>
+            <m:sty m:val="p"/>
+          </m:rPr>
+          <m:t>=</m:t>
+        </m:r>
+        <m:r>
+          <m:rPr>
+            <m:sty m:val="p"/>
+          </m:rPr>
+          <m:t>Ω</m:t>
+        </m:r>
+      </m:oMath>
+      <w:r>
+        <w:t xml:space="preserve">.</w:t>
+      </w:r>
+    </w:p>
+    <w:bookmarkEnd w:id="19"/>
+    <w:p>
+      <w:pPr>
+        <w:pStyle w:val="BodyText"/>
+      </w:pPr>
+      <w:r>
+        <w:t xml:space="preserve">Some sources also require each piece</w:t>
+      </w:r>
+      <w:r>
+        <w:t xml:space="preserve"> </w:t>
+      </w:r>
+      <m:oMath>
+        <m:sSub>
+          <m:e>
+            <m:r>
+              <m:t>A</m:t>
+            </m:r>
+          </m:e>
+          <m:sub>
+            <m:r>
+              <m:t>i</m:t>
+            </m:r>
+          </m:sub>
+        </m:sSub>
+      </m:oMath>
+      <w:r>
+        <w:t xml:space="preserve"> </w:t>
+      </w:r>
+      <w:r>
+        <w:t xml:space="preserve">to contain at least one outcome.</w:t>
+      </w:r>
+    </w:p>
+    <w:bookmarkStart w:id="20" w:name="exm-partition"/>
+    <w:p>
+      <w:pPr>
+        <w:pStyle w:val="BodyText"/>
+      </w:pPr>
+      <w:r>
+        <w:rPr>
+          <w:b/>
+          <w:bCs/>
+        </w:rPr>
+        <w:t xml:space="preserve">Example 5 (Partitioning the die roll)</w:t>
+      </w:r>
+      <w:r>
+        <w:t xml:space="preserve"> </w:t>
+      </w:r>
+      <w:r>
+        <w:t xml:space="preserve">In</w:t>
+      </w:r>
+      <w:r>
+        <w:t xml:space="preserve"> </w:t>
+      </w:r>
+      <w:hyperlink w:anchor="exm-sample-space">
+        <w:r>
+          <w:rPr>
+            <w:rStyle w:val="Hyperlink"/>
+          </w:rPr>
+          <w:t xml:space="preserve">Example 1</w:t>
+        </w:r>
+      </w:hyperlink>
+      <w:r>
+        <w:t xml:space="preserve">,</w:t>
+      </w:r>
+      <w:r>
+        <w:t xml:space="preserve"> </w:t>
+      </w:r>
+      <w:r>
+        <w:t xml:space="preserve">the events</w:t>
+      </w:r>
+      <w:r>
+        <w:t xml:space="preserve"> </w:t>
+      </w:r>
+      <w:r>
+        <w:t xml:space="preserve">“the roll is even”</w:t>
+      </w:r>
+      <w:r>
+        <w:t xml:space="preserve">,</w:t>
+      </w:r>
+      <w:r>
+        <w:t xml:space="preserve"> </w:t>
+      </w:r>
+      <m:oMath>
+        <m:r>
+          <m:t>​</m:t>
+        </m:r>
+        <m:d>
+          <m:dPr>
+            <m:begChr m:val="{"/>
+            <m:sepChr m:val=""/>
+            <m:endChr m:val="}"/>
+            <m:grow/>
+          </m:dPr>
+          <m:e>
+            <m:r>
+              <m:t>2</m:t>
+            </m:r>
+            <m:r>
+              <m:rPr>
+                <m:sty m:val="p"/>
+              </m:rPr>
+              <m:t>,</m:t>
+            </m:r>
+            <m:r>
+              <m:t>4</m:t>
+            </m:r>
+            <m:r>
+              <m:rPr>
+                <m:sty m:val="p"/>
+              </m:rPr>
+              <m:t>,</m:t>
+            </m:r>
+            <m:r>
+              <m:t>6</m:t>
+            </m:r>
+          </m:e>
+        </m:d>
+        <m:r>
+          <m:t>​</m:t>
+        </m:r>
+      </m:oMath>
+      <w:r>
+        <w:t xml:space="preserve">,</w:t>
+      </w:r>
+      <w:r>
+        <w:t xml:space="preserve"> </w:t>
+      </w:r>
+      <w:r>
+        <w:t xml:space="preserve">and</w:t>
+      </w:r>
+      <w:r>
+        <w:t xml:space="preserve"> </w:t>
+      </w:r>
+      <w:r>
+        <w:t xml:space="preserve">“the roll is odd”</w:t>
+      </w:r>
+      <w:r>
+        <w:t xml:space="preserve">,</w:t>
+      </w:r>
+      <w:r>
+        <w:t xml:space="preserve"> </w:t>
+      </w:r>
+      <m:oMath>
+        <m:r>
+          <m:t>​</m:t>
+        </m:r>
+        <m:d>
+          <m:dPr>
+            <m:begChr m:val="{"/>
+            <m:sepChr m:val=""/>
+            <m:endChr m:val="}"/>
+            <m:grow/>
+          </m:dPr>
+          <m:e>
+            <m:r>
+              <m:t>1</m:t>
+            </m:r>
+            <m:r>
+              <m:rPr>
+                <m:sty m:val="p"/>
+              </m:rPr>
+              <m:t>,</m:t>
+            </m:r>
+            <m:r>
+              <m:t>3</m:t>
+            </m:r>
+            <m:r>
+              <m:rPr>
+                <m:sty m:val="p"/>
+              </m:rPr>
+              <m:t>,</m:t>
+            </m:r>
+            <m:r>
+              <m:t>5</m:t>
+            </m:r>
+          </m:e>
+        </m:d>
+        <m:r>
+          <m:t>​</m:t>
+        </m:r>
+      </m:oMath>
+      <w:r>
+        <w:t xml:space="preserve">,</w:t>
+      </w:r>
+      <w:r>
+        <w:t xml:space="preserve"> </w:t>
+      </w:r>
+      <w:r>
+        <w:t xml:space="preserve">are mutually exclusive, and their union is</w:t>
+      </w:r>
+      <w:r>
+        <w:t xml:space="preserve"> </w:t>
+      </w:r>
+      <m:oMath>
+        <m:r>
+          <m:rPr>
+            <m:sty m:val="p"/>
+          </m:rPr>
+          <m:t>Ω</m:t>
+        </m:r>
+      </m:oMath>
+      <w:r>
+        <w:t xml:space="preserve">,</w:t>
+      </w:r>
+      <w:r>
+        <w:t xml:space="preserve"> </w:t>
+      </w:r>
+      <w:r>
+        <w:t xml:space="preserve">so they partition the sample space.</w:t>
+      </w:r>
+      <w:r>
+        <w:t xml:space="preserve"> </w:t>
+      </w:r>
+      <w:r>
+        <w:t xml:space="preserve">So do the six single-outcome events</w:t>
+      </w:r>
+      <w:r>
+        <w:t xml:space="preserve"> </w:t>
+      </w:r>
+      <m:oMath>
+        <m:r>
+          <m:t>​</m:t>
+        </m:r>
+        <m:d>
+          <m:dPr>
+            <m:begChr m:val="{"/>
+            <m:sepChr m:val=""/>
+            <m:endChr m:val="}"/>
+            <m:grow/>
+          </m:dPr>
+          <m:e>
+            <m:r>
+              <m:t>1</m:t>
+            </m:r>
+          </m:e>
+        </m:d>
+        <m:r>
+          <m:t>​</m:t>
+        </m:r>
+        <m:r>
+          <m:rPr>
+            <m:sty m:val="p"/>
+          </m:rPr>
+          <m:t>,</m:t>
+        </m:r>
+        <m:r>
+          <m:t>​</m:t>
+        </m:r>
+        <m:d>
+          <m:dPr>
+            <m:begChr m:val="{"/>
+            <m:sepChr m:val=""/>
+            <m:endChr m:val="}"/>
+            <m:grow/>
+          </m:dPr>
+          <m:e>
+            <m:r>
+              <m:t>2</m:t>
+            </m:r>
+          </m:e>
+        </m:d>
+        <m:r>
+          <m:t>​</m:t>
+        </m:r>
+        <m:r>
+          <m:rPr>
+            <m:sty m:val="p"/>
+          </m:rPr>
+          <m:t>,</m:t>
+        </m:r>
+        <m:r>
+          <m:rPr>
+            <m:sty m:val="p"/>
+          </m:rPr>
+          <m:t>…</m:t>
+        </m:r>
+        <m:r>
+          <m:rPr>
+            <m:sty m:val="p"/>
+          </m:rPr>
+          <m:t>,</m:t>
+        </m:r>
+        <m:r>
+          <m:t>​</m:t>
+        </m:r>
+        <m:d>
+          <m:dPr>
+            <m:begChr m:val="{"/>
+            <m:sepChr m:val=""/>
+            <m:endChr m:val="}"/>
+            <m:grow/>
+          </m:dPr>
+          <m:e>
+            <m:r>
+              <m:t>6</m:t>
+            </m:r>
+          </m:e>
+        </m:d>
+        <m:r>
+          <m:t>​</m:t>
+        </m:r>
+      </m:oMath>
+      <w:r>
+        <w:t xml:space="preserve">.</w:t>
+      </w:r>
+      <w:r>
+        <w:t xml:space="preserve"> </w:t>
+      </w:r>
+      <w:r>
+        <w:t xml:space="preserve">The events</w:t>
+      </w:r>
+      <w:r>
+        <w:t xml:space="preserve"> </w:t>
+      </w:r>
+      <m:oMath>
+        <m:r>
+          <m:t>​</m:t>
+        </m:r>
+        <m:d>
+          <m:dPr>
+            <m:begChr m:val="{"/>
+            <m:sepChr m:val=""/>
+            <m:endChr m:val="}"/>
+            <m:grow/>
+          </m:dPr>
+          <m:e>
+            <m:r>
+              <m:t>1</m:t>
+            </m:r>
+            <m:r>
+              <m:rPr>
+                <m:sty m:val="p"/>
+              </m:rPr>
+              <m:t>,</m:t>
+            </m:r>
+            <m:r>
+              <m:t>2</m:t>
+            </m:r>
+          </m:e>
+        </m:d>
+        <m:r>
+          <m:t>​</m:t>
+        </m:r>
+      </m:oMath>
+      <w:r>
+        <w:t xml:space="preserve"> </w:t>
+      </w:r>
+      <w:r>
+        <w:t xml:space="preserve">and</w:t>
+      </w:r>
+      <w:r>
+        <w:t xml:space="preserve"> </w:t>
+      </w:r>
+      <m:oMath>
+        <m:r>
+          <m:t>​</m:t>
+        </m:r>
+        <m:d>
+          <m:dPr>
+            <m:begChr m:val="{"/>
+            <m:sepChr m:val=""/>
+            <m:endChr m:val="}"/>
+            <m:grow/>
+          </m:dPr>
+          <m:e>
+            <m:r>
+              <m:t>5</m:t>
+            </m:r>
+            <m:r>
+              <m:rPr>
+                <m:sty m:val="p"/>
+              </m:rPr>
+              <m:t>,</m:t>
+            </m:r>
+            <m:r>
+              <m:t>6</m:t>
+            </m:r>
+          </m:e>
+        </m:d>
+        <m:r>
+          <m:t>​</m:t>
+        </m:r>
+      </m:oMath>
+      <w:r>
+        <w:t xml:space="preserve"> </w:t>
+      </w:r>
+      <w:r>
+        <w:t xml:space="preserve">from</w:t>
+      </w:r>
+      <w:r>
+        <w:t xml:space="preserve"> </w:t>
+      </w:r>
+      <w:hyperlink w:anchor="exm-mutually-exclusive">
+        <w:r>
+          <w:rPr>
+            <w:rStyle w:val="Hyperlink"/>
+          </w:rPr>
+          <w:t xml:space="preserve">Example 4</w:t>
+        </w:r>
+      </w:hyperlink>
+      <w:r>
+        <w:t xml:space="preserve"> </w:t>
+      </w:r>
+      <w:r>
+        <w:t xml:space="preserve">do not partition</w:t>
+      </w:r>
+      <w:r>
+        <w:t xml:space="preserve"> </w:t>
+      </w:r>
+      <m:oMath>
+        <m:r>
+          <m:rPr>
+            <m:sty m:val="p"/>
+          </m:rPr>
+          <m:t>Ω</m:t>
+        </m:r>
+      </m:oMath>
+      <w:r>
+        <w:t xml:space="preserve">: their union leaves out 3 and 4.</w:t>
+      </w:r>
+    </w:p>
+    <w:bookmarkEnd w:id="20"/>
+    <w:bookmarkStart w:id="21" w:name="def-finite-additivity"/>
+    <w:p>
+      <w:pPr>
+        <w:pStyle w:val="BodyText"/>
+      </w:pPr>
+      <w:r>
+        <w:rPr>
+          <w:b/>
+          <w:bCs/>
+        </w:rPr>
+        <w:t xml:space="preserve">Definition 6 (Finite additivity)</w:t>
+      </w:r>
+      <w:r>
+        <w:t xml:space="preserve"> </w:t>
+      </w:r>
+      <w:r>
+        <w:t xml:space="preserve">A function</w:t>
+      </w:r>
+      <w:r>
+        <w:t xml:space="preserve"> </w:t>
+      </w:r>
+      <m:oMath>
+        <m:r>
+          <m:t>μ</m:t>
+        </m:r>
+      </m:oMath>
+      <w:r>
+        <w:t xml:space="preserve"> </w:t>
+      </w:r>
+      <w:r>
+        <w:t xml:space="preserve">that assigns a real number</w:t>
+      </w:r>
+      <w:r>
+        <w:t xml:space="preserve"> </w:t>
+      </w:r>
+      <m:oMath>
+        <m:r>
+          <m:t>μ</m:t>
+        </m:r>
+        <m:r>
+          <m:rPr>
+            <m:sty m:val="p"/>
+          </m:rPr>
+          <m:t>(</m:t>
+        </m:r>
+        <m:r>
+          <m:t>A</m:t>
+        </m:r>
+        <m:r>
+          <m:rPr>
+            <m:sty m:val="p"/>
+          </m:rPr>
+          <m:t>)</m:t>
+        </m:r>
+      </m:oMath>
+      <w:r>
+        <w:t xml:space="preserve"> </w:t>
+      </w:r>
+      <w:r>
+        <w:t xml:space="preserve">to each</w:t>
+      </w:r>
+      <w:r>
+        <w:t xml:space="preserve"> </w:t>
+      </w:r>
+      <w:hyperlink w:anchor="def-event">
+        <w:r>
+          <w:rPr>
+            <w:rStyle w:val="Hyperlink"/>
+          </w:rPr>
+          <w:t xml:space="preserve">event</w:t>
+        </w:r>
+      </w:hyperlink>
+      <w:r>
+        <w:t xml:space="preserve"> </w:t>
+      </w:r>
+      <m:oMath>
+        <m:r>
+          <m:t>A</m:t>
+        </m:r>
+      </m:oMath>
+      <w:r>
+        <w:t xml:space="preserve"> </w:t>
+      </w:r>
+      <w:r>
+        <w:t xml:space="preserve">is</w:t>
+      </w:r>
+      <w:r>
+        <w:t xml:space="preserve"> </w:t>
+      </w:r>
+      <w:r>
+        <w:rPr>
+          <w:b/>
+          <w:bCs/>
+        </w:rPr>
+        <w:t xml:space="preserve">finitely additive</w:t>
+      </w:r>
+      <w:r>
+        <w:t xml:space="preserve"> </w:t>
+      </w:r>
+      <w:r>
+        <w:t xml:space="preserve">if, for every finite collection of</w:t>
+      </w:r>
+      <w:r>
+        <w:t xml:space="preserve"> </w:t>
+      </w:r>
+      <w:hyperlink w:anchor="def-mutually-exclusive">
+        <w:r>
+          <w:rPr>
+            <w:rStyle w:val="Hyperlink"/>
+          </w:rPr>
+          <w:t xml:space="preserve">mutually exclusive</w:t>
+        </w:r>
+      </w:hyperlink>
+      <w:r>
+        <w:t xml:space="preserve"> </w:t>
+      </w:r>
+      <w:r>
+        <w:t xml:space="preserve">events</w:t>
+      </w:r>
+      <w:r>
+        <w:t xml:space="preserve"> </w:t>
+      </w:r>
+      <m:oMath>
+        <m:sSub>
+          <m:e>
+            <m:r>
+              <m:t>A</m:t>
+            </m:r>
+          </m:e>
+          <m:sub>
+            <m:r>
+              <m:t>1</m:t>
+            </m:r>
+          </m:sub>
+        </m:sSub>
+        <m:r>
+          <m:rPr>
+            <m:sty m:val="p"/>
+          </m:rPr>
+          <m:t>,</m:t>
+        </m:r>
+        <m:r>
+          <m:rPr>
+            <m:sty m:val="p"/>
+          </m:rPr>
+          <m:t>…</m:t>
+        </m:r>
+        <m:r>
+          <m:rPr>
+            <m:sty m:val="p"/>
+          </m:rPr>
+          <m:t>,</m:t>
+        </m:r>
+        <m:sSub>
+          <m:e>
+            <m:r>
+              <m:t>A</m:t>
+            </m:r>
+          </m:e>
+          <m:sub>
+            <m:r>
+              <m:t>n</m:t>
+            </m:r>
+          </m:sub>
+        </m:sSub>
+      </m:oMath>
+      <w:r>
+        <w:t xml:space="preserve">,</w:t>
+      </w:r>
+      <w:r>
+        <w:t xml:space="preserve"> </w:t>
+      </w:r>
+      <w:r>
+        <w:t xml:space="preserve">the value of their union is the sum of their values:</w:t>
+      </w:r>
+    </w:p>
+    <w:p>
+      <w:pPr>
+        <w:pStyle w:val="BodyText"/>
+      </w:pPr>
+      <m:oMathPara>
+        <m:oMathParaPr>
+          <m:jc m:val="center"/>
+        </m:oMathParaPr>
+        <m:oMath>
+          <m:r>
+            <m:t>μ</m:t>
+          </m:r>
+          <m:r>
+            <m:rPr>
+              <m:sty m:val="p"/>
+            </m:rPr>
+            <m:t>(</m:t>
+          </m:r>
+          <m:sSub>
+            <m:e>
+              <m:r>
+                <m:t>A</m:t>
+              </m:r>
+            </m:e>
+            <m:sub>
+              <m:r>
+                <m:t>1</m:t>
+              </m:r>
+            </m:sub>
+          </m:sSub>
+          <m:r>
+            <m:rPr>
+              <m:sty m:val="p"/>
+            </m:rPr>
+            <m:t>∪</m:t>
+          </m:r>
+          <m:r>
+            <m:rPr>
+              <m:sty m:val="p"/>
+            </m:rPr>
+            <m:t>⋯</m:t>
+          </m:r>
+          <m:r>
+            <m:rPr>
+              <m:sty m:val="p"/>
+            </m:rPr>
+            <m:t>∪</m:t>
+          </m:r>
+          <m:sSub>
+            <m:e>
+              <m:r>
+                <m:t>A</m:t>
+              </m:r>
+            </m:e>
+            <m:sub>
+              <m:r>
+                <m:t>n</m:t>
+              </m:r>
+            </m:sub>
+          </m:sSub>
+          <m:r>
+            <m:rPr>
+              <m:sty m:val="p"/>
+            </m:rPr>
+            <m:t>)</m:t>
+          </m:r>
+          <m:r>
+            <m:rPr>
+              <m:sty m:val="p"/>
+            </m:rPr>
+            <m:t>=</m:t>
+          </m:r>
+          <m:nary>
+            <m:naryPr>
+              <m:chr m:val="∑"/>
+              <m:limLoc m:val="undOvr"/>
+              <m:subHide m:val="off"/>
+              <m:supHide m:val="off"/>
+            </m:naryPr>
+            <m:sub>
+              <m:r>
+                <m:t>i</m:t>
+              </m:r>
+              <m:r>
+                <m:rPr>
+                  <m:sty m:val="p"/>
+                </m:rPr>
+                <m:t>=</m:t>
+              </m:r>
+              <m:r>
+                <m:t>1</m:t>
+              </m:r>
+            </m:sub>
+            <m:sup>
+              <m:r>
+                <m:t>n</m:t>
+              </m:r>
+            </m:sup>
+            <m:e>
+              <m:r>
+                <m:t>μ</m:t>
+              </m:r>
+            </m:e>
+          </m:nary>
+          <m:r>
+            <m:rPr>
+              <m:sty m:val="p"/>
+            </m:rPr>
+            <m:t>(</m:t>
+          </m:r>
+          <m:sSub>
+            <m:e>
+              <m:r>
+                <m:t>A</m:t>
+              </m:r>
+            </m:e>
+            <m:sub>
+              <m:r>
+                <m:t>i</m:t>
+              </m:r>
+            </m:sub>
+          </m:sSub>
+          <m:r>
+            <m:rPr>
+              <m:sty m:val="p"/>
+            </m:rPr>
+            <m:t>)</m:t>
+          </m:r>
+        </m:oMath>
+      </m:oMathPara>
+    </w:p>
+    <w:bookmarkEnd w:id="21"/>
+    <w:bookmarkStart w:id="22" w:name="exm-finite-additivity"/>
+    <w:p>
+      <w:pPr>
+        <w:pStyle w:val="FirstParagraph"/>
+      </w:pPr>
+      <w:r>
+        <w:rPr>
+          <w:b/>
+          <w:bCs/>
+        </w:rPr>
+        <w:t xml:space="preserve">Example 6 (Counting outcomes is finitely additive)</w:t>
+      </w:r>
+      <w:r>
+        <w:t xml:space="preserve"> </w:t>
+      </w:r>
+      <w:r>
+        <w:t xml:space="preserve">For the die roll in</w:t>
+      </w:r>
+      <w:r>
+        <w:t xml:space="preserve"> </w:t>
+      </w:r>
+      <w:hyperlink w:anchor="exm-sample-space">
+        <w:r>
+          <w:rPr>
+            <w:rStyle w:val="Hyperlink"/>
+          </w:rPr>
+          <w:t xml:space="preserve">Example 1</w:t>
+        </w:r>
+      </w:hyperlink>
+      <w:r>
+        <w:t xml:space="preserve">,</w:t>
+      </w:r>
+      <w:r>
+        <w:t xml:space="preserve"> </w:t>
+      </w:r>
+      <w:r>
+        <w:t xml:space="preserve">let</w:t>
+      </w:r>
+      <w:r>
+        <w:t xml:space="preserve"> </w:t>
+      </w:r>
+      <m:oMath>
+        <m:r>
+          <m:t>μ</m:t>
+        </m:r>
+        <m:r>
+          <m:rPr>
+            <m:sty m:val="p"/>
+          </m:rPr>
+          <m:t>(</m:t>
+        </m:r>
+        <m:r>
+          <m:t>A</m:t>
+        </m:r>
+        <m:r>
+          <m:rPr>
+            <m:sty m:val="p"/>
+          </m:rPr>
+          <m:t>)</m:t>
+        </m:r>
+        <m:limUpp>
+          <m:e>
+            <m:r>
+              <m:rPr>
+                <m:sty m:val="p"/>
+              </m:rPr>
+              <m:t>=</m:t>
+            </m:r>
+          </m:e>
+          <m:lim>
+            <m:r>
+              <m:rPr>
+                <m:nor/>
+                <m:sty m:val="p"/>
+              </m:rPr>
+              <m:t>def</m:t>
+            </m:r>
+          </m:lim>
+        </m:limUpp>
+        <m:r>
+          <m:t>​</m:t>
+        </m:r>
+        <m:d>
+          <m:dPr>
+            <m:begChr m:val="|"/>
+            <m:sepChr m:val=""/>
+            <m:endChr m:val="|"/>
+            <m:grow/>
+          </m:dPr>
+          <m:e>
+            <m:r>
+              <m:t>A</m:t>
+            </m:r>
+          </m:e>
+        </m:d>
+        <m:r>
+          <m:t>​</m:t>
+        </m:r>
+      </m:oMath>
+      <w:r>
+        <w:t xml:space="preserve">, the number of outcomes in</w:t>
+      </w:r>
+      <w:r>
+        <w:t xml:space="preserve"> </w:t>
+      </w:r>
+      <m:oMath>
+        <m:r>
+          <m:t>A</m:t>
+        </m:r>
+      </m:oMath>
+      <w:r>
+        <w:t xml:space="preserve">.</w:t>
+      </w:r>
+      <w:r>
+        <w:t xml:space="preserve"> </w:t>
+      </w:r>
+      <w:r>
+        <w:t xml:space="preserve">The events</w:t>
+      </w:r>
+      <w:r>
+        <w:t xml:space="preserve"> </w:t>
+      </w:r>
+      <m:oMath>
+        <m:r>
+          <m:t>​</m:t>
+        </m:r>
+        <m:d>
+          <m:dPr>
+            <m:begChr m:val="{"/>
+            <m:sepChr m:val=""/>
+            <m:endChr m:val="}"/>
+            <m:grow/>
+          </m:dPr>
+          <m:e>
+            <m:r>
+              <m:t>1</m:t>
+            </m:r>
+            <m:r>
+              <m:rPr>
+                <m:sty m:val="p"/>
+              </m:rPr>
+              <m:t>,</m:t>
+            </m:r>
+            <m:r>
+              <m:t>2</m:t>
+            </m:r>
+          </m:e>
+        </m:d>
+        <m:r>
+          <m:t>​</m:t>
+        </m:r>
+      </m:oMath>
+      <w:r>
+        <w:t xml:space="preserve"> </w:t>
+      </w:r>
+      <w:r>
+        <w:t xml:space="preserve">and</w:t>
+      </w:r>
+      <w:r>
+        <w:t xml:space="preserve"> </w:t>
+      </w:r>
+      <m:oMath>
+        <m:r>
+          <m:t>​</m:t>
+        </m:r>
+        <m:d>
+          <m:dPr>
+            <m:begChr m:val="{"/>
+            <m:sepChr m:val=""/>
+            <m:endChr m:val="}"/>
+            <m:grow/>
+          </m:dPr>
+          <m:e>
+            <m:r>
+              <m:t>5</m:t>
+            </m:r>
+            <m:r>
+              <m:rPr>
+                <m:sty m:val="p"/>
+              </m:rPr>
+              <m:t>,</m:t>
+            </m:r>
+            <m:r>
+              <m:t>6</m:t>
+            </m:r>
+          </m:e>
+        </m:d>
+        <m:r>
+          <m:t>​</m:t>
+        </m:r>
+      </m:oMath>
+      <w:r>
+        <w:t xml:space="preserve"> </w:t>
+      </w:r>
+      <w:r>
+        <w:t xml:space="preserve">are mutually exclusive</w:t>
+      </w:r>
+      <w:r>
+        <w:t xml:space="preserve"> </w:t>
+      </w:r>
+      <w:r>
+        <w:t xml:space="preserve">(</w:t>
+      </w:r>
+      <w:hyperlink w:anchor="exm-mutually-exclusive">
+        <w:r>
+          <w:rPr>
+            <w:rStyle w:val="Hyperlink"/>
+          </w:rPr>
+          <w:t xml:space="preserve">Example 4</w:t>
+        </w:r>
+      </w:hyperlink>
+      <w:r>
+        <w:t xml:space="preserve">), and:</w:t>
+      </w:r>
+    </w:p>
+    <w:p>
+      <w:pPr>
+        <w:pStyle w:val="BodyText"/>
+      </w:pPr>
+      <m:oMathPara>
+        <m:oMathParaPr>
+          <m:jc m:val="center"/>
+        </m:oMathParaPr>
+        <m:oMath>
+          <m:eqArr>
+            <m:e>
+              <m:r>
+                <m:t>μ</m:t>
+              </m:r>
+              <m:r>
+                <m:rPr>
+                  <m:sty m:val="p"/>
+                </m:rPr>
+                <m:t>(</m:t>
+              </m:r>
+              <m:r>
+                <m:t>​</m:t>
+              </m:r>
+              <m:d>
+                <m:dPr>
+                  <m:begChr m:val="{"/>
+                  <m:sepChr m:val=""/>
+                  <m:endChr m:val="}"/>
+                  <m:grow/>
+                </m:dPr>
+                <m:e>
+                  <m:r>
+                    <m:t>1</m:t>
+                  </m:r>
+                  <m:r>
+                    <m:rPr>
+                      <m:sty m:val="p"/>
+                    </m:rPr>
+                    <m:t>,</m:t>
+                  </m:r>
+                  <m:r>
+                    <m:t>2</m:t>
+                  </m:r>
+                </m:e>
+              </m:d>
+              <m:r>
+                <m:t>​</m:t>
+              </m:r>
+              <m:r>
+                <m:rPr>
+                  <m:sty m:val="p"/>
+                </m:rPr>
+                <m:t>∪</m:t>
+              </m:r>
+              <m:r>
+                <m:t>​</m:t>
+              </m:r>
+              <m:d>
+                <m:dPr>
+                  <m:begChr m:val="{"/>
+                  <m:sepChr m:val=""/>
+                  <m:endChr m:val="}"/>
+                  <m:grow/>
+                </m:dPr>
+                <m:e>
+                  <m:r>
+                    <m:t>5</m:t>
+                  </m:r>
+                  <m:r>
+                    <m:rPr>
+                      <m:sty m:val="p"/>
+                    </m:rPr>
+                    <m:t>,</m:t>
+                  </m:r>
+                  <m:r>
+                    <m:t>6</m:t>
+                  </m:r>
+                </m:e>
+              </m:d>
+              <m:r>
+                <m:t>​</m:t>
+              </m:r>
+              <m:r>
+                <m:rPr>
+                  <m:sty m:val="p"/>
+                </m:rPr>
+                <m:t>)</m:t>
+              </m:r>
+              <m:r>
+                <m:t>&amp;</m:t>
+              </m:r>
+              <m:r>
+                <m:rPr>
+                  <m:sty m:val="p"/>
+                </m:rPr>
+                <m:t>=</m:t>
+              </m:r>
+              <m:r>
+                <m:t>μ</m:t>
+              </m:r>
+              <m:r>
+                <m:rPr>
+                  <m:sty m:val="p"/>
+                </m:rPr>
+                <m:t>(</m:t>
+              </m:r>
+              <m:r>
+                <m:t>​</m:t>
+              </m:r>
+              <m:d>
+                <m:dPr>
+                  <m:begChr m:val="{"/>
+                  <m:sepChr m:val=""/>
+                  <m:endChr m:val="}"/>
+                  <m:grow/>
+                </m:dPr>
+                <m:e>
+                  <m:r>
+                    <m:t>1</m:t>
+                  </m:r>
+                  <m:r>
+                    <m:rPr>
+                      <m:sty m:val="p"/>
+                    </m:rPr>
+                    <m:t>,</m:t>
+                  </m:r>
+                  <m:r>
+                    <m:t>2</m:t>
+                  </m:r>
+                  <m:r>
+                    <m:rPr>
+                      <m:sty m:val="p"/>
+                    </m:rPr>
+                    <m:t>,</m:t>
+                  </m:r>
+                  <m:r>
+                    <m:t>5</m:t>
+                  </m:r>
+                  <m:r>
+                    <m:rPr>
+                      <m:sty m:val="p"/>
+                    </m:rPr>
+                    <m:t>,</m:t>
+                  </m:r>
+                  <m:r>
+                    <m:t>6</m:t>
+                  </m:r>
+                </m:e>
+              </m:d>
+              <m:r>
+                <m:t>​</m:t>
+              </m:r>
+              <m:r>
+                <m:rPr>
+                  <m:sty m:val="p"/>
+                </m:rPr>
+                <m:t>)</m:t>
+              </m:r>
+              <m:r>
+                <m:t>&amp;</m:t>
+              </m:r>
+              <m:r>
+                <m:t>&amp;</m:t>
+              </m:r>
+              <m:r>
+                <m:rPr>
+                  <m:nor/>
+                  <m:sty m:val="p"/>
+                </m:rPr>
+                <m:t>(take the union)</m:t>
+              </m:r>
+            </m:e>
+            <m:e>
+              <m:r>
+                <m:t>&amp;</m:t>
+              </m:r>
+              <m:r>
+                <m:rPr>
+                  <m:sty m:val="p"/>
+                </m:rPr>
+                <m:t>=</m:t>
+              </m:r>
+              <m:r>
+                <m:t>4</m:t>
+              </m:r>
+              <m:r>
+                <m:t>&amp;</m:t>
+              </m:r>
+              <m:r>
+                <m:t>&amp;</m:t>
+              </m:r>
+              <m:r>
+                <m:rPr>
+                  <m:nor/>
+                  <m:sty m:val="p"/>
+                </m:rPr>
+                <m:t>(count the outcomes)</m:t>
+              </m:r>
+            </m:e>
+            <m:e>
+              <m:r>
+                <m:t>&amp;</m:t>
+              </m:r>
+              <m:r>
+                <m:rPr>
+                  <m:sty m:val="p"/>
+                </m:rPr>
+                <m:t>=</m:t>
+              </m:r>
+              <m:r>
+                <m:t>2</m:t>
+              </m:r>
+              <m:r>
+                <m:rPr>
+                  <m:sty m:val="p"/>
+                </m:rPr>
+                <m:t>+</m:t>
+              </m:r>
+              <m:r>
+                <m:t>2</m:t>
+              </m:r>
+              <m:r>
+                <m:t>&amp;</m:t>
+              </m:r>
+              <m:r>
+                <m:t>&amp;</m:t>
+              </m:r>
+              <m:r>
+                <m:rPr>
+                  <m:nor/>
+                  <m:sty m:val="p"/>
+                </m:rPr>
+                <m:t>(write 4 as a sum)</m:t>
+              </m:r>
+            </m:e>
+            <m:e>
+              <m:r>
+                <m:t>&amp;</m:t>
+              </m:r>
+              <m:r>
+                <m:rPr>
+                  <m:sty m:val="p"/>
+                </m:rPr>
+                <m:t>=</m:t>
+              </m:r>
+              <m:r>
+                <m:t>μ</m:t>
+              </m:r>
+              <m:r>
+                <m:rPr>
+                  <m:sty m:val="p"/>
+                </m:rPr>
+                <m:t>(</m:t>
+              </m:r>
+              <m:r>
+                <m:t>​</m:t>
+              </m:r>
+              <m:d>
+                <m:dPr>
+                  <m:begChr m:val="{"/>
+                  <m:sepChr m:val=""/>
+                  <m:endChr m:val="}"/>
+                  <m:grow/>
+                </m:dPr>
+                <m:e>
+                  <m:r>
+                    <m:t>1</m:t>
+                  </m:r>
+                  <m:r>
+                    <m:rPr>
+                      <m:sty m:val="p"/>
+                    </m:rPr>
+                    <m:t>,</m:t>
+                  </m:r>
+                  <m:r>
+                    <m:t>2</m:t>
+                  </m:r>
+                </m:e>
+              </m:d>
+              <m:r>
+                <m:t>​</m:t>
+              </m:r>
+              <m:r>
+                <m:rPr>
+                  <m:sty m:val="p"/>
+                </m:rPr>
+                <m:t>)</m:t>
+              </m:r>
+              <m:r>
+                <m:rPr>
+                  <m:sty m:val="p"/>
+                </m:rPr>
+                <m:t>+</m:t>
+              </m:r>
+              <m:r>
+                <m:t>μ</m:t>
+              </m:r>
+              <m:r>
+                <m:rPr>
+                  <m:sty m:val="p"/>
+                </m:rPr>
+                <m:t>(</m:t>
+              </m:r>
+              <m:r>
+                <m:t>​</m:t>
+              </m:r>
+              <m:d>
+                <m:dPr>
+                  <m:begChr m:val="{"/>
+                  <m:sepChr m:val=""/>
+                  <m:endChr m:val="}"/>
+                  <m:grow/>
+                </m:dPr>
+                <m:e>
+                  <m:r>
+                    <m:t>5</m:t>
+                  </m:r>
+                  <m:r>
+                    <m:rPr>
+                      <m:sty m:val="p"/>
+                    </m:rPr>
+                    <m:t>,</m:t>
+                  </m:r>
+                  <m:r>
+                    <m:t>6</m:t>
+                  </m:r>
+                </m:e>
+              </m:d>
+              <m:r>
+                <m:t>​</m:t>
+              </m:r>
+              <m:r>
+                <m:rPr>
+                  <m:sty m:val="p"/>
+                </m:rPr>
+                <m:t>)</m:t>
+              </m:r>
+              <m:r>
+                <m:t>&amp;</m:t>
+              </m:r>
+              <m:r>
+                <m:t>&amp;</m:t>
+              </m:r>
+              <m:r>
+                <m:rPr>
+                  <m:nor/>
+                  <m:sty m:val="p"/>
+                </m:rPr>
+                <m:t>(count each event’s outcomes)</m:t>
+              </m:r>
+            </m:e>
+          </m:eqArr>
+        </m:oMath>
+      </m:oMathPara>
+    </w:p>
+    <w:p>
+      <w:pPr>
+        <w:pStyle w:val="FirstParagraph"/>
+      </w:pPr>
+      <w:r>
+        <w:t xml:space="preserve">The same holds for any mutually exclusive events,</w:t>
+      </w:r>
+      <w:r>
+        <w:t xml:space="preserve"> </w:t>
+      </w:r>
+      <w:r>
+        <w:t xml:space="preserve">because the sizes of disjoint sets add,</w:t>
+      </w:r>
+      <w:r>
+        <w:t xml:space="preserve"> </w:t>
+      </w:r>
+      <w:r>
+        <w:t xml:space="preserve">so</w:t>
+      </w:r>
+      <w:r>
+        <w:t xml:space="preserve"> </w:t>
+      </w:r>
+      <m:oMath>
+        <m:r>
+          <m:t>μ</m:t>
+        </m:r>
+      </m:oMath>
+      <w:r>
+        <w:t xml:space="preserve"> </w:t>
+      </w:r>
+      <w:r>
+        <w:t xml:space="preserve">is finitely additive.</w:t>
+      </w:r>
+    </w:p>
+    <w:bookmarkEnd w:id="22"/>
+    <w:bookmarkStart w:id="23" w:name="def-countable-additivity"/>
+    <w:p>
+      <w:pPr>
+        <w:pStyle w:val="BodyText"/>
+      </w:pPr>
+      <w:r>
+        <w:rPr>
+          <w:b/>
+          <w:bCs/>
+        </w:rPr>
+        <w:t xml:space="preserve">Definition 7 (Countable additivity)</w:t>
+      </w:r>
+      <w:r>
+        <w:t xml:space="preserve"> </w:t>
+      </w:r>
+      <w:r>
+        <w:t xml:space="preserve">A function</w:t>
+      </w:r>
+      <w:r>
+        <w:t xml:space="preserve"> </w:t>
+      </w:r>
+      <m:oMath>
+        <m:r>
+          <m:t>μ</m:t>
+        </m:r>
+      </m:oMath>
+      <w:r>
+        <w:t xml:space="preserve"> </w:t>
+      </w:r>
+      <w:r>
+        <w:t xml:space="preserve">that assigns a real number</w:t>
+      </w:r>
+      <w:r>
+        <w:t xml:space="preserve"> </w:t>
+      </w:r>
+      <m:oMath>
+        <m:r>
+          <m:t>μ</m:t>
+        </m:r>
+        <m:r>
+          <m:rPr>
+            <m:sty m:val="p"/>
+          </m:rPr>
+          <m:t>(</m:t>
+        </m:r>
+        <m:r>
+          <m:t>A</m:t>
+        </m:r>
+        <m:r>
+          <m:rPr>
+            <m:sty m:val="p"/>
+          </m:rPr>
+          <m:t>)</m:t>
+        </m:r>
+      </m:oMath>
+      <w:r>
+        <w:t xml:space="preserve"> </w:t>
+      </w:r>
+      <w:r>
+        <w:t xml:space="preserve">to each</w:t>
+      </w:r>
+      <w:r>
+        <w:t xml:space="preserve"> </w:t>
+      </w:r>
+      <w:hyperlink w:anchor="def-event">
+        <w:r>
+          <w:rPr>
+            <w:rStyle w:val="Hyperlink"/>
+          </w:rPr>
+          <w:t xml:space="preserve">event</w:t>
+        </w:r>
+      </w:hyperlink>
+      <w:r>
+        <w:t xml:space="preserve"> </w:t>
+      </w:r>
+      <m:oMath>
+        <m:r>
+          <m:t>A</m:t>
+        </m:r>
+      </m:oMath>
+      <w:r>
+        <w:t xml:space="preserve"> </w:t>
+      </w:r>
+      <w:r>
+        <w:t xml:space="preserve">is</w:t>
+      </w:r>
+      <w:r>
+        <w:t xml:space="preserve"> </w:t>
+      </w:r>
+      <w:r>
+        <w:rPr>
+          <w:b/>
+          <w:bCs/>
+        </w:rPr>
+        <w:t xml:space="preserve">countably additive</w:t>
+      </w:r>
+      <w:r>
+        <w:t xml:space="preserve"> </w:t>
+      </w:r>
+      <w:r>
+        <w:t xml:space="preserve">(also called</w:t>
+      </w:r>
+      <w:r>
+        <w:t xml:space="preserve"> </w:t>
+      </w:r>
+      <m:oMath>
+        <m:r>
+          <m:t>σ</m:t>
+        </m:r>
+      </m:oMath>
+      <w:r>
+        <w:rPr>
+          <w:b/>
+          <w:bCs/>
+        </w:rPr>
+        <w:t xml:space="preserve">-additive</w:t>
+      </w:r>
+      <w:r>
+        <w:t xml:space="preserve">)</w:t>
+      </w:r>
+      <w:r>
+        <w:t xml:space="preserve"> </w:t>
+      </w:r>
+      <w:r>
+        <w:t xml:space="preserve">if, for every sequence of</w:t>
+      </w:r>
+      <w:r>
+        <w:t xml:space="preserve"> </w:t>
+      </w:r>
+      <w:hyperlink w:anchor="def-mutually-exclusive">
+        <w:r>
+          <w:rPr>
+            <w:rStyle w:val="Hyperlink"/>
+          </w:rPr>
+          <w:t xml:space="preserve">mutually exclusive</w:t>
+        </w:r>
+      </w:hyperlink>
+      <w:r>
+        <w:t xml:space="preserve"> </w:t>
+      </w:r>
+      <w:r>
+        <w:t xml:space="preserve">events</w:t>
+      </w:r>
+      <w:r>
+        <w:t xml:space="preserve"> </w:t>
+      </w:r>
+      <m:oMath>
+        <m:sSub>
+          <m:e>
+            <m:r>
+              <m:t>A</m:t>
+            </m:r>
+          </m:e>
+          <m:sub>
+            <m:r>
+              <m:t>1</m:t>
+            </m:r>
+          </m:sub>
+        </m:sSub>
+        <m:r>
+          <m:rPr>
+            <m:sty m:val="p"/>
+          </m:rPr>
+          <m:t>,</m:t>
+        </m:r>
+        <m:sSub>
+          <m:e>
+            <m:r>
+              <m:t>A</m:t>
+            </m:r>
+          </m:e>
+          <m:sub>
+            <m:r>
+              <m:t>2</m:t>
+            </m:r>
+          </m:sub>
+        </m:sSub>
+        <m:r>
+          <m:rPr>
+            <m:sty m:val="p"/>
+          </m:rPr>
+          <m:t>,</m:t>
+        </m:r>
+        <m:r>
+          <m:rPr>
+            <m:sty m:val="p"/>
+          </m:rPr>
+          <m:t>…</m:t>
+        </m:r>
+      </m:oMath>
+      <w:r>
+        <w:t xml:space="preserve">,</w:t>
+      </w:r>
+      <w:r>
+        <w:t xml:space="preserve"> </w:t>
+      </w:r>
+      <w:r>
+        <w:t xml:space="preserve">the value of their union is the sum of their values:</w:t>
+      </w:r>
+    </w:p>
+    <w:p>
+      <w:pPr>
+        <w:pStyle w:val="BodyText"/>
+      </w:pPr>
+      <m:oMathPara>
+        <m:oMathParaPr>
+          <m:jc m:val="center"/>
+        </m:oMathParaPr>
+        <m:oMath>
+          <m:r>
+            <m:t>μ</m:t>
+          </m:r>
+          <m:r>
+            <m:t>​</m:t>
+          </m:r>
+          <m:d>
+            <m:dPr>
+              <m:begChr m:val="("/>
+              <m:sepChr m:val=""/>
+              <m:endChr m:val=")"/>
+              <m:grow/>
+            </m:dPr>
+            <m:e>
+              <m:limLow>
+                <m:e>
+                  <m:limUpp>
+                    <m:e>
+                      <m:r>
+                        <m:rPr>
+                          <m:sty m:val="p"/>
+                        </m:rPr>
+                        <m:t>⋃</m:t>
+                      </m:r>
+                    </m:e>
+                    <m:lim>
+                      <m:r>
+                        <m:rPr>
+                          <m:sty m:val="p"/>
+                        </m:rPr>
+                        <m:t>∞</m:t>
+                      </m:r>
+                    </m:lim>
+                  </m:limUpp>
+                </m:e>
+                <m:lim>
+                  <m:r>
+                    <m:t>i</m:t>
+                  </m:r>
+                  <m:r>
+                    <m:rPr>
+                      <m:sty m:val="p"/>
+                    </m:rPr>
+                    <m:t>=</m:t>
+                  </m:r>
+                  <m:r>
+                    <m:t>1</m:t>
+                  </m:r>
+                </m:lim>
+              </m:limLow>
+              <m:sSub>
+                <m:e>
+                  <m:r>
+                    <m:t>A</m:t>
+                  </m:r>
+                </m:e>
+                <m:sub>
+                  <m:r>
+                    <m:t>i</m:t>
+                  </m:r>
+                </m:sub>
+              </m:sSub>
+            </m:e>
+          </m:d>
+          <m:r>
+            <m:rPr>
+              <m:sty m:val="p"/>
+            </m:rPr>
+            <m:t>=</m:t>
+          </m:r>
+          <m:nary>
+            <m:naryPr>
+              <m:chr m:val="∑"/>
+              <m:limLoc m:val="undOvr"/>
+              <m:subHide m:val="off"/>
+              <m:supHide m:val="off"/>
+            </m:naryPr>
+            <m:sub>
+              <m:r>
+                <m:t>i</m:t>
+              </m:r>
+              <m:r>
+                <m:rPr>
+                  <m:sty m:val="p"/>
+                </m:rPr>
+                <m:t>=</m:t>
+              </m:r>
+              <m:r>
+                <m:t>1</m:t>
+              </m:r>
+            </m:sub>
+            <m:sup>
+              <m:r>
+                <m:rPr>
+                  <m:sty m:val="p"/>
+                </m:rPr>
+                <m:t>∞</m:t>
+              </m:r>
+            </m:sup>
+            <m:e>
+              <m:r>
+                <m:t>μ</m:t>
+              </m:r>
+            </m:e>
+          </m:nary>
+          <m:r>
+            <m:rPr>
+              <m:sty m:val="p"/>
+            </m:rPr>
+            <m:t>(</m:t>
+          </m:r>
+          <m:sSub>
+            <m:e>
+              <m:r>
+                <m:t>A</m:t>
+              </m:r>
+            </m:e>
+            <m:sub>
+              <m:r>
+                <m:t>i</m:t>
+              </m:r>
+            </m:sub>
+          </m:sSub>
+          <m:r>
+            <m:rPr>
+              <m:sty m:val="p"/>
+            </m:rPr>
+            <m:t>)</m:t>
+          </m:r>
+        </m:oMath>
+      </m:oMathPara>
+    </w:p>
+    <w:bookmarkEnd w:id="23"/>
+    <w:p>
+      <w:pPr>
+        <w:pStyle w:val="FirstParagraph"/>
+      </w:pPr>
+      <w:r>
+        <w:t xml:space="preserve">Countable additivity implies</w:t>
+      </w:r>
+      <w:r>
+        <w:t xml:space="preserve"> </w:t>
+      </w:r>
+      <w:hyperlink w:anchor="def-finite-additivity">
+        <w:r>
+          <w:rPr>
+            <w:rStyle w:val="Hyperlink"/>
+          </w:rPr>
+          <w:t xml:space="preserve">finite additivity</w:t>
+        </w:r>
+      </w:hyperlink>
+      <w:r>
+        <w:t xml:space="preserve">.</w:t>
+      </w:r>
+      <w:r>
+        <w:t xml:space="preserve"> </w:t>
+      </w:r>
+      <w:r>
+        <w:t xml:space="preserve">Applying countable additivity to</w:t>
+      </w:r>
+      <w:r>
+        <w:t xml:space="preserve"> </w:t>
+      </w:r>
+      <m:oMath>
+        <m:r>
+          <m:rPr>
+            <m:sty m:val="p"/>
+          </m:rPr>
+          <m:t>∅</m:t>
+        </m:r>
+        <m:r>
+          <m:rPr>
+            <m:sty m:val="p"/>
+          </m:rPr>
+          <m:t>,</m:t>
+        </m:r>
+        <m:r>
+          <m:rPr>
+            <m:sty m:val="p"/>
+          </m:rPr>
+          <m:t>∅</m:t>
+        </m:r>
+        <m:r>
+          <m:rPr>
+            <m:sty m:val="p"/>
+          </m:rPr>
+          <m:t>,</m:t>
+        </m:r>
+        <m:r>
+          <m:rPr>
+            <m:sty m:val="p"/>
+          </m:rPr>
+          <m:t>…</m:t>
+        </m:r>
+      </m:oMath>
+      <w:r>
+        <w:t xml:space="preserve">,</w:t>
+      </w:r>
+      <w:r>
+        <w:t xml:space="preserve"> </w:t>
+      </w:r>
+      <w:r>
+        <w:t xml:space="preserve">which are mutually exclusive with union</w:t>
+      </w:r>
+      <w:r>
+        <w:t xml:space="preserve"> </w:t>
+      </w:r>
+      <m:oMath>
+        <m:r>
+          <m:rPr>
+            <m:sty m:val="p"/>
+          </m:rPr>
+          <m:t>∅</m:t>
+        </m:r>
+      </m:oMath>
+      <w:r>
+        <w:t xml:space="preserve">,</w:t>
+      </w:r>
+      <w:r>
+        <w:t xml:space="preserve"> </w:t>
+      </w:r>
+      <w:r>
+        <w:t xml:space="preserve">gives</w:t>
+      </w:r>
+      <w:r>
+        <w:t xml:space="preserve"> </w:t>
+      </w:r>
+      <m:oMath>
+        <m:r>
+          <m:t>μ</m:t>
+        </m:r>
+        <m:r>
+          <m:rPr>
+            <m:sty m:val="p"/>
+          </m:rPr>
+          <m:t>(</m:t>
+        </m:r>
+        <m:r>
+          <m:rPr>
+            <m:sty m:val="p"/>
+          </m:rPr>
+          <m:t>∅</m:t>
+        </m:r>
+        <m:r>
+          <m:rPr>
+            <m:sty m:val="p"/>
+          </m:rPr>
+          <m:t>)</m:t>
+        </m:r>
+        <m:r>
+          <m:rPr>
+            <m:sty m:val="p"/>
+          </m:rPr>
+          <m:t>=</m:t>
+        </m:r>
+        <m:nary>
+          <m:naryPr>
+            <m:chr m:val="∑"/>
+            <m:limLoc m:val="undOvr"/>
+            <m:subHide m:val="off"/>
+            <m:supHide m:val="off"/>
+          </m:naryPr>
+          <m:sub>
+            <m:r>
+              <m:t>i</m:t>
+            </m:r>
+            <m:r>
+              <m:rPr>
+                <m:sty m:val="p"/>
+              </m:rPr>
+              <m:t>=</m:t>
+            </m:r>
+            <m:r>
+              <m:t>1</m:t>
+            </m:r>
+          </m:sub>
+          <m:sup>
+            <m:r>
+              <m:rPr>
+                <m:sty m:val="p"/>
+              </m:rPr>
+              <m:t>∞</m:t>
+            </m:r>
+          </m:sup>
+          <m:e>
+            <m:r>
+              <m:t>μ</m:t>
+            </m:r>
+          </m:e>
+        </m:nary>
+        <m:r>
+          <m:rPr>
+            <m:sty m:val="p"/>
+          </m:rPr>
+          <m:t>(</m:t>
+        </m:r>
+        <m:r>
+          <m:rPr>
+            <m:sty m:val="p"/>
+          </m:rPr>
+          <m:t>∅</m:t>
+        </m:r>
+        <m:r>
+          <m:rPr>
+            <m:sty m:val="p"/>
+          </m:rPr>
+          <m:t>)</m:t>
+        </m:r>
+      </m:oMath>
+      <w:r>
+        <w:t xml:space="preserve">,</w:t>
+      </w:r>
+      <w:r>
+        <w:t xml:space="preserve"> </w:t>
+      </w:r>
+      <w:r>
+        <w:t xml:space="preserve">a sum of identical terms that is finite only if</w:t>
+      </w:r>
+      <w:r>
+        <w:t xml:space="preserve"> </w:t>
+      </w:r>
+      <m:oMath>
+        <m:r>
+          <m:t>μ</m:t>
+        </m:r>
+        <m:r>
+          <m:rPr>
+            <m:sty m:val="p"/>
+          </m:rPr>
+          <m:t>(</m:t>
+        </m:r>
+        <m:r>
+          <m:rPr>
+            <m:sty m:val="p"/>
+          </m:rPr>
+          <m:t>∅</m:t>
+        </m:r>
+        <m:r>
+          <m:rPr>
+            <m:sty m:val="p"/>
+          </m:rPr>
+          <m:t>)</m:t>
+        </m:r>
+        <m:r>
+          <m:rPr>
+            <m:sty m:val="p"/>
+          </m:rPr>
+          <m:t>=</m:t>
+        </m:r>
+        <m:r>
+          <m:t>0</m:t>
+        </m:r>
+      </m:oMath>
+      <w:r>
+        <w:t xml:space="preserve">.</w:t>
+      </w:r>
+      <w:r>
+        <w:t xml:space="preserve"> </w:t>
+      </w:r>
+      <w:r>
+        <w:t xml:space="preserve">Then, for mutually exclusive</w:t>
+      </w:r>
+      <w:r>
+        <w:t xml:space="preserve"> </w:t>
+      </w:r>
+      <m:oMath>
+        <m:sSub>
+          <m:e>
+            <m:r>
+              <m:t>A</m:t>
+            </m:r>
+          </m:e>
+          <m:sub>
+            <m:r>
+              <m:t>1</m:t>
+            </m:r>
+          </m:sub>
+        </m:sSub>
+        <m:r>
+          <m:rPr>
+            <m:sty m:val="p"/>
+          </m:rPr>
+          <m:t>,</m:t>
+        </m:r>
+        <m:r>
+          <m:rPr>
+            <m:sty m:val="p"/>
+          </m:rPr>
+          <m:t>…</m:t>
+        </m:r>
+        <m:r>
+          <m:rPr>
+            <m:sty m:val="p"/>
+          </m:rPr>
+          <m:t>,</m:t>
+        </m:r>
+        <m:sSub>
+          <m:e>
+            <m:r>
+              <m:t>A</m:t>
+            </m:r>
+          </m:e>
+          <m:sub>
+            <m:r>
+              <m:t>n</m:t>
+            </m:r>
+          </m:sub>
+        </m:sSub>
+      </m:oMath>
+      <w:r>
+        <w:t xml:space="preserve">,</w:t>
+      </w:r>
+      <w:r>
+        <w:t xml:space="preserve"> </w:t>
+      </w:r>
+      <w:r>
+        <w:t xml:space="preserve">set</w:t>
+      </w:r>
+      <w:r>
+        <w:t xml:space="preserve"> </w:t>
+      </w:r>
+      <m:oMath>
+        <m:sSub>
+          <m:e>
+            <m:r>
+              <m:t>A</m:t>
+            </m:r>
+          </m:e>
+          <m:sub>
+            <m:r>
+              <m:t>n</m:t>
+            </m:r>
+            <m:r>
+              <m:rPr>
+                <m:sty m:val="p"/>
+              </m:rPr>
+              <m:t>+</m:t>
+            </m:r>
+            <m:r>
+              <m:t>1</m:t>
+            </m:r>
+          </m:sub>
+        </m:sSub>
+        <m:r>
+          <m:rPr>
+            <m:sty m:val="p"/>
+          </m:rPr>
+          <m:t>=</m:t>
+        </m:r>
+        <m:sSub>
+          <m:e>
+            <m:r>
+              <m:t>A</m:t>
+            </m:r>
+          </m:e>
+          <m:sub>
+            <m:r>
+              <m:t>n</m:t>
+            </m:r>
+            <m:r>
+              <m:rPr>
+                <m:sty m:val="p"/>
+              </m:rPr>
+              <m:t>+</m:t>
+            </m:r>
+            <m:r>
+              <m:t>2</m:t>
+            </m:r>
+          </m:sub>
+        </m:sSub>
+        <m:r>
+          <m:rPr>
+            <m:sty m:val="p"/>
+          </m:rPr>
+          <m:t>=</m:t>
+        </m:r>
+        <m:r>
+          <m:rPr>
+            <m:sty m:val="p"/>
+          </m:rPr>
+          <m:t>⋯</m:t>
+        </m:r>
+        <m:r>
+          <m:rPr>
+            <m:sty m:val="p"/>
+          </m:rPr>
+          <m:t>=</m:t>
+        </m:r>
+        <m:r>
+          <m:rPr>
+            <m:sty m:val="p"/>
+          </m:rPr>
+          <m:t>∅</m:t>
+        </m:r>
+      </m:oMath>
+      <w:r>
+        <w:t xml:space="preserve"> </w:t>
+      </w:r>
+      <w:r>
+        <w:t xml:space="preserve">and apply countable additivity to the whole sequence.</w:t>
+      </w:r>
+      <w:r>
+        <w:t xml:space="preserve"> </w:t>
+      </w:r>
+      <w:r>
+        <w:t xml:space="preserve">The converse fails:</w:t>
+      </w:r>
+      <w:r>
+        <w:t xml:space="preserve"> </w:t>
+      </w:r>
+      <w:r>
+        <w:t xml:space="preserve">there exist set functions that satisfy finite additivity</w:t>
+      </w:r>
+      <w:r>
+        <w:t xml:space="preserve"> </w:t>
+      </w:r>
+      <w:r>
+        <w:t xml:space="preserve">but fail countable additivity</w:t>
+      </w:r>
+      <w:r>
+        <w:t xml:space="preserve"> </w:t>
+      </w:r>
+      <w:r>
+        <w:t xml:space="preserve">(see</w:t>
+      </w:r>
+      <w:r>
+        <w:t xml:space="preserve"> </w:t>
+      </w:r>
+      <w:hyperlink r:id="rId24">
+        <w:r>
+          <w:rPr>
+            <w:rStyle w:val="Hyperlink"/>
+          </w:rPr>
+          <w:t xml:space="preserve">Wikipedia: Sigma-additive set function — An additive function which is not</w:t>
+        </w:r>
+        <w:r>
+          <w:rPr>
+            <w:rStyle w:val="Hyperlink"/>
+          </w:rPr>
+          <w:t xml:space="preserve"> </w:t>
+        </w:r>
+        <m:oMath>
+          <m:r>
+            <m:t>σ</m:t>
+          </m:r>
+        </m:oMath>
+        <w:r>
+          <w:rPr>
+            <w:rStyle w:val="Hyperlink"/>
+          </w:rPr>
+          <w:t xml:space="preserve">-additive</w:t>
+        </w:r>
+      </w:hyperlink>
+      <w:r>
+        <w:t xml:space="preserve">).</w:t>
+      </w:r>
+    </w:p>
+    <w:bookmarkStart w:id="25" w:name="exm-countable-additivity"/>
+    <w:p>
+      <w:pPr>
+        <w:pStyle w:val="BodyText"/>
+      </w:pPr>
+      <w:r>
+        <w:rPr>
+          <w:b/>
+          <w:bCs/>
+        </w:rPr>
+        <w:t xml:space="preserve">Example 7 (Counting outcomes is countably additive)</w:t>
+      </w:r>
+      <w:r>
+        <w:t xml:space="preserve"> </w:t>
+      </w:r>
+      <w:r>
+        <w:t xml:space="preserve">For the counting function</w:t>
+      </w:r>
+      <w:r>
+        <w:t xml:space="preserve"> </w:t>
+      </w:r>
+      <m:oMath>
+        <m:r>
+          <m:t>μ</m:t>
+        </m:r>
+        <m:r>
+          <m:rPr>
+            <m:sty m:val="p"/>
+          </m:rPr>
+          <m:t>(</m:t>
+        </m:r>
+        <m:r>
+          <m:t>A</m:t>
+        </m:r>
+        <m:r>
+          <m:rPr>
+            <m:sty m:val="p"/>
+          </m:rPr>
+          <m:t>)</m:t>
+        </m:r>
+        <m:limUpp>
+          <m:e>
+            <m:r>
+              <m:rPr>
+                <m:sty m:val="p"/>
+              </m:rPr>
+              <m:t>=</m:t>
+            </m:r>
+          </m:e>
+          <m:lim>
+            <m:r>
+              <m:rPr>
+                <m:nor/>
+                <m:sty m:val="p"/>
+              </m:rPr>
+              <m:t>def</m:t>
+            </m:r>
+          </m:lim>
+        </m:limUpp>
+        <m:r>
+          <m:t>​</m:t>
+        </m:r>
+        <m:d>
+          <m:dPr>
+            <m:begChr m:val="|"/>
+            <m:sepChr m:val=""/>
+            <m:endChr m:val="|"/>
+            <m:grow/>
+          </m:dPr>
+          <m:e>
+            <m:r>
+              <m:t>A</m:t>
+            </m:r>
+          </m:e>
+        </m:d>
+        <m:r>
+          <m:t>​</m:t>
+        </m:r>
+      </m:oMath>
+      <w:r>
+        <w:t xml:space="preserve"> </w:t>
+      </w:r>
+      <w:r>
+        <w:t xml:space="preserve">of</w:t>
+      </w:r>
+      <w:r>
+        <w:t xml:space="preserve"> </w:t>
+      </w:r>
+      <w:hyperlink w:anchor="exm-finite-additivity">
+        <w:r>
+          <w:rPr>
+            <w:rStyle w:val="Hyperlink"/>
+          </w:rPr>
+          <w:t xml:space="preserve">Example 6</w:t>
+        </w:r>
+      </w:hyperlink>
+      <w:r>
+        <w:t xml:space="preserve">,</w:t>
+      </w:r>
+      <w:r>
+        <w:t xml:space="preserve"> </w:t>
+      </w:r>
+      <w:r>
+        <w:t xml:space="preserve">take any sequence of mutually exclusive events</w:t>
+      </w:r>
+      <w:r>
+        <w:t xml:space="preserve"> </w:t>
+      </w:r>
+      <m:oMath>
+        <m:sSub>
+          <m:e>
+            <m:r>
+              <m:t>A</m:t>
+            </m:r>
+          </m:e>
+          <m:sub>
+            <m:r>
+              <m:t>1</m:t>
+            </m:r>
+          </m:sub>
+        </m:sSub>
+        <m:r>
+          <m:rPr>
+            <m:sty m:val="p"/>
+          </m:rPr>
+          <m:t>,</m:t>
+        </m:r>
+        <m:sSub>
+          <m:e>
+            <m:r>
+              <m:t>A</m:t>
+            </m:r>
+          </m:e>
+          <m:sub>
+            <m:r>
+              <m:t>2</m:t>
+            </m:r>
+          </m:sub>
+        </m:sSub>
+        <m:r>
+          <m:rPr>
+            <m:sty m:val="p"/>
+          </m:rPr>
+          <m:t>,</m:t>
+        </m:r>
+        <m:r>
+          <m:rPr>
+            <m:sty m:val="p"/>
+          </m:rPr>
+          <m:t>…</m:t>
+        </m:r>
+      </m:oMath>
+      <w:r>
+        <w:t xml:space="preserve">.</w:t>
+      </w:r>
+      <w:r>
+        <w:t xml:space="preserve"> </w:t>
+      </w:r>
+      <w:r>
+        <w:t xml:space="preserve">No two of them share an outcome, and</w:t>
+      </w:r>
+      <w:r>
+        <w:t xml:space="preserve"> </w:t>
+      </w:r>
+      <m:oMath>
+        <m:r>
+          <m:rPr>
+            <m:sty m:val="p"/>
+          </m:rPr>
+          <m:t>Ω</m:t>
+        </m:r>
+      </m:oMath>
+      <w:r>
+        <w:t xml:space="preserve"> </w:t>
+      </w:r>
+      <w:r>
+        <w:t xml:space="preserve">has only six outcomes,</w:t>
+      </w:r>
+      <w:r>
+        <w:t xml:space="preserve"> </w:t>
+      </w:r>
+      <w:r>
+        <w:t xml:space="preserve">so at most six of the</w:t>
+      </w:r>
+      <w:r>
+        <w:t xml:space="preserve"> </w:t>
+      </w:r>
+      <m:oMath>
+        <m:sSub>
+          <m:e>
+            <m:r>
+              <m:t>A</m:t>
+            </m:r>
+          </m:e>
+          <m:sub>
+            <m:r>
+              <m:t>i</m:t>
+            </m:r>
+          </m:sub>
+        </m:sSub>
+      </m:oMath>
+      <w:r>
+        <w:t xml:space="preserve"> </w:t>
+      </w:r>
+      <w:r>
+        <w:t xml:space="preserve">contain any outcomes;</w:t>
+      </w:r>
+      <w:r>
+        <w:t xml:space="preserve"> </w:t>
+      </w:r>
+      <w:r>
+        <w:t xml:space="preserve">the rest are</w:t>
+      </w:r>
+      <w:r>
+        <w:t xml:space="preserve"> </w:t>
+      </w:r>
+      <m:oMath>
+        <m:r>
+          <m:rPr>
+            <m:sty m:val="p"/>
+          </m:rPr>
+          <m:t>∅</m:t>
+        </m:r>
+      </m:oMath>
+      <w:r>
+        <w:t xml:space="preserve">, with</w:t>
+      </w:r>
+      <w:r>
+        <w:t xml:space="preserve"> </w:t>
+      </w:r>
+      <m:oMath>
+        <m:r>
+          <m:t>μ</m:t>
+        </m:r>
+        <m:r>
+          <m:rPr>
+            <m:sty m:val="p"/>
+          </m:rPr>
+          <m:t>(</m:t>
+        </m:r>
+        <m:r>
+          <m:rPr>
+            <m:sty m:val="p"/>
+          </m:rPr>
+          <m:t>∅</m:t>
+        </m:r>
+        <m:r>
+          <m:rPr>
+            <m:sty m:val="p"/>
+          </m:rPr>
+          <m:t>)</m:t>
+        </m:r>
+        <m:r>
+          <m:rPr>
+            <m:sty m:val="p"/>
+          </m:rPr>
+          <m:t>=</m:t>
+        </m:r>
+        <m:r>
+          <m:t>0</m:t>
+        </m:r>
+      </m:oMath>
+      <w:r>
+        <w:t xml:space="preserve">.</w:t>
+      </w:r>
+      <w:r>
+        <w:t xml:space="preserve"> </w:t>
+      </w:r>
+      <w:r>
+        <w:t xml:space="preserve">The infinite sum therefore has at most six nonzero terms,</w:t>
+      </w:r>
+      <w:r>
+        <w:t xml:space="preserve"> </w:t>
+      </w:r>
+      <w:r>
+        <w:t xml:space="preserve">and finite additivity (</w:t>
+      </w:r>
+      <w:hyperlink w:anchor="exm-finite-additivity">
+        <w:r>
+          <w:rPr>
+            <w:rStyle w:val="Hyperlink"/>
+          </w:rPr>
+          <w:t xml:space="preserve">Example 6</w:t>
+        </w:r>
+      </w:hyperlink>
+      <w:r>
+        <w:t xml:space="preserve">) shows that those terms</w:t>
+      </w:r>
+      <w:r>
+        <w:t xml:space="preserve"> </w:t>
+      </w:r>
+      <w:r>
+        <w:t xml:space="preserve">add up to</w:t>
+      </w:r>
+      <w:r>
+        <w:t xml:space="preserve"> </w:t>
+      </w:r>
+      <m:oMath>
+        <m:r>
+          <m:t>μ</m:t>
+        </m:r>
+      </m:oMath>
+      <w:r>
+        <w:t xml:space="preserve"> </w:t>
+      </w:r>
+      <w:r>
+        <w:t xml:space="preserve">of the union.</w:t>
+      </w:r>
+      <w:r>
+        <w:t xml:space="preserve"> </w:t>
+      </w:r>
+      <w:r>
+        <w:t xml:space="preserve">So</w:t>
+      </w:r>
+      <w:r>
+        <w:t xml:space="preserve"> </w:t>
+      </w:r>
+      <m:oMath>
+        <m:r>
+          <m:t>μ</m:t>
+        </m:r>
+      </m:oMath>
+      <w:r>
+        <w:t xml:space="preserve"> </w:t>
+      </w:r>
+      <w:r>
+        <w:t xml:space="preserve">is countably additive.</w:t>
+      </w:r>
+    </w:p>
+    <w:bookmarkEnd w:id="25"/>
+    <w:bookmarkStart w:id="26" w:name="def-probability"/>
+    <w:p>
+      <w:pPr>
+        <w:pStyle w:val="BodyText"/>
+      </w:pPr>
+      <w:r>
+        <w:rPr>
+          <w:b/>
+          <w:bCs/>
+        </w:rPr>
+        <w:t xml:space="preserve">Definition 8 (Probability measure)</w:t>
       </w:r>
       <w:r>
         <w:t xml:space="preserve"> </w:t>
@@ -1247,8 +4395,56 @@
           <w:numId w:val="1001"/>
         </w:numPr>
       </w:pPr>
-      <w:r>
-        <w:t xml:space="preserve">For countably many mutually disjoint events</w:t>
+      <m:oMath>
+        <m:r>
+          <m:rPr>
+            <m:sty m:val="p"/>
+          </m:rPr>
+          <m:t>Pr</m:t>
+        </m:r>
+      </m:oMath>
+      <w:r>
+        <w:t xml:space="preserve"> </w:t>
+      </w:r>
+      <w:r>
+        <w:t xml:space="preserve">is</w:t>
+      </w:r>
+      <w:r>
+        <w:t xml:space="preserve"> </w:t>
+      </w:r>
+      <w:hyperlink w:anchor="def-countable-additivity">
+        <w:r>
+          <w:rPr>
+            <w:rStyle w:val="Hyperlink"/>
+          </w:rPr>
+          <w:t xml:space="preserve">countably additive</w:t>
+        </w:r>
+      </w:hyperlink>
+      <w:r>
+        <w:t xml:space="preserve">:</w:t>
+      </w:r>
+      <w:r>
+        <w:t xml:space="preserve"> </w:t>
+      </w:r>
+      <w:r>
+        <w:t xml:space="preserve">for any</w:t>
+      </w:r>
+      <w:r>
+        <w:t xml:space="preserve"> </w:t>
+      </w:r>
+      <w:hyperlink w:anchor="def-mutually-exclusive">
+        <w:r>
+          <w:rPr>
+            <w:rStyle w:val="Hyperlink"/>
+          </w:rPr>
+          <w:t xml:space="preserve">mutually exclusive</w:t>
+        </w:r>
+      </w:hyperlink>
+      <w:r>
+        <w:t xml:space="preserve"> </w:t>
+      </w:r>
+      <w:r>
+        <w:t xml:space="preserve">events</w:t>
       </w:r>
       <w:r>
         <w:t xml:space="preserve"> </w:t>
@@ -1298,105 +4494,7 @@
         </m:r>
       </m:oMath>
       <w:r>
-        <w:t xml:space="preserve"> </w:t>
-      </w:r>
-      <w:r>
-        <w:t xml:space="preserve">(where</w:t>
-      </w:r>
-      <w:r>
-        <w:t xml:space="preserve"> </w:t>
-      </w:r>
-      <m:oMath>
-        <m:sSub>
-          <m:e>
-            <m:r>
-              <m:t>A</m:t>
-            </m:r>
-          </m:e>
-          <m:sub>
-            <m:r>
-              <m:t>i</m:t>
-            </m:r>
-          </m:sub>
-        </m:sSub>
-        <m:r>
-          <m:rPr>
-            <m:sty m:val="p"/>
-          </m:rPr>
-          <m:t>∩</m:t>
-        </m:r>
-        <m:sSub>
-          <m:e>
-            <m:r>
-              <m:t>A</m:t>
-            </m:r>
-          </m:e>
-          <m:sub>
-            <m:r>
-              <m:t>j</m:t>
-            </m:r>
-          </m:sub>
-        </m:sSub>
-        <m:r>
-          <m:rPr>
-            <m:sty m:val="p"/>
-          </m:rPr>
-          <m:t>=</m:t>
-        </m:r>
-        <m:r>
-          <m:rPr>
-            <m:sty m:val="p"/>
-          </m:rPr>
-          <m:t>∅</m:t>
-        </m:r>
-      </m:oMath>
-      <w:r>
-        <w:t xml:space="preserve"> </w:t>
-      </w:r>
-      <w:r>
-        <w:t xml:space="preserve">for all</w:t>
-      </w:r>
-      <w:r>
-        <w:t xml:space="preserve"> </w:t>
-      </w:r>
-      <m:oMath>
-        <m:r>
-          <m:t>i</m:t>
-        </m:r>
-        <m:r>
-          <m:rPr>
-            <m:sty m:val="p"/>
-          </m:rPr>
-          <m:t>≠</m:t>
-        </m:r>
-        <m:r>
-          <m:t>j</m:t>
-        </m:r>
-      </m:oMath>
-      <w:r>
-        <w:t xml:space="preserve">),</w:t>
-      </w:r>
-      <w:r>
-        <w:t xml:space="preserve"> </w:t>
-      </w:r>
-      <w:r>
-        <w:t xml:space="preserve">the probability of their union is the sum of their probabilities</w:t>
-      </w:r>
-      <w:r>
-        <w:t xml:space="preserve"> </w:t>
-      </w:r>
-      <w:r>
-        <w:t xml:space="preserve">(</w:t>
-      </w:r>
-      <w:r>
-        <w:rPr>
-          <w:i/>
-          <w:iCs/>
-        </w:rPr>
-        <w:t xml:space="preserve">countable additivity</w:t>
-      </w:r>
-      <w:r>
-        <w:t xml:space="preserve">):</w:t>
+        <w:t xml:space="preserve">,</w:t>
       </w:r>
     </w:p>
     <w:p>
@@ -1546,34 +4644,166 @@
         </m:oMath>
       </m:oMathPara>
     </w:p>
-    <w:bookmarkEnd w:id="17"/>
+    <w:bookmarkEnd w:id="26"/>
     <w:p>
       <w:pPr>
         <w:pStyle w:val="FirstParagraph"/>
       </w:pPr>
       <w:r>
-        <w:t xml:space="preserve">Property 3 (</w:t>
-      </w:r>
-      <w:r>
-        <w:rPr>
-          <w:i/>
-          <w:iCs/>
-        </w:rPr>
-        <w:t xml:space="preserve">countable additivity</w:t>
-      </w:r>
-      <w:r>
-        <w:t xml:space="preserve">) is stronger than</w:t>
-      </w:r>
-      <w:r>
-        <w:t xml:space="preserve"> </w:t>
-      </w:r>
-      <w:r>
-        <w:rPr>
-          <w:i/>
-          <w:iCs/>
-        </w:rPr>
-        <w:t xml:space="preserve">finite additivity</w:t>
-      </w:r>
+        <w:t xml:space="preserve">Property 3 implies that</w:t>
+      </w:r>
+      <w:r>
+        <w:t xml:space="preserve"> </w:t>
+      </w:r>
+      <m:oMath>
+        <m:r>
+          <m:rPr>
+            <m:sty m:val="p"/>
+          </m:rPr>
+          <m:t>Pr</m:t>
+        </m:r>
+      </m:oMath>
+      <w:r>
+        <w:t xml:space="preserve"> </w:t>
+      </w:r>
+      <w:r>
+        <w:t xml:space="preserve">is also</w:t>
+      </w:r>
+      <w:r>
+        <w:t xml:space="preserve"> </w:t>
+      </w:r>
+      <w:hyperlink w:anchor="def-finite-additivity">
+        <w:r>
+          <w:rPr>
+            <w:rStyle w:val="Hyperlink"/>
+          </w:rPr>
+          <w:t xml:space="preserve">finitely additive</w:t>
+        </w:r>
+      </w:hyperlink>
+      <w:r>
+        <w:t xml:space="preserve">.</w:t>
+      </w:r>
+      <w:r>
+        <w:t xml:space="preserve"> </w:t>
+      </w:r>
+      <w:r>
+        <w:t xml:space="preserve">Requiring countable additivity, not just finite additivity,</w:t>
+      </w:r>
+      <w:r>
+        <w:t xml:space="preserve"> </w:t>
+      </w:r>
+      <w:r>
+        <w:t xml:space="preserve">enables results such as</w:t>
+      </w:r>
+      <w:r>
+        <w:t xml:space="preserve"> </w:t>
+      </w:r>
+      <w:r>
+        <w:t xml:space="preserve">the continuity of probability</w:t>
+      </w:r>
+      <w:r>
+        <w:t xml:space="preserve"> </w:t>
+      </w:r>
+      <w:r>
+        <w:t xml:space="preserve">(if</w:t>
+      </w:r>
+      <w:r>
+        <w:t xml:space="preserve"> </w:t>
+      </w:r>
+      <m:oMath>
+        <m:sSub>
+          <m:e>
+            <m:r>
+              <m:t>A</m:t>
+            </m:r>
+          </m:e>
+          <m:sub>
+            <m:r>
+              <m:t>1</m:t>
+            </m:r>
+          </m:sub>
+        </m:sSub>
+        <m:r>
+          <m:rPr>
+            <m:sty m:val="p"/>
+          </m:rPr>
+          <m:t>⊇</m:t>
+        </m:r>
+        <m:sSub>
+          <m:e>
+            <m:r>
+              <m:t>A</m:t>
+            </m:r>
+          </m:e>
+          <m:sub>
+            <m:r>
+              <m:t>2</m:t>
+            </m:r>
+          </m:sub>
+        </m:sSub>
+        <m:r>
+          <m:rPr>
+            <m:sty m:val="p"/>
+          </m:rPr>
+          <m:t>⊇</m:t>
+        </m:r>
+        <m:r>
+          <m:rPr>
+            <m:sty m:val="p"/>
+          </m:rPr>
+          <m:t>⋯</m:t>
+        </m:r>
+      </m:oMath>
+      <w:r>
+        <w:t xml:space="preserve"> </w:t>
+      </w:r>
+      <w:r>
+        <w:t xml:space="preserve">with</w:t>
+      </w:r>
+      <w:r>
+        <w:t xml:space="preserve"> </w:t>
+      </w:r>
+      <m:oMath>
+        <m:sSub>
+          <m:e>
+            <m:r>
+              <m:rPr>
+                <m:sty m:val="p"/>
+              </m:rPr>
+              <m:t>⋂</m:t>
+            </m:r>
+          </m:e>
+          <m:sub>
+            <m:r>
+              <m:t>i</m:t>
+            </m:r>
+          </m:sub>
+        </m:sSub>
+        <m:sSub>
+          <m:e>
+            <m:r>
+              <m:t>A</m:t>
+            </m:r>
+          </m:e>
+          <m:sub>
+            <m:r>
+              <m:t>i</m:t>
+            </m:r>
+          </m:sub>
+        </m:sSub>
+        <m:r>
+          <m:rPr>
+            <m:sty m:val="p"/>
+          </m:rPr>
+          <m:t>=</m:t>
+        </m:r>
+        <m:r>
+          <m:rPr>
+            <m:sty m:val="p"/>
+          </m:rPr>
+          <m:t>∅</m:t>
+        </m:r>
+      </m:oMath>
       <w:r>
         <w:t xml:space="preserve">,</w:t>
       </w:r>
@@ -1581,595 +4811,90 @@
         <w:t xml:space="preserve"> </w:t>
       </w:r>
       <w:r>
-        <w:t xml:space="preserve">which only requires</w:t>
+        <w:t xml:space="preserve">then</w:t>
+      </w:r>
+      <w:r>
+        <w:t xml:space="preserve"> </w:t>
+      </w:r>
+      <m:oMath>
+        <m:r>
+          <m:rPr>
+            <m:sty m:val="p"/>
+          </m:rPr>
+          <m:t>Pr</m:t>
+        </m:r>
+        <m:r>
+          <m:rPr>
+            <m:sty m:val="p"/>
+          </m:rPr>
+          <m:t>(</m:t>
+        </m:r>
+        <m:sSub>
+          <m:e>
+            <m:r>
+              <m:t>A</m:t>
+            </m:r>
+          </m:e>
+          <m:sub>
+            <m:r>
+              <m:t>i</m:t>
+            </m:r>
+          </m:sub>
+        </m:sSub>
+        <m:r>
+          <m:rPr>
+            <m:sty m:val="p"/>
+          </m:rPr>
+          <m:t>)</m:t>
+        </m:r>
+        <m:r>
+          <m:rPr>
+            <m:sty m:val="p"/>
+          </m:rPr>
+          <m:t>→</m:t>
+        </m:r>
+        <m:r>
+          <m:t>0</m:t>
+        </m:r>
+      </m:oMath>
+      <w:r>
+        <w:t xml:space="preserve">),</w:t>
+      </w:r>
+      <w:r>
+        <w:t xml:space="preserve"> </w:t>
+      </w:r>
+      <w:r>
+        <w:t xml:space="preserve">and it is what makes sums over countably infinite</w:t>
+      </w:r>
+      <w:r>
+        <w:t xml:space="preserve"> </w:t>
+      </w:r>
+      <w:hyperlink w:anchor="def-partition">
+        <w:r>
+          <w:rPr>
+            <w:rStyle w:val="Hyperlink"/>
+          </w:rPr>
+          <w:t xml:space="preserve">partitions</w:t>
+        </w:r>
+      </w:hyperlink>
+      <w:r>
+        <w:t xml:space="preserve"> </w:t>
+      </w:r>
+      <w:r>
+        <w:t xml:space="preserve">valid.</w:t>
       </w:r>
     </w:p>
+    <w:bookmarkStart w:id="27" w:name="exm-probability"/>
     <w:p>
       <w:pPr>
         <w:pStyle w:val="BodyText"/>
       </w:pPr>
-      <m:oMathPara>
-        <m:oMathParaPr>
-          <m:jc m:val="center"/>
-        </m:oMathParaPr>
-        <m:oMath>
-          <m:r>
-            <m:rPr>
-              <m:sty m:val="p"/>
-            </m:rPr>
-            <m:t>Pr</m:t>
-          </m:r>
-          <m:r>
-            <m:rPr>
-              <m:sty m:val="p"/>
-            </m:rPr>
-            <m:t>(</m:t>
-          </m:r>
-          <m:sSub>
-            <m:e>
-              <m:r>
-                <m:t>A</m:t>
-              </m:r>
-            </m:e>
-            <m:sub>
-              <m:r>
-                <m:t>1</m:t>
-              </m:r>
-            </m:sub>
-          </m:sSub>
-          <m:r>
-            <m:rPr>
-              <m:sty m:val="p"/>
-            </m:rPr>
-            <m:t>∪</m:t>
-          </m:r>
-          <m:r>
-            <m:rPr>
-              <m:sty m:val="p"/>
-            </m:rPr>
-            <m:t>⋯</m:t>
-          </m:r>
-          <m:r>
-            <m:rPr>
-              <m:sty m:val="p"/>
-            </m:rPr>
-            <m:t>∪</m:t>
-          </m:r>
-          <m:sSub>
-            <m:e>
-              <m:r>
-                <m:t>A</m:t>
-              </m:r>
-            </m:e>
-            <m:sub>
-              <m:r>
-                <m:t>n</m:t>
-              </m:r>
-            </m:sub>
-          </m:sSub>
-          <m:r>
-            <m:rPr>
-              <m:sty m:val="p"/>
-            </m:rPr>
-            <m:t>)</m:t>
-          </m:r>
-          <m:r>
-            <m:rPr>
-              <m:sty m:val="p"/>
-            </m:rPr>
-            <m:t>=</m:t>
-          </m:r>
-          <m:nary>
-            <m:naryPr>
-              <m:chr m:val="∑"/>
-              <m:limLoc m:val="undOvr"/>
-              <m:subHide m:val="off"/>
-              <m:supHide m:val="off"/>
-            </m:naryPr>
-            <m:sub>
-              <m:r>
-                <m:t>i</m:t>
-              </m:r>
-              <m:r>
-                <m:rPr>
-                  <m:sty m:val="p"/>
-                </m:rPr>
-                <m:t>=</m:t>
-              </m:r>
-              <m:r>
-                <m:t>1</m:t>
-              </m:r>
-            </m:sub>
-            <m:sup>
-              <m:r>
-                <m:t>n</m:t>
-              </m:r>
-            </m:sup>
-            <m:e>
-              <m:r>
-                <m:rPr>
-                  <m:sty m:val="p"/>
-                </m:rPr>
-                <m:t>Pr</m:t>
-              </m:r>
-            </m:e>
-          </m:nary>
-          <m:r>
-            <m:rPr>
-              <m:sty m:val="p"/>
-            </m:rPr>
-            <m:t>(</m:t>
-          </m:r>
-          <m:sSub>
-            <m:e>
-              <m:r>
-                <m:t>A</m:t>
-              </m:r>
-            </m:e>
-            <m:sub>
-              <m:r>
-                <m:t>i</m:t>
-              </m:r>
-            </m:sub>
-          </m:sSub>
-          <m:r>
-            <m:rPr>
-              <m:sty m:val="p"/>
-            </m:rPr>
-            <m:t>)</m:t>
-          </m:r>
-        </m:oMath>
-      </m:oMathPara>
-    </w:p>
-    <w:p>
-      <w:pPr>
-        <w:pStyle w:val="FirstParagraph"/>
-      </w:pPr>
-      <w:r>
-        <w:t xml:space="preserve">for every finite collection of mutually disjoint events.</w:t>
-      </w:r>
-      <w:r>
-        <w:t xml:space="preserve"> </w:t>
-      </w:r>
-      <w:r>
-        <w:t xml:space="preserve">Countable additivity implies finite additivity</w:t>
-      </w:r>
-      <w:r>
-        <w:t xml:space="preserve"> </w:t>
-      </w:r>
-      <w:r>
-        <w:t xml:space="preserve">(set</w:t>
-      </w:r>
-      <w:r>
-        <w:t xml:space="preserve"> </w:t>
-      </w:r>
-      <m:oMath>
-        <m:sSub>
-          <m:e>
-            <m:r>
-              <m:t>A</m:t>
-            </m:r>
-          </m:e>
-          <m:sub>
-            <m:r>
-              <m:t>n</m:t>
-            </m:r>
-            <m:r>
-              <m:rPr>
-                <m:sty m:val="p"/>
-              </m:rPr>
-              <m:t>+</m:t>
-            </m:r>
-            <m:r>
-              <m:t>1</m:t>
-            </m:r>
-          </m:sub>
-        </m:sSub>
-        <m:r>
-          <m:rPr>
-            <m:sty m:val="p"/>
-          </m:rPr>
-          <m:t>=</m:t>
-        </m:r>
-        <m:sSub>
-          <m:e>
-            <m:r>
-              <m:t>A</m:t>
-            </m:r>
-          </m:e>
-          <m:sub>
-            <m:r>
-              <m:t>n</m:t>
-            </m:r>
-            <m:r>
-              <m:rPr>
-                <m:sty m:val="p"/>
-              </m:rPr>
-              <m:t>+</m:t>
-            </m:r>
-            <m:r>
-              <m:t>2</m:t>
-            </m:r>
-          </m:sub>
-        </m:sSub>
-        <m:r>
-          <m:rPr>
-            <m:sty m:val="p"/>
-          </m:rPr>
-          <m:t>=</m:t>
-        </m:r>
-        <m:r>
-          <m:rPr>
-            <m:sty m:val="p"/>
-          </m:rPr>
-          <m:t>⋯</m:t>
-        </m:r>
-        <m:r>
-          <m:rPr>
-            <m:sty m:val="p"/>
-          </m:rPr>
-          <m:t>=</m:t>
-        </m:r>
-        <m:r>
-          <m:rPr>
-            <m:sty m:val="p"/>
-          </m:rPr>
-          <m:t>∅</m:t>
-        </m:r>
-      </m:oMath>
-      <w:r>
-        <w:t xml:space="preserve"> </w:t>
-      </w:r>
-      <w:r>
-        <w:t xml:space="preserve">in property 3,</w:t>
-      </w:r>
-      <w:r>
-        <w:t xml:space="preserve"> </w:t>
-      </w:r>
-      <w:r>
-        <w:t xml:space="preserve">using</w:t>
-      </w:r>
-      <w:r>
-        <w:t xml:space="preserve"> </w:t>
-      </w:r>
-      <m:oMath>
-        <m:r>
-          <m:rPr>
-            <m:sty m:val="p"/>
-          </m:rPr>
-          <m:t>Pr</m:t>
-        </m:r>
-        <m:r>
-          <m:rPr>
-            <m:sty m:val="p"/>
-          </m:rPr>
-          <m:t>(</m:t>
-        </m:r>
-        <m:r>
-          <m:rPr>
-            <m:sty m:val="p"/>
-          </m:rPr>
-          <m:t>∅</m:t>
-        </m:r>
-        <m:r>
-          <m:rPr>
-            <m:sty m:val="p"/>
-          </m:rPr>
-          <m:t>)</m:t>
-        </m:r>
-        <m:r>
-          <m:rPr>
-            <m:sty m:val="p"/>
-          </m:rPr>
-          <m:t>=</m:t>
-        </m:r>
-        <m:r>
-          <m:t>0</m:t>
-        </m:r>
-      </m:oMath>
-      <w:r>
-        <w:t xml:space="preserve">,</w:t>
-      </w:r>
-      <w:r>
-        <w:t xml:space="preserve"> </w:t>
-      </w:r>
-      <w:r>
-        <w:t xml:space="preserve">which itself follows from property 3 applied to</w:t>
-      </w:r>
-      <w:r>
-        <w:t xml:space="preserve"> </w:t>
-      </w:r>
-      <m:oMath>
-        <m:r>
-          <m:rPr>
-            <m:sty m:val="p"/>
-          </m:rPr>
-          <m:t>Ω</m:t>
-        </m:r>
-        <m:r>
-          <m:rPr>
-            <m:sty m:val="p"/>
-          </m:rPr>
-          <m:t>,</m:t>
-        </m:r>
-        <m:r>
-          <m:rPr>
-            <m:sty m:val="p"/>
-          </m:rPr>
-          <m:t>∅</m:t>
-        </m:r>
-        <m:r>
-          <m:rPr>
-            <m:sty m:val="p"/>
-          </m:rPr>
-          <m:t>,</m:t>
-        </m:r>
-        <m:r>
-          <m:rPr>
-            <m:sty m:val="p"/>
-          </m:rPr>
-          <m:t>∅</m:t>
-        </m:r>
-        <m:r>
-          <m:rPr>
-            <m:sty m:val="p"/>
-          </m:rPr>
-          <m:t>,</m:t>
-        </m:r>
-        <m:r>
-          <m:rPr>
-            <m:sty m:val="p"/>
-          </m:rPr>
-          <m:t>…</m:t>
-        </m:r>
-      </m:oMath>
-      <w:r>
-        <w:t xml:space="preserve">),</w:t>
-      </w:r>
-      <w:r>
-        <w:t xml:space="preserve"> </w:t>
-      </w:r>
-      <w:r>
-        <w:t xml:space="preserve">but not vice versa:</w:t>
-      </w:r>
-      <w:r>
-        <w:t xml:space="preserve"> </w:t>
-      </w:r>
-      <w:r>
-        <w:t xml:space="preserve">there exist set functions that satisfy finite additivity</w:t>
-      </w:r>
-      <w:r>
-        <w:t xml:space="preserve"> </w:t>
-      </w:r>
-      <w:r>
-        <w:t xml:space="preserve">but fail countable additivity</w:t>
-      </w:r>
-      <w:r>
-        <w:t xml:space="preserve"> </w:t>
-      </w:r>
-      <w:r>
-        <w:t xml:space="preserve">(see</w:t>
-      </w:r>
-      <w:r>
-        <w:t xml:space="preserve"> </w:t>
-      </w:r>
-      <w:hyperlink r:id="rId18">
-        <w:r>
-          <w:rPr>
-            <w:rStyle w:val="Hyperlink"/>
-          </w:rPr>
-          <w:t xml:space="preserve">Wikipedia: Sigma-additive set function — An additive function which is not</w:t>
-        </w:r>
-        <w:r>
-          <w:rPr>
-            <w:rStyle w:val="Hyperlink"/>
-          </w:rPr>
-          <w:t xml:space="preserve"> </w:t>
-        </w:r>
-        <m:oMath>
-          <m:r>
-            <m:t>σ</m:t>
-          </m:r>
-        </m:oMath>
-        <w:r>
-          <w:rPr>
-            <w:rStyle w:val="Hyperlink"/>
-          </w:rPr>
-          <w:t xml:space="preserve">-additive</w:t>
-        </w:r>
-      </w:hyperlink>
-      <w:r>
-        <w:t xml:space="preserve">).</w:t>
-      </w:r>
-      <w:r>
-        <w:t xml:space="preserve"> </w:t>
-      </w:r>
-      <w:r>
-        <w:t xml:space="preserve">Requiring countable additivity enables results such as</w:t>
-      </w:r>
-      <w:r>
-        <w:t xml:space="preserve"> </w:t>
-      </w:r>
-      <w:r>
-        <w:t xml:space="preserve">the continuity of probability</w:t>
-      </w:r>
-      <w:r>
-        <w:t xml:space="preserve"> </w:t>
-      </w:r>
-      <w:r>
-        <w:t xml:space="preserve">(if</w:t>
-      </w:r>
-      <w:r>
-        <w:t xml:space="preserve"> </w:t>
-      </w:r>
-      <m:oMath>
-        <m:sSub>
-          <m:e>
-            <m:r>
-              <m:t>A</m:t>
-            </m:r>
-          </m:e>
-          <m:sub>
-            <m:r>
-              <m:t>1</m:t>
-            </m:r>
-          </m:sub>
-        </m:sSub>
-        <m:r>
-          <m:rPr>
-            <m:sty m:val="p"/>
-          </m:rPr>
-          <m:t>⊇</m:t>
-        </m:r>
-        <m:sSub>
-          <m:e>
-            <m:r>
-              <m:t>A</m:t>
-            </m:r>
-          </m:e>
-          <m:sub>
-            <m:r>
-              <m:t>2</m:t>
-            </m:r>
-          </m:sub>
-        </m:sSub>
-        <m:r>
-          <m:rPr>
-            <m:sty m:val="p"/>
-          </m:rPr>
-          <m:t>⊇</m:t>
-        </m:r>
-        <m:r>
-          <m:rPr>
-            <m:sty m:val="p"/>
-          </m:rPr>
-          <m:t>⋯</m:t>
-        </m:r>
-      </m:oMath>
-      <w:r>
-        <w:t xml:space="preserve"> </w:t>
-      </w:r>
-      <w:r>
-        <w:t xml:space="preserve">with</w:t>
-      </w:r>
-      <w:r>
-        <w:t xml:space="preserve"> </w:t>
-      </w:r>
-      <m:oMath>
-        <m:sSub>
-          <m:e>
-            <m:r>
-              <m:rPr>
-                <m:sty m:val="p"/>
-              </m:rPr>
-              <m:t>⋂</m:t>
-            </m:r>
-          </m:e>
-          <m:sub>
-            <m:r>
-              <m:t>i</m:t>
-            </m:r>
-          </m:sub>
-        </m:sSub>
-        <m:sSub>
-          <m:e>
-            <m:r>
-              <m:t>A</m:t>
-            </m:r>
-          </m:e>
-          <m:sub>
-            <m:r>
-              <m:t>i</m:t>
-            </m:r>
-          </m:sub>
-        </m:sSub>
-        <m:r>
-          <m:rPr>
-            <m:sty m:val="p"/>
-          </m:rPr>
-          <m:t>=</m:t>
-        </m:r>
-        <m:r>
-          <m:rPr>
-            <m:sty m:val="p"/>
-          </m:rPr>
-          <m:t>∅</m:t>
-        </m:r>
-      </m:oMath>
-      <w:r>
-        <w:t xml:space="preserve">,</w:t>
-      </w:r>
-      <w:r>
-        <w:t xml:space="preserve"> </w:t>
-      </w:r>
-      <w:r>
-        <w:t xml:space="preserve">then</w:t>
-      </w:r>
-      <w:r>
-        <w:t xml:space="preserve"> </w:t>
-      </w:r>
-      <m:oMath>
-        <m:r>
-          <m:rPr>
-            <m:sty m:val="p"/>
-          </m:rPr>
-          <m:t>Pr</m:t>
-        </m:r>
-        <m:r>
-          <m:rPr>
-            <m:sty m:val="p"/>
-          </m:rPr>
-          <m:t>(</m:t>
-        </m:r>
-        <m:sSub>
-          <m:e>
-            <m:r>
-              <m:t>A</m:t>
-            </m:r>
-          </m:e>
-          <m:sub>
-            <m:r>
-              <m:t>i</m:t>
-            </m:r>
-          </m:sub>
-        </m:sSub>
-        <m:r>
-          <m:rPr>
-            <m:sty m:val="p"/>
-          </m:rPr>
-          <m:t>)</m:t>
-        </m:r>
-        <m:r>
-          <m:rPr>
-            <m:sty m:val="p"/>
-          </m:rPr>
-          <m:t>→</m:t>
-        </m:r>
-        <m:r>
-          <m:t>0</m:t>
-        </m:r>
-      </m:oMath>
-      <w:r>
-        <w:t xml:space="preserve">),</w:t>
-      </w:r>
-      <w:r>
-        <w:t xml:space="preserve"> </w:t>
-      </w:r>
-      <w:r>
-        <w:t xml:space="preserve">and it is what makes sums over countably infinite partitions valid.</w:t>
-      </w:r>
-    </w:p>
-    <w:bookmarkStart w:id="19" w:name="exm-probability"/>
-    <w:p>
-      <w:pPr>
-        <w:pStyle w:val="BodyText"/>
-      </w:pPr>
       <w:r>
         <w:rPr>
           <w:b/>
           <w:bCs/>
         </w:rPr>
-        <w:t xml:space="preserve">Example 4 (Probability measure for a fair die)</w:t>
+        <w:t xml:space="preserve">Example 8 (Probability measure for a fair die)</w:t>
       </w:r>
       <w:r>
         <w:t xml:space="preserve"> </w:t>
@@ -2389,13 +5114,64 @@
         <w:t xml:space="preserve"> </w:t>
       </w:r>
       <w:r>
-        <w:t xml:space="preserve">and is additive over disjoint events,</w:t>
-      </w:r>
-      <w:r>
-        <w:t xml:space="preserve"> </w:t>
-      </w:r>
-      <w:r>
-        <w:t xml:space="preserve">because the sizes of disjoint sets add.</w:t>
+        <w:t xml:space="preserve">and is</w:t>
+      </w:r>
+      <w:r>
+        <w:t xml:space="preserve"> </w:t>
+      </w:r>
+      <w:hyperlink w:anchor="def-countable-additivity">
+        <w:r>
+          <w:rPr>
+            <w:rStyle w:val="Hyperlink"/>
+          </w:rPr>
+          <w:t xml:space="preserve">countably additive</w:t>
+        </w:r>
+      </w:hyperlink>
+      <w:r>
+        <w:t xml:space="preserve">,</w:t>
+      </w:r>
+      <w:r>
+        <w:t xml:space="preserve"> </w:t>
+      </w:r>
+      <w:r>
+        <w:t xml:space="preserve">because it is</w:t>
+      </w:r>
+      <w:r>
+        <w:t xml:space="preserve"> </w:t>
+      </w:r>
+      <m:oMath>
+        <m:r>
+          <m:t>1</m:t>
+        </m:r>
+        <m:r>
+          <m:rPr>
+            <m:sty m:val="p"/>
+          </m:rPr>
+          <m:t>/</m:t>
+        </m:r>
+        <m:r>
+          <m:t>6</m:t>
+        </m:r>
+      </m:oMath>
+      <w:r>
+        <w:t xml:space="preserve"> </w:t>
+      </w:r>
+      <w:r>
+        <w:t xml:space="preserve">times the counting function of</w:t>
+      </w:r>
+      <w:r>
+        <w:t xml:space="preserve"> </w:t>
+      </w:r>
+      <w:hyperlink w:anchor="exm-countable-additivity">
+        <w:r>
+          <w:rPr>
+            <w:rStyle w:val="Hyperlink"/>
+          </w:rPr>
+          <w:t xml:space="preserve">Example 7</w:t>
+        </w:r>
+      </w:hyperlink>
+      <w:r>
+        <w:t xml:space="preserve">.</w:t>
       </w:r>
       <w:r>
         <w:t xml:space="preserve"> </w:t>
@@ -2532,8 +5308,8 @@
         <w:t xml:space="preserve">.</w:t>
       </w:r>
     </w:p>
-    <w:bookmarkEnd w:id="19"/>
-    <w:bookmarkStart w:id="20" w:name="thm-prob-subset"/>
+    <w:bookmarkEnd w:id="27"/>
+    <w:bookmarkStart w:id="28" w:name="thm-prob-subset"/>
     <w:p>
       <w:pPr>
         <w:pStyle w:val="BodyText"/>
@@ -2665,7 +5441,7 @@
         <w:t xml:space="preserve">.</w:t>
       </w:r>
     </w:p>
-    <w:bookmarkEnd w:id="20"/>
+    <w:bookmarkEnd w:id="28"/>
     <w:p>
       <w:pPr>
         <w:pStyle w:val="BodyText"/>
@@ -2829,7 +5605,7 @@
         <w:t xml:space="preserve">.</w:t>
       </w:r>
     </w:p>
-    <w:bookmarkStart w:id="21" w:name="thm-total-prob-1"/>
+    <w:bookmarkStart w:id="29" w:name="thm-total-prob-1"/>
     <w:p>
       <w:pPr>
         <w:pStyle w:val="BodyText"/>
@@ -2965,7 +5741,7 @@
         </m:oMath>
       </m:oMathPara>
     </w:p>
-    <w:bookmarkEnd w:id="21"/>
+    <w:bookmarkEnd w:id="29"/>
     <w:p>
       <w:pPr>
         <w:pStyle w:val="FirstParagraph"/>
@@ -3272,7 +6048,7 @@
         </m:oMath>
       </m:oMathPara>
     </w:p>
-    <w:bookmarkStart w:id="22" w:name="cor-p-neg0"/>
+    <w:bookmarkStart w:id="30" w:name="cor-p-neg0"/>
     <w:p>
       <w:pPr>
         <w:pStyle w:val="FirstParagraph"/>
@@ -3377,7 +6153,7 @@
         </m:oMath>
       </m:oMathPara>
     </w:p>
-    <w:bookmarkEnd w:id="22"/>
+    <w:bookmarkEnd w:id="30"/>
     <w:p>
       <w:pPr>
         <w:pStyle w:val="FirstParagraph"/>
@@ -3442,7 +6218,7 @@
         <w:t xml:space="preserve">.</w:t>
       </w:r>
     </w:p>
-    <w:bookmarkStart w:id="23" w:name="cor-p-neg"/>
+    <w:bookmarkStart w:id="31" w:name="cor-p-neg"/>
     <w:p>
       <w:pPr>
         <w:pStyle w:val="BodyText"/>
@@ -3602,7 +6378,7 @@
         </m:oMath>
       </m:oMathPara>
     </w:p>
-    <w:bookmarkEnd w:id="23"/>
+    <w:bookmarkEnd w:id="31"/>
     <w:p>
       <w:pPr>
         <w:pStyle w:val="FirstParagraph"/>
@@ -3786,7 +6562,7 @@
         </m:oMath>
       </m:oMathPara>
     </w:p>
-    <w:bookmarkStart w:id="24" w:name="exm-p-neg"/>
+    <w:bookmarkStart w:id="32" w:name="exm-p-neg"/>
     <w:p>
       <w:pPr>
         <w:pStyle w:val="FirstParagraph"/>
@@ -3796,7 +6572,7 @@
           <w:b/>
           <w:bCs/>
         </w:rPr>
-        <w:t xml:space="preserve">Example 5 (Probability of not rolling a six)</w:t>
+        <w:t xml:space="preserve">Example 9 (Probability of not rolling a six)</w:t>
       </w:r>
       <w:r>
         <w:t xml:space="preserve"> </w:t>
@@ -3916,9 +6692,9 @@
         <w:t xml:space="preserve">.</w:t>
       </w:r>
     </w:p>
-    <w:bookmarkEnd w:id="24"/>
-    <w:bookmarkEnd w:id="25"/>
-    <w:bookmarkStart w:id="33" w:name="conditional-probability"/>
+    <w:bookmarkEnd w:id="32"/>
+    <w:bookmarkEnd w:id="33"/>
+    <w:bookmarkStart w:id="41" w:name="conditional-probability"/>
     <w:p>
       <w:pPr>
         <w:pStyle w:val="Heading2"/>
@@ -3927,7 +6703,7 @@
         <w:t xml:space="preserve">2 Conditional probability</w:t>
       </w:r>
     </w:p>
-    <w:bookmarkStart w:id="26" w:name="def-conditional-prob"/>
+    <w:bookmarkStart w:id="34" w:name="def-conditional-prob"/>
     <w:p>
       <w:pPr>
         <w:pStyle w:val="FirstParagraph"/>
@@ -3937,7 +6713,7 @@
           <w:b/>
           <w:bCs/>
         </w:rPr>
-        <w:t xml:space="preserve">Definition 5 (Conditional probability)</w:t>
+        <w:t xml:space="preserve">Definition 9 (Conditional probability)</w:t>
       </w:r>
       <w:r>
         <w:t xml:space="preserve"> </w:t>
@@ -4224,8 +7000,8 @@
         </m:oMath>
       </m:oMathPara>
     </w:p>
-    <w:bookmarkEnd w:id="26"/>
-    <w:bookmarkStart w:id="27" w:name="exm-conditional-prob"/>
+    <w:bookmarkEnd w:id="34"/>
+    <w:bookmarkStart w:id="35" w:name="exm-conditional-prob"/>
     <w:p>
       <w:pPr>
         <w:pStyle w:val="FirstParagraph"/>
@@ -4235,7 +7011,7 @@
           <w:b/>
           <w:bCs/>
         </w:rPr>
-        <w:t xml:space="preserve">Example 6 (Rolling a six, given an even roll)</w:t>
+        <w:t xml:space="preserve">Example 10 (Rolling a six, given an even roll)</w:t>
       </w:r>
       <w:r>
         <w:t xml:space="preserve"> </w:t>
@@ -4248,7 +7024,7 @@
           <w:rPr>
             <w:rStyle w:val="Hyperlink"/>
           </w:rPr>
-          <w:t xml:space="preserve">Example 4</w:t>
+          <w:t xml:space="preserve">Example 8</w:t>
         </w:r>
       </w:hyperlink>
       <w:r>
@@ -4629,8 +7405,8 @@
         </m:oMath>
       </m:oMathPara>
     </w:p>
-    <w:bookmarkEnd w:id="27"/>
-    <w:bookmarkStart w:id="28" w:name="thm-law-conditional-prob"/>
+    <w:bookmarkEnd w:id="35"/>
+    <w:bookmarkStart w:id="36" w:name="thm-law-conditional-prob"/>
     <w:p>
       <w:pPr>
         <w:pStyle w:val="FirstParagraph"/>
@@ -4820,7 +7596,7 @@
         </m:oMath>
       </m:oMathPara>
     </w:p>
-    <w:bookmarkEnd w:id="28"/>
+    <w:bookmarkEnd w:id="36"/>
     <w:p>
       <w:pPr>
         <w:pStyle w:val="FirstParagraph"/>
@@ -4846,7 +7622,7 @@
           <w:rPr>
             <w:rStyle w:val="Hyperlink"/>
           </w:rPr>
-          <w:t xml:space="preserve">Definition 5</w:t>
+          <w:t xml:space="preserve">Definition 9</w:t>
         </w:r>
       </w:hyperlink>
       <w:r>
@@ -5120,7 +7896,7 @@
         </m:oMath>
       </m:oMathPara>
     </w:p>
-    <w:bookmarkStart w:id="29" w:name="exm-law-conditional-prob"/>
+    <w:bookmarkStart w:id="37" w:name="exm-law-conditional-prob"/>
     <w:p>
       <w:pPr>
         <w:pStyle w:val="FirstParagraph"/>
@@ -5130,7 +7906,7 @@
           <w:b/>
           <w:bCs/>
         </w:rPr>
-        <w:t xml:space="preserve">Example 7 (Applying the law of conditional probability)</w:t>
+        <w:t xml:space="preserve">Example 11 (Applying the law of conditional probability)</w:t>
       </w:r>
       <w:r>
         <w:t xml:space="preserve"> </w:t>
@@ -5452,8 +8228,8 @@
         </m:oMath>
       </m:oMathPara>
     </w:p>
-    <w:bookmarkEnd w:id="29"/>
-    <w:bookmarkStart w:id="30" w:name="thm-total-prob"/>
+    <w:bookmarkEnd w:id="37"/>
+    <w:bookmarkStart w:id="38" w:name="thm-total-prob"/>
     <w:p>
       <w:pPr>
         <w:pStyle w:val="FirstParagraph"/>
@@ -5522,13 +8298,24 @@
         <w:t xml:space="preserve"> </w:t>
       </w:r>
       <w:r>
-        <w:t xml:space="preserve">is a finite or countably infinite partition of the sample space</w:t>
-      </w:r>
-      <w:r>
-        <w:t xml:space="preserve"> </w:t>
-      </w:r>
-      <w:r>
-        <w:t xml:space="preserve">(mutually exclusive events whose union is the entire sample space),</w:t>
+        <w:t xml:space="preserve">is a</w:t>
+      </w:r>
+      <w:r>
+        <w:t xml:space="preserve"> </w:t>
+      </w:r>
+      <w:hyperlink w:anchor="def-partition">
+        <w:r>
+          <w:rPr>
+            <w:rStyle w:val="Hyperlink"/>
+          </w:rPr>
+          <w:t xml:space="preserve">partition</w:t>
+        </w:r>
+      </w:hyperlink>
+      <w:r>
+        <w:t xml:space="preserve"> </w:t>
+      </w:r>
+      <w:r>
+        <w:t xml:space="preserve">of the sample space,</w:t>
       </w:r>
       <w:r>
         <w:t xml:space="preserve"> </w:t>
@@ -5749,7 +8536,7 @@
         </m:oMath>
       </m:oMathPara>
     </w:p>
-    <w:bookmarkEnd w:id="30"/>
+    <w:bookmarkEnd w:id="38"/>
     <w:p>
       <w:pPr>
         <w:pStyle w:val="FirstParagraph"/>
@@ -5920,12 +8707,12 @@
       <w:r>
         <w:t xml:space="preserve">By countable additivity (</w:t>
       </w:r>
-      <w:hyperlink w:anchor="def-probability">
+      <w:hyperlink w:anchor="def-countable-additivity">
         <w:r>
           <w:rPr>
             <w:rStyle w:val="Hyperlink"/>
           </w:rPr>
-          <w:t xml:space="preserve">Definition 4</w:t>
+          <w:t xml:space="preserve">Definition 7</w:t>
         </w:r>
       </w:hyperlink>
       <w:r>
@@ -6245,7 +9032,7 @@
         </m:oMath>
       </m:oMathPara>
     </w:p>
-    <w:bookmarkStart w:id="31" w:name="thm-bayes"/>
+    <w:bookmarkStart w:id="39" w:name="thm-bayes"/>
     <w:p>
       <w:pPr>
         <w:pStyle w:val="FirstParagraph"/>
@@ -6506,7 +9293,7 @@
         </m:oMath>
       </m:oMathPara>
     </w:p>
-    <w:bookmarkEnd w:id="31"/>
+    <w:bookmarkEnd w:id="39"/>
     <w:p>
       <w:pPr>
         <w:pStyle w:val="FirstParagraph"/>
@@ -6532,7 +9319,7 @@
           <w:rPr>
             <w:rStyle w:val="Hyperlink"/>
           </w:rPr>
-          <w:t xml:space="preserve">Definition 5</w:t>
+          <w:t xml:space="preserve">Definition 9</w:t>
         </w:r>
       </w:hyperlink>
       <w:r>
@@ -6953,7 +9740,7 @@
         </m:oMath>
       </m:oMathPara>
     </w:p>
-    <w:bookmarkStart w:id="32" w:name="exm-bayes"/>
+    <w:bookmarkStart w:id="40" w:name="exm-bayes"/>
     <w:p>
       <w:pPr>
         <w:pStyle w:val="FirstParagraph"/>
@@ -6963,7 +9750,7 @@
           <w:b/>
           <w:bCs/>
         </w:rPr>
-        <w:t xml:space="preserve">Example 8 (Positive predictive value of a medical test)</w:t>
+        <w:t xml:space="preserve">Example 12 (Positive predictive value of a medical test)</w:t>
       </w:r>
       <w:r>
         <w:t xml:space="preserve"> </w:t>
@@ -7979,8 +10766,8 @@
         <w:t xml:space="preserve">because the disease prevalence is relatively low (7%).</w:t>
       </w:r>
     </w:p>
-    <w:bookmarkEnd w:id="32"/>
-    <w:bookmarkEnd w:id="33"/>
+    <w:bookmarkEnd w:id="40"/>
+    <w:bookmarkEnd w:id="41"/>
     <w:sectPr>
       <w:footnotePr>
         <w:numRestart w:val="eachSect"/>

</xml_diff>

<commit_message>
Deploying to gh-pages from @ Morrison-Lab/pds@b5b6de1e8a952a28e9971a71cd62990746a30e64 🚀
</commit_message>
<xml_diff>
--- a/probability-basics.docx
+++ b/probability-basics.docx
@@ -15,10 +15,10 @@
         <w:pStyle w:val="Date"/>
       </w:pPr>
       <w:r>
-        <w:t xml:space="preserve">Last modified: 2026-09-28 15:15:49 (PDT)</w:t>
+        <w:t xml:space="preserve">Last modified: 2026-09-28 15:22:34 (PDT)</w:t>
       </w:r>
     </w:p>
-    <w:bookmarkStart w:id="45" w:name="defining-probabilities"/>
+    <w:bookmarkStart w:id="47" w:name="defining-probabilities"/>
     <w:p>
       <w:pPr>
         <w:pStyle w:val="Heading2"/>
@@ -8978,7 +8978,824 @@
         <w:t xml:space="preserve"> </w:t>
       </w:r>
       <w:r>
-        <w:t xml:space="preserve">is a function that assigns a number</w:t>
+        <w:t xml:space="preserve">is a</w:t>
+      </w:r>
+      <w:r>
+        <w:t xml:space="preserve"> </w:t>
+      </w:r>
+      <w:hyperlink w:anchor="def-measure">
+        <w:r>
+          <w:rPr>
+            <w:rStyle w:val="Hyperlink"/>
+          </w:rPr>
+          <w:t xml:space="preserve">measure</w:t>
+        </w:r>
+      </w:hyperlink>
+      <w:r>
+        <w:t xml:space="preserve"> </w:t>
+      </w:r>
+      <w:r>
+        <w:t xml:space="preserve">on the</w:t>
+      </w:r>
+      <w:r>
+        <w:t xml:space="preserve"> </w:t>
+      </w:r>
+      <w:hyperlink w:anchor="def-event">
+        <w:r>
+          <w:rPr>
+            <w:rStyle w:val="Hyperlink"/>
+          </w:rPr>
+          <w:t xml:space="preserve">events</w:t>
+        </w:r>
+      </w:hyperlink>
+      <w:r>
+        <w:t xml:space="preserve"> </w:t>
+      </w:r>
+      <w:r>
+        <w:t xml:space="preserve">of</w:t>
+      </w:r>
+      <w:r>
+        <w:t xml:space="preserve"> </w:t>
+      </w:r>
+      <m:oMath>
+        <m:r>
+          <m:rPr>
+            <m:sty m:val="p"/>
+          </m:rPr>
+          <m:t>Ω</m:t>
+        </m:r>
+      </m:oMath>
+      <w:r>
+        <w:t xml:space="preserve"> </w:t>
+      </w:r>
+      <w:r>
+        <w:t xml:space="preserve">that gives the whole sample space probability 1:</w:t>
+      </w:r>
+    </w:p>
+    <w:p>
+      <w:pPr>
+        <w:pStyle w:val="BodyText"/>
+      </w:pPr>
+      <m:oMathPara>
+        <m:oMathParaPr>
+          <m:jc m:val="center"/>
+        </m:oMathParaPr>
+        <m:oMath>
+          <m:r>
+            <m:rPr>
+              <m:sty m:val="p"/>
+            </m:rPr>
+            <m:t>Pr</m:t>
+          </m:r>
+          <m:r>
+            <m:rPr>
+              <m:sty m:val="p"/>
+            </m:rPr>
+            <m:t>(</m:t>
+          </m:r>
+          <m:r>
+            <m:rPr>
+              <m:sty m:val="p"/>
+            </m:rPr>
+            <m:t>Ω</m:t>
+          </m:r>
+          <m:r>
+            <m:rPr>
+              <m:sty m:val="p"/>
+            </m:rPr>
+            <m:t>)</m:t>
+          </m:r>
+          <m:r>
+            <m:rPr>
+              <m:sty m:val="p"/>
+            </m:rPr>
+            <m:t>=</m:t>
+          </m:r>
+          <m:r>
+            <m:t>1</m:t>
+          </m:r>
+        </m:oMath>
+      </m:oMathPara>
+    </w:p>
+    <w:bookmarkEnd w:id="38"/>
+    <w:p>
+      <w:pPr>
+        <w:pStyle w:val="FirstParagraph"/>
+      </w:pPr>
+      <w:r>
+        <w:t xml:space="preserve">A probability measure is also</w:t>
+      </w:r>
+      <w:r>
+        <w:t xml:space="preserve"> </w:t>
+      </w:r>
+      <w:hyperlink w:anchor="def-finite-additivity">
+        <w:r>
+          <w:rPr>
+            <w:rStyle w:val="Hyperlink"/>
+          </w:rPr>
+          <w:t xml:space="preserve">finitely additive</w:t>
+        </w:r>
+      </w:hyperlink>
+      <w:r>
+        <w:t xml:space="preserve">,</w:t>
+      </w:r>
+      <w:r>
+        <w:t xml:space="preserve"> </w:t>
+      </w:r>
+      <w:r>
+        <w:t xml:space="preserve">by</w:t>
+      </w:r>
+      <w:r>
+        <w:t xml:space="preserve"> </w:t>
+      </w:r>
+      <w:hyperlink w:anchor="thm-countable-implies-finite">
+        <w:r>
+          <w:rPr>
+            <w:rStyle w:val="Hyperlink"/>
+          </w:rPr>
+          <w:t xml:space="preserve">Theorem 1</w:t>
+        </w:r>
+      </w:hyperlink>
+      <w:r>
+        <w:t xml:space="preserve">.</w:t>
+      </w:r>
+      <w:r>
+        <w:t xml:space="preserve"> </w:t>
+      </w:r>
+      <w:r>
+        <w:t xml:space="preserve">Requiring countable additivity, not just finite additivity,</w:t>
+      </w:r>
+      <w:r>
+        <w:t xml:space="preserve"> </w:t>
+      </w:r>
+      <w:r>
+        <w:t xml:space="preserve">enables results such as</w:t>
+      </w:r>
+      <w:r>
+        <w:t xml:space="preserve"> </w:t>
+      </w:r>
+      <w:r>
+        <w:t xml:space="preserve">the continuity of probability</w:t>
+      </w:r>
+      <w:r>
+        <w:t xml:space="preserve"> </w:t>
+      </w:r>
+      <w:r>
+        <w:t xml:space="preserve">(if</w:t>
+      </w:r>
+      <w:r>
+        <w:t xml:space="preserve"> </w:t>
+      </w:r>
+      <m:oMath>
+        <m:sSub>
+          <m:e>
+            <m:r>
+              <m:t>A</m:t>
+            </m:r>
+          </m:e>
+          <m:sub>
+            <m:r>
+              <m:t>1</m:t>
+            </m:r>
+          </m:sub>
+        </m:sSub>
+        <m:r>
+          <m:rPr>
+            <m:sty m:val="p"/>
+          </m:rPr>
+          <m:t>⊇</m:t>
+        </m:r>
+        <m:sSub>
+          <m:e>
+            <m:r>
+              <m:t>A</m:t>
+            </m:r>
+          </m:e>
+          <m:sub>
+            <m:r>
+              <m:t>2</m:t>
+            </m:r>
+          </m:sub>
+        </m:sSub>
+        <m:r>
+          <m:rPr>
+            <m:sty m:val="p"/>
+          </m:rPr>
+          <m:t>⊇</m:t>
+        </m:r>
+        <m:r>
+          <m:rPr>
+            <m:sty m:val="p"/>
+          </m:rPr>
+          <m:t>⋯</m:t>
+        </m:r>
+      </m:oMath>
+      <w:r>
+        <w:t xml:space="preserve"> </w:t>
+      </w:r>
+      <w:r>
+        <w:t xml:space="preserve">with</w:t>
+      </w:r>
+      <w:r>
+        <w:t xml:space="preserve"> </w:t>
+      </w:r>
+      <m:oMath>
+        <m:sSub>
+          <m:e>
+            <m:r>
+              <m:rPr>
+                <m:sty m:val="p"/>
+              </m:rPr>
+              <m:t>⋂</m:t>
+            </m:r>
+          </m:e>
+          <m:sub>
+            <m:r>
+              <m:t>i</m:t>
+            </m:r>
+          </m:sub>
+        </m:sSub>
+        <m:sSub>
+          <m:e>
+            <m:r>
+              <m:t>A</m:t>
+            </m:r>
+          </m:e>
+          <m:sub>
+            <m:r>
+              <m:t>i</m:t>
+            </m:r>
+          </m:sub>
+        </m:sSub>
+        <m:r>
+          <m:rPr>
+            <m:sty m:val="p"/>
+          </m:rPr>
+          <m:t>=</m:t>
+        </m:r>
+        <m:r>
+          <m:rPr>
+            <m:sty m:val="p"/>
+          </m:rPr>
+          <m:t>∅</m:t>
+        </m:r>
+      </m:oMath>
+      <w:r>
+        <w:t xml:space="preserve">,</w:t>
+      </w:r>
+      <w:r>
+        <w:t xml:space="preserve"> </w:t>
+      </w:r>
+      <w:r>
+        <w:t xml:space="preserve">then</w:t>
+      </w:r>
+      <w:r>
+        <w:t xml:space="preserve"> </w:t>
+      </w:r>
+      <m:oMath>
+        <m:r>
+          <m:rPr>
+            <m:sty m:val="p"/>
+          </m:rPr>
+          <m:t>Pr</m:t>
+        </m:r>
+        <m:r>
+          <m:rPr>
+            <m:sty m:val="p"/>
+          </m:rPr>
+          <m:t>(</m:t>
+        </m:r>
+        <m:sSub>
+          <m:e>
+            <m:r>
+              <m:t>A</m:t>
+            </m:r>
+          </m:e>
+          <m:sub>
+            <m:r>
+              <m:t>i</m:t>
+            </m:r>
+          </m:sub>
+        </m:sSub>
+        <m:r>
+          <m:rPr>
+            <m:sty m:val="p"/>
+          </m:rPr>
+          <m:t>)</m:t>
+        </m:r>
+        <m:r>
+          <m:rPr>
+            <m:sty m:val="p"/>
+          </m:rPr>
+          <m:t>→</m:t>
+        </m:r>
+        <m:r>
+          <m:t>0</m:t>
+        </m:r>
+      </m:oMath>
+      <w:r>
+        <w:t xml:space="preserve">),</w:t>
+      </w:r>
+      <w:r>
+        <w:t xml:space="preserve"> </w:t>
+      </w:r>
+      <w:r>
+        <w:t xml:space="preserve">and it is what makes sums over countably infinite</w:t>
+      </w:r>
+      <w:r>
+        <w:t xml:space="preserve"> </w:t>
+      </w:r>
+      <w:hyperlink w:anchor="def-partition">
+        <w:r>
+          <w:rPr>
+            <w:rStyle w:val="Hyperlink"/>
+          </w:rPr>
+          <w:t xml:space="preserve">partitions</w:t>
+        </w:r>
+      </w:hyperlink>
+      <w:r>
+        <w:t xml:space="preserve"> </w:t>
+      </w:r>
+      <w:r>
+        <w:t xml:space="preserve">valid.</w:t>
+      </w:r>
+    </w:p>
+    <w:bookmarkStart w:id="39" w:name="exm-probability"/>
+    <w:p>
+      <w:pPr>
+        <w:pStyle w:val="BodyText"/>
+      </w:pPr>
+      <w:r>
+        <w:rPr>
+          <w:b/>
+          <w:bCs/>
+        </w:rPr>
+        <w:t xml:space="preserve">Example 12 (Probability measure for a fair die)</w:t>
+      </w:r>
+      <w:r>
+        <w:t xml:space="preserve"> </w:t>
+      </w:r>
+      <w:r>
+        <w:t xml:space="preserve">For the die roll in</w:t>
+      </w:r>
+      <w:r>
+        <w:t xml:space="preserve"> </w:t>
+      </w:r>
+      <w:hyperlink w:anchor="exm-sample-space">
+        <w:r>
+          <w:rPr>
+            <w:rStyle w:val="Hyperlink"/>
+          </w:rPr>
+          <w:t xml:space="preserve">Example 1</w:t>
+        </w:r>
+      </w:hyperlink>
+      <w:r>
+        <w:t xml:space="preserve">,</w:t>
+      </w:r>
+      <w:r>
+        <w:t xml:space="preserve"> </w:t>
+      </w:r>
+      <w:r>
+        <w:t xml:space="preserve">define</w:t>
+      </w:r>
+      <w:r>
+        <w:t xml:space="preserve"> </w:t>
+      </w:r>
+      <m:oMath>
+        <m:r>
+          <m:rPr>
+            <m:sty m:val="p"/>
+          </m:rPr>
+          <m:t>Pr</m:t>
+        </m:r>
+        <m:r>
+          <m:rPr>
+            <m:sty m:val="p"/>
+          </m:rPr>
+          <m:t>(</m:t>
+        </m:r>
+        <m:r>
+          <m:t>A</m:t>
+        </m:r>
+        <m:r>
+          <m:rPr>
+            <m:sty m:val="p"/>
+          </m:rPr>
+          <m:t>)</m:t>
+        </m:r>
+        <m:limUpp>
+          <m:e>
+            <m:r>
+              <m:rPr>
+                <m:sty m:val="p"/>
+              </m:rPr>
+              <m:t>=</m:t>
+            </m:r>
+          </m:e>
+          <m:lim>
+            <m:r>
+              <m:rPr>
+                <m:nor/>
+                <m:sty m:val="p"/>
+              </m:rPr>
+              <m:t>def</m:t>
+            </m:r>
+          </m:lim>
+        </m:limUpp>
+        <m:r>
+          <m:t>​</m:t>
+        </m:r>
+        <m:d>
+          <m:dPr>
+            <m:begChr m:val="|"/>
+            <m:sepChr m:val=""/>
+            <m:endChr m:val="|"/>
+            <m:grow/>
+          </m:dPr>
+          <m:e>
+            <m:r>
+              <m:t>A</m:t>
+            </m:r>
+          </m:e>
+        </m:d>
+        <m:r>
+          <m:t>​</m:t>
+        </m:r>
+        <m:r>
+          <m:rPr>
+            <m:sty m:val="p"/>
+          </m:rPr>
+          <m:t>/</m:t>
+        </m:r>
+        <m:r>
+          <m:t>6</m:t>
+        </m:r>
+      </m:oMath>
+      <w:r>
+        <w:t xml:space="preserve">,</w:t>
+      </w:r>
+      <w:r>
+        <w:t xml:space="preserve"> </w:t>
+      </w:r>
+      <w:r>
+        <w:t xml:space="preserve">where</w:t>
+      </w:r>
+      <w:r>
+        <w:t xml:space="preserve"> </w:t>
+      </w:r>
+      <m:oMath>
+        <m:r>
+          <m:t>​</m:t>
+        </m:r>
+        <m:d>
+          <m:dPr>
+            <m:begChr m:val="|"/>
+            <m:sepChr m:val=""/>
+            <m:endChr m:val="|"/>
+            <m:grow/>
+          </m:dPr>
+          <m:e>
+            <m:r>
+              <m:t>A</m:t>
+            </m:r>
+          </m:e>
+        </m:d>
+        <m:r>
+          <m:t>​</m:t>
+        </m:r>
+      </m:oMath>
+      <w:r>
+        <w:t xml:space="preserve"> </w:t>
+      </w:r>
+      <w:r>
+        <w:t xml:space="preserve">is the number of outcomes in</w:t>
+      </w:r>
+      <w:r>
+        <w:t xml:space="preserve"> </w:t>
+      </w:r>
+      <m:oMath>
+        <m:r>
+          <m:t>A</m:t>
+        </m:r>
+      </m:oMath>
+      <w:r>
+        <w:t xml:space="preserve">.</w:t>
+      </w:r>
+      <w:r>
+        <w:t xml:space="preserve"> </w:t>
+      </w:r>
+      <w:r>
+        <w:t xml:space="preserve">This function is</w:t>
+      </w:r>
+      <w:r>
+        <w:t xml:space="preserve"> </w:t>
+      </w:r>
+      <m:oMath>
+        <m:r>
+          <m:t>1</m:t>
+        </m:r>
+        <m:r>
+          <m:rPr>
+            <m:sty m:val="p"/>
+          </m:rPr>
+          <m:t>/</m:t>
+        </m:r>
+        <m:r>
+          <m:t>6</m:t>
+        </m:r>
+      </m:oMath>
+      <w:r>
+        <w:t xml:space="preserve"> </w:t>
+      </w:r>
+      <w:r>
+        <w:t xml:space="preserve">times the measure of</w:t>
+      </w:r>
+      <w:r>
+        <w:t xml:space="preserve"> </w:t>
+      </w:r>
+      <w:hyperlink w:anchor="exm-measure">
+        <w:r>
+          <w:rPr>
+            <w:rStyle w:val="Hyperlink"/>
+          </w:rPr>
+          <w:t xml:space="preserve">Example 10</w:t>
+        </w:r>
+      </w:hyperlink>
+      <w:r>
+        <w:t xml:space="preserve">,</w:t>
+      </w:r>
+      <w:r>
+        <w:t xml:space="preserve"> </w:t>
+      </w:r>
+      <w:r>
+        <w:t xml:space="preserve">so it is a</w:t>
+      </w:r>
+      <w:r>
+        <w:t xml:space="preserve"> </w:t>
+      </w:r>
+      <w:hyperlink w:anchor="def-measure">
+        <w:r>
+          <w:rPr>
+            <w:rStyle w:val="Hyperlink"/>
+          </w:rPr>
+          <w:t xml:space="preserve">measure</w:t>
+        </w:r>
+      </w:hyperlink>
+      <w:r>
+        <w:t xml:space="preserve"> </w:t>
+      </w:r>
+      <w:r>
+        <w:t xml:space="preserve">on the events of</w:t>
+      </w:r>
+      <w:r>
+        <w:t xml:space="preserve"> </w:t>
+      </w:r>
+      <m:oMath>
+        <m:r>
+          <m:rPr>
+            <m:sty m:val="p"/>
+          </m:rPr>
+          <m:t>Ω</m:t>
+        </m:r>
+      </m:oMath>
+      <w:r>
+        <w:t xml:space="preserve">,</w:t>
+      </w:r>
+      <w:r>
+        <w:t xml:space="preserve"> </w:t>
+      </w:r>
+      <w:r>
+        <w:t xml:space="preserve">and it gives</w:t>
+      </w:r>
+      <w:r>
+        <w:t xml:space="preserve"> </w:t>
+      </w:r>
+      <m:oMath>
+        <m:r>
+          <m:rPr>
+            <m:sty m:val="p"/>
+          </m:rPr>
+          <m:t>Pr</m:t>
+        </m:r>
+        <m:r>
+          <m:rPr>
+            <m:sty m:val="p"/>
+          </m:rPr>
+          <m:t>(</m:t>
+        </m:r>
+        <m:r>
+          <m:rPr>
+            <m:sty m:val="p"/>
+          </m:rPr>
+          <m:t>Ω</m:t>
+        </m:r>
+        <m:r>
+          <m:rPr>
+            <m:sty m:val="p"/>
+          </m:rPr>
+          <m:t>)</m:t>
+        </m:r>
+        <m:r>
+          <m:rPr>
+            <m:sty m:val="p"/>
+          </m:rPr>
+          <m:t>=</m:t>
+        </m:r>
+        <m:r>
+          <m:t>6</m:t>
+        </m:r>
+        <m:r>
+          <m:rPr>
+            <m:sty m:val="p"/>
+          </m:rPr>
+          <m:t>/</m:t>
+        </m:r>
+        <m:r>
+          <m:t>6</m:t>
+        </m:r>
+        <m:r>
+          <m:rPr>
+            <m:sty m:val="p"/>
+          </m:rPr>
+          <m:t>=</m:t>
+        </m:r>
+        <m:r>
+          <m:t>1</m:t>
+        </m:r>
+      </m:oMath>
+      <w:r>
+        <w:t xml:space="preserve">.</w:t>
+      </w:r>
+      <w:r>
+        <w:t xml:space="preserve"> </w:t>
+      </w:r>
+      <w:r>
+        <w:t xml:space="preserve">The event</w:t>
+      </w:r>
+      <w:r>
+        <w:t xml:space="preserve"> </w:t>
+      </w:r>
+      <w:r>
+        <w:t xml:space="preserve">“the roll is even”</w:t>
+      </w:r>
+      <w:r>
+        <w:t xml:space="preserve"> </w:t>
+      </w:r>
+      <w:r>
+        <w:t xml:space="preserve">from</w:t>
+      </w:r>
+      <w:r>
+        <w:t xml:space="preserve"> </w:t>
+      </w:r>
+      <w:hyperlink w:anchor="exm-event">
+        <w:r>
+          <w:rPr>
+            <w:rStyle w:val="Hyperlink"/>
+          </w:rPr>
+          <w:t xml:space="preserve">Example 3</w:t>
+        </w:r>
+      </w:hyperlink>
+      <w:r>
+        <w:t xml:space="preserve"> </w:t>
+      </w:r>
+      <w:r>
+        <w:t xml:space="preserve">has probability</w:t>
+      </w:r>
+      <w:r>
+        <w:t xml:space="preserve"> </w:t>
+      </w:r>
+      <m:oMath>
+        <m:r>
+          <m:rPr>
+            <m:sty m:val="p"/>
+          </m:rPr>
+          <m:t>Pr</m:t>
+        </m:r>
+        <m:r>
+          <m:rPr>
+            <m:sty m:val="p"/>
+          </m:rPr>
+          <m:t>(</m:t>
+        </m:r>
+        <m:r>
+          <m:t>​</m:t>
+        </m:r>
+        <m:d>
+          <m:dPr>
+            <m:begChr m:val="{"/>
+            <m:sepChr m:val=""/>
+            <m:endChr m:val="}"/>
+            <m:grow/>
+          </m:dPr>
+          <m:e>
+            <m:r>
+              <m:t>2</m:t>
+            </m:r>
+            <m:r>
+              <m:rPr>
+                <m:sty m:val="p"/>
+              </m:rPr>
+              <m:t>,</m:t>
+            </m:r>
+            <m:r>
+              <m:t>4</m:t>
+            </m:r>
+            <m:r>
+              <m:rPr>
+                <m:sty m:val="p"/>
+              </m:rPr>
+              <m:t>,</m:t>
+            </m:r>
+            <m:r>
+              <m:t>6</m:t>
+            </m:r>
+          </m:e>
+        </m:d>
+        <m:r>
+          <m:t>​</m:t>
+        </m:r>
+        <m:r>
+          <m:rPr>
+            <m:sty m:val="p"/>
+          </m:rPr>
+          <m:t>)</m:t>
+        </m:r>
+        <m:r>
+          <m:rPr>
+            <m:sty m:val="p"/>
+          </m:rPr>
+          <m:t>=</m:t>
+        </m:r>
+        <m:r>
+          <m:t>3</m:t>
+        </m:r>
+        <m:r>
+          <m:rPr>
+            <m:sty m:val="p"/>
+          </m:rPr>
+          <m:t>/</m:t>
+        </m:r>
+        <m:r>
+          <m:t>6</m:t>
+        </m:r>
+        <m:r>
+          <m:rPr>
+            <m:sty m:val="p"/>
+          </m:rPr>
+          <m:t>=</m:t>
+        </m:r>
+        <m:r>
+          <m:t>1</m:t>
+        </m:r>
+        <m:r>
+          <m:rPr>
+            <m:sty m:val="p"/>
+          </m:rPr>
+          <m:t>/</m:t>
+        </m:r>
+        <m:r>
+          <m:t>2</m:t>
+        </m:r>
+      </m:oMath>
+      <w:r>
+        <w:t xml:space="preserve">.</w:t>
+      </w:r>
+    </w:p>
+    <w:bookmarkEnd w:id="39"/>
+    <w:bookmarkStart w:id="40" w:name="thm-kolmogorov-axioms"/>
+    <w:p>
+      <w:pPr>
+        <w:pStyle w:val="BodyText"/>
+      </w:pPr>
+      <w:r>
+        <w:rPr>
+          <w:b/>
+          <w:bCs/>
+        </w:rPr>
+        <w:t xml:space="preserve">Theorem 2 (Kolmogorov axioms)</w:t>
+      </w:r>
+      <w:r>
+        <w:t xml:space="preserve"> </w:t>
+      </w:r>
+      <w:r>
+        <w:t xml:space="preserve">A function</w:t>
+      </w:r>
+      <w:r>
+        <w:t xml:space="preserve"> </w:t>
+      </w:r>
+      <m:oMath>
+        <m:r>
+          <m:rPr>
+            <m:sty m:val="p"/>
+          </m:rPr>
+          <m:t>Pr</m:t>
+        </m:r>
+      </m:oMath>
+      <w:r>
+        <w:t xml:space="preserve"> </w:t>
+      </w:r>
+      <w:r>
+        <w:t xml:space="preserve">that assigns a real number</w:t>
       </w:r>
       <w:r>
         <w:t xml:space="preserve"> </w:t>
@@ -9035,7 +9852,41 @@
         <w:t xml:space="preserve"> </w:t>
       </w:r>
       <w:r>
-        <w:t xml:space="preserve">and satisfies:</w:t>
+        <w:t xml:space="preserve">of a sample space</w:t>
+      </w:r>
+      <w:r>
+        <w:t xml:space="preserve"> </w:t>
+      </w:r>
+      <m:oMath>
+        <m:r>
+          <m:rPr>
+            <m:sty m:val="p"/>
+          </m:rPr>
+          <m:t>Ω</m:t>
+        </m:r>
+      </m:oMath>
+      <w:r>
+        <w:t xml:space="preserve"> </w:t>
+      </w:r>
+      <w:r>
+        <w:t xml:space="preserve">is a</w:t>
+      </w:r>
+      <w:r>
+        <w:t xml:space="preserve"> </w:t>
+      </w:r>
+      <w:hyperlink w:anchor="def-probability">
+        <w:r>
+          <w:rPr>
+            <w:rStyle w:val="Hyperlink"/>
+          </w:rPr>
+          <w:t xml:space="preserve">probability measure</w:t>
+        </w:r>
+      </w:hyperlink>
+      <w:r>
+        <w:t xml:space="preserve"> </w:t>
+      </w:r>
+      <w:r>
+        <w:t xml:space="preserve">if and only if it satisfies:</w:t>
       </w:r>
     </w:p>
     <w:p>
@@ -9046,6 +9897,23 @@
           <w:numId w:val="1004"/>
         </w:numPr>
       </w:pPr>
+      <w:r>
+        <w:t xml:space="preserve">For any event</w:t>
+      </w:r>
+      <w:r>
+        <w:t xml:space="preserve"> </w:t>
+      </w:r>
+      <m:oMath>
+        <m:r>
+          <m:t>A</m:t>
+        </m:r>
+      </m:oMath>
+      <w:r>
+        <w:t xml:space="preserve">,</w:t>
+      </w:r>
+      <w:r>
+        <w:t xml:space="preserve"> </w:t>
+      </w:r>
       <m:oMath>
         <m:r>
           <m:rPr>
@@ -9053,39 +9921,29 @@
           </m:rPr>
           <m:t>Pr</m:t>
         </m:r>
-      </m:oMath>
-      <w:r>
-        <w:t xml:space="preserve"> </w:t>
-      </w:r>
-      <w:r>
-        <w:t xml:space="preserve">is a</w:t>
-      </w:r>
-      <w:r>
-        <w:t xml:space="preserve"> </w:t>
-      </w:r>
-      <w:hyperlink w:anchor="def-measure">
-        <w:r>
-          <w:rPr>
-            <w:rStyle w:val="Hyperlink"/>
-          </w:rPr>
-          <w:t xml:space="preserve">measure</w:t>
-        </w:r>
-      </w:hyperlink>
-      <w:r>
-        <w:t xml:space="preserve"> </w:t>
-      </w:r>
-      <w:r>
-        <w:t xml:space="preserve">on the events of</w:t>
-      </w:r>
-      <w:r>
-        <w:t xml:space="preserve"> </w:t>
-      </w:r>
-      <m:oMath>
-        <m:r>
-          <m:rPr>
-            <m:sty m:val="p"/>
-          </m:rPr>
-          <m:t>Ω</m:t>
+        <m:r>
+          <m:rPr>
+            <m:sty m:val="p"/>
+          </m:rPr>
+          <m:t>(</m:t>
+        </m:r>
+        <m:r>
+          <m:t>A</m:t>
+        </m:r>
+        <m:r>
+          <m:rPr>
+            <m:sty m:val="p"/>
+          </m:rPr>
+          <m:t>)</m:t>
+        </m:r>
+        <m:r>
+          <m:rPr>
+            <m:sty m:val="p"/>
+          </m:rPr>
+          <m:t>≥</m:t>
+        </m:r>
+        <m:r>
+          <m:t>0</m:t>
         </m:r>
       </m:oMath>
       <w:r>
@@ -9098,135 +9956,6 @@
         <w:numPr>
           <w:ilvl w:val="0"/>
           <w:numId w:val="1004"/>
-        </w:numPr>
-      </w:pPr>
-      <w:r>
-        <w:t xml:space="preserve">The whole sample space has probability 1:</w:t>
-      </w:r>
-      <w:r>
-        <w:t xml:space="preserve"> </w:t>
-      </w:r>
-      <m:oMath>
-        <m:r>
-          <m:rPr>
-            <m:sty m:val="p"/>
-          </m:rPr>
-          <m:t>Pr</m:t>
-        </m:r>
-        <m:r>
-          <m:rPr>
-            <m:sty m:val="p"/>
-          </m:rPr>
-          <m:t>(</m:t>
-        </m:r>
-        <m:r>
-          <m:rPr>
-            <m:sty m:val="p"/>
-          </m:rPr>
-          <m:t>Ω</m:t>
-        </m:r>
-        <m:r>
-          <m:rPr>
-            <m:sty m:val="p"/>
-          </m:rPr>
-          <m:t>)</m:t>
-        </m:r>
-        <m:r>
-          <m:rPr>
-            <m:sty m:val="p"/>
-          </m:rPr>
-          <m:t>=</m:t>
-        </m:r>
-        <m:r>
-          <m:t>1</m:t>
-        </m:r>
-      </m:oMath>
-      <w:r>
-        <w:t xml:space="preserve">.</w:t>
-      </w:r>
-    </w:p>
-    <w:bookmarkEnd w:id="38"/>
-    <w:p>
-      <w:pPr>
-        <w:pStyle w:val="FirstParagraph"/>
-      </w:pPr>
-      <w:r>
-        <w:t xml:space="preserve">Many sources state this definition as three axioms instead</w:t>
-      </w:r>
-      <w:r>
-        <w:t xml:space="preserve"> </w:t>
-      </w:r>
-      <w:r>
-        <w:t xml:space="preserve">(the Kolmogorov axioms):</w:t>
-      </w:r>
-    </w:p>
-    <w:p>
-      <w:pPr>
-        <w:pStyle w:val="Compact"/>
-        <w:numPr>
-          <w:ilvl w:val="0"/>
-          <w:numId w:val="1005"/>
-        </w:numPr>
-      </w:pPr>
-      <w:r>
-        <w:t xml:space="preserve">For any event</w:t>
-      </w:r>
-      <w:r>
-        <w:t xml:space="preserve"> </w:t>
-      </w:r>
-      <m:oMath>
-        <m:r>
-          <m:t>A</m:t>
-        </m:r>
-      </m:oMath>
-      <w:r>
-        <w:t xml:space="preserve">,</w:t>
-      </w:r>
-      <w:r>
-        <w:t xml:space="preserve"> </w:t>
-      </w:r>
-      <m:oMath>
-        <m:r>
-          <m:rPr>
-            <m:sty m:val="p"/>
-          </m:rPr>
-          <m:t>Pr</m:t>
-        </m:r>
-        <m:r>
-          <m:rPr>
-            <m:sty m:val="p"/>
-          </m:rPr>
-          <m:t>(</m:t>
-        </m:r>
-        <m:r>
-          <m:t>A</m:t>
-        </m:r>
-        <m:r>
-          <m:rPr>
-            <m:sty m:val="p"/>
-          </m:rPr>
-          <m:t>)</m:t>
-        </m:r>
-        <m:r>
-          <m:rPr>
-            <m:sty m:val="p"/>
-          </m:rPr>
-          <m:t>≥</m:t>
-        </m:r>
-        <m:r>
-          <m:t>0</m:t>
-        </m:r>
-      </m:oMath>
-      <w:r>
-        <w:t xml:space="preserve">.</w:t>
-      </w:r>
-    </w:p>
-    <w:p>
-      <w:pPr>
-        <w:pStyle w:val="Compact"/>
-        <w:numPr>
-          <w:ilvl w:val="0"/>
-          <w:numId w:val="1005"/>
         </w:numPr>
       </w:pPr>
       <w:r>
@@ -9283,7 +10012,7 @@
         <w:pStyle w:val="Compact"/>
         <w:numPr>
           <w:ilvl w:val="0"/>
-          <w:numId w:val="1005"/>
+          <w:numId w:val="1004"/>
         </w:numPr>
       </w:pPr>
       <m:oMath>
@@ -9535,18 +10264,23 @@
         </m:oMath>
       </m:oMathPara>
     </w:p>
+    <w:bookmarkEnd w:id="40"/>
     <w:p>
       <w:pPr>
         <w:pStyle w:val="FirstParagraph"/>
       </w:pPr>
       <w:r>
-        <w:t xml:space="preserve">The two forms are equivalent.</w:t>
-      </w:r>
-      <w:r>
-        <w:t xml:space="preserve"> </w:t>
-      </w:r>
-      <w:r>
-        <w:t xml:space="preserve">The axioms do not list</w:t>
+        <w:rPr>
+          <w:i/>
+          <w:iCs/>
+        </w:rPr>
+        <w:t xml:space="preserve">Proof</w:t>
+      </w:r>
+      <w:r>
+        <w:t xml:space="preserve">. </w:t>
+      </w:r>
+      <w:r>
+        <w:t xml:space="preserve">Suppose</w:t>
       </w:r>
       <w:r>
         <w:t xml:space="preserve"> </w:t>
@@ -9558,675 +10292,18 @@
           </m:rPr>
           <m:t>Pr</m:t>
         </m:r>
-        <m:r>
-          <m:rPr>
-            <m:sty m:val="p"/>
-          </m:rPr>
-          <m:t>(</m:t>
-        </m:r>
-        <m:r>
-          <m:rPr>
-            <m:sty m:val="p"/>
-          </m:rPr>
-          <m:t>∅</m:t>
-        </m:r>
-        <m:r>
-          <m:rPr>
-            <m:sty m:val="p"/>
-          </m:rPr>
-          <m:t>)</m:t>
-        </m:r>
-        <m:r>
-          <m:rPr>
-            <m:sty m:val="p"/>
-          </m:rPr>
-          <m:t>=</m:t>
-        </m:r>
-        <m:r>
-          <m:t>0</m:t>
-        </m:r>
-      </m:oMath>
-      <w:r>
-        <w:t xml:space="preserve">, but they imply it:</w:t>
-      </w:r>
-      <w:r>
-        <w:t xml:space="preserve"> </w:t>
-      </w:r>
-      <w:r>
-        <w:t xml:space="preserve">applying property 3 to</w:t>
-      </w:r>
-      <w:r>
-        <w:t xml:space="preserve"> </w:t>
-      </w:r>
-      <m:oMath>
-        <m:r>
-          <m:rPr>
-            <m:sty m:val="p"/>
-          </m:rPr>
-          <m:t>Ω</m:t>
-        </m:r>
-        <m:r>
-          <m:rPr>
-            <m:sty m:val="p"/>
-          </m:rPr>
-          <m:t>,</m:t>
-        </m:r>
-        <m:r>
-          <m:rPr>
-            <m:sty m:val="p"/>
-          </m:rPr>
-          <m:t>∅</m:t>
-        </m:r>
-        <m:r>
-          <m:rPr>
-            <m:sty m:val="p"/>
-          </m:rPr>
-          <m:t>,</m:t>
-        </m:r>
-        <m:r>
-          <m:rPr>
-            <m:sty m:val="p"/>
-          </m:rPr>
-          <m:t>∅</m:t>
-        </m:r>
-        <m:r>
-          <m:rPr>
-            <m:sty m:val="p"/>
-          </m:rPr>
-          <m:t>,</m:t>
-        </m:r>
-        <m:r>
-          <m:rPr>
-            <m:sty m:val="p"/>
-          </m:rPr>
-          <m:t>…</m:t>
-        </m:r>
-      </m:oMath>
-      <w:r>
-        <w:t xml:space="preserve"> </w:t>
-      </w:r>
-      <w:r>
-        <w:t xml:space="preserve">gives</w:t>
-      </w:r>
-      <w:r>
-        <w:t xml:space="preserve"> </w:t>
-      </w:r>
-      <m:oMath>
-        <m:r>
-          <m:t>1</m:t>
-        </m:r>
-        <m:r>
-          <m:rPr>
-            <m:sty m:val="p"/>
-          </m:rPr>
-          <m:t>=</m:t>
-        </m:r>
-        <m:r>
-          <m:t>1</m:t>
-        </m:r>
-        <m:r>
-          <m:rPr>
-            <m:sty m:val="p"/>
-          </m:rPr>
-          <m:t>+</m:t>
-        </m:r>
-        <m:nary>
-          <m:naryPr>
-            <m:chr m:val="∑"/>
-            <m:limLoc m:val="undOvr"/>
-            <m:subHide m:val="off"/>
-            <m:supHide m:val="off"/>
-          </m:naryPr>
-          <m:sub>
-            <m:r>
-              <m:t>i</m:t>
-            </m:r>
-            <m:r>
-              <m:rPr>
-                <m:sty m:val="p"/>
-              </m:rPr>
-              <m:t>=</m:t>
-            </m:r>
-            <m:r>
-              <m:t>2</m:t>
-            </m:r>
-          </m:sub>
-          <m:sup>
-            <m:r>
-              <m:rPr>
-                <m:sty m:val="p"/>
-              </m:rPr>
-              <m:t>∞</m:t>
-            </m:r>
-          </m:sup>
-          <m:e>
-            <m:r>
-              <m:rPr>
-                <m:sty m:val="p"/>
-              </m:rPr>
-              <m:t>Pr</m:t>
-            </m:r>
-          </m:e>
-        </m:nary>
-        <m:r>
-          <m:rPr>
-            <m:sty m:val="p"/>
-          </m:rPr>
-          <m:t>(</m:t>
-        </m:r>
-        <m:r>
-          <m:rPr>
-            <m:sty m:val="p"/>
-          </m:rPr>
-          <m:t>∅</m:t>
-        </m:r>
-        <m:r>
-          <m:rPr>
-            <m:sty m:val="p"/>
-          </m:rPr>
-          <m:t>)</m:t>
-        </m:r>
-      </m:oMath>
-      <w:r>
-        <w:t xml:space="preserve">,</w:t>
-      </w:r>
-      <w:r>
-        <w:t xml:space="preserve"> </w:t>
-      </w:r>
-      <w:r>
-        <w:t xml:space="preserve">so</w:t>
-      </w:r>
-      <w:r>
-        <w:t xml:space="preserve"> </w:t>
-      </w:r>
-      <m:oMath>
-        <m:r>
-          <m:rPr>
-            <m:sty m:val="p"/>
-          </m:rPr>
-          <m:t>Pr</m:t>
-        </m:r>
-        <m:r>
-          <m:rPr>
-            <m:sty m:val="p"/>
-          </m:rPr>
-          <m:t>(</m:t>
-        </m:r>
-        <m:r>
-          <m:rPr>
-            <m:sty m:val="p"/>
-          </m:rPr>
-          <m:t>∅</m:t>
-        </m:r>
-        <m:r>
-          <m:rPr>
-            <m:sty m:val="p"/>
-          </m:rPr>
-          <m:t>)</m:t>
-        </m:r>
-        <m:r>
-          <m:rPr>
-            <m:sty m:val="p"/>
-          </m:rPr>
-          <m:t>=</m:t>
-        </m:r>
-        <m:r>
-          <m:t>0</m:t>
-        </m:r>
-      </m:oMath>
-      <w:r>
-        <w:t xml:space="preserve">.</w:t>
-      </w:r>
-      <w:r>
-        <w:t xml:space="preserve"> </w:t>
-      </w:r>
-      <w:r>
-        <w:t xml:space="preserve">A probability measure is also</w:t>
-      </w:r>
-      <w:r>
-        <w:t xml:space="preserve"> </w:t>
-      </w:r>
-      <w:hyperlink w:anchor="def-finite-additivity">
-        <w:r>
-          <w:rPr>
-            <w:rStyle w:val="Hyperlink"/>
-          </w:rPr>
-          <w:t xml:space="preserve">finitely additive</w:t>
-        </w:r>
-      </w:hyperlink>
-      <w:r>
-        <w:t xml:space="preserve">,</w:t>
-      </w:r>
-      <w:r>
-        <w:t xml:space="preserve"> </w:t>
-      </w:r>
-      <w:r>
-        <w:t xml:space="preserve">by</w:t>
-      </w:r>
-      <w:r>
-        <w:t xml:space="preserve"> </w:t>
-      </w:r>
-      <w:hyperlink w:anchor="thm-countable-implies-finite">
-        <w:r>
-          <w:rPr>
-            <w:rStyle w:val="Hyperlink"/>
-          </w:rPr>
-          <w:t xml:space="preserve">Theorem 1</w:t>
-        </w:r>
-      </w:hyperlink>
-      <w:r>
-        <w:t xml:space="preserve">.</w:t>
-      </w:r>
-      <w:r>
-        <w:t xml:space="preserve"> </w:t>
-      </w:r>
-      <w:r>
-        <w:t xml:space="preserve">Requiring countable additivity, not just finite additivity,</w:t>
-      </w:r>
-      <w:r>
-        <w:t xml:space="preserve"> </w:t>
-      </w:r>
-      <w:r>
-        <w:t xml:space="preserve">enables results such as</w:t>
-      </w:r>
-      <w:r>
-        <w:t xml:space="preserve"> </w:t>
-      </w:r>
-      <w:r>
-        <w:t xml:space="preserve">the continuity of probability</w:t>
-      </w:r>
-      <w:r>
-        <w:t xml:space="preserve"> </w:t>
-      </w:r>
-      <w:r>
-        <w:t xml:space="preserve">(if</w:t>
-      </w:r>
-      <w:r>
-        <w:t xml:space="preserve"> </w:t>
-      </w:r>
-      <m:oMath>
-        <m:sSub>
-          <m:e>
-            <m:r>
-              <m:t>A</m:t>
-            </m:r>
-          </m:e>
-          <m:sub>
-            <m:r>
-              <m:t>1</m:t>
-            </m:r>
-          </m:sub>
-        </m:sSub>
-        <m:r>
-          <m:rPr>
-            <m:sty m:val="p"/>
-          </m:rPr>
-          <m:t>⊇</m:t>
-        </m:r>
-        <m:sSub>
-          <m:e>
-            <m:r>
-              <m:t>A</m:t>
-            </m:r>
-          </m:e>
-          <m:sub>
-            <m:r>
-              <m:t>2</m:t>
-            </m:r>
-          </m:sub>
-        </m:sSub>
-        <m:r>
-          <m:rPr>
-            <m:sty m:val="p"/>
-          </m:rPr>
-          <m:t>⊇</m:t>
-        </m:r>
-        <m:r>
-          <m:rPr>
-            <m:sty m:val="p"/>
-          </m:rPr>
-          <m:t>⋯</m:t>
-        </m:r>
-      </m:oMath>
-      <w:r>
-        <w:t xml:space="preserve"> </w:t>
-      </w:r>
-      <w:r>
-        <w:t xml:space="preserve">with</w:t>
-      </w:r>
-      <w:r>
-        <w:t xml:space="preserve"> </w:t>
-      </w:r>
-      <m:oMath>
-        <m:sSub>
-          <m:e>
-            <m:r>
-              <m:rPr>
-                <m:sty m:val="p"/>
-              </m:rPr>
-              <m:t>⋂</m:t>
-            </m:r>
-          </m:e>
-          <m:sub>
-            <m:r>
-              <m:t>i</m:t>
-            </m:r>
-          </m:sub>
-        </m:sSub>
-        <m:sSub>
-          <m:e>
-            <m:r>
-              <m:t>A</m:t>
-            </m:r>
-          </m:e>
-          <m:sub>
-            <m:r>
-              <m:t>i</m:t>
-            </m:r>
-          </m:sub>
-        </m:sSub>
-        <m:r>
-          <m:rPr>
-            <m:sty m:val="p"/>
-          </m:rPr>
-          <m:t>=</m:t>
-        </m:r>
-        <m:r>
-          <m:rPr>
-            <m:sty m:val="p"/>
-          </m:rPr>
-          <m:t>∅</m:t>
-        </m:r>
-      </m:oMath>
-      <w:r>
-        <w:t xml:space="preserve">,</w:t>
-      </w:r>
-      <w:r>
-        <w:t xml:space="preserve"> </w:t>
-      </w:r>
-      <w:r>
-        <w:t xml:space="preserve">then</w:t>
-      </w:r>
-      <w:r>
-        <w:t xml:space="preserve"> </w:t>
-      </w:r>
-      <m:oMath>
-        <m:r>
-          <m:rPr>
-            <m:sty m:val="p"/>
-          </m:rPr>
-          <m:t>Pr</m:t>
-        </m:r>
-        <m:r>
-          <m:rPr>
-            <m:sty m:val="p"/>
-          </m:rPr>
-          <m:t>(</m:t>
-        </m:r>
-        <m:sSub>
-          <m:e>
-            <m:r>
-              <m:t>A</m:t>
-            </m:r>
-          </m:e>
-          <m:sub>
-            <m:r>
-              <m:t>i</m:t>
-            </m:r>
-          </m:sub>
-        </m:sSub>
-        <m:r>
-          <m:rPr>
-            <m:sty m:val="p"/>
-          </m:rPr>
-          <m:t>)</m:t>
-        </m:r>
-        <m:r>
-          <m:rPr>
-            <m:sty m:val="p"/>
-          </m:rPr>
-          <m:t>→</m:t>
-        </m:r>
-        <m:r>
-          <m:t>0</m:t>
-        </m:r>
-      </m:oMath>
-      <w:r>
-        <w:t xml:space="preserve">),</w:t>
-      </w:r>
-      <w:r>
-        <w:t xml:space="preserve"> </w:t>
-      </w:r>
-      <w:r>
-        <w:t xml:space="preserve">and it is what makes sums over countably infinite</w:t>
-      </w:r>
-      <w:r>
-        <w:t xml:space="preserve"> </w:t>
-      </w:r>
-      <w:hyperlink w:anchor="def-partition">
-        <w:r>
-          <w:rPr>
-            <w:rStyle w:val="Hyperlink"/>
-          </w:rPr>
-          <w:t xml:space="preserve">partitions</w:t>
-        </w:r>
-      </w:hyperlink>
-      <w:r>
-        <w:t xml:space="preserve"> </w:t>
-      </w:r>
-      <w:r>
-        <w:t xml:space="preserve">valid.</w:t>
-      </w:r>
-    </w:p>
-    <w:bookmarkStart w:id="39" w:name="exm-probability"/>
-    <w:p>
-      <w:pPr>
-        <w:pStyle w:val="BodyText"/>
-      </w:pPr>
-      <w:r>
-        <w:rPr>
-          <w:b/>
-          <w:bCs/>
-        </w:rPr>
-        <w:t xml:space="preserve">Example 12 (Probability measure for a fair die)</w:t>
-      </w:r>
-      <w:r>
-        <w:t xml:space="preserve"> </w:t>
-      </w:r>
-      <w:r>
-        <w:t xml:space="preserve">For the die roll in</w:t>
-      </w:r>
-      <w:r>
-        <w:t xml:space="preserve"> </w:t>
-      </w:r>
-      <w:hyperlink w:anchor="exm-sample-space">
-        <w:r>
-          <w:rPr>
-            <w:rStyle w:val="Hyperlink"/>
-          </w:rPr>
-          <w:t xml:space="preserve">Example 1</w:t>
-        </w:r>
-      </w:hyperlink>
-      <w:r>
-        <w:t xml:space="preserve">,</w:t>
-      </w:r>
-      <w:r>
-        <w:t xml:space="preserve"> </w:t>
-      </w:r>
-      <w:r>
-        <w:t xml:space="preserve">define</w:t>
-      </w:r>
-      <w:r>
-        <w:t xml:space="preserve"> </w:t>
-      </w:r>
-      <m:oMath>
-        <m:r>
-          <m:rPr>
-            <m:sty m:val="p"/>
-          </m:rPr>
-          <m:t>Pr</m:t>
-        </m:r>
-        <m:r>
-          <m:rPr>
-            <m:sty m:val="p"/>
-          </m:rPr>
-          <m:t>(</m:t>
-        </m:r>
-        <m:r>
-          <m:t>A</m:t>
-        </m:r>
-        <m:r>
-          <m:rPr>
-            <m:sty m:val="p"/>
-          </m:rPr>
-          <m:t>)</m:t>
-        </m:r>
-        <m:limUpp>
-          <m:e>
-            <m:r>
-              <m:rPr>
-                <m:sty m:val="p"/>
-              </m:rPr>
-              <m:t>=</m:t>
-            </m:r>
-          </m:e>
-          <m:lim>
-            <m:r>
-              <m:rPr>
-                <m:nor/>
-                <m:sty m:val="p"/>
-              </m:rPr>
-              <m:t>def</m:t>
-            </m:r>
-          </m:lim>
-        </m:limUpp>
-        <m:r>
-          <m:t>​</m:t>
-        </m:r>
-        <m:d>
-          <m:dPr>
-            <m:begChr m:val="|"/>
-            <m:sepChr m:val=""/>
-            <m:endChr m:val="|"/>
-            <m:grow/>
-          </m:dPr>
-          <m:e>
-            <m:r>
-              <m:t>A</m:t>
-            </m:r>
-          </m:e>
-        </m:d>
-        <m:r>
-          <m:t>​</m:t>
-        </m:r>
-        <m:r>
-          <m:rPr>
-            <m:sty m:val="p"/>
-          </m:rPr>
-          <m:t>/</m:t>
-        </m:r>
-        <m:r>
-          <m:t>6</m:t>
-        </m:r>
-      </m:oMath>
-      <w:r>
-        <w:t xml:space="preserve">,</w:t>
-      </w:r>
-      <w:r>
-        <w:t xml:space="preserve"> </w:t>
-      </w:r>
-      <w:r>
-        <w:t xml:space="preserve">where</w:t>
-      </w:r>
-      <w:r>
-        <w:t xml:space="preserve"> </w:t>
-      </w:r>
-      <m:oMath>
-        <m:r>
-          <m:t>​</m:t>
-        </m:r>
-        <m:d>
-          <m:dPr>
-            <m:begChr m:val="|"/>
-            <m:sepChr m:val=""/>
-            <m:endChr m:val="|"/>
-            <m:grow/>
-          </m:dPr>
-          <m:e>
-            <m:r>
-              <m:t>A</m:t>
-            </m:r>
-          </m:e>
-        </m:d>
-        <m:r>
-          <m:t>​</m:t>
-        </m:r>
-      </m:oMath>
-      <w:r>
-        <w:t xml:space="preserve"> </w:t>
-      </w:r>
-      <w:r>
-        <w:t xml:space="preserve">is the number of outcomes in</w:t>
-      </w:r>
-      <w:r>
-        <w:t xml:space="preserve"> </w:t>
-      </w:r>
-      <m:oMath>
-        <m:r>
-          <m:t>A</m:t>
-        </m:r>
-      </m:oMath>
-      <w:r>
-        <w:t xml:space="preserve">.</w:t>
-      </w:r>
-      <w:r>
-        <w:t xml:space="preserve"> </w:t>
-      </w:r>
-      <w:r>
-        <w:t xml:space="preserve">This function is</w:t>
-      </w:r>
-      <w:r>
-        <w:t xml:space="preserve"> </w:t>
-      </w:r>
-      <m:oMath>
-        <m:r>
-          <m:t>1</m:t>
-        </m:r>
-        <m:r>
-          <m:rPr>
-            <m:sty m:val="p"/>
-          </m:rPr>
-          <m:t>/</m:t>
-        </m:r>
-        <m:r>
-          <m:t>6</m:t>
-        </m:r>
-      </m:oMath>
-      <w:r>
-        <w:t xml:space="preserve"> </w:t>
-      </w:r>
-      <w:r>
-        <w:t xml:space="preserve">times the measure of</w:t>
-      </w:r>
-      <w:r>
-        <w:t xml:space="preserve"> </w:t>
-      </w:r>
-      <w:hyperlink w:anchor="exm-measure">
-        <w:r>
-          <w:rPr>
-            <w:rStyle w:val="Hyperlink"/>
-          </w:rPr>
-          <w:t xml:space="preserve">Example 10</w:t>
-        </w:r>
-      </w:hyperlink>
-      <w:r>
-        <w:t xml:space="preserve">,</w:t>
-      </w:r>
-      <w:r>
-        <w:t xml:space="preserve"> </w:t>
-      </w:r>
-      <w:r>
-        <w:t xml:space="preserve">so it is a</w:t>
+      </m:oMath>
+      <w:r>
+        <w:t xml:space="preserve"> </w:t>
+      </w:r>
+      <w:r>
+        <w:t xml:space="preserve">is a probability measure.</w:t>
+      </w:r>
+      <w:r>
+        <w:t xml:space="preserve"> </w:t>
+      </w:r>
+      <w:r>
+        <w:t xml:space="preserve">It is a</w:t>
       </w:r>
       <w:r>
         <w:t xml:space="preserve"> </w:t>
@@ -10240,53 +10317,83 @@
         </w:r>
       </w:hyperlink>
       <w:r>
-        <w:t xml:space="preserve"> </w:t>
-      </w:r>
-      <w:r>
-        <w:t xml:space="preserve">on the events of</w:t>
-      </w:r>
-      <w:r>
-        <w:t xml:space="preserve"> </w:t>
-      </w:r>
-      <m:oMath>
+        <w:t xml:space="preserve">, so its values lie in</w:t>
+      </w:r>
+      <w:r>
+        <w:t xml:space="preserve"> </w:t>
+      </w:r>
+      <m:oMath>
+        <m:r>
+          <m:rPr>
+            <m:sty m:val="p"/>
+          </m:rPr>
+          <m:t>[</m:t>
+        </m:r>
+        <m:r>
+          <m:t>0</m:t>
+        </m:r>
+        <m:r>
+          <m:rPr>
+            <m:sty m:val="p"/>
+          </m:rPr>
+          <m:t>,</m:t>
+        </m:r>
+        <m:r>
+          <m:rPr>
+            <m:sty m:val="p"/>
+          </m:rPr>
+          <m:t>∞</m:t>
+        </m:r>
+        <m:r>
+          <m:rPr>
+            <m:sty m:val="p"/>
+          </m:rPr>
+          <m:t>]</m:t>
+        </m:r>
+      </m:oMath>
+      <w:r>
+        <w:t xml:space="preserve">,</w:t>
+      </w:r>
+      <w:r>
+        <w:t xml:space="preserve"> </w:t>
+      </w:r>
+      <w:r>
+        <w:t xml:space="preserve">which gives axiom 1,</w:t>
+      </w:r>
+      <w:r>
+        <w:t xml:space="preserve"> </w:t>
+      </w:r>
+      <w:r>
+        <w:t xml:space="preserve">and it is countably additive, which is axiom 3.</w:t>
+      </w:r>
+      <w:r>
+        <w:t xml:space="preserve"> </w:t>
+      </w:r>
+      <w:r>
+        <w:t xml:space="preserve">Axiom 2 is the condition</w:t>
+      </w:r>
+      <w:r>
+        <w:t xml:space="preserve"> </w:t>
+      </w:r>
+      <m:oMath>
+        <m:r>
+          <m:rPr>
+            <m:sty m:val="p"/>
+          </m:rPr>
+          <m:t>Pr</m:t>
+        </m:r>
+        <m:r>
+          <m:rPr>
+            <m:sty m:val="p"/>
+          </m:rPr>
+          <m:t>(</m:t>
+        </m:r>
         <m:r>
           <m:rPr>
             <m:sty m:val="p"/>
           </m:rPr>
           <m:t>Ω</m:t>
         </m:r>
-      </m:oMath>
-      <w:r>
-        <w:t xml:space="preserve">,</w:t>
-      </w:r>
-      <w:r>
-        <w:t xml:space="preserve"> </w:t>
-      </w:r>
-      <w:r>
-        <w:t xml:space="preserve">and it gives</w:t>
-      </w:r>
-      <w:r>
-        <w:t xml:space="preserve"> </w:t>
-      </w:r>
-      <m:oMath>
-        <m:r>
-          <m:rPr>
-            <m:sty m:val="p"/>
-          </m:rPr>
-          <m:t>Pr</m:t>
-        </m:r>
-        <m:r>
-          <m:rPr>
-            <m:sty m:val="p"/>
-          </m:rPr>
-          <m:t>(</m:t>
-        </m:r>
-        <m:r>
-          <m:rPr>
-            <m:sty m:val="p"/>
-          </m:rPr>
-          <m:t>Ω</m:t>
-        </m:r>
         <m:r>
           <m:rPr>
             <m:sty m:val="p"/>
@@ -10300,177 +10407,540 @@
           <m:t>=</m:t>
         </m:r>
         <m:r>
-          <m:t>6</m:t>
-        </m:r>
-        <m:r>
-          <m:rPr>
-            <m:sty m:val="p"/>
-          </m:rPr>
-          <m:t>/</m:t>
-        </m:r>
-        <m:r>
-          <m:t>6</m:t>
-        </m:r>
-        <m:r>
-          <m:rPr>
-            <m:sty m:val="p"/>
-          </m:rPr>
-          <m:t>=</m:t>
-        </m:r>
-        <m:r>
           <m:t>1</m:t>
         </m:r>
       </m:oMath>
       <w:r>
-        <w:t xml:space="preserve">.</w:t>
-      </w:r>
-      <w:r>
-        <w:t xml:space="preserve"> </w:t>
-      </w:r>
-      <w:r>
-        <w:t xml:space="preserve">The event</w:t>
-      </w:r>
-      <w:r>
-        <w:t xml:space="preserve"> </w:t>
-      </w:r>
-      <w:r>
-        <w:t xml:space="preserve">“the roll is even”</w:t>
-      </w:r>
-      <w:r>
-        <w:t xml:space="preserve"> </w:t>
-      </w:r>
-      <w:r>
-        <w:t xml:space="preserve">from</w:t>
-      </w:r>
-      <w:r>
-        <w:t xml:space="preserve"> </w:t>
-      </w:r>
-      <w:hyperlink w:anchor="exm-event">
+        <w:t xml:space="preserve"> </w:t>
+      </w:r>
+      <w:r>
+        <w:t xml:space="preserve">in</w:t>
+      </w:r>
+      <w:r>
+        <w:t xml:space="preserve"> </w:t>
+      </w:r>
+      <w:hyperlink w:anchor="def-probability">
         <w:r>
           <w:rPr>
             <w:rStyle w:val="Hyperlink"/>
           </w:rPr>
-          <w:t xml:space="preserve">Example 3</w:t>
+          <w:t xml:space="preserve">Definition 12</w:t>
         </w:r>
       </w:hyperlink>
       <w:r>
-        <w:t xml:space="preserve"> </w:t>
-      </w:r>
-      <w:r>
-        <w:t xml:space="preserve">has probability</w:t>
-      </w:r>
-      <w:r>
-        <w:t xml:space="preserve"> </w:t>
-      </w:r>
-      <m:oMath>
-        <m:r>
-          <m:rPr>
-            <m:sty m:val="p"/>
-          </m:rPr>
-          <m:t>Pr</m:t>
-        </m:r>
-        <m:r>
-          <m:rPr>
-            <m:sty m:val="p"/>
-          </m:rPr>
-          <m:t>(</m:t>
-        </m:r>
-        <m:r>
-          <m:t>​</m:t>
-        </m:r>
-        <m:d>
-          <m:dPr>
-            <m:begChr m:val="{"/>
-            <m:sepChr m:val=""/>
-            <m:endChr m:val="}"/>
-            <m:grow/>
-          </m:dPr>
-          <m:e>
-            <m:r>
-              <m:t>2</m:t>
-            </m:r>
-            <m:r>
-              <m:rPr>
-                <m:sty m:val="p"/>
-              </m:rPr>
-              <m:t>,</m:t>
-            </m:r>
-            <m:r>
-              <m:t>4</m:t>
-            </m:r>
-            <m:r>
-              <m:rPr>
-                <m:sty m:val="p"/>
-              </m:rPr>
-              <m:t>,</m:t>
-            </m:r>
-            <m:r>
-              <m:t>6</m:t>
-            </m:r>
-          </m:e>
-        </m:d>
-        <m:r>
-          <m:t>​</m:t>
-        </m:r>
-        <m:r>
-          <m:rPr>
-            <m:sty m:val="p"/>
-          </m:rPr>
-          <m:t>)</m:t>
-        </m:r>
-        <m:r>
-          <m:rPr>
-            <m:sty m:val="p"/>
-          </m:rPr>
-          <m:t>=</m:t>
-        </m:r>
-        <m:r>
-          <m:t>3</m:t>
-        </m:r>
-        <m:r>
-          <m:rPr>
-            <m:sty m:val="p"/>
-          </m:rPr>
-          <m:t>/</m:t>
-        </m:r>
-        <m:r>
-          <m:t>6</m:t>
-        </m:r>
-        <m:r>
-          <m:rPr>
-            <m:sty m:val="p"/>
-          </m:rPr>
-          <m:t>=</m:t>
-        </m:r>
-        <m:r>
-          <m:t>1</m:t>
-        </m:r>
-        <m:r>
-          <m:rPr>
-            <m:sty m:val="p"/>
-          </m:rPr>
-          <m:t>/</m:t>
-        </m:r>
-        <m:r>
-          <m:t>2</m:t>
-        </m:r>
-      </m:oMath>
-      <w:r>
         <w:t xml:space="preserve">.</w:t>
       </w:r>
     </w:p>
-    <w:bookmarkEnd w:id="39"/>
-    <w:bookmarkStart w:id="40" w:name="thm-prob-subset"/>
     <w:p>
       <w:pPr>
         <w:pStyle w:val="BodyText"/>
       </w:pPr>
       <w:r>
+        <w:t xml:space="preserve">Conversely, suppose</w:t>
+      </w:r>
+      <w:r>
+        <w:t xml:space="preserve"> </w:t>
+      </w:r>
+      <m:oMath>
+        <m:r>
+          <m:rPr>
+            <m:sty m:val="p"/>
+          </m:rPr>
+          <m:t>Pr</m:t>
+        </m:r>
+      </m:oMath>
+      <w:r>
+        <w:t xml:space="preserve"> </w:t>
+      </w:r>
+      <w:r>
+        <w:t xml:space="preserve">satisfies the three axioms.</w:t>
+      </w:r>
+      <w:r>
+        <w:t xml:space="preserve"> </w:t>
+      </w:r>
+      <w:r>
+        <w:t xml:space="preserve">By axiom 1,</w:t>
+      </w:r>
+      <w:r>
+        <w:t xml:space="preserve"> </w:t>
+      </w:r>
+      <m:oMath>
+        <m:r>
+          <m:rPr>
+            <m:sty m:val="p"/>
+          </m:rPr>
+          <m:t>Pr</m:t>
+        </m:r>
+      </m:oMath>
+      <w:r>
+        <w:t xml:space="preserve"> </w:t>
+      </w:r>
+      <w:r>
+        <w:t xml:space="preserve">takes values in</w:t>
+      </w:r>
+      <w:r>
+        <w:t xml:space="preserve"> </w:t>
+      </w:r>
+      <m:oMath>
+        <m:r>
+          <m:rPr>
+            <m:sty m:val="p"/>
+          </m:rPr>
+          <m:t>[</m:t>
+        </m:r>
+        <m:r>
+          <m:t>0</m:t>
+        </m:r>
+        <m:r>
+          <m:rPr>
+            <m:sty m:val="p"/>
+          </m:rPr>
+          <m:t>,</m:t>
+        </m:r>
+        <m:r>
+          <m:rPr>
+            <m:sty m:val="p"/>
+          </m:rPr>
+          <m:t>∞</m:t>
+        </m:r>
+        <m:r>
+          <m:rPr>
+            <m:sty m:val="p"/>
+          </m:rPr>
+          <m:t>]</m:t>
+        </m:r>
+      </m:oMath>
+      <w:r>
+        <w:t xml:space="preserve">,</w:t>
+      </w:r>
+      <w:r>
+        <w:t xml:space="preserve"> </w:t>
+      </w:r>
+      <w:r>
+        <w:t xml:space="preserve">so axiom 3 says</w:t>
+      </w:r>
+      <w:r>
+        <w:t xml:space="preserve"> </w:t>
+      </w:r>
+      <m:oMath>
+        <m:r>
+          <m:rPr>
+            <m:sty m:val="p"/>
+          </m:rPr>
+          <m:t>Pr</m:t>
+        </m:r>
+      </m:oMath>
+      <w:r>
+        <w:t xml:space="preserve"> </w:t>
+      </w:r>
+      <w:r>
+        <w:t xml:space="preserve">is countably additive in the sense of</w:t>
+      </w:r>
+      <w:r>
+        <w:t xml:space="preserve"> </w:t>
+      </w:r>
+      <w:hyperlink w:anchor="def-countable-additivity">
+        <w:r>
+          <w:rPr>
+            <w:rStyle w:val="Hyperlink"/>
+          </w:rPr>
+          <w:t xml:space="preserve">Definition 9</w:t>
+        </w:r>
+      </w:hyperlink>
+      <w:r>
+        <w:t xml:space="preserve">.</w:t>
+      </w:r>
+      <w:r>
+        <w:t xml:space="preserve"> </w:t>
+      </w:r>
+      <w:r>
+        <w:t xml:space="preserve">Then, by</w:t>
+      </w:r>
+      <w:r>
+        <w:t xml:space="preserve"> </w:t>
+      </w:r>
+      <w:hyperlink w:anchor="lem-countable-additivity-empty">
+        <w:r>
+          <w:rPr>
+            <w:rStyle w:val="Hyperlink"/>
+          </w:rPr>
+          <w:t xml:space="preserve">Lemma 1</w:t>
+        </w:r>
+      </w:hyperlink>
+      <w:r>
+        <w:t xml:space="preserve">,</w:t>
+      </w:r>
+      <w:r>
+        <w:t xml:space="preserve"> </w:t>
+      </w:r>
+      <m:oMath>
+        <m:r>
+          <m:rPr>
+            <m:sty m:val="p"/>
+          </m:rPr>
+          <m:t>Pr</m:t>
+        </m:r>
+        <m:r>
+          <m:rPr>
+            <m:sty m:val="p"/>
+          </m:rPr>
+          <m:t>(</m:t>
+        </m:r>
+        <m:r>
+          <m:rPr>
+            <m:sty m:val="p"/>
+          </m:rPr>
+          <m:t>∅</m:t>
+        </m:r>
+        <m:r>
+          <m:rPr>
+            <m:sty m:val="p"/>
+          </m:rPr>
+          <m:t>)</m:t>
+        </m:r>
+      </m:oMath>
+      <w:r>
+        <w:t xml:space="preserve"> </w:t>
+      </w:r>
+      <w:r>
+        <w:t xml:space="preserve">is 0 or</w:t>
+      </w:r>
+      <w:r>
+        <w:t xml:space="preserve"> </w:t>
+      </w:r>
+      <m:oMath>
+        <m:r>
+          <m:rPr>
+            <m:sty m:val="p"/>
+          </m:rPr>
+          <m:t>∞</m:t>
+        </m:r>
+      </m:oMath>
+      <w:r>
+        <w:t xml:space="preserve">;</w:t>
+      </w:r>
+      <w:r>
+        <w:t xml:space="preserve"> </w:t>
+      </w:r>
+      <m:oMath>
+        <m:r>
+          <m:rPr>
+            <m:sty m:val="p"/>
+          </m:rPr>
+          <m:t>Pr</m:t>
+        </m:r>
+        <m:r>
+          <m:rPr>
+            <m:sty m:val="p"/>
+          </m:rPr>
+          <m:t>(</m:t>
+        </m:r>
+        <m:r>
+          <m:rPr>
+            <m:sty m:val="p"/>
+          </m:rPr>
+          <m:t>∅</m:t>
+        </m:r>
+        <m:r>
+          <m:rPr>
+            <m:sty m:val="p"/>
+          </m:rPr>
+          <m:t>)</m:t>
+        </m:r>
+      </m:oMath>
+      <w:r>
+        <w:t xml:space="preserve"> </w:t>
+      </w:r>
+      <w:r>
+        <w:t xml:space="preserve">is a real number, so</w:t>
+      </w:r>
+      <w:r>
+        <w:t xml:space="preserve"> </w:t>
+      </w:r>
+      <m:oMath>
+        <m:r>
+          <m:rPr>
+            <m:sty m:val="p"/>
+          </m:rPr>
+          <m:t>Pr</m:t>
+        </m:r>
+        <m:r>
+          <m:rPr>
+            <m:sty m:val="p"/>
+          </m:rPr>
+          <m:t>(</m:t>
+        </m:r>
+        <m:r>
+          <m:rPr>
+            <m:sty m:val="p"/>
+          </m:rPr>
+          <m:t>∅</m:t>
+        </m:r>
+        <m:r>
+          <m:rPr>
+            <m:sty m:val="p"/>
+          </m:rPr>
+          <m:t>)</m:t>
+        </m:r>
+        <m:r>
+          <m:rPr>
+            <m:sty m:val="p"/>
+          </m:rPr>
+          <m:t>=</m:t>
+        </m:r>
+        <m:r>
+          <m:t>0</m:t>
+        </m:r>
+      </m:oMath>
+      <w:r>
+        <w:t xml:space="preserve">.</w:t>
+      </w:r>
+      <w:r>
+        <w:t xml:space="preserve"> </w:t>
+      </w:r>
+      <w:r>
+        <w:t xml:space="preserve">So</w:t>
+      </w:r>
+      <w:r>
+        <w:t xml:space="preserve"> </w:t>
+      </w:r>
+      <m:oMath>
+        <m:r>
+          <m:rPr>
+            <m:sty m:val="p"/>
+          </m:rPr>
+          <m:t>Pr</m:t>
+        </m:r>
+      </m:oMath>
+      <w:r>
+        <w:t xml:space="preserve"> </w:t>
+      </w:r>
+      <w:r>
+        <w:t xml:space="preserve">satisfies both conditions of</w:t>
+      </w:r>
+      <w:r>
+        <w:t xml:space="preserve"> </w:t>
+      </w:r>
+      <w:hyperlink w:anchor="def-measure">
+        <w:r>
+          <w:rPr>
+            <w:rStyle w:val="Hyperlink"/>
+          </w:rPr>
+          <w:t xml:space="preserve">Definition 10</w:t>
+        </w:r>
+      </w:hyperlink>
+      <w:r>
+        <w:t xml:space="preserve"> </w:t>
+      </w:r>
+      <w:r>
+        <w:t xml:space="preserve">(</w:t>
+      </w:r>
+      <m:oMath>
+        <m:r>
+          <m:rPr>
+            <m:sty m:val="p"/>
+          </m:rPr>
+          <m:t>Pr</m:t>
+        </m:r>
+        <m:r>
+          <m:rPr>
+            <m:sty m:val="p"/>
+          </m:rPr>
+          <m:t>(</m:t>
+        </m:r>
+        <m:r>
+          <m:rPr>
+            <m:sty m:val="p"/>
+          </m:rPr>
+          <m:t>∅</m:t>
+        </m:r>
+        <m:r>
+          <m:rPr>
+            <m:sty m:val="p"/>
+          </m:rPr>
+          <m:t>)</m:t>
+        </m:r>
+        <m:r>
+          <m:rPr>
+            <m:sty m:val="p"/>
+          </m:rPr>
+          <m:t>=</m:t>
+        </m:r>
+        <m:r>
+          <m:t>0</m:t>
+        </m:r>
+      </m:oMath>
+      <w:r>
+        <w:t xml:space="preserve"> </w:t>
+      </w:r>
+      <w:r>
+        <w:t xml:space="preserve">and countable additivity)</w:t>
+      </w:r>
+      <w:r>
+        <w:t xml:space="preserve"> </w:t>
+      </w:r>
+      <w:r>
+        <w:t xml:space="preserve">and is a measure on the events of</w:t>
+      </w:r>
+      <w:r>
+        <w:t xml:space="preserve"> </w:t>
+      </w:r>
+      <m:oMath>
+        <m:r>
+          <m:rPr>
+            <m:sty m:val="p"/>
+          </m:rPr>
+          <m:t>Ω</m:t>
+        </m:r>
+      </m:oMath>
+      <w:r>
+        <w:t xml:space="preserve">.</w:t>
+      </w:r>
+      <w:r>
+        <w:t xml:space="preserve"> </w:t>
+      </w:r>
+      <w:r>
+        <w:t xml:space="preserve">With axiom 2,</w:t>
+      </w:r>
+      <w:r>
+        <w:t xml:space="preserve"> </w:t>
+      </w:r>
+      <m:oMath>
+        <m:r>
+          <m:rPr>
+            <m:sty m:val="p"/>
+          </m:rPr>
+          <m:t>Pr</m:t>
+        </m:r>
+      </m:oMath>
+      <w:r>
+        <w:t xml:space="preserve"> </w:t>
+      </w:r>
+      <w:r>
+        <w:t xml:space="preserve">is a probability measure (</w:t>
+      </w:r>
+      <w:hyperlink w:anchor="def-probability">
+        <w:r>
+          <w:rPr>
+            <w:rStyle w:val="Hyperlink"/>
+          </w:rPr>
+          <w:t xml:space="preserve">Definition 12</w:t>
+        </w:r>
+      </w:hyperlink>
+      <w:r>
+        <w:t xml:space="preserve">).</w:t>
+      </w:r>
+    </w:p>
+    <w:p>
+      <w:pPr>
+        <w:pStyle w:val="BodyText"/>
+      </w:pPr>
+      <w:r>
+        <w:t xml:space="preserve">Many sources define a probability measure by these three axioms instead;</w:t>
+      </w:r>
+      <w:r>
+        <w:t xml:space="preserve"> </w:t>
+      </w:r>
+      <w:r>
+        <w:t xml:space="preserve">the theorem shows that the two definitions agree.</w:t>
+      </w:r>
+      <w:r>
+        <w:t xml:space="preserve"> </w:t>
+      </w:r>
+      <w:r>
+        <w:t xml:space="preserve">The axioms are named for Kolmogorov,</w:t>
+      </w:r>
+      <w:r>
+        <w:t xml:space="preserve"> </w:t>
+      </w:r>
+      <w:r>
+        <w:t xml:space="preserve">who introduced them in 1933</w:t>
+      </w:r>
+      <w:r>
+        <w:t xml:space="preserve"> </w:t>
+      </w:r>
+      <w:r>
+        <w:t xml:space="preserve">(see</w:t>
+      </w:r>
+      <w:r>
+        <w:t xml:space="preserve"> </w:t>
+      </w:r>
+      <w:hyperlink r:id="rId41">
+        <w:r>
+          <w:rPr>
+            <w:rStyle w:val="Hyperlink"/>
+          </w:rPr>
+          <w:t xml:space="preserve">Wikipedia: Probability axioms</w:t>
+        </w:r>
+      </w:hyperlink>
+      <w:r>
+        <w:t xml:space="preserve">).</w:t>
+      </w:r>
+      <w:r>
+        <w:t xml:space="preserve"> </w:t>
+      </w:r>
+      <w:r>
+        <w:t xml:space="preserve">The axiom form does not list</w:t>
+      </w:r>
+      <w:r>
+        <w:t xml:space="preserve"> </w:t>
+      </w:r>
+      <m:oMath>
+        <m:r>
+          <m:rPr>
+            <m:sty m:val="p"/>
+          </m:rPr>
+          <m:t>Pr</m:t>
+        </m:r>
+        <m:r>
+          <m:rPr>
+            <m:sty m:val="p"/>
+          </m:rPr>
+          <m:t>(</m:t>
+        </m:r>
+        <m:r>
+          <m:rPr>
+            <m:sty m:val="p"/>
+          </m:rPr>
+          <m:t>∅</m:t>
+        </m:r>
+        <m:r>
+          <m:rPr>
+            <m:sty m:val="p"/>
+          </m:rPr>
+          <m:t>)</m:t>
+        </m:r>
+        <m:r>
+          <m:rPr>
+            <m:sty m:val="p"/>
+          </m:rPr>
+          <m:t>=</m:t>
+        </m:r>
+        <m:r>
+          <m:t>0</m:t>
+        </m:r>
+      </m:oMath>
+      <w:r>
+        <w:t xml:space="preserve">;</w:t>
+      </w:r>
+      <w:r>
+        <w:t xml:space="preserve"> </w:t>
+      </w:r>
+      <w:r>
+        <w:t xml:space="preserve">the proof above derives it.</w:t>
+      </w:r>
+    </w:p>
+    <w:bookmarkStart w:id="42" w:name="thm-prob-subset"/>
+    <w:p>
+      <w:pPr>
+        <w:pStyle w:val="BodyText"/>
+      </w:pPr>
+      <w:r>
         <w:rPr>
           <w:b/>
           <w:bCs/>
         </w:rPr>
-        <w:t xml:space="preserve">Theorem 2 (Probability of a subset’s intersection)</w:t>
+        <w:t xml:space="preserve">Theorem 3 (Probability of a subset’s intersection)</w:t>
       </w:r>
       <w:r>
         <w:t xml:space="preserve"> </w:t>
@@ -10592,7 +11062,7 @@
         <w:t xml:space="preserve">.</w:t>
       </w:r>
     </w:p>
-    <w:bookmarkEnd w:id="40"/>
+    <w:bookmarkEnd w:id="42"/>
     <w:p>
       <w:pPr>
         <w:pStyle w:val="BodyText"/>
@@ -10756,7 +11226,7 @@
         <w:t xml:space="preserve">.</w:t>
       </w:r>
     </w:p>
-    <w:bookmarkStart w:id="41" w:name="thm-total-prob-1"/>
+    <w:bookmarkStart w:id="43" w:name="thm-total-prob-1"/>
     <w:p>
       <w:pPr>
         <w:pStyle w:val="BodyText"/>
@@ -10766,7 +11236,7 @@
           <w:b/>
           <w:bCs/>
         </w:rPr>
-        <w:t xml:space="preserve">Theorem 3 (An event and its complement sum to 1)</w:t>
+        <w:t xml:space="preserve">Theorem 4 (An event and its complement sum to 1)</w:t>
       </w:r>
       <w:r>
         <w:t xml:space="preserve"> </w:t>
@@ -10892,7 +11362,7 @@
         </m:oMath>
       </m:oMathPara>
     </w:p>
-    <w:bookmarkEnd w:id="41"/>
+    <w:bookmarkEnd w:id="43"/>
     <w:p>
       <w:pPr>
         <w:pStyle w:val="FirstParagraph"/>
@@ -11199,7 +11669,7 @@
         </m:oMath>
       </m:oMathPara>
     </w:p>
-    <w:bookmarkStart w:id="42" w:name="cor-p-neg0"/>
+    <w:bookmarkStart w:id="44" w:name="cor-p-neg0"/>
     <w:p>
       <w:pPr>
         <w:pStyle w:val="FirstParagraph"/>
@@ -11304,7 +11774,7 @@
         </m:oMath>
       </m:oMathPara>
     </w:p>
-    <w:bookmarkEnd w:id="42"/>
+    <w:bookmarkEnd w:id="44"/>
     <w:p>
       <w:pPr>
         <w:pStyle w:val="FirstParagraph"/>
@@ -11362,14 +11832,14 @@
           <w:rPr>
             <w:rStyle w:val="Hyperlink"/>
           </w:rPr>
-          <w:t xml:space="preserve">Theorem 3</w:t>
+          <w:t xml:space="preserve">Theorem 4</w:t>
         </w:r>
       </w:hyperlink>
       <w:r>
         <w:t xml:space="preserve">.</w:t>
       </w:r>
     </w:p>
-    <w:bookmarkStart w:id="43" w:name="cor-p-neg"/>
+    <w:bookmarkStart w:id="45" w:name="cor-p-neg"/>
     <w:p>
       <w:pPr>
         <w:pStyle w:val="BodyText"/>
@@ -11529,7 +11999,7 @@
         </m:oMath>
       </m:oMathPara>
     </w:p>
-    <w:bookmarkEnd w:id="43"/>
+    <w:bookmarkEnd w:id="45"/>
     <w:p>
       <w:pPr>
         <w:pStyle w:val="FirstParagraph"/>
@@ -11713,7 +12183,7 @@
         </m:oMath>
       </m:oMathPara>
     </w:p>
-    <w:bookmarkStart w:id="44" w:name="exm-p-neg"/>
+    <w:bookmarkStart w:id="46" w:name="exm-p-neg"/>
     <w:p>
       <w:pPr>
         <w:pStyle w:val="FirstParagraph"/>
@@ -11843,9 +12313,9 @@
         <w:t xml:space="preserve">.</w:t>
       </w:r>
     </w:p>
-    <w:bookmarkEnd w:id="44"/>
-    <w:bookmarkEnd w:id="45"/>
-    <w:bookmarkStart w:id="58" w:name="conditional-probability"/>
+    <w:bookmarkEnd w:id="46"/>
+    <w:bookmarkEnd w:id="47"/>
+    <w:bookmarkStart w:id="60" w:name="conditional-probability"/>
     <w:p>
       <w:pPr>
         <w:pStyle w:val="Heading2"/>
@@ -11854,7 +12324,7 @@
         <w:t xml:space="preserve">2 Conditional probability</w:t>
       </w:r>
     </w:p>
-    <w:bookmarkStart w:id="46" w:name="def-conditional-prob"/>
+    <w:bookmarkStart w:id="48" w:name="def-conditional-prob"/>
     <w:p>
       <w:pPr>
         <w:pStyle w:val="FirstParagraph"/>
@@ -12151,8 +12621,8 @@
         </m:oMath>
       </m:oMathPara>
     </w:p>
-    <w:bookmarkEnd w:id="46"/>
-    <w:bookmarkStart w:id="47" w:name="exm-conditional-prob"/>
+    <w:bookmarkEnd w:id="48"/>
+    <w:bookmarkStart w:id="49" w:name="exm-conditional-prob"/>
     <w:p>
       <w:pPr>
         <w:pStyle w:val="FirstParagraph"/>
@@ -12556,8 +13026,8 @@
         </m:oMath>
       </m:oMathPara>
     </w:p>
-    <w:bookmarkEnd w:id="47"/>
-    <w:bookmarkStart w:id="48" w:name="thm-law-conditional-prob"/>
+    <w:bookmarkEnd w:id="49"/>
+    <w:bookmarkStart w:id="50" w:name="thm-law-conditional-prob"/>
     <w:p>
       <w:pPr>
         <w:pStyle w:val="FirstParagraph"/>
@@ -12567,7 +13037,7 @@
           <w:b/>
           <w:bCs/>
         </w:rPr>
-        <w:t xml:space="preserve">Theorem 4 (Law of conditional probability)</w:t>
+        <w:t xml:space="preserve">Theorem 5 (Law of conditional probability)</w:t>
       </w:r>
       <w:r>
         <w:t xml:space="preserve"> </w:t>
@@ -12747,7 +13217,7 @@
         </m:oMath>
       </m:oMathPara>
     </w:p>
-    <w:bookmarkEnd w:id="48"/>
+    <w:bookmarkEnd w:id="50"/>
     <w:p>
       <w:pPr>
         <w:pStyle w:val="FirstParagraph"/>
@@ -13047,7 +13517,7 @@
         </m:oMath>
       </m:oMathPara>
     </w:p>
-    <w:bookmarkStart w:id="49" w:name="exm-law-conditional-prob"/>
+    <w:bookmarkStart w:id="51" w:name="exm-law-conditional-prob"/>
     <w:p>
       <w:pPr>
         <w:pStyle w:val="FirstParagraph"/>
@@ -13172,7 +13642,7 @@
           <w:rPr>
             <w:rStyle w:val="Hyperlink"/>
           </w:rPr>
-          <w:t xml:space="preserve">Theorem 4</w:t>
+          <w:t xml:space="preserve">Theorem 5</w:t>
         </w:r>
       </w:hyperlink>
       <w:r>
@@ -13379,8 +13849,8 @@
         </m:oMath>
       </m:oMathPara>
     </w:p>
-    <w:bookmarkEnd w:id="49"/>
-    <w:bookmarkStart w:id="50" w:name="thm-total-prob"/>
+    <w:bookmarkEnd w:id="51"/>
+    <w:bookmarkStart w:id="52" w:name="thm-total-prob"/>
     <w:p>
       <w:pPr>
         <w:pStyle w:val="FirstParagraph"/>
@@ -13390,7 +13860,7 @@
           <w:b/>
           <w:bCs/>
         </w:rPr>
-        <w:t xml:space="preserve">Theorem 5 (Law of total probability)</w:t>
+        <w:t xml:space="preserve">Theorem 6 (Law of total probability)</w:t>
       </w:r>
       <w:r>
         <w:t xml:space="preserve"> </w:t>
@@ -13687,7 +14157,7 @@
         </m:oMath>
       </m:oMathPara>
     </w:p>
-    <w:bookmarkEnd w:id="50"/>
+    <w:bookmarkEnd w:id="52"/>
     <w:p>
       <w:pPr>
         <w:pStyle w:val="FirstParagraph"/>
@@ -13883,7 +14353,7 @@
           <w:rPr>
             <w:rStyle w:val="Hyperlink"/>
           </w:rPr>
-          <w:t xml:space="preserve">Theorem 4</w:t>
+          <w:t xml:space="preserve">Theorem 5</w:t>
         </w:r>
       </w:hyperlink>
       <w:r>
@@ -14183,7 +14653,7 @@
         </m:oMath>
       </m:oMathPara>
     </w:p>
-    <w:bookmarkStart w:id="51" w:name="thm-bayes"/>
+    <w:bookmarkStart w:id="53" w:name="thm-bayes"/>
     <w:p>
       <w:pPr>
         <w:pStyle w:val="FirstParagraph"/>
@@ -14193,7 +14663,7 @@
           <w:b/>
           <w:bCs/>
         </w:rPr>
-        <w:t xml:space="preserve">Theorem 6 (Bayes’ theorem)</w:t>
+        <w:t xml:space="preserve">Theorem 7 (Bayes’ theorem)</w:t>
       </w:r>
       <w:r>
         <w:t xml:space="preserve"> </w:t>
@@ -14444,7 +14914,7 @@
         </m:oMath>
       </m:oMathPara>
     </w:p>
-    <w:bookmarkEnd w:id="51"/>
+    <w:bookmarkEnd w:id="53"/>
     <w:p>
       <w:pPr>
         <w:pStyle w:val="FirstParagraph"/>
@@ -14487,7 +14957,7 @@
           <w:rPr>
             <w:rStyle w:val="Hyperlink"/>
           </w:rPr>
-          <w:t xml:space="preserve">Theorem 4</w:t>
+          <w:t xml:space="preserve">Theorem 5</w:t>
         </w:r>
       </w:hyperlink>
       <w:r>
@@ -14891,7 +15361,7 @@
         </m:oMath>
       </m:oMathPara>
     </w:p>
-    <w:bookmarkStart w:id="52" w:name="exm-bayes"/>
+    <w:bookmarkStart w:id="54" w:name="exm-bayes"/>
     <w:p>
       <w:pPr>
         <w:pStyle w:val="FirstParagraph"/>
@@ -14987,7 +15457,7 @@
         <w:pStyle w:val="Compact"/>
         <w:numPr>
           <w:ilvl w:val="0"/>
-          <w:numId w:val="1006"/>
+          <w:numId w:val="1005"/>
         </w:numPr>
       </w:pPr>
       <m:oMath>
@@ -15046,7 +15516,7 @@
         <w:pStyle w:val="Compact"/>
         <w:numPr>
           <w:ilvl w:val="0"/>
-          <w:numId w:val="1006"/>
+          <w:numId w:val="1005"/>
         </w:numPr>
       </w:pPr>
       <m:oMath>
@@ -15194,7 +15664,7 @@
         <w:pStyle w:val="Compact"/>
         <w:numPr>
           <w:ilvl w:val="0"/>
-          <w:numId w:val="1006"/>
+          <w:numId w:val="1005"/>
         </w:numPr>
       </w:pPr>
       <m:oMath>
@@ -15251,7 +15721,7 @@
           <w:rPr>
             <w:rStyle w:val="Hyperlink"/>
           </w:rPr>
-          <w:t xml:space="preserve">Theorem 6</w:t>
+          <w:t xml:space="preserve">Theorem 7</w:t>
         </w:r>
       </w:hyperlink>
       <w:r>
@@ -15917,7 +16387,7 @@
         <w:t xml:space="preserve">because the disease prevalence is relatively low (7%).</w:t>
       </w:r>
     </w:p>
-    <w:bookmarkEnd w:id="52"/>
+    <w:bookmarkEnd w:id="54"/>
     <w:tbl>
       <w:tblPr>
         <w:tblStyle w:val="Table"/>
@@ -15959,18 +16429,18 @@
                 <wp:inline>
                   <wp:extent cx="152400" cy="152400"/>
                   <wp:effectExtent b="0" l="0" r="0" t="0"/>
-                  <wp:docPr descr="" title="" id="54" name="Picture"/>
+                  <wp:docPr descr="" title="" id="56" name="Picture"/>
                   <a:graphic>
                     <a:graphicData uri="http://schemas.openxmlformats.org/drawingml/2006/picture">
                       <pic:pic>
                         <pic:nvPicPr>
-                          <pic:cNvPr descr="/opt/quarto/share/formats/docx/tip.png" id="55" name="Picture"/>
+                          <pic:cNvPr descr="/opt/quarto/share/formats/docx/tip.png" id="57" name="Picture"/>
                           <pic:cNvPicPr>
                             <a:picLocks noChangeArrowheads="1" noChangeAspect="1"/>
                           </pic:cNvPicPr>
                         </pic:nvPicPr>
                         <pic:blipFill>
-                          <a:blip r:embed="rId53"/>
+                          <a:blip r:embed="rId55"/>
                           <a:stretch>
                             <a:fillRect/>
                           </a:stretch>
@@ -16032,7 +16502,7 @@
             <w:r>
               <w:t xml:space="preserve"> </w:t>
             </w:r>
-            <w:hyperlink r:id="rId56">
+            <w:hyperlink r:id="rId58">
               <w:r>
                 <w:rPr>
                   <w:rStyle w:val="Hyperlink"/>
@@ -16076,7 +16546,7 @@
             <w:r>
               <w:t xml:space="preserve"> </w:t>
             </w:r>
-            <w:hyperlink r:id="rId57">
+            <w:hyperlink r:id="rId59">
               <w:r>
                 <w:rPr>
                   <w:rStyle w:val="Hyperlink"/>
@@ -16092,8 +16562,8 @@
         </w:tc>
       </w:tr>
     </w:tbl>
-    <w:bookmarkEnd w:id="58"/>
-    <w:bookmarkStart w:id="62" w:name="references"/>
+    <w:bookmarkEnd w:id="60"/>
+    <w:bookmarkStart w:id="64" w:name="references"/>
     <w:p>
       <w:pPr>
         <w:pStyle w:val="Heading2"/>
@@ -16102,8 +16572,8 @@
         <w:t xml:space="preserve">References</w:t>
       </w:r>
     </w:p>
-    <w:bookmarkStart w:id="61" w:name="refs"/>
-    <w:bookmarkStart w:id="60" w:name="ref-hutchinson_wwu_ml_videos"/>
+    <w:bookmarkStart w:id="63" w:name="refs"/>
+    <w:bookmarkStart w:id="62" w:name="ref-hutchinson_wwu_ml_videos"/>
     <w:p>
       <w:pPr>
         <w:pStyle w:val="Bibliography"/>
@@ -16169,7 +16639,7 @@
       <w:r>
         <w:t xml:space="preserve"> </w:t>
       </w:r>
-      <w:hyperlink r:id="rId59">
+      <w:hyperlink r:id="rId61">
         <w:r>
           <w:rPr>
             <w:rStyle w:val="Hyperlink"/>
@@ -16181,9 +16651,9 @@
         <w:t xml:space="preserve">.</w:t>
       </w:r>
     </w:p>
-    <w:bookmarkEnd w:id="60"/>
-    <w:bookmarkEnd w:id="61"/>
     <w:bookmarkEnd w:id="62"/>
+    <w:bookmarkEnd w:id="63"/>
+    <w:bookmarkEnd w:id="64"/>
     <w:sectPr>
       <w:footnotePr>
         <w:numRestart w:val="eachSect"/>
@@ -16495,9 +16965,6 @@
     <w:abstractNumId w:val="991"/>
   </w:num>
   <w:num w:numId="1004">
-    <w:abstractNumId w:val="991"/>
-  </w:num>
-  <w:num w:numId="1005">
     <w:abstractNumId w:val="99411"/>
     <w:lvlOverride w:ilvl="0">
       <w:startOverride w:val="1"/>
@@ -16527,7 +16994,7 @@
       <w:startOverride w:val="1"/>
     </w:lvlOverride>
   </w:num>
-  <w:num w:numId="1006">
+  <w:num w:numId="1005">
     <w:abstractNumId w:val="991"/>
   </w:num>
 </w:numbering>

</xml_diff>

<commit_message>
Deploying to gh-pages from @ Morrison-Lab/pds@aa17f4680ef6a7d71c2bb14ab6c504dd607047c9 🚀
</commit_message>
<xml_diff>
--- a/probability-basics.docx
+++ b/probability-basics.docx
@@ -15,10 +15,10 @@
         <w:pStyle w:val="Date"/>
       </w:pPr>
       <w:r>
-        <w:t xml:space="preserve">Last modified: 2026-10-12 00:43:48 (PDT)</w:t>
+        <w:t xml:space="preserve">Last modified: 2026-10-12 16:25:27 (PDT)</w:t>
       </w:r>
     </w:p>
-    <w:bookmarkStart w:id="47" w:name="defining-probabilities"/>
+    <w:bookmarkStart w:id="54" w:name="defining-probabilities"/>
     <w:p>
       <w:pPr>
         <w:pStyle w:val="Heading2"/>
@@ -9322,8 +9322,1118 @@
       </w:r>
     </w:p>
     <w:bookmarkEnd w:id="46"/>
-    <w:bookmarkEnd w:id="47"/>
-    <w:bookmarkStart w:id="65" w:name="conditional-probability"/>
+    <w:bookmarkStart w:id="48" w:name="def-random-choice"/>
+    <w:p>
+      <w:pPr>
+        <w:pStyle w:val="BodyText"/>
+      </w:pPr>
+      <w:r>
+        <w:rPr>
+          <w:b/>
+          <w:bCs/>
+        </w:rPr>
+        <w:t xml:space="preserve">Definition 8 (Choosing at random)</w:t>
+      </w:r>
+      <w:r>
+        <w:t xml:space="preserve"> </w:t>
+      </w:r>
+      <w:r>
+        <w:t xml:space="preserve">Let</w:t>
+      </w:r>
+      <w:r>
+        <w:t xml:space="preserve"> </w:t>
+      </w:r>
+      <m:oMath>
+        <m:r>
+          <m:t>S</m:t>
+        </m:r>
+      </m:oMath>
+      <w:r>
+        <w:t xml:space="preserve"> </w:t>
+      </w:r>
+      <w:r>
+        <w:t xml:space="preserve">be a set with a</w:t>
+      </w:r>
+      <w:r>
+        <w:t xml:space="preserve"> </w:t>
+      </w:r>
+      <w:hyperlink r:id="rId28">
+        <w:r>
+          <w:rPr>
+            <w:rStyle w:val="Hyperlink"/>
+          </w:rPr>
+          <w:t xml:space="preserve">measure</w:t>
+        </w:r>
+      </w:hyperlink>
+      <w:r>
+        <w:t xml:space="preserve"> </w:t>
+      </w:r>
+      <m:oMath>
+        <m:r>
+          <m:t>μ</m:t>
+        </m:r>
+      </m:oMath>
+      <w:r>
+        <w:t xml:space="preserve"> </w:t>
+      </w:r>
+      <w:r>
+        <w:t xml:space="preserve">such that</w:t>
+      </w:r>
+      <w:r>
+        <w:t xml:space="preserve"> </w:t>
+      </w:r>
+      <m:oMath>
+        <m:r>
+          <m:t>0</m:t>
+        </m:r>
+        <m:r>
+          <m:rPr>
+            <m:sty m:val="p"/>
+          </m:rPr>
+          <m:t>&lt;</m:t>
+        </m:r>
+        <m:r>
+          <m:t>μ</m:t>
+        </m:r>
+        <m:r>
+          <m:rPr>
+            <m:sty m:val="p"/>
+          </m:rPr>
+          <m:t>(</m:t>
+        </m:r>
+        <m:r>
+          <m:t>S</m:t>
+        </m:r>
+        <m:r>
+          <m:rPr>
+            <m:sty m:val="p"/>
+          </m:rPr>
+          <m:t>)</m:t>
+        </m:r>
+        <m:r>
+          <m:rPr>
+            <m:sty m:val="p"/>
+          </m:rPr>
+          <m:t>&lt;</m:t>
+        </m:r>
+        <m:r>
+          <m:rPr>
+            <m:sty m:val="p"/>
+          </m:rPr>
+          <m:t>∞</m:t>
+        </m:r>
+      </m:oMath>
+      <w:r>
+        <w:t xml:space="preserve">.</w:t>
+      </w:r>
+      <w:r>
+        <w:t xml:space="preserve"> </w:t>
+      </w:r>
+      <w:r>
+        <w:t xml:space="preserve">To</w:t>
+      </w:r>
+      <w:r>
+        <w:t xml:space="preserve"> </w:t>
+      </w:r>
+      <w:r>
+        <w:rPr>
+          <w:b/>
+          <w:bCs/>
+        </w:rPr>
+        <w:t xml:space="preserve">choose an element of</w:t>
+      </w:r>
+      <w:r>
+        <w:rPr>
+          <w:b/>
+          <w:bCs/>
+        </w:rPr>
+        <w:t xml:space="preserve"> </w:t>
+      </w:r>
+      <m:oMath>
+        <m:r>
+          <m:t>S</m:t>
+        </m:r>
+      </m:oMath>
+      <w:r>
+        <w:rPr>
+          <w:b/>
+          <w:bCs/>
+        </w:rPr>
+        <w:t xml:space="preserve"> </w:t>
+      </w:r>
+      <w:r>
+        <w:rPr>
+          <w:b/>
+          <w:bCs/>
+        </w:rPr>
+        <w:t xml:space="preserve">at random</w:t>
+      </w:r>
+      <w:r>
+        <w:t xml:space="preserve"> </w:t>
+      </w:r>
+      <w:r>
+        <w:t xml:space="preserve">is to run a</w:t>
+      </w:r>
+      <w:r>
+        <w:t xml:space="preserve"> </w:t>
+      </w:r>
+      <w:r>
+        <w:t xml:space="preserve">random experiment whose</w:t>
+      </w:r>
+      <w:r>
+        <w:t xml:space="preserve"> </w:t>
+      </w:r>
+      <w:hyperlink w:anchor="def-sample-space">
+        <w:r>
+          <w:rPr>
+            <w:rStyle w:val="Hyperlink"/>
+          </w:rPr>
+          <w:t xml:space="preserve">sample space</w:t>
+        </w:r>
+      </w:hyperlink>
+      <w:r>
+        <w:t xml:space="preserve"> </w:t>
+      </w:r>
+      <w:r>
+        <w:t xml:space="preserve">is</w:t>
+      </w:r>
+      <w:r>
+        <w:t xml:space="preserve"> </w:t>
+      </w:r>
+      <m:oMath>
+        <m:r>
+          <m:t>S</m:t>
+        </m:r>
+      </m:oMath>
+      <w:r>
+        <w:t xml:space="preserve"> </w:t>
+      </w:r>
+      <w:r>
+        <w:t xml:space="preserve">and whose</w:t>
+      </w:r>
+      <w:r>
+        <w:t xml:space="preserve"> </w:t>
+      </w:r>
+      <w:hyperlink w:anchor="def-probability">
+        <w:r>
+          <w:rPr>
+            <w:rStyle w:val="Hyperlink"/>
+          </w:rPr>
+          <w:t xml:space="preserve">probability measure</w:t>
+        </w:r>
+      </w:hyperlink>
+      <w:r>
+        <w:t xml:space="preserve"> </w:t>
+      </w:r>
+      <w:r>
+        <w:t xml:space="preserve">is the</w:t>
+      </w:r>
+      <w:r>
+        <w:t xml:space="preserve"> </w:t>
+      </w:r>
+      <w:hyperlink r:id="rId47">
+        <w:r>
+          <w:rPr>
+            <w:rStyle w:val="Hyperlink"/>
+          </w:rPr>
+          <w:t xml:space="preserve">uniform distribution</w:t>
+        </w:r>
+      </w:hyperlink>
+      <w:r>
+        <w:t xml:space="preserve"> </w:t>
+      </w:r>
+      <w:r>
+        <w:t xml:space="preserve">on</w:t>
+      </w:r>
+      <w:r>
+        <w:t xml:space="preserve"> </w:t>
+      </w:r>
+      <m:oMath>
+        <m:r>
+          <m:t>S</m:t>
+        </m:r>
+      </m:oMath>
+      <w:r>
+        <w:t xml:space="preserve">.</w:t>
+      </w:r>
+    </w:p>
+    <w:bookmarkEnd w:id="48"/>
+    <w:bookmarkStart w:id="50" w:name="exm-random-choice-sets"/>
+    <w:p>
+      <w:pPr>
+        <w:pStyle w:val="BodyText"/>
+      </w:pPr>
+      <w:r>
+        <w:rPr>
+          <w:b/>
+          <w:bCs/>
+        </w:rPr>
+        <w:t xml:space="preserve">Example 9 (Choosing at random from a finite set and from an interval)</w:t>
+      </w:r>
+      <w:r>
+        <w:t xml:space="preserve"> </w:t>
+      </w:r>
+      <w:r>
+        <w:t xml:space="preserve">For a finite set</w:t>
+      </w:r>
+      <w:r>
+        <w:t xml:space="preserve"> </w:t>
+      </w:r>
+      <m:oMath>
+        <m:r>
+          <m:t>S</m:t>
+        </m:r>
+      </m:oMath>
+      <w:r>
+        <w:t xml:space="preserve">, let</w:t>
+      </w:r>
+      <w:r>
+        <w:t xml:space="preserve"> </w:t>
+      </w:r>
+      <m:oMath>
+        <m:r>
+          <m:t>μ</m:t>
+        </m:r>
+        <m:r>
+          <m:rPr>
+            <m:sty m:val="p"/>
+          </m:rPr>
+          <m:t>(</m:t>
+        </m:r>
+        <m:r>
+          <m:t>A</m:t>
+        </m:r>
+        <m:r>
+          <m:rPr>
+            <m:sty m:val="p"/>
+          </m:rPr>
+          <m:t>)</m:t>
+        </m:r>
+        <m:r>
+          <m:rPr>
+            <m:sty m:val="p"/>
+          </m:rPr>
+          <m:t>=</m:t>
+        </m:r>
+        <m:r>
+          <m:t>​</m:t>
+        </m:r>
+        <m:d>
+          <m:dPr>
+            <m:begChr m:val="|"/>
+            <m:sepChr m:val=""/>
+            <m:endChr m:val="|"/>
+            <m:grow/>
+          </m:dPr>
+          <m:e>
+            <m:r>
+              <m:t>A</m:t>
+            </m:r>
+          </m:e>
+        </m:d>
+        <m:r>
+          <m:t>​</m:t>
+        </m:r>
+      </m:oMath>
+      <w:r>
+        <w:t xml:space="preserve"> </w:t>
+      </w:r>
+      <w:r>
+        <w:t xml:space="preserve">be the</w:t>
+      </w:r>
+      <w:r>
+        <w:t xml:space="preserve"> </w:t>
+      </w:r>
+      <w:hyperlink r:id="rId30">
+        <w:r>
+          <w:rPr>
+            <w:rStyle w:val="Hyperlink"/>
+          </w:rPr>
+          <w:t xml:space="preserve">counting measure</w:t>
+        </w:r>
+      </w:hyperlink>
+      <w:r>
+        <w:t xml:space="preserve">.</w:t>
+      </w:r>
+      <w:r>
+        <w:t xml:space="preserve"> </w:t>
+      </w:r>
+      <w:r>
+        <w:t xml:space="preserve">Then</w:t>
+      </w:r>
+      <w:r>
+        <w:t xml:space="preserve"> </w:t>
+      </w:r>
+      <m:oMath>
+        <m:r>
+          <m:rPr>
+            <m:sty m:val="p"/>
+          </m:rPr>
+          <m:t>Pr</m:t>
+        </m:r>
+        <m:r>
+          <m:rPr>
+            <m:sty m:val="p"/>
+          </m:rPr>
+          <m:t>(</m:t>
+        </m:r>
+        <m:r>
+          <m:t>A</m:t>
+        </m:r>
+        <m:r>
+          <m:rPr>
+            <m:sty m:val="p"/>
+          </m:rPr>
+          <m:t>)</m:t>
+        </m:r>
+        <m:r>
+          <m:rPr>
+            <m:sty m:val="p"/>
+          </m:rPr>
+          <m:t>=</m:t>
+        </m:r>
+        <m:r>
+          <m:t>​</m:t>
+        </m:r>
+        <m:d>
+          <m:dPr>
+            <m:begChr m:val="|"/>
+            <m:sepChr m:val=""/>
+            <m:endChr m:val="|"/>
+            <m:grow/>
+          </m:dPr>
+          <m:e>
+            <m:r>
+              <m:t>A</m:t>
+            </m:r>
+          </m:e>
+        </m:d>
+        <m:r>
+          <m:t>​</m:t>
+        </m:r>
+        <m:r>
+          <m:rPr>
+            <m:sty m:val="p"/>
+          </m:rPr>
+          <m:t>/</m:t>
+        </m:r>
+        <m:r>
+          <m:t>​</m:t>
+        </m:r>
+        <m:d>
+          <m:dPr>
+            <m:begChr m:val="|"/>
+            <m:sepChr m:val=""/>
+            <m:endChr m:val="|"/>
+            <m:grow/>
+          </m:dPr>
+          <m:e>
+            <m:r>
+              <m:t>S</m:t>
+            </m:r>
+          </m:e>
+        </m:d>
+        <m:r>
+          <m:t>​</m:t>
+        </m:r>
+      </m:oMath>
+      <w:r>
+        <w:t xml:space="preserve">,</w:t>
+      </w:r>
+      <w:r>
+        <w:t xml:space="preserve"> </w:t>
+      </w:r>
+      <w:r>
+        <w:t xml:space="preserve">so every element of</w:t>
+      </w:r>
+      <w:r>
+        <w:t xml:space="preserve"> </w:t>
+      </w:r>
+      <m:oMath>
+        <m:r>
+          <m:t>S</m:t>
+        </m:r>
+      </m:oMath>
+      <w:r>
+        <w:t xml:space="preserve"> </w:t>
+      </w:r>
+      <w:r>
+        <w:t xml:space="preserve">has the same probability</w:t>
+      </w:r>
+      <w:r>
+        <w:t xml:space="preserve"> </w:t>
+      </w:r>
+      <m:oMath>
+        <m:r>
+          <m:t>1</m:t>
+        </m:r>
+        <m:r>
+          <m:rPr>
+            <m:sty m:val="p"/>
+          </m:rPr>
+          <m:t>/</m:t>
+        </m:r>
+        <m:r>
+          <m:t>​</m:t>
+        </m:r>
+        <m:d>
+          <m:dPr>
+            <m:begChr m:val="|"/>
+            <m:sepChr m:val=""/>
+            <m:endChr m:val="|"/>
+            <m:grow/>
+          </m:dPr>
+          <m:e>
+            <m:r>
+              <m:t>S</m:t>
+            </m:r>
+          </m:e>
+        </m:d>
+        <m:r>
+          <m:t>​</m:t>
+        </m:r>
+      </m:oMath>
+      <w:r>
+        <w:t xml:space="preserve">.</w:t>
+      </w:r>
+    </w:p>
+    <w:p>
+      <w:pPr>
+        <w:pStyle w:val="BodyText"/>
+      </w:pPr>
+      <w:r>
+        <w:t xml:space="preserve">For the interval</w:t>
+      </w:r>
+      <w:r>
+        <w:t xml:space="preserve"> </w:t>
+      </w:r>
+      <m:oMath>
+        <m:r>
+          <m:t>S</m:t>
+        </m:r>
+        <m:r>
+          <m:rPr>
+            <m:sty m:val="p"/>
+          </m:rPr>
+          <m:t>=</m:t>
+        </m:r>
+        <m:r>
+          <m:rPr>
+            <m:sty m:val="p"/>
+          </m:rPr>
+          <m:t>[</m:t>
+        </m:r>
+        <m:r>
+          <m:t>0</m:t>
+        </m:r>
+        <m:r>
+          <m:rPr>
+            <m:sty m:val="p"/>
+          </m:rPr>
+          <m:t>,</m:t>
+        </m:r>
+        <m:r>
+          <m:t>1</m:t>
+        </m:r>
+        <m:r>
+          <m:rPr>
+            <m:sty m:val="p"/>
+          </m:rPr>
+          <m:t>]</m:t>
+        </m:r>
+      </m:oMath>
+      <w:r>
+        <w:t xml:space="preserve">, let</w:t>
+      </w:r>
+      <w:r>
+        <w:t xml:space="preserve"> </w:t>
+      </w:r>
+      <m:oMath>
+        <m:r>
+          <m:t>μ</m:t>
+        </m:r>
+        <m:r>
+          <m:rPr>
+            <m:sty m:val="p"/>
+          </m:rPr>
+          <m:t>(</m:t>
+        </m:r>
+        <m:r>
+          <m:t>A</m:t>
+        </m:r>
+        <m:r>
+          <m:rPr>
+            <m:sty m:val="p"/>
+          </m:rPr>
+          <m:t>)</m:t>
+        </m:r>
+      </m:oMath>
+      <w:r>
+        <w:t xml:space="preserve"> </w:t>
+      </w:r>
+      <w:r>
+        <w:t xml:space="preserve">be the length of</w:t>
+      </w:r>
+      <w:r>
+        <w:t xml:space="preserve"> </w:t>
+      </w:r>
+      <m:oMath>
+        <m:r>
+          <m:t>A</m:t>
+        </m:r>
+      </m:oMath>
+      <w:r>
+        <w:t xml:space="preserve">.</w:t>
+      </w:r>
+      <w:r>
+        <w:t xml:space="preserve"> </w:t>
+      </w:r>
+      <w:r>
+        <w:t xml:space="preserve">Then</w:t>
+      </w:r>
+      <w:r>
+        <w:t xml:space="preserve"> </w:t>
+      </w:r>
+      <m:oMath>
+        <m:r>
+          <m:rPr>
+            <m:sty m:val="p"/>
+          </m:rPr>
+          <m:t>Pr</m:t>
+        </m:r>
+        <m:r>
+          <m:rPr>
+            <m:sty m:val="p"/>
+          </m:rPr>
+          <m:t>(</m:t>
+        </m:r>
+        <m:r>
+          <m:t>A</m:t>
+        </m:r>
+        <m:r>
+          <m:rPr>
+            <m:sty m:val="p"/>
+          </m:rPr>
+          <m:t>)</m:t>
+        </m:r>
+      </m:oMath>
+      <w:r>
+        <w:t xml:space="preserve"> </w:t>
+      </w:r>
+      <w:r>
+        <w:t xml:space="preserve">is the length of</w:t>
+      </w:r>
+      <w:r>
+        <w:t xml:space="preserve"> </w:t>
+      </w:r>
+      <m:oMath>
+        <m:r>
+          <m:t>A</m:t>
+        </m:r>
+      </m:oMath>
+      <w:r>
+        <w:t xml:space="preserve">,</w:t>
+      </w:r>
+      <w:r>
+        <w:t xml:space="preserve"> </w:t>
+      </w:r>
+      <w:r>
+        <w:t xml:space="preserve">so the probability that the chosen number lies in</w:t>
+      </w:r>
+      <w:r>
+        <w:t xml:space="preserve"> </w:t>
+      </w:r>
+      <m:oMath>
+        <m:r>
+          <m:rPr>
+            <m:sty m:val="p"/>
+          </m:rPr>
+          <m:t>[</m:t>
+        </m:r>
+        <m:r>
+          <m:t>0.2</m:t>
+        </m:r>
+        <m:r>
+          <m:rPr>
+            <m:sty m:val="p"/>
+          </m:rPr>
+          <m:t>,</m:t>
+        </m:r>
+        <m:r>
+          <m:t>0.5</m:t>
+        </m:r>
+        <m:r>
+          <m:rPr>
+            <m:sty m:val="p"/>
+          </m:rPr>
+          <m:t>]</m:t>
+        </m:r>
+      </m:oMath>
+      <w:r>
+        <w:t xml:space="preserve"> </w:t>
+      </w:r>
+      <w:r>
+        <w:t xml:space="preserve">is</w:t>
+      </w:r>
+      <w:r>
+        <w:t xml:space="preserve"> </w:t>
+      </w:r>
+      <m:oMath>
+        <m:r>
+          <m:t>0.3</m:t>
+        </m:r>
+      </m:oMath>
+      <w:r>
+        <w:t xml:space="preserve">.</w:t>
+      </w:r>
+      <w:r>
+        <w:t xml:space="preserve"> </w:t>
+      </w:r>
+      <w:r>
+        <w:t xml:space="preserve">The chosen number has the</w:t>
+      </w:r>
+      <w:r>
+        <w:t xml:space="preserve"> </w:t>
+      </w:r>
+      <w:hyperlink r:id="rId49">
+        <m:oMath>
+          <m:r>
+            <m:rPr>
+              <m:nor/>
+              <m:sty m:val="p"/>
+            </m:rPr>
+            <m:t>Uniform</m:t>
+          </m:r>
+          <m:r>
+            <m:rPr>
+              <m:sty m:val="p"/>
+            </m:rPr>
+            <m:t>(</m:t>
+          </m:r>
+          <m:r>
+            <m:t>0</m:t>
+          </m:r>
+          <m:r>
+            <m:rPr>
+              <m:sty m:val="p"/>
+            </m:rPr>
+            <m:t>,</m:t>
+          </m:r>
+          <m:r>
+            <m:t>1</m:t>
+          </m:r>
+          <m:r>
+            <m:rPr>
+              <m:sty m:val="p"/>
+            </m:rPr>
+            <m:t>)</m:t>
+          </m:r>
+        </m:oMath>
+        <w:r>
+          <w:rPr>
+            <w:rStyle w:val="Hyperlink"/>
+          </w:rPr>
+          <w:t xml:space="preserve"> </w:t>
+        </w:r>
+        <w:r>
+          <w:rPr>
+            <w:rStyle w:val="Hyperlink"/>
+          </w:rPr>
+          <w:t xml:space="preserve">distribution</w:t>
+        </w:r>
+      </w:hyperlink>
+      <w:r>
+        <w:t xml:space="preserve">.</w:t>
+      </w:r>
+    </w:p>
+    <w:p>
+      <w:pPr>
+        <w:pStyle w:val="BodyText"/>
+      </w:pPr>
+      <w:r>
+        <w:t xml:space="preserve">The integers have infinite counting measure,</w:t>
+      </w:r>
+      <w:r>
+        <w:t xml:space="preserve"> </w:t>
+      </w:r>
+      <w:r>
+        <w:t xml:space="preserve">so they have no choice at random in this sense.</w:t>
+      </w:r>
+    </w:p>
+    <w:bookmarkEnd w:id="50"/>
+    <w:bookmarkStart w:id="53" w:name="exm-random-choice-auto"/>
+    <w:p>
+      <w:pPr>
+        <w:pStyle w:val="BodyText"/>
+      </w:pPr>
+      <w:r>
+        <w:rPr>
+          <w:b/>
+          <w:bCs/>
+        </w:rPr>
+        <w:t xml:space="preserve">Example 10 (Choosing a car at random from the Auto data)</w:t>
+      </w:r>
+      <w:r>
+        <w:t xml:space="preserve"> </w:t>
+      </w:r>
+      <w:r>
+        <w:t xml:space="preserve">The Auto data record the number of engine cylinders and the fuel economy</w:t>
+      </w:r>
+      <w:r>
+        <w:t xml:space="preserve"> </w:t>
+      </w:r>
+      <w:r>
+        <w:t xml:space="preserve">(miles per gallon) of</w:t>
+      </w:r>
+      <w:r>
+        <w:t xml:space="preserve"> </w:t>
+      </w:r>
+      <w:r>
+        <w:t xml:space="preserve">392 car models</w:t>
+      </w:r>
+      <w:r>
+        <w:t xml:space="preserve"> </w:t>
+      </w:r>
+      <w:r>
+        <w:t xml:space="preserve">sold between 1970 and 1982.</w:t>
+      </w:r>
+      <w:r>
+        <w:t xml:space="preserve"> </w:t>
+      </w:r>
+      <w:r>
+        <w:t xml:space="preserve">They come from the StatLib library at Carnegie Mellon University</w:t>
+      </w:r>
+      <w:r>
+        <w:t xml:space="preserve"> </w:t>
+      </w:r>
+      <w:r>
+        <w:t xml:space="preserve">and ship with the book</w:t>
+      </w:r>
+      <w:r>
+        <w:t xml:space="preserve"> </w:t>
+      </w:r>
+      <w:r>
+        <w:rPr>
+          <w:i/>
+          <w:iCs/>
+        </w:rPr>
+        <w:t xml:space="preserve">An Introduction to Statistical Learning</w:t>
+      </w:r>
+      <w:r>
+        <w:t xml:space="preserve"> </w:t>
+      </w:r>
+      <w:r>
+        <w:t xml:space="preserve">and the R package</w:t>
+      </w:r>
+      <w:r>
+        <w:t xml:space="preserve"> </w:t>
+      </w:r>
+      <w:hyperlink r:id="rId51">
+        <w:r>
+          <w:rPr>
+            <w:rStyle w:val="VerbatimChar"/>
+          </w:rPr>
+          <w:t xml:space="preserve">ISLR2</w:t>
+        </w:r>
+      </w:hyperlink>
+      <w:r>
+        <w:t xml:space="preserve"> </w:t>
+      </w:r>
+      <w:r>
+        <w:t xml:space="preserve">(</w:t>
+      </w:r>
+      <w:r>
+        <w:rPr>
+          <w:rStyle w:val="VerbatimChar"/>
+        </w:rPr>
+        <w:t xml:space="preserve">ISLR2::Auto</w:t>
+      </w:r>
+      <w:r>
+        <w:t xml:space="preserve">).</w:t>
+      </w:r>
+      <w:r>
+        <w:t xml:space="preserve"> </w:t>
+      </w:r>
+      <w:r>
+        <w:t xml:space="preserve">This site has a copy at</w:t>
+      </w:r>
+      <w:r>
+        <w:t xml:space="preserve"> </w:t>
+      </w:r>
+      <w:hyperlink r:id="rId52">
+        <w:r>
+          <w:rPr>
+            <w:rStyle w:val="VerbatimChar"/>
+          </w:rPr>
+          <w:t xml:space="preserve">data/auto.csv</w:t>
+        </w:r>
+      </w:hyperlink>
+      <w:r>
+        <w:t xml:space="preserve">.</w:t>
+      </w:r>
+    </w:p>
+    <w:p>
+      <w:pPr>
+        <w:pStyle w:val="BodyText"/>
+      </w:pPr>
+      <w:r>
+        <w:t xml:space="preserve">Let</w:t>
+      </w:r>
+      <w:r>
+        <w:t xml:space="preserve"> </w:t>
+      </w:r>
+      <m:oMath>
+        <m:r>
+          <m:t>S</m:t>
+        </m:r>
+      </m:oMath>
+      <w:r>
+        <w:t xml:space="preserve"> </w:t>
+      </w:r>
+      <w:r>
+        <w:t xml:space="preserve">be the set of car models in the data.</w:t>
+      </w:r>
+      <w:r>
+        <w:t xml:space="preserve"> </w:t>
+      </w:r>
+      <w:r>
+        <w:t xml:space="preserve">Choosing a car at random from</w:t>
+      </w:r>
+      <w:r>
+        <w:t xml:space="preserve"> </w:t>
+      </w:r>
+      <m:oMath>
+        <m:r>
+          <m:t>S</m:t>
+        </m:r>
+      </m:oMath>
+      <w:r>
+        <w:t xml:space="preserve"> </w:t>
+      </w:r>
+      <w:r>
+        <w:t xml:space="preserve">(</w:t>
+      </w:r>
+      <w:hyperlink w:anchor="def-random-choice">
+        <w:r>
+          <w:rPr>
+            <w:rStyle w:val="Hyperlink"/>
+          </w:rPr>
+          <w:t xml:space="preserve">Definition 8</w:t>
+        </w:r>
+      </w:hyperlink>
+      <w:r>
+        <w:t xml:space="preserve">),</w:t>
+      </w:r>
+      <w:r>
+        <w:t xml:space="preserve"> </w:t>
+      </w:r>
+      <w:r>
+        <w:t xml:space="preserve">with the counting measure, gives each car</w:t>
+      </w:r>
+      <w:r>
+        <w:t xml:space="preserve"> </w:t>
+      </w:r>
+      <w:r>
+        <w:t xml:space="preserve">probability</w:t>
+      </w:r>
+      <w:r>
+        <w:t xml:space="preserve"> </w:t>
+      </w:r>
+      <m:oMath>
+        <m:r>
+          <m:t>1</m:t>
+        </m:r>
+        <m:r>
+          <m:rPr>
+            <m:sty m:val="p"/>
+          </m:rPr>
+          <m:t>/</m:t>
+        </m:r>
+        <m:r>
+          <m:t>​</m:t>
+        </m:r>
+        <m:d>
+          <m:dPr>
+            <m:begChr m:val="|"/>
+            <m:sepChr m:val=""/>
+            <m:endChr m:val="|"/>
+            <m:grow/>
+          </m:dPr>
+          <m:e>
+            <m:r>
+              <m:t>S</m:t>
+            </m:r>
+          </m:e>
+        </m:d>
+        <m:r>
+          <m:t>​</m:t>
+        </m:r>
+      </m:oMath>
+      <w:r>
+        <w:t xml:space="preserve">,</w:t>
+      </w:r>
+      <w:r>
+        <w:t xml:space="preserve"> </w:t>
+      </w:r>
+      <w:r>
+        <w:t xml:space="preserve">so the probability that the car has four cylinders</w:t>
+      </w:r>
+      <w:r>
+        <w:t xml:space="preserve"> </w:t>
+      </w:r>
+      <w:r>
+        <w:t xml:space="preserve">is the fraction of cars with four cylinders:</w:t>
+      </w:r>
+    </w:p>
+    <w:p>
+      <w:pPr>
+        <w:pStyle w:val="SourceCode"/>
+      </w:pPr>
+      <w:r>
+        <w:rPr>
+          <w:rStyle w:val="CommentTok"/>
+        </w:rPr>
+        <w:t xml:space="preserve"># read the local copy of the Auto data (one row per car model):</w:t>
+      </w:r>
+      <w:r>
+        <w:br/>
+      </w:r>
+      <w:r>
+        <w:rPr>
+          <w:rStyle w:val="NormalTok"/>
+        </w:rPr>
+        <w:t xml:space="preserve">auto </w:t>
+      </w:r>
+      <w:r>
+        <w:rPr>
+          <w:rStyle w:val="OtherTok"/>
+        </w:rPr>
+        <w:t xml:space="preserve">&lt;-</w:t>
+      </w:r>
+      <w:r>
+        <w:rPr>
+          <w:rStyle w:val="NormalTok"/>
+        </w:rPr>
+        <w:t xml:space="preserve"> </w:t>
+      </w:r>
+      <w:r>
+        <w:rPr>
+          <w:rStyle w:val="FunctionTok"/>
+        </w:rPr>
+        <w:t xml:space="preserve">read.csv</w:t>
+      </w:r>
+      <w:r>
+        <w:rPr>
+          <w:rStyle w:val="NormalTok"/>
+        </w:rPr>
+        <w:t xml:space="preserve">(</w:t>
+      </w:r>
+      <w:r>
+        <w:rPr>
+          <w:rStyle w:val="StringTok"/>
+        </w:rPr>
+        <w:t xml:space="preserve">"data/auto.csv"</w:t>
+      </w:r>
+      <w:r>
+        <w:rPr>
+          <w:rStyle w:val="NormalTok"/>
+        </w:rPr>
+        <w:t xml:space="preserve">)</w:t>
+      </w:r>
+      <w:r>
+        <w:br/>
+      </w:r>
+      <w:r>
+        <w:br/>
+      </w:r>
+      <w:r>
+        <w:rPr>
+          <w:rStyle w:val="CommentTok"/>
+        </w:rPr>
+        <w:t xml:space="preserve"># the event "four cylinders" is the set of rows where cylinders == 4;</w:t>
+      </w:r>
+      <w:r>
+        <w:br/>
+      </w:r>
+      <w:r>
+        <w:rPr>
+          <w:rStyle w:val="CommentTok"/>
+        </w:rPr>
+        <w:t xml:space="preserve"># the mean of the logical vector is |A| / |S|, the probability in</w:t>
+      </w:r>
+      <w:r>
+        <w:br/>
+      </w:r>
+      <w:r>
+        <w:rPr>
+          <w:rStyle w:val="CommentTok"/>
+        </w:rPr>
+        <w:t xml:space="preserve"># the definition of choosing at random:</w:t>
+      </w:r>
+      <w:r>
+        <w:br/>
+      </w:r>
+      <w:r>
+        <w:rPr>
+          <w:rStyle w:val="FunctionTok"/>
+        </w:rPr>
+        <w:t xml:space="preserve">mean</w:t>
+      </w:r>
+      <w:r>
+        <w:rPr>
+          <w:rStyle w:val="NormalTok"/>
+        </w:rPr>
+        <w:t xml:space="preserve">(auto</w:t>
+      </w:r>
+      <w:r>
+        <w:rPr>
+          <w:rStyle w:val="SpecialCharTok"/>
+        </w:rPr>
+        <w:t xml:space="preserve">$</w:t>
+      </w:r>
+      <w:r>
+        <w:rPr>
+          <w:rStyle w:val="NormalTok"/>
+        </w:rPr>
+        <w:t xml:space="preserve">cylinders </w:t>
+      </w:r>
+      <w:r>
+        <w:rPr>
+          <w:rStyle w:val="SpecialCharTok"/>
+        </w:rPr>
+        <w:t xml:space="preserve">==</w:t>
+      </w:r>
+      <w:r>
+        <w:rPr>
+          <w:rStyle w:val="NormalTok"/>
+        </w:rPr>
+        <w:t xml:space="preserve"> </w:t>
+      </w:r>
+      <w:r>
+        <w:rPr>
+          <w:rStyle w:val="DecValTok"/>
+        </w:rPr>
+        <w:t xml:space="preserve">4</w:t>
+      </w:r>
+      <w:r>
+        <w:rPr>
+          <w:rStyle w:val="NormalTok"/>
+        </w:rPr>
+        <w:t xml:space="preserve">)</w:t>
+      </w:r>
+      <w:r>
+        <w:br/>
+      </w:r>
+      <w:r>
+        <w:rPr>
+          <w:rStyle w:val="CommentTok"/>
+        </w:rPr>
+        <w:t xml:space="preserve">#&gt; [1] 0.5076531</w:t>
+      </w:r>
+    </w:p>
+    <w:bookmarkEnd w:id="53"/>
+    <w:bookmarkEnd w:id="54"/>
+    <w:bookmarkStart w:id="72" w:name="conditional-probability"/>
     <w:p>
       <w:pPr>
         <w:pStyle w:val="Heading2"/>
@@ -9332,7 +10442,7 @@
         <w:t xml:space="preserve">2 Conditional probability</w:t>
       </w:r>
     </w:p>
-    <w:bookmarkStart w:id="48" w:name="def-conditional-prob"/>
+    <w:bookmarkStart w:id="55" w:name="def-conditional-prob"/>
     <w:p>
       <w:pPr>
         <w:pStyle w:val="FirstParagraph"/>
@@ -9342,7 +10452,7 @@
           <w:b/>
           <w:bCs/>
         </w:rPr>
-        <w:t xml:space="preserve">Definition 8 (Conditional probability)</w:t>
+        <w:t xml:space="preserve">Definition 9 (Conditional probability)</w:t>
       </w:r>
       <w:r>
         <w:t xml:space="preserve"> </w:t>
@@ -9629,7 +10739,7 @@
         </m:oMath>
       </m:oMathPara>
     </w:p>
-    <w:bookmarkEnd w:id="48"/>
+    <w:bookmarkEnd w:id="55"/>
     <w:p>
       <w:pPr>
         <w:pStyle w:val="FirstParagraph"/>
@@ -9761,7 +10871,7 @@
         <w:t xml:space="preserve">.</w:t>
       </w:r>
     </w:p>
-    <w:bookmarkStart w:id="49" w:name="exm-conditional-prob"/>
+    <w:bookmarkStart w:id="56" w:name="exm-conditional-prob"/>
     <w:p>
       <w:pPr>
         <w:pStyle w:val="BodyText"/>
@@ -9771,7 +10881,7 @@
           <w:b/>
           <w:bCs/>
         </w:rPr>
-        <w:t xml:space="preserve">Example 9 (Rolling a six, given an even roll)</w:t>
+        <w:t xml:space="preserve">Example 11 (Rolling a six, given an even roll)</w:t>
       </w:r>
       <w:r>
         <w:t xml:space="preserve"> </w:t>
@@ -10165,8 +11275,8 @@
         </m:oMath>
       </m:oMathPara>
     </w:p>
-    <w:bookmarkEnd w:id="49"/>
-    <w:bookmarkStart w:id="50" w:name="thm-law-conditional-prob"/>
+    <w:bookmarkEnd w:id="56"/>
+    <w:bookmarkStart w:id="57" w:name="thm-law-conditional-prob"/>
     <w:p>
       <w:pPr>
         <w:pStyle w:val="FirstParagraph"/>
@@ -10356,7 +11466,7 @@
         </m:oMath>
       </m:oMathPara>
     </w:p>
-    <w:bookmarkEnd w:id="50"/>
+    <w:bookmarkEnd w:id="57"/>
     <w:p>
       <w:pPr>
         <w:pStyle w:val="FirstParagraph"/>
@@ -10382,7 +11492,7 @@
           <w:rPr>
             <w:rStyle w:val="Hyperlink"/>
           </w:rPr>
-          <w:t xml:space="preserve">Definition 8</w:t>
+          <w:t xml:space="preserve">Definition 9</w:t>
         </w:r>
       </w:hyperlink>
       <w:r>
@@ -10656,7 +11766,7 @@
         </m:oMath>
       </m:oMathPara>
     </w:p>
-    <w:bookmarkStart w:id="51" w:name="exm-law-conditional-prob"/>
+    <w:bookmarkStart w:id="58" w:name="exm-law-conditional-prob"/>
     <w:p>
       <w:pPr>
         <w:pStyle w:val="FirstParagraph"/>
@@ -10666,7 +11776,7 @@
           <w:b/>
           <w:bCs/>
         </w:rPr>
-        <w:t xml:space="preserve">Example 10 (Applying the law of conditional probability)</w:t>
+        <w:t xml:space="preserve">Example 12 (Applying the law of conditional probability)</w:t>
       </w:r>
       <w:r>
         <w:t xml:space="preserve"> </w:t>
@@ -10988,8 +12098,8 @@
         </m:oMath>
       </m:oMathPara>
     </w:p>
-    <w:bookmarkEnd w:id="51"/>
-    <w:bookmarkStart w:id="52" w:name="thm-total-prob"/>
+    <w:bookmarkEnd w:id="58"/>
+    <w:bookmarkStart w:id="59" w:name="thm-total-prob"/>
     <w:p>
       <w:pPr>
         <w:pStyle w:val="FirstParagraph"/>
@@ -11308,7 +12418,7 @@
         </m:oMath>
       </m:oMathPara>
     </w:p>
-    <w:bookmarkEnd w:id="52"/>
+    <w:bookmarkEnd w:id="59"/>
     <w:p>
       <w:pPr>
         <w:pStyle w:val="FirstParagraph"/>
@@ -11831,7 +12941,7 @@
         </m:oMath>
       </m:oMathPara>
     </w:p>
-    <w:bookmarkStart w:id="53" w:name="thm-bayes"/>
+    <w:bookmarkStart w:id="60" w:name="thm-bayes"/>
     <w:p>
       <w:pPr>
         <w:pStyle w:val="FirstParagraph"/>
@@ -12092,7 +13202,7 @@
         </m:oMath>
       </m:oMathPara>
     </w:p>
-    <w:bookmarkEnd w:id="53"/>
+    <w:bookmarkEnd w:id="60"/>
     <w:p>
       <w:pPr>
         <w:pStyle w:val="FirstParagraph"/>
@@ -12118,7 +13228,7 @@
           <w:rPr>
             <w:rStyle w:val="Hyperlink"/>
           </w:rPr>
-          <w:t xml:space="preserve">Definition 8</w:t>
+          <w:t xml:space="preserve">Definition 9</w:t>
         </w:r>
       </w:hyperlink>
       <w:r>
@@ -12539,7 +13649,7 @@
         </m:oMath>
       </m:oMathPara>
     </w:p>
-    <w:bookmarkStart w:id="54" w:name="exm-bayes"/>
+    <w:bookmarkStart w:id="61" w:name="exm-bayes"/>
     <w:p>
       <w:pPr>
         <w:pStyle w:val="FirstParagraph"/>
@@ -12549,7 +13659,7 @@
           <w:b/>
           <w:bCs/>
         </w:rPr>
-        <w:t xml:space="preserve">Example 11 (Positive predictive value of a medical test)</w:t>
+        <w:t xml:space="preserve">Example 13 (Positive predictive value of a medical test)</w:t>
       </w:r>
       <w:r>
         <w:t xml:space="preserve"> </w:t>
@@ -13581,8 +14691,8 @@
         <w:t xml:space="preserve">because the disease prevalence is relatively low (7%).</w:t>
       </w:r>
     </w:p>
-    <w:bookmarkEnd w:id="54"/>
-    <w:bookmarkStart w:id="55" w:name="exr-bayes"/>
+    <w:bookmarkEnd w:id="61"/>
+    <w:bookmarkStart w:id="62" w:name="exr-bayes"/>
     <w:p>
       <w:pPr>
         <w:pStyle w:val="BodyText"/>
@@ -13602,7 +14712,7 @@
           <w:rPr>
             <w:rStyle w:val="Hyperlink"/>
           </w:rPr>
-          <w:t xml:space="preserve">Definition 8</w:t>
+          <w:t xml:space="preserve">Definition 9</w:t>
         </w:r>
       </w:hyperlink>
       <w:r>
@@ -13920,8 +15030,8 @@
         <w:t xml:space="preserve">, and none of them jointly.</w:t>
       </w:r>
     </w:p>
-    <w:bookmarkEnd w:id="55"/>
-    <w:bookmarkStart w:id="57" w:name="sol-bayes"/>
+    <w:bookmarkEnd w:id="62"/>
+    <w:bookmarkStart w:id="64" w:name="sol-bayes"/>
     <w:p>
       <w:pPr>
         <w:pStyle w:val="BodyText"/>
@@ -13947,7 +15057,7 @@
           <w:rPr>
             <w:rStyle w:val="Hyperlink"/>
           </w:rPr>
-          <w:t xml:space="preserve">Definition 8</w:t>
+          <w:t xml:space="preserve">Definition 9</w:t>
         </w:r>
       </w:hyperlink>
       <w:r>
@@ -14235,7 +15345,7 @@
       <w:pPr>
         <w:pStyle w:val="BodyText"/>
       </w:pPr>
-      <w:bookmarkStart w:id="56" w:name="eq-bayes"/>
+      <w:bookmarkStart w:id="63" w:name="eq-bayes"/>
       <m:oMathPara>
         <m:oMathParaPr>
           <m:jc m:val="center"/>
@@ -14381,7 +15491,7 @@
           </m:r>
         </m:oMath>
       </m:oMathPara>
-      <w:bookmarkEnd w:id="56"/>
+      <w:bookmarkEnd w:id="63"/>
     </w:p>
     <w:p>
       <w:pPr>
@@ -14962,8 +16072,8 @@
         <w:t xml:space="preserve">decreases it.</w:t>
       </w:r>
     </w:p>
-    <w:bookmarkEnd w:id="57"/>
-    <w:bookmarkStart w:id="58" w:name="exr-base-rate"/>
+    <w:bookmarkEnd w:id="64"/>
+    <w:bookmarkStart w:id="65" w:name="exr-base-rate"/>
     <w:p>
       <w:pPr>
         <w:pStyle w:val="BodyText"/>
@@ -15068,8 +16178,8 @@
         <w:t xml:space="preserve">.</w:t>
       </w:r>
     </w:p>
-    <w:bookmarkEnd w:id="58"/>
-    <w:bookmarkStart w:id="59" w:name="sol-base-rate"/>
+    <w:bookmarkEnd w:id="65"/>
+    <w:bookmarkStart w:id="66" w:name="sol-base-rate"/>
     <w:p>
       <w:pPr>
         <w:pStyle w:val="BodyText"/>
@@ -16034,7 +17144,7 @@
         <w:t xml:space="preserve">and it illustrates why raw accuracy can be misleading on rare events.</w:t>
       </w:r>
     </w:p>
-    <w:bookmarkEnd w:id="59"/>
+    <w:bookmarkEnd w:id="66"/>
     <w:tbl>
       <w:tblPr>
         <w:tblStyle w:val="Table"/>
@@ -16076,18 +17186,18 @@
                 <wp:inline>
                   <wp:extent cx="152400" cy="152400"/>
                   <wp:effectExtent b="0" l="0" r="0" t="0"/>
-                  <wp:docPr descr="" title="" id="61" name="Picture"/>
+                  <wp:docPr descr="" title="" id="68" name="Picture"/>
                   <a:graphic>
                     <a:graphicData uri="http://schemas.openxmlformats.org/drawingml/2006/picture">
                       <pic:pic>
                         <pic:nvPicPr>
-                          <pic:cNvPr descr="/opt/quarto/share/formats/docx/tip.png" id="62" name="Picture"/>
+                          <pic:cNvPr descr="/opt/quarto/share/formats/docx/tip.png" id="69" name="Picture"/>
                           <pic:cNvPicPr>
                             <a:picLocks noChangeArrowheads="1" noChangeAspect="1"/>
                           </pic:cNvPicPr>
                         </pic:nvPicPr>
                         <pic:blipFill>
-                          <a:blip r:embed="rId60"/>
+                          <a:blip r:embed="rId67"/>
                           <a:stretch>
                             <a:fillRect/>
                           </a:stretch>
@@ -16149,7 +17259,7 @@
             <w:r>
               <w:t xml:space="preserve"> </w:t>
             </w:r>
-            <w:hyperlink r:id="rId63">
+            <w:hyperlink r:id="rId70">
               <w:r>
                 <w:rPr>
                   <w:rStyle w:val="Hyperlink"/>
@@ -16193,7 +17303,7 @@
             <w:r>
               <w:t xml:space="preserve"> </w:t>
             </w:r>
-            <w:hyperlink r:id="rId64">
+            <w:hyperlink r:id="rId71">
               <w:r>
                 <w:rPr>
                   <w:rStyle w:val="Hyperlink"/>
@@ -16209,8 +17319,8 @@
         </w:tc>
       </w:tr>
     </w:tbl>
-    <w:bookmarkEnd w:id="65"/>
-    <w:bookmarkStart w:id="72" w:name="references"/>
+    <w:bookmarkEnd w:id="72"/>
+    <w:bookmarkStart w:id="79" w:name="references"/>
     <w:p>
       <w:pPr>
         <w:pStyle w:val="Heading2"/>
@@ -16219,8 +17329,8 @@
         <w:t xml:space="preserve">References</w:t>
       </w:r>
     </w:p>
-    <w:bookmarkStart w:id="71" w:name="refs"/>
-    <w:bookmarkStart w:id="66" w:name="ref-hutchinson2024data471"/>
+    <w:bookmarkStart w:id="78" w:name="refs"/>
+    <w:bookmarkStart w:id="73" w:name="ref-hutchinson2024data471"/>
     <w:p>
       <w:pPr>
         <w:pStyle w:val="Bibliography"/>
@@ -16256,8 +17366,8 @@
         <w:t xml:space="preserve">. Western Washington University.</w:t>
       </w:r>
     </w:p>
-    <w:bookmarkEnd w:id="66"/>
-    <w:bookmarkStart w:id="68" w:name="ref-hutchinson_wwu_ml_videos"/>
+    <w:bookmarkEnd w:id="73"/>
+    <w:bookmarkStart w:id="75" w:name="ref-hutchinson_wwu_ml_videos"/>
     <w:p>
       <w:pPr>
         <w:pStyle w:val="Bibliography"/>
@@ -16323,7 +17433,7 @@
       <w:r>
         <w:t xml:space="preserve"> </w:t>
       </w:r>
-      <w:hyperlink r:id="rId67">
+      <w:hyperlink r:id="rId74">
         <w:r>
           <w:rPr>
             <w:rStyle w:val="Hyperlink"/>
@@ -16335,8 +17445,8 @@
         <w:t xml:space="preserve">.</w:t>
       </w:r>
     </w:p>
-    <w:bookmarkEnd w:id="68"/>
-    <w:bookmarkStart w:id="70" w:name="ref-ross-probsim"/>
+    <w:bookmarkEnd w:id="75"/>
+    <w:bookmarkStart w:id="77" w:name="ref-ross-probsim"/>
     <w:p>
       <w:pPr>
         <w:pStyle w:val="Bibliography"/>
@@ -16360,7 +17470,7 @@
       <w:r>
         <w:t xml:space="preserve"> </w:t>
       </w:r>
-      <w:hyperlink r:id="rId69">
+      <w:hyperlink r:id="rId76">
         <w:r>
           <w:rPr>
             <w:rStyle w:val="Hyperlink"/>
@@ -16372,9 +17482,9 @@
         <w:t xml:space="preserve">.</w:t>
       </w:r>
     </w:p>
-    <w:bookmarkEnd w:id="70"/>
-    <w:bookmarkEnd w:id="71"/>
-    <w:bookmarkEnd w:id="72"/>
+    <w:bookmarkEnd w:id="77"/>
+    <w:bookmarkEnd w:id="78"/>
+    <w:bookmarkEnd w:id="79"/>
     <w:sectPr>
       <w:footnotePr>
         <w:numRestart w:val="eachSect"/>

</xml_diff>

<commit_message>
Deploying to gh-pages from @ Morrison-Lab/pds@d8b07b78e4880459977d0d2c5d233a599bba0d0e 🚀
</commit_message>
<xml_diff>
--- a/probability-basics.docx
+++ b/probability-basics.docx
@@ -15,10 +15,10 @@
         <w:pStyle w:val="Date"/>
       </w:pPr>
       <w:r>
-        <w:t xml:space="preserve">Last modified: 2026-10-12 16:25:27 (PDT)</w:t>
+        <w:t xml:space="preserve">Last modified: 2026-10-12 20:16:36 (PDT)</w:t>
       </w:r>
     </w:p>
-    <w:bookmarkStart w:id="54" w:name="defining-probabilities"/>
+    <w:bookmarkStart w:id="56" w:name="defining-probabilities"/>
     <w:p>
       <w:pPr>
         <w:pStyle w:val="Heading2"/>
@@ -34,7 +34,7 @@
       <w:bookmarkStart w:id="9" w:name="sec-prob-axioms"/>
       <w:bookmarkEnd w:id="9"/>
     </w:p>
-    <w:bookmarkStart w:id="11" w:name="def-sample-space"/>
+    <w:bookmarkStart w:id="10" w:name="def-random-experiment"/>
     <w:p>
       <w:pPr>
         <w:pStyle w:val="BodyText"/>
@@ -44,7 +44,353 @@
           <w:b/>
           <w:bCs/>
         </w:rPr>
-        <w:t xml:space="preserve">Definition 1 (Sample space)</w:t>
+        <w:t xml:space="preserve">Definition 1 (Random experiment)</w:t>
+      </w:r>
+      <w:r>
+        <w:t xml:space="preserve"> </w:t>
+      </w:r>
+      <w:r>
+        <w:t xml:space="preserve">A</w:t>
+      </w:r>
+      <w:r>
+        <w:t xml:space="preserve"> </w:t>
+      </w:r>
+      <w:r>
+        <w:rPr>
+          <w:b/>
+          <w:bCs/>
+        </w:rPr>
+        <w:t xml:space="preserve">random experiment</w:t>
+      </w:r>
+      <w:r>
+        <w:t xml:space="preserve"> </w:t>
+      </w:r>
+      <w:r>
+        <w:t xml:space="preserve">is a procedure that produces exactly one outcome</w:t>
+      </w:r>
+      <w:r>
+        <w:t xml:space="preserve"> </w:t>
+      </w:r>
+      <w:r>
+        <w:t xml:space="preserve">out of several possible outcomes,</w:t>
+      </w:r>
+      <w:r>
+        <w:t xml:space="preserve"> </w:t>
+      </w:r>
+      <w:r>
+        <w:t xml:space="preserve">where which outcome it will produce is not determined in advance.</w:t>
+      </w:r>
+    </w:p>
+    <w:bookmarkEnd w:id="10"/>
+    <w:p>
+      <w:pPr>
+        <w:pStyle w:val="BodyText"/>
+      </w:pPr>
+      <w:r>
+        <w:rPr>
+          <w:i/>
+          <w:iCs/>
+        </w:rPr>
+        <w:t xml:space="preserve">Remark</w:t>
+      </w:r>
+      <w:r>
+        <w:t xml:space="preserve">. </w:t>
+      </w:r>
+      <w:r>
+        <w:t xml:space="preserve">The possible outcomes are collected in the</w:t>
+      </w:r>
+      <w:r>
+        <w:t xml:space="preserve"> </w:t>
+      </w:r>
+      <w:hyperlink w:anchor="def-sample-space">
+        <w:r>
+          <w:rPr>
+            <w:rStyle w:val="Hyperlink"/>
+          </w:rPr>
+          <w:t xml:space="preserve">sample space</w:t>
+        </w:r>
+      </w:hyperlink>
+      <w:r>
+        <w:t xml:space="preserve">.</w:t>
+      </w:r>
+      <w:r>
+        <w:t xml:space="preserve"> </w:t>
+      </w:r>
+      <w:r>
+        <w:t xml:space="preserve">Physical procedures, such as rolling a die, and sampling procedures,</w:t>
+      </w:r>
+      <w:r>
+        <w:t xml:space="preserve"> </w:t>
+      </w:r>
+      <w:r>
+        <w:t xml:space="preserve">such as picking a unit from a data set without looking, are both random experiments.</w:t>
+      </w:r>
+    </w:p>
+    <w:bookmarkStart w:id="13" w:name="exm-random-experiment"/>
+    <w:p>
+      <w:pPr>
+        <w:pStyle w:val="BodyText"/>
+      </w:pPr>
+      <w:r>
+        <w:rPr>
+          <w:b/>
+          <w:bCs/>
+        </w:rPr>
+        <w:t xml:space="preserve">Example 1 (Picking a car model from the Auto data)</w:t>
+      </w:r>
+      <w:r>
+        <w:t xml:space="preserve"> </w:t>
+      </w:r>
+      <w:r>
+        <w:t xml:space="preserve">The Auto data record the number of engine cylinders and the fuel economy</w:t>
+      </w:r>
+      <w:r>
+        <w:t xml:space="preserve"> </w:t>
+      </w:r>
+      <w:r>
+        <w:t xml:space="preserve">(miles per gallon) of</w:t>
+      </w:r>
+      <w:r>
+        <w:t xml:space="preserve"> </w:t>
+      </w:r>
+      <w:r>
+        <w:t xml:space="preserve">392 car models</w:t>
+      </w:r>
+      <w:r>
+        <w:t xml:space="preserve"> </w:t>
+      </w:r>
+      <w:r>
+        <w:t xml:space="preserve">sold between 1970 and 1982.</w:t>
+      </w:r>
+      <w:r>
+        <w:t xml:space="preserve"> </w:t>
+      </w:r>
+      <w:r>
+        <w:t xml:space="preserve">They come from the StatLib library at Carnegie Mellon University</w:t>
+      </w:r>
+      <w:r>
+        <w:t xml:space="preserve"> </w:t>
+      </w:r>
+      <w:r>
+        <w:t xml:space="preserve">and ship with the book</w:t>
+      </w:r>
+      <w:r>
+        <w:t xml:space="preserve"> </w:t>
+      </w:r>
+      <w:r>
+        <w:rPr>
+          <w:i/>
+          <w:iCs/>
+        </w:rPr>
+        <w:t xml:space="preserve">An Introduction to Statistical Learning</w:t>
+      </w:r>
+      <w:r>
+        <w:t xml:space="preserve"> </w:t>
+      </w:r>
+      <w:r>
+        <w:t xml:space="preserve">and the R package</w:t>
+      </w:r>
+      <w:r>
+        <w:t xml:space="preserve"> </w:t>
+      </w:r>
+      <w:hyperlink r:id="rId11">
+        <w:r>
+          <w:rPr>
+            <w:rStyle w:val="VerbatimChar"/>
+          </w:rPr>
+          <w:t xml:space="preserve">ISLR2</w:t>
+        </w:r>
+      </w:hyperlink>
+      <w:r>
+        <w:t xml:space="preserve"> </w:t>
+      </w:r>
+      <w:r>
+        <w:t xml:space="preserve">(</w:t>
+      </w:r>
+      <w:r>
+        <w:rPr>
+          <w:rStyle w:val="VerbatimChar"/>
+        </w:rPr>
+        <w:t xml:space="preserve">ISLR2::Auto</w:t>
+      </w:r>
+      <w:r>
+        <w:t xml:space="preserve">).</w:t>
+      </w:r>
+      <w:r>
+        <w:t xml:space="preserve"> </w:t>
+      </w:r>
+      <w:r>
+        <w:t xml:space="preserve">This site has a copy at</w:t>
+      </w:r>
+      <w:r>
+        <w:t xml:space="preserve"> </w:t>
+      </w:r>
+      <w:hyperlink r:id="rId12">
+        <w:r>
+          <w:rPr>
+            <w:rStyle w:val="VerbatimChar"/>
+          </w:rPr>
+          <w:t xml:space="preserve">data/auto.csv</w:t>
+        </w:r>
+      </w:hyperlink>
+      <w:r>
+        <w:t xml:space="preserve">.</w:t>
+      </w:r>
+    </w:p>
+    <w:p>
+      <w:pPr>
+        <w:pStyle w:val="BodyText"/>
+      </w:pPr>
+      <w:r>
+        <w:t xml:space="preserve">Pick one car model from the data without looking, and record its number of cylinders.</w:t>
+      </w:r>
+      <w:r>
+        <w:t xml:space="preserve"> </w:t>
+      </w:r>
+      <w:r>
+        <w:t xml:space="preserve">Which model comes up is not determined in advance,</w:t>
+      </w:r>
+      <w:r>
+        <w:t xml:space="preserve"> </w:t>
+      </w:r>
+      <w:r>
+        <w:t xml:space="preserve">so this procedure is a random experiment.</w:t>
+      </w:r>
+      <w:r>
+        <w:t xml:space="preserve"> </w:t>
+      </w:r>
+      <w:r>
+        <w:t xml:space="preserve">Its possible outcomes are the cylinder counts that occur in the data:</w:t>
+      </w:r>
+    </w:p>
+    <w:p>
+      <w:pPr>
+        <w:pStyle w:val="SourceCode"/>
+      </w:pPr>
+      <w:r>
+        <w:rPr>
+          <w:rStyle w:val="CommentTok"/>
+        </w:rPr>
+        <w:t xml:space="preserve"># read the local copy of the Auto data (one row per car model):</w:t>
+      </w:r>
+      <w:r>
+        <w:br/>
+      </w:r>
+      <w:r>
+        <w:rPr>
+          <w:rStyle w:val="NormalTok"/>
+        </w:rPr>
+        <w:t xml:space="preserve">auto </w:t>
+      </w:r>
+      <w:r>
+        <w:rPr>
+          <w:rStyle w:val="OtherTok"/>
+        </w:rPr>
+        <w:t xml:space="preserve">&lt;-</w:t>
+      </w:r>
+      <w:r>
+        <w:rPr>
+          <w:rStyle w:val="NormalTok"/>
+        </w:rPr>
+        <w:t xml:space="preserve"> </w:t>
+      </w:r>
+      <w:r>
+        <w:rPr>
+          <w:rStyle w:val="FunctionTok"/>
+        </w:rPr>
+        <w:t xml:space="preserve">read.csv</w:t>
+      </w:r>
+      <w:r>
+        <w:rPr>
+          <w:rStyle w:val="NormalTok"/>
+        </w:rPr>
+        <w:t xml:space="preserve">(</w:t>
+      </w:r>
+      <w:r>
+        <w:rPr>
+          <w:rStyle w:val="StringTok"/>
+        </w:rPr>
+        <w:t xml:space="preserve">"data/auto.csv"</w:t>
+      </w:r>
+      <w:r>
+        <w:rPr>
+          <w:rStyle w:val="NormalTok"/>
+        </w:rPr>
+        <w:t xml:space="preserve">)</w:t>
+      </w:r>
+      <w:r>
+        <w:br/>
+      </w:r>
+      <w:r>
+        <w:br/>
+      </w:r>
+      <w:r>
+        <w:rPr>
+          <w:rStyle w:val="CommentTok"/>
+        </w:rPr>
+        <w:t xml:space="preserve"># the possible outcomes are the distinct cylinder counts in the data:</w:t>
+      </w:r>
+      <w:r>
+        <w:br/>
+      </w:r>
+      <w:r>
+        <w:rPr>
+          <w:rStyle w:val="FunctionTok"/>
+        </w:rPr>
+        <w:t xml:space="preserve">sort</w:t>
+      </w:r>
+      <w:r>
+        <w:rPr>
+          <w:rStyle w:val="NormalTok"/>
+        </w:rPr>
+        <w:t xml:space="preserve">(</w:t>
+      </w:r>
+      <w:r>
+        <w:rPr>
+          <w:rStyle w:val="FunctionTok"/>
+        </w:rPr>
+        <w:t xml:space="preserve">unique</w:t>
+      </w:r>
+      <w:r>
+        <w:rPr>
+          <w:rStyle w:val="NormalTok"/>
+        </w:rPr>
+        <w:t xml:space="preserve">(auto</w:t>
+      </w:r>
+      <w:r>
+        <w:rPr>
+          <w:rStyle w:val="SpecialCharTok"/>
+        </w:rPr>
+        <w:t xml:space="preserve">$</w:t>
+      </w:r>
+      <w:r>
+        <w:rPr>
+          <w:rStyle w:val="NormalTok"/>
+        </w:rPr>
+        <w:t xml:space="preserve">cylinders))</w:t>
+      </w:r>
+      <w:r>
+        <w:br/>
+      </w:r>
+      <w:r>
+        <w:rPr>
+          <w:rStyle w:val="CommentTok"/>
+        </w:rPr>
+        <w:t xml:space="preserve">#&gt; [1] 3 4 5 6 8</w:t>
+      </w:r>
+    </w:p>
+    <w:bookmarkEnd w:id="13"/>
+    <w:bookmarkStart w:id="15" w:name="def-sample-space"/>
+    <w:p>
+      <w:pPr>
+        <w:pStyle w:val="FirstParagraph"/>
+      </w:pPr>
+      <w:r>
+        <w:rPr>
+          <w:b/>
+          <w:bCs/>
+        </w:rPr>
+        <w:t xml:space="preserve">Definition 2 (Sample space)</w:t>
       </w:r>
       <w:r>
         <w:t xml:space="preserve"> </w:t>
@@ -66,7 +412,21 @@
         <w:t xml:space="preserve"> </w:t>
       </w:r>
       <w:r>
-        <w:t xml:space="preserve">of a random experiment, denoted</w:t>
+        <w:t xml:space="preserve">of a</w:t>
+      </w:r>
+      <w:r>
+        <w:t xml:space="preserve"> </w:t>
+      </w:r>
+      <w:hyperlink w:anchor="def-random-experiment">
+        <w:r>
+          <w:rPr>
+            <w:rStyle w:val="Hyperlink"/>
+          </w:rPr>
+          <w:t xml:space="preserve">random experiment</w:t>
+        </w:r>
+      </w:hyperlink>
+      <w:r>
+        <w:t xml:space="preserve">, denoted</w:t>
       </w:r>
       <w:r>
         <w:t xml:space="preserve"> </w:t>
@@ -91,7 +451,7 @@
       <w:r>
         <w:t xml:space="preserve"> </w:t>
       </w:r>
-      <w:hyperlink r:id="rId10">
+      <w:hyperlink r:id="rId14">
         <w:r>
           <w:rPr>
             <w:rStyle w:val="Hyperlink"/>
@@ -106,8 +466,8 @@
         <w:t xml:space="preserve">of all of its possible outcomes.</w:t>
       </w:r>
     </w:p>
-    <w:bookmarkEnd w:id="11"/>
-    <w:bookmarkStart w:id="12" w:name="exm-sample-space"/>
+    <w:bookmarkEnd w:id="15"/>
+    <w:bookmarkStart w:id="16" w:name="exm-sample-space"/>
     <w:p>
       <w:pPr>
         <w:pStyle w:val="BodyText"/>
@@ -117,7 +477,7 @@
           <w:b/>
           <w:bCs/>
         </w:rPr>
-        <w:t xml:space="preserve">Example 1 (Sample space of a die roll)</w:t>
+        <w:t xml:space="preserve">Example 2 (Sample space of a die roll)</w:t>
       </w:r>
       <w:r>
         <w:t xml:space="preserve"> </w:t>
@@ -210,8 +570,8 @@
         <w:t xml:space="preserve">.</w:t>
       </w:r>
     </w:p>
-    <w:bookmarkEnd w:id="12"/>
-    <w:bookmarkStart w:id="13" w:name="def-event"/>
+    <w:bookmarkEnd w:id="16"/>
+    <w:bookmarkStart w:id="17" w:name="def-event"/>
     <w:p>
       <w:pPr>
         <w:pStyle w:val="BodyText"/>
@@ -221,7 +581,7 @@
           <w:b/>
           <w:bCs/>
         </w:rPr>
-        <w:t xml:space="preserve">Definition 2 (Event)</w:t>
+        <w:t xml:space="preserve">Definition 3 (Event)</w:t>
       </w:r>
       <w:r>
         <w:t xml:space="preserve"> </w:t>
@@ -277,7 +637,7 @@
         <w:t xml:space="preserve">a set of outcomes.</w:t>
       </w:r>
     </w:p>
-    <w:bookmarkEnd w:id="13"/>
+    <w:bookmarkEnd w:id="17"/>
     <w:p>
       <w:pPr>
         <w:pStyle w:val="BodyText"/>
@@ -321,7 +681,7 @@
       <w:r>
         <w:t xml:space="preserve"> </w:t>
       </w:r>
-      <w:hyperlink r:id="rId14">
+      <w:hyperlink r:id="rId18">
         <m:oMath>
           <m:r>
             <m:t>σ</m:t>
@@ -367,7 +727,43 @@
         <w:t xml:space="preserve"> </w:t>
       </w:r>
       <w:r>
-        <w:t xml:space="preserve">count as events;</w:t>
+        <w:t xml:space="preserve">count as events</w:t>
+      </w:r>
+      <w:r>
+        <w:t xml:space="preserve"> </w:t>
+      </w:r>
+      <w:r>
+        <w:t xml:space="preserve">(some sources call a</w:t>
+      </w:r>
+      <w:r>
+        <w:t xml:space="preserve"> </w:t>
+      </w:r>
+      <m:oMath>
+        <m:r>
+          <m:t>σ</m:t>
+        </m:r>
+      </m:oMath>
+      <w:r>
+        <w:t xml:space="preserve">-algebra a</w:t>
+      </w:r>
+      <w:r>
+        <w:t xml:space="preserve"> </w:t>
+      </w:r>
+      <w:r>
+        <w:rPr>
+          <w:b/>
+          <w:bCs/>
+        </w:rPr>
+        <w:t xml:space="preserve">Borel field</w:t>
+      </w:r>
+      <w:r>
+        <w:t xml:space="preserve"> </w:t>
+      </w:r>
+      <w:r>
+        <w:t xml:space="preserve">(Casella and Berger 2002, Def. 1.2.1)</w:t>
+      </w:r>
+      <w:r>
+        <w:t xml:space="preserve">);</w:t>
       </w:r>
       <w:r>
         <w:t xml:space="preserve"> </w:t>
@@ -416,7 +812,7 @@
       <w:r>
         <w:t xml:space="preserve"> </w:t>
       </w:r>
-      <w:hyperlink r:id="rId15">
+      <w:hyperlink r:id="rId19">
         <w:r>
           <w:rPr>
             <w:rStyle w:val="Hyperlink"/>
@@ -490,7 +886,7 @@
       <w:r>
         <w:t xml:space="preserve">(</w:t>
       </w:r>
-      <w:hyperlink r:id="rId16">
+      <w:hyperlink r:id="rId20">
         <w:r>
           <w:rPr>
             <w:rStyle w:val="Hyperlink"/>
@@ -527,7 +923,7 @@
       <w:r>
         <w:t xml:space="preserve"> </w:t>
       </w:r>
-      <w:hyperlink r:id="rId17">
+      <w:hyperlink r:id="rId21">
         <m:oMath>
           <m:r>
             <m:t>σ</m:t>
@@ -544,7 +940,7 @@
         <w:t xml:space="preserve">.</w:t>
       </w:r>
     </w:p>
-    <w:bookmarkStart w:id="18" w:name="exm-event"/>
+    <w:bookmarkStart w:id="22" w:name="exm-event"/>
     <w:p>
       <w:pPr>
         <w:pStyle w:val="BodyText"/>
@@ -554,7 +950,7 @@
           <w:b/>
           <w:bCs/>
         </w:rPr>
-        <w:t xml:space="preserve">Example 2 (Rolling an even number)</w:t>
+        <w:t xml:space="preserve">Example 3 (Rolling an even number)</w:t>
       </w:r>
       <w:r>
         <w:t xml:space="preserve"> </w:t>
@@ -570,7 +966,7 @@
           <w:rPr>
             <w:rStyle w:val="Hyperlink"/>
           </w:rPr>
-          <w:t xml:space="preserve">Example 1</w:t>
+          <w:t xml:space="preserve">Example 2</w:t>
         </w:r>
       </w:hyperlink>
       <w:r>
@@ -649,8 +1045,8 @@
         <w:t xml:space="preserve">.</w:t>
       </w:r>
     </w:p>
-    <w:bookmarkEnd w:id="18"/>
-    <w:bookmarkStart w:id="19" w:name="def-occurs"/>
+    <w:bookmarkEnd w:id="22"/>
+    <w:bookmarkStart w:id="23" w:name="def-occurs"/>
     <w:p>
       <w:pPr>
         <w:pStyle w:val="BodyText"/>
@@ -660,7 +1056,7 @@
           <w:b/>
           <w:bCs/>
         </w:rPr>
-        <w:t xml:space="preserve">Definition 3 (Occurrence of an event)</w:t>
+        <w:t xml:space="preserve">Definition 4 (Occurrence of an event)</w:t>
       </w:r>
       <w:r>
         <w:t xml:space="preserve"> </w:t>
@@ -732,8 +1128,8 @@
         <w:t xml:space="preserve">.</w:t>
       </w:r>
     </w:p>
-    <w:bookmarkEnd w:id="19"/>
-    <w:bookmarkStart w:id="20" w:name="exm-occurs"/>
+    <w:bookmarkEnd w:id="23"/>
+    <w:bookmarkStart w:id="24" w:name="exm-occurs"/>
     <w:p>
       <w:pPr>
         <w:pStyle w:val="BodyText"/>
@@ -743,7 +1139,7 @@
           <w:b/>
           <w:bCs/>
         </w:rPr>
-        <w:t xml:space="preserve">Example 3 (Rolling a 4)</w:t>
+        <w:t xml:space="preserve">Example 4 (Rolling a 4)</w:t>
       </w:r>
       <w:r>
         <w:t xml:space="preserve"> </w:t>
@@ -759,7 +1155,7 @@
           <w:rPr>
             <w:rStyle w:val="Hyperlink"/>
           </w:rPr>
-          <w:t xml:space="preserve">Example 2</w:t>
+          <w:t xml:space="preserve">Example 3</w:t>
         </w:r>
       </w:hyperlink>
       <w:r>
@@ -937,8 +1333,8 @@
         <w:t xml:space="preserve">, does not occur.</w:t>
       </w:r>
     </w:p>
-    <w:bookmarkEnd w:id="20"/>
-    <w:bookmarkStart w:id="21" w:name="def-complement"/>
+    <w:bookmarkEnd w:id="24"/>
+    <w:bookmarkStart w:id="25" w:name="def-complement"/>
     <w:p>
       <w:pPr>
         <w:pStyle w:val="BodyText"/>
@@ -948,7 +1344,7 @@
           <w:b/>
           <w:bCs/>
         </w:rPr>
-        <w:t xml:space="preserve">Definition 4 (Complement of an event)</w:t>
+        <w:t xml:space="preserve">Definition 5 (Complement of an event)</w:t>
       </w:r>
       <w:r>
         <w:t xml:space="preserve"> </w:t>
@@ -1135,7 +1531,7 @@
         </m:oMath>
       </m:oMathPara>
     </w:p>
-    <w:bookmarkEnd w:id="21"/>
+    <w:bookmarkEnd w:id="25"/>
     <w:p>
       <w:pPr>
         <w:pStyle w:val="FirstParagraph"/>
@@ -1195,7 +1591,7 @@
         <w:t xml:space="preserve">.</w:t>
       </w:r>
     </w:p>
-    <w:bookmarkStart w:id="22" w:name="exm-complement"/>
+    <w:bookmarkStart w:id="26" w:name="exm-complement"/>
     <w:p>
       <w:pPr>
         <w:pStyle w:val="BodyText"/>
@@ -1205,7 +1601,7 @@
           <w:b/>
           <w:bCs/>
         </w:rPr>
-        <w:t xml:space="preserve">Example 4 (Rolling an odd number)</w:t>
+        <w:t xml:space="preserve">Example 5 (Rolling an odd number)</w:t>
       </w:r>
       <w:r>
         <w:t xml:space="preserve"> </w:t>
@@ -1221,7 +1617,7 @@
           <w:rPr>
             <w:rStyle w:val="Hyperlink"/>
           </w:rPr>
-          <w:t xml:space="preserve">Example 2</w:t>
+          <w:t xml:space="preserve">Example 3</w:t>
         </w:r>
       </w:hyperlink>
       <w:r>
@@ -1372,8 +1768,8 @@
         <w:t xml:space="preserve">.</w:t>
       </w:r>
     </w:p>
-    <w:bookmarkEnd w:id="22"/>
-    <w:bookmarkStart w:id="23" w:name="def-mutually-exclusive"/>
+    <w:bookmarkEnd w:id="26"/>
+    <w:bookmarkStart w:id="27" w:name="def-mutually-exclusive"/>
     <w:p>
       <w:pPr>
         <w:pStyle w:val="BodyText"/>
@@ -1383,7 +1779,7 @@
           <w:b/>
           <w:bCs/>
         </w:rPr>
-        <w:t xml:space="preserve">Definition 5 (Mutually exclusive events)</w:t>
+        <w:t xml:space="preserve">Definition 6 (Mutually exclusive events)</w:t>
       </w:r>
       <w:r>
         <w:t xml:space="preserve"> </w:t>
@@ -1605,7 +2001,7 @@
         </m:oMath>
       </m:oMathPara>
     </w:p>
-    <w:bookmarkEnd w:id="23"/>
+    <w:bookmarkEnd w:id="27"/>
     <w:p>
       <w:pPr>
         <w:pStyle w:val="FirstParagraph"/>
@@ -1632,7 +2028,7 @@
       <w:r>
         <w:t xml:space="preserve"> </w:t>
       </w:r>
-      <w:hyperlink r:id="rId24">
+      <w:hyperlink r:id="rId28">
         <w:r>
           <w:rPr>
             <w:rStyle w:val="Hyperlink"/>
@@ -1644,7 +2040,7 @@
         <w:t xml:space="preserve">.</w:t>
       </w:r>
     </w:p>
-    <w:bookmarkStart w:id="25" w:name="exm-mutually-exclusive"/>
+    <w:bookmarkStart w:id="29" w:name="exm-mutually-exclusive"/>
     <w:p>
       <w:pPr>
         <w:pStyle w:val="BodyText"/>
@@ -1654,7 +2050,7 @@
           <w:b/>
           <w:bCs/>
         </w:rPr>
-        <w:t xml:space="preserve">Example 5 (Low and high rolls)</w:t>
+        <w:t xml:space="preserve">Example 6 (Low and high rolls)</w:t>
       </w:r>
       <w:r>
         <w:t xml:space="preserve"> </w:t>
@@ -1670,7 +2066,7 @@
           <w:rPr>
             <w:rStyle w:val="Hyperlink"/>
           </w:rPr>
-          <w:t xml:space="preserve">Example 1</w:t>
+          <w:t xml:space="preserve">Example 2</w:t>
         </w:r>
       </w:hyperlink>
       <w:r>
@@ -1902,8 +2298,8 @@
         <w:t xml:space="preserve">are not mutually exclusive: a roll of 2 is in both.</w:t>
       </w:r>
     </w:p>
-    <w:bookmarkEnd w:id="25"/>
-    <w:bookmarkStart w:id="26" w:name="def-partition"/>
+    <w:bookmarkEnd w:id="29"/>
+    <w:bookmarkStart w:id="30" w:name="def-partition"/>
     <w:p>
       <w:pPr>
         <w:pStyle w:val="BodyText"/>
@@ -1913,7 +2309,7 @@
           <w:b/>
           <w:bCs/>
         </w:rPr>
-        <w:t xml:space="preserve">Definition 6 (Partition of an event)</w:t>
+        <w:t xml:space="preserve">Definition 7 (Partition of an event)</w:t>
       </w:r>
       <w:r>
         <w:t xml:space="preserve"> </w:t>
@@ -2210,7 +2606,7 @@
         <w:t xml:space="preserve">.</w:t>
       </w:r>
     </w:p>
-    <w:bookmarkEnd w:id="26"/>
+    <w:bookmarkEnd w:id="30"/>
     <w:p>
       <w:pPr>
         <w:pStyle w:val="BodyText"/>
@@ -2252,7 +2648,7 @@
         <w:t xml:space="preserve">to contain at least one outcome.</w:t>
       </w:r>
     </w:p>
-    <w:bookmarkStart w:id="27" w:name="exm-partition"/>
+    <w:bookmarkStart w:id="31" w:name="exm-partition"/>
     <w:p>
       <w:pPr>
         <w:pStyle w:val="BodyText"/>
@@ -2262,7 +2658,7 @@
           <w:b/>
           <w:bCs/>
         </w:rPr>
-        <w:t xml:space="preserve">Example 6 (Partitioning the die roll)</w:t>
+        <w:t xml:space="preserve">Example 7 (Partitioning the die roll)</w:t>
       </w:r>
       <w:r>
         <w:t xml:space="preserve"> </w:t>
@@ -2278,7 +2674,7 @@
           <w:rPr>
             <w:rStyle w:val="Hyperlink"/>
           </w:rPr>
-          <w:t xml:space="preserve">Example 1</w:t>
+          <w:t xml:space="preserve">Example 2</w:t>
         </w:r>
       </w:hyperlink>
       <w:r>
@@ -2617,7 +3013,7 @@
           <w:rPr>
             <w:rStyle w:val="Hyperlink"/>
           </w:rPr>
-          <w:t xml:space="preserve">Example 5</w:t>
+          <w:t xml:space="preserve">Example 6</w:t>
         </w:r>
       </w:hyperlink>
       <w:r>
@@ -2641,8 +3037,8 @@
         <w:t xml:space="preserve">: their union leaves out 3 and 4.</w:t>
       </w:r>
     </w:p>
-    <w:bookmarkEnd w:id="27"/>
-    <w:bookmarkStart w:id="29" w:name="def-probability"/>
+    <w:bookmarkEnd w:id="31"/>
+    <w:bookmarkStart w:id="33" w:name="def-probability"/>
     <w:p>
       <w:pPr>
         <w:pStyle w:val="BodyText"/>
@@ -2652,7 +3048,7 @@
           <w:b/>
           <w:bCs/>
         </w:rPr>
-        <w:t xml:space="preserve">Definition 7 (Probability measure)</w:t>
+        <w:t xml:space="preserve">Definition 8 (Probability measure)</w:t>
       </w:r>
       <w:r>
         <w:t xml:space="preserve"> </w:t>
@@ -2771,7 +3167,7 @@
       <w:r>
         <w:t xml:space="preserve"> </w:t>
       </w:r>
-      <w:hyperlink r:id="rId28">
+      <w:hyperlink r:id="rId32">
         <w:r>
           <w:rPr>
             <w:rStyle w:val="Hyperlink"/>
@@ -2865,18 +3261,61 @@
         </m:oMath>
       </m:oMathPara>
     </w:p>
-    <w:bookmarkEnd w:id="29"/>
-    <w:bookmarkStart w:id="31" w:name="exm-probability"/>
+    <w:bookmarkEnd w:id="33"/>
     <w:p>
       <w:pPr>
         <w:pStyle w:val="FirstParagraph"/>
       </w:pPr>
       <w:r>
         <w:rPr>
+          <w:i/>
+          <w:iCs/>
+        </w:rPr>
+        <w:t xml:space="preserve">Remark</w:t>
+      </w:r>
+      <w:r>
+        <w:t xml:space="preserve">. </w:t>
+      </w:r>
+      <w:r>
+        <w:t xml:space="preserve">Other sources call a probability measure a</w:t>
+      </w:r>
+      <w:r>
+        <w:t xml:space="preserve"> </w:t>
+      </w:r>
+      <w:r>
+        <w:rPr>
           <w:b/>
           <w:bCs/>
         </w:rPr>
-        <w:t xml:space="preserve">Example 7 (Probability measure for a fair die)</w:t>
+        <w:t xml:space="preserve">probability function</w:t>
+      </w:r>
+      <w:r>
+        <w:t xml:space="preserve"> </w:t>
+      </w:r>
+      <w:r>
+        <w:t xml:space="preserve">(Casella and Berger 2002, Def. 1.2.4)</w:t>
+      </w:r>
+      <w:r>
+        <w:t xml:space="preserve">.</w:t>
+      </w:r>
+      <w:r>
+        <w:t xml:space="preserve"> </w:t>
+      </w:r>
+      <w:r>
+        <w:t xml:space="preserve">The two names mean the same thing.</w:t>
+      </w:r>
+    </w:p>
+    <w:bookmarkStart w:id="35" w:name="exm-probability"/>
+    <w:p>
+      <w:pPr>
+        <w:pStyle w:val="BodyText"/>
+      </w:pPr>
+      <w:r>
+        <w:rPr>
+          <w:b/>
+          <w:bCs/>
+        </w:rPr>
+        <w:t xml:space="preserve">Example 8 (Probability measure for a fair die)</w:t>
       </w:r>
       <w:r>
         <w:t xml:space="preserve"> </w:t>
@@ -2892,7 +3331,7 @@
           <w:rPr>
             <w:rStyle w:val="Hyperlink"/>
           </w:rPr>
-          <w:t xml:space="preserve">Example 1</w:t>
+          <w:t xml:space="preserve">Example 2</w:t>
         </w:r>
       </w:hyperlink>
       <w:r>
@@ -3116,7 +3555,7 @@
       <w:r>
         <w:t xml:space="preserve">(</w:t>
       </w:r>
-      <w:hyperlink r:id="rId30">
+      <w:hyperlink r:id="rId34">
         <w:r>
           <w:rPr>
             <w:rStyle w:val="Hyperlink"/>
@@ -3136,7 +3575,7 @@
       <w:r>
         <w:t xml:space="preserve"> </w:t>
       </w:r>
-      <w:hyperlink r:id="rId28">
+      <w:hyperlink r:id="rId32">
         <w:r>
           <w:rPr>
             <w:rStyle w:val="Hyperlink"/>
@@ -3279,7 +3718,7 @@
           <w:rPr>
             <w:rStyle w:val="Hyperlink"/>
           </w:rPr>
-          <w:t xml:space="preserve">Example 2</w:t>
+          <w:t xml:space="preserve">Example 3</w:t>
         </w:r>
       </w:hyperlink>
       <w:r>
@@ -3410,8 +3849,8 @@
         </m:oMath>
       </m:oMathPara>
     </w:p>
-    <w:bookmarkEnd w:id="31"/>
-    <w:bookmarkStart w:id="33" w:name="cor-probability-finitely-additive"/>
+    <w:bookmarkEnd w:id="35"/>
+    <w:bookmarkStart w:id="37" w:name="cor-probability-finitely-additive"/>
     <w:p>
       <w:pPr>
         <w:pStyle w:val="FirstParagraph"/>
@@ -3449,7 +3888,7 @@
       <w:r>
         <w:t xml:space="preserve"> </w:t>
       </w:r>
-      <w:hyperlink r:id="rId32">
+      <w:hyperlink r:id="rId36">
         <w:r>
           <w:rPr>
             <w:rStyle w:val="Hyperlink"/>
@@ -3671,7 +4110,7 @@
         </m:oMath>
       </m:oMathPara>
     </w:p>
-    <w:bookmarkEnd w:id="33"/>
+    <w:bookmarkEnd w:id="37"/>
     <w:p>
       <w:pPr>
         <w:pStyle w:val="FirstParagraph"/>
@@ -3694,7 +4133,7 @@
           <w:rPr>
             <w:rStyle w:val="Hyperlink"/>
           </w:rPr>
-          <w:t xml:space="preserve">Definition 7</w:t>
+          <w:t xml:space="preserve">Definition 8</w:t>
         </w:r>
       </w:hyperlink>
       <w:r>
@@ -3709,7 +4148,7 @@
       <w:r>
         <w:t xml:space="preserve"> </w:t>
       </w:r>
-      <w:hyperlink r:id="rId34">
+      <w:hyperlink r:id="rId38">
         <w:r>
           <w:rPr>
             <w:rStyle w:val="Hyperlink"/>
@@ -3724,7 +4163,7 @@
         <w:t xml:space="preserve">applies to it.</w:t>
       </w:r>
     </w:p>
-    <w:bookmarkStart w:id="35" w:name="thm-continuity-probability"/>
+    <w:bookmarkStart w:id="39" w:name="thm-continuity-probability"/>
     <w:p>
       <w:pPr>
         <w:pStyle w:val="BodyText"/>
@@ -3950,7 +4389,7 @@
         </m:oMath>
       </m:oMathPara>
     </w:p>
-    <w:bookmarkEnd w:id="35"/>
+    <w:bookmarkEnd w:id="39"/>
     <w:p>
       <w:pPr>
         <w:pStyle w:val="FirstParagraph"/>
@@ -4222,7 +4661,7 @@
       <w:r>
         <w:t xml:space="preserve"> </w:t>
       </w:r>
-      <w:hyperlink r:id="rId36">
+      <w:hyperlink r:id="rId40">
         <w:r>
           <w:rPr>
             <w:rStyle w:val="Hyperlink"/>
@@ -6746,7 +7185,7 @@
         <w:t xml:space="preserve">valid.</w:t>
       </w:r>
     </w:p>
-    <w:bookmarkStart w:id="38" w:name="thm-kolmogorov-axioms"/>
+    <w:bookmarkStart w:id="42" w:name="thm-kolmogorov-axioms"/>
     <w:p>
       <w:pPr>
         <w:pStyle w:val="BodyText"/>
@@ -7016,7 +7455,7 @@
       <w:r>
         <w:t xml:space="preserve"> </w:t>
       </w:r>
-      <w:hyperlink r:id="rId37">
+      <w:hyperlink r:id="rId41">
         <w:r>
           <w:rPr>
             <w:rStyle w:val="Hyperlink"/>
@@ -7251,7 +7690,7 @@
         </m:oMath>
       </m:oMathPara>
     </w:p>
-    <w:bookmarkEnd w:id="38"/>
+    <w:bookmarkEnd w:id="42"/>
     <w:p>
       <w:pPr>
         <w:pStyle w:val="FirstParagraph"/>
@@ -7295,7 +7734,7 @@
       <w:r>
         <w:t xml:space="preserve"> </w:t>
       </w:r>
-      <w:hyperlink r:id="rId28">
+      <w:hyperlink r:id="rId32">
         <w:r>
           <w:rPr>
             <w:rStyle w:val="Hyperlink"/>
@@ -7309,7 +7748,7 @@
       <w:r>
         <w:t xml:space="preserve"> </w:t>
       </w:r>
-      <w:hyperlink r:id="rId39">
+      <w:hyperlink r:id="rId43">
         <w:r>
           <w:rPr>
             <w:rStyle w:val="Hyperlink"/>
@@ -7422,7 +7861,7 @@
           <w:rPr>
             <w:rStyle w:val="Hyperlink"/>
           </w:rPr>
-          <w:t xml:space="preserve">Definition 7</w:t>
+          <w:t xml:space="preserve">Definition 8</w:t>
         </w:r>
       </w:hyperlink>
       <w:r>
@@ -7537,7 +7976,7 @@
       <w:r>
         <w:t xml:space="preserve"> </w:t>
       </w:r>
-      <w:hyperlink r:id="rId37">
+      <w:hyperlink r:id="rId41">
         <w:r>
           <w:rPr>
             <w:rStyle w:val="Hyperlink"/>
@@ -7557,7 +7996,7 @@
       <w:r>
         <w:t xml:space="preserve"> </w:t>
       </w:r>
-      <w:hyperlink r:id="rId40">
+      <w:hyperlink r:id="rId44">
         <w:r>
           <w:rPr>
             <w:rStyle w:val="Hyperlink"/>
@@ -7719,7 +8158,7 @@
       <w:r>
         <w:t xml:space="preserve"> </w:t>
       </w:r>
-      <w:hyperlink r:id="rId28">
+      <w:hyperlink r:id="rId32">
         <w:r>
           <w:rPr>
             <w:rStyle w:val="Hyperlink"/>
@@ -7822,7 +8261,7 @@
           <w:rPr>
             <w:rStyle w:val="Hyperlink"/>
           </w:rPr>
-          <w:t xml:space="preserve">Definition 7</w:t>
+          <w:t xml:space="preserve">Definition 8</w:t>
         </w:r>
       </w:hyperlink>
       <w:r>
@@ -7873,7 +8312,7 @@
       <w:r>
         <w:t xml:space="preserve"> </w:t>
       </w:r>
-      <w:hyperlink r:id="rId41">
+      <w:hyperlink r:id="rId45">
         <w:r>
           <w:rPr>
             <w:rStyle w:val="Hyperlink"/>
@@ -7938,7 +8377,7 @@
         <w:t xml:space="preserve">the proof above derives it.</w:t>
       </w:r>
     </w:p>
-    <w:bookmarkStart w:id="42" w:name="thm-prob-subset"/>
+    <w:bookmarkStart w:id="46" w:name="thm-prob-subset"/>
     <w:p>
       <w:pPr>
         <w:pStyle w:val="BodyText"/>
@@ -8070,7 +8509,7 @@
         <w:t xml:space="preserve">.</w:t>
       </w:r>
     </w:p>
-    <w:bookmarkEnd w:id="42"/>
+    <w:bookmarkEnd w:id="46"/>
     <w:p>
       <w:pPr>
         <w:pStyle w:val="BodyText"/>
@@ -8234,7 +8673,7 @@
         <w:t xml:space="preserve">.</w:t>
       </w:r>
     </w:p>
-    <w:bookmarkStart w:id="43" w:name="thm-total-prob-1"/>
+    <w:bookmarkStart w:id="47" w:name="thm-total-prob-1"/>
     <w:p>
       <w:pPr>
         <w:pStyle w:val="BodyText"/>
@@ -8370,7 +8809,7 @@
         </m:oMath>
       </m:oMathPara>
     </w:p>
-    <w:bookmarkEnd w:id="43"/>
+    <w:bookmarkEnd w:id="47"/>
     <w:p>
       <w:pPr>
         <w:pStyle w:val="FirstParagraph"/>
@@ -8677,7 +9116,7 @@
         </m:oMath>
       </m:oMathPara>
     </w:p>
-    <w:bookmarkStart w:id="44" w:name="cor-p-neg0"/>
+    <w:bookmarkStart w:id="48" w:name="cor-p-neg0"/>
     <w:p>
       <w:pPr>
         <w:pStyle w:val="FirstParagraph"/>
@@ -8782,7 +9221,7 @@
         </m:oMath>
       </m:oMathPara>
     </w:p>
-    <w:bookmarkEnd w:id="44"/>
+    <w:bookmarkEnd w:id="48"/>
     <w:p>
       <w:pPr>
         <w:pStyle w:val="FirstParagraph"/>
@@ -8847,7 +9286,7 @@
         <w:t xml:space="preserve">.</w:t>
       </w:r>
     </w:p>
-    <w:bookmarkStart w:id="45" w:name="cor-p-neg"/>
+    <w:bookmarkStart w:id="49" w:name="cor-p-neg"/>
     <w:p>
       <w:pPr>
         <w:pStyle w:val="BodyText"/>
@@ -9007,7 +9446,7 @@
         </m:oMath>
       </m:oMathPara>
     </w:p>
-    <w:bookmarkEnd w:id="45"/>
+    <w:bookmarkEnd w:id="49"/>
     <w:p>
       <w:pPr>
         <w:pStyle w:val="FirstParagraph"/>
@@ -9191,7 +9630,7 @@
         </m:oMath>
       </m:oMathPara>
     </w:p>
-    <w:bookmarkStart w:id="46" w:name="exm-p-neg"/>
+    <w:bookmarkStart w:id="50" w:name="exm-p-neg"/>
     <w:p>
       <w:pPr>
         <w:pStyle w:val="FirstParagraph"/>
@@ -9201,7 +9640,7 @@
           <w:b/>
           <w:bCs/>
         </w:rPr>
-        <w:t xml:space="preserve">Example 8 (Probability of not rolling a six)</w:t>
+        <w:t xml:space="preserve">Example 9 (Probability of not rolling a six)</w:t>
       </w:r>
       <w:r>
         <w:t xml:space="preserve"> </w:t>
@@ -9321,8 +9760,8 @@
         <w:t xml:space="preserve">.</w:t>
       </w:r>
     </w:p>
-    <w:bookmarkEnd w:id="46"/>
-    <w:bookmarkStart w:id="48" w:name="def-random-choice"/>
+    <w:bookmarkEnd w:id="50"/>
+    <w:bookmarkStart w:id="52" w:name="def-random-choice"/>
     <w:p>
       <w:pPr>
         <w:pStyle w:val="BodyText"/>
@@ -9332,7 +9771,7 @@
           <w:b/>
           <w:bCs/>
         </w:rPr>
-        <w:t xml:space="preserve">Definition 8 (Choosing at random)</w:t>
+        <w:t xml:space="preserve">Definition 9 (Choosing at random)</w:t>
       </w:r>
       <w:r>
         <w:t xml:space="preserve"> </w:t>
@@ -9357,7 +9796,7 @@
       <w:r>
         <w:t xml:space="preserve"> </w:t>
       </w:r>
-      <w:hyperlink r:id="rId28">
+      <w:hyperlink r:id="rId32">
         <w:r>
           <w:rPr>
             <w:rStyle w:val="Hyperlink"/>
@@ -9477,8 +9916,19 @@
       <w:r>
         <w:t xml:space="preserve"> </w:t>
       </w:r>
-      <w:r>
-        <w:t xml:space="preserve">random experiment whose</w:t>
+      <w:hyperlink w:anchor="def-random-experiment">
+        <w:r>
+          <w:rPr>
+            <w:rStyle w:val="Hyperlink"/>
+          </w:rPr>
+          <w:t xml:space="preserve">random experiment</w:t>
+        </w:r>
+      </w:hyperlink>
+      <w:r>
+        <w:t xml:space="preserve"> </w:t>
+      </w:r>
+      <w:r>
+        <w:t xml:space="preserve">whose</w:t>
       </w:r>
       <w:r>
         <w:t xml:space="preserve"> </w:t>
@@ -9531,7 +9981,7 @@
       <w:r>
         <w:t xml:space="preserve"> </w:t>
       </w:r>
-      <w:hyperlink r:id="rId47">
+      <w:hyperlink r:id="rId51">
         <w:r>
           <w:rPr>
             <w:rStyle w:val="Hyperlink"/>
@@ -9557,8 +10007,8 @@
         <w:t xml:space="preserve">.</w:t>
       </w:r>
     </w:p>
-    <w:bookmarkEnd w:id="48"/>
-    <w:bookmarkStart w:id="50" w:name="exm-random-choice-sets"/>
+    <w:bookmarkEnd w:id="52"/>
+    <w:bookmarkStart w:id="54" w:name="exm-random-choice-sets"/>
     <w:p>
       <w:pPr>
         <w:pStyle w:val="BodyText"/>
@@ -9568,7 +10018,7 @@
           <w:b/>
           <w:bCs/>
         </w:rPr>
-        <w:t xml:space="preserve">Example 9 (Choosing at random from a finite set and from an interval)</w:t>
+        <w:t xml:space="preserve">Example 10 (Choosing at random from a finite set and from an interval)</w:t>
       </w:r>
       <w:r>
         <w:t xml:space="preserve"> </w:t>
@@ -9644,7 +10094,7 @@
       <w:r>
         <w:t xml:space="preserve"> </w:t>
       </w:r>
-      <w:hyperlink r:id="rId30">
+      <w:hyperlink r:id="rId34">
         <w:r>
           <w:rPr>
             <w:rStyle w:val="Hyperlink"/>
@@ -9995,7 +10445,7 @@
       <w:r>
         <w:t xml:space="preserve"> </w:t>
       </w:r>
-      <w:hyperlink r:id="rId49">
+      <w:hyperlink r:id="rId53">
         <m:oMath>
           <m:r>
             <m:rPr>
@@ -10060,8 +10510,8 @@
         <w:t xml:space="preserve">so they have no choice at random in this sense.</w:t>
       </w:r>
     </w:p>
-    <w:bookmarkEnd w:id="50"/>
-    <w:bookmarkStart w:id="53" w:name="exm-random-choice-auto"/>
+    <w:bookmarkEnd w:id="54"/>
+    <w:bookmarkStart w:id="55" w:name="exm-random-choice-auto"/>
     <w:p>
       <w:pPr>
         <w:pStyle w:val="BodyText"/>
@@ -10071,111 +10521,40 @@
           <w:b/>
           <w:bCs/>
         </w:rPr>
-        <w:t xml:space="preserve">Example 10 (Choosing a car at random from the Auto data)</w:t>
-      </w:r>
-      <w:r>
-        <w:t xml:space="preserve"> </w:t>
-      </w:r>
-      <w:r>
-        <w:t xml:space="preserve">The Auto data record the number of engine cylinders and the fuel economy</w:t>
-      </w:r>
-      <w:r>
-        <w:t xml:space="preserve"> </w:t>
-      </w:r>
-      <w:r>
-        <w:t xml:space="preserve">(miles per gallon) of</w:t>
-      </w:r>
-      <w:r>
-        <w:t xml:space="preserve"> </w:t>
-      </w:r>
-      <w:r>
-        <w:t xml:space="preserve">392 car models</w:t>
-      </w:r>
-      <w:r>
-        <w:t xml:space="preserve"> </w:t>
-      </w:r>
-      <w:r>
-        <w:t xml:space="preserve">sold between 1970 and 1982.</w:t>
-      </w:r>
-      <w:r>
-        <w:t xml:space="preserve"> </w:t>
-      </w:r>
-      <w:r>
-        <w:t xml:space="preserve">They come from the StatLib library at Carnegie Mellon University</w:t>
-      </w:r>
-      <w:r>
-        <w:t xml:space="preserve"> </w:t>
-      </w:r>
-      <w:r>
-        <w:t xml:space="preserve">and ship with the book</w:t>
-      </w:r>
-      <w:r>
-        <w:t xml:space="preserve"> </w:t>
-      </w:r>
-      <w:r>
-        <w:rPr>
-          <w:i/>
-          <w:iCs/>
-        </w:rPr>
-        <w:t xml:space="preserve">An Introduction to Statistical Learning</w:t>
-      </w:r>
-      <w:r>
-        <w:t xml:space="preserve"> </w:t>
-      </w:r>
-      <w:r>
-        <w:t xml:space="preserve">and the R package</w:t>
-      </w:r>
-      <w:r>
-        <w:t xml:space="preserve"> </w:t>
-      </w:r>
-      <w:hyperlink r:id="rId51">
+        <w:t xml:space="preserve">Example 11 (Choosing a car at random from the Auto data)</w:t>
+      </w:r>
+      <w:r>
+        <w:t xml:space="preserve"> </w:t>
+      </w:r>
+      <w:r>
+        <w:t xml:space="preserve">The Auto data of</w:t>
+      </w:r>
+      <w:r>
+        <w:t xml:space="preserve"> </w:t>
+      </w:r>
+      <w:hyperlink w:anchor="exm-random-experiment">
         <w:r>
           <w:rPr>
-            <w:rStyle w:val="VerbatimChar"/>
+            <w:rStyle w:val="Hyperlink"/>
           </w:rPr>
-          <w:t xml:space="preserve">ISLR2</w:t>
+          <w:t xml:space="preserve">Example 1</w:t>
         </w:r>
       </w:hyperlink>
       <w:r>
         <w:t xml:space="preserve"> </w:t>
       </w:r>
       <w:r>
-        <w:t xml:space="preserve">(</w:t>
-      </w:r>
-      <w:r>
-        <w:rPr>
-          <w:rStyle w:val="VerbatimChar"/>
-        </w:rPr>
-        <w:t xml:space="preserve">ISLR2::Auto</w:t>
-      </w:r>
-      <w:r>
-        <w:t xml:space="preserve">).</w:t>
-      </w:r>
-      <w:r>
-        <w:t xml:space="preserve"> </w:t>
-      </w:r>
-      <w:r>
-        <w:t xml:space="preserve">This site has a copy at</w:t>
-      </w:r>
-      <w:r>
-        <w:t xml:space="preserve"> </w:t>
-      </w:r>
-      <w:hyperlink r:id="rId52">
-        <w:r>
-          <w:rPr>
-            <w:rStyle w:val="VerbatimChar"/>
-          </w:rPr>
-          <w:t xml:space="preserve">data/auto.csv</w:t>
-        </w:r>
-      </w:hyperlink>
-      <w:r>
-        <w:t xml:space="preserve">.</w:t>
-      </w:r>
-    </w:p>
-    <w:p>
-      <w:pPr>
-        <w:pStyle w:val="BodyText"/>
-      </w:pPr>
+        <w:t xml:space="preserve">have</w:t>
+      </w:r>
+      <w:r>
+        <w:t xml:space="preserve"> </w:t>
+      </w:r>
+      <w:r>
+        <w:t xml:space="preserve">392 car models.</w:t>
+      </w:r>
+      <w:r>
+        <w:t xml:space="preserve"> </w:t>
+      </w:r>
       <w:r>
         <w:t xml:space="preserve">Let</w:t>
       </w:r>
@@ -10218,7 +10597,7 @@
           <w:rPr>
             <w:rStyle w:val="Hyperlink"/>
           </w:rPr>
-          <w:t xml:space="preserve">Definition 8</w:t>
+          <w:t xml:space="preserve">Definition 9</w:t>
         </w:r>
       </w:hyperlink>
       <w:r>
@@ -10431,9 +10810,9 @@
         <w:t xml:space="preserve">#&gt; [1] 0.5076531</w:t>
       </w:r>
     </w:p>
-    <w:bookmarkEnd w:id="53"/>
-    <w:bookmarkEnd w:id="54"/>
-    <w:bookmarkStart w:id="72" w:name="conditional-probability"/>
+    <w:bookmarkEnd w:id="55"/>
+    <w:bookmarkEnd w:id="56"/>
+    <w:bookmarkStart w:id="74" w:name="conditional-probability"/>
     <w:p>
       <w:pPr>
         <w:pStyle w:val="Heading2"/>
@@ -10442,7 +10821,7 @@
         <w:t xml:space="preserve">2 Conditional probability</w:t>
       </w:r>
     </w:p>
-    <w:bookmarkStart w:id="55" w:name="def-conditional-prob"/>
+    <w:bookmarkStart w:id="57" w:name="def-conditional-prob"/>
     <w:p>
       <w:pPr>
         <w:pStyle w:val="FirstParagraph"/>
@@ -10452,7 +10831,7 @@
           <w:b/>
           <w:bCs/>
         </w:rPr>
-        <w:t xml:space="preserve">Definition 9 (Conditional probability)</w:t>
+        <w:t xml:space="preserve">Definition 10 (Conditional probability)</w:t>
       </w:r>
       <w:r>
         <w:t xml:space="preserve"> </w:t>
@@ -10739,7 +11118,7 @@
         </m:oMath>
       </m:oMathPara>
     </w:p>
-    <w:bookmarkEnd w:id="55"/>
+    <w:bookmarkEnd w:id="57"/>
     <w:p>
       <w:pPr>
         <w:pStyle w:val="FirstParagraph"/>
@@ -10871,7 +11250,7 @@
         <w:t xml:space="preserve">.</w:t>
       </w:r>
     </w:p>
-    <w:bookmarkStart w:id="56" w:name="exm-conditional-prob"/>
+    <w:bookmarkStart w:id="58" w:name="exm-conditional-prob"/>
     <w:p>
       <w:pPr>
         <w:pStyle w:val="BodyText"/>
@@ -10881,7 +11260,7 @@
           <w:b/>
           <w:bCs/>
         </w:rPr>
-        <w:t xml:space="preserve">Example 11 (Rolling a six, given an even roll)</w:t>
+        <w:t xml:space="preserve">Example 12 (Rolling a six, given an even roll)</w:t>
       </w:r>
       <w:r>
         <w:t xml:space="preserve"> </w:t>
@@ -10894,7 +11273,7 @@
           <w:rPr>
             <w:rStyle w:val="Hyperlink"/>
           </w:rPr>
-          <w:t xml:space="preserve">Example 7</w:t>
+          <w:t xml:space="preserve">Example 8</w:t>
         </w:r>
       </w:hyperlink>
       <w:r>
@@ -11275,8 +11654,8 @@
         </m:oMath>
       </m:oMathPara>
     </w:p>
-    <w:bookmarkEnd w:id="56"/>
-    <w:bookmarkStart w:id="57" w:name="thm-law-conditional-prob"/>
+    <w:bookmarkEnd w:id="58"/>
+    <w:bookmarkStart w:id="59" w:name="thm-law-conditional-prob"/>
     <w:p>
       <w:pPr>
         <w:pStyle w:val="FirstParagraph"/>
@@ -11466,7 +11845,7 @@
         </m:oMath>
       </m:oMathPara>
     </w:p>
-    <w:bookmarkEnd w:id="57"/>
+    <w:bookmarkEnd w:id="59"/>
     <w:p>
       <w:pPr>
         <w:pStyle w:val="FirstParagraph"/>
@@ -11492,7 +11871,7 @@
           <w:rPr>
             <w:rStyle w:val="Hyperlink"/>
           </w:rPr>
-          <w:t xml:space="preserve">Definition 9</w:t>
+          <w:t xml:space="preserve">Definition 10</w:t>
         </w:r>
       </w:hyperlink>
       <w:r>
@@ -11766,7 +12145,7 @@
         </m:oMath>
       </m:oMathPara>
     </w:p>
-    <w:bookmarkStart w:id="58" w:name="exm-law-conditional-prob"/>
+    <w:bookmarkStart w:id="60" w:name="exm-law-conditional-prob"/>
     <w:p>
       <w:pPr>
         <w:pStyle w:val="FirstParagraph"/>
@@ -11776,7 +12155,7 @@
           <w:b/>
           <w:bCs/>
         </w:rPr>
-        <w:t xml:space="preserve">Example 12 (Applying the law of conditional probability)</w:t>
+        <w:t xml:space="preserve">Example 13 (Applying the law of conditional probability)</w:t>
       </w:r>
       <w:r>
         <w:t xml:space="preserve"> </w:t>
@@ -12098,8 +12477,8 @@
         </m:oMath>
       </m:oMathPara>
     </w:p>
-    <w:bookmarkEnd w:id="58"/>
-    <w:bookmarkStart w:id="59" w:name="thm-total-prob"/>
+    <w:bookmarkEnd w:id="60"/>
+    <w:bookmarkStart w:id="61" w:name="thm-total-prob"/>
     <w:p>
       <w:pPr>
         <w:pStyle w:val="FirstParagraph"/>
@@ -12418,7 +12797,7 @@
         </m:oMath>
       </m:oMathPara>
     </w:p>
-    <w:bookmarkEnd w:id="59"/>
+    <w:bookmarkEnd w:id="61"/>
     <w:p>
       <w:pPr>
         <w:pStyle w:val="FirstParagraph"/>
@@ -12592,7 +12971,7 @@
       <w:r>
         <w:t xml:space="preserve"> </w:t>
       </w:r>
-      <w:hyperlink r:id="rId37">
+      <w:hyperlink r:id="rId41">
         <w:r>
           <w:rPr>
             <w:rStyle w:val="Hyperlink"/>
@@ -12941,7 +13320,7 @@
         </m:oMath>
       </m:oMathPara>
     </w:p>
-    <w:bookmarkStart w:id="60" w:name="thm-bayes"/>
+    <w:bookmarkStart w:id="62" w:name="thm-bayes"/>
     <w:p>
       <w:pPr>
         <w:pStyle w:val="FirstParagraph"/>
@@ -13202,7 +13581,7 @@
         </m:oMath>
       </m:oMathPara>
     </w:p>
-    <w:bookmarkEnd w:id="60"/>
+    <w:bookmarkEnd w:id="62"/>
     <w:p>
       <w:pPr>
         <w:pStyle w:val="FirstParagraph"/>
@@ -13228,7 +13607,7 @@
           <w:rPr>
             <w:rStyle w:val="Hyperlink"/>
           </w:rPr>
-          <w:t xml:space="preserve">Definition 9</w:t>
+          <w:t xml:space="preserve">Definition 10</w:t>
         </w:r>
       </w:hyperlink>
       <w:r>
@@ -13649,7 +14028,7 @@
         </m:oMath>
       </m:oMathPara>
     </w:p>
-    <w:bookmarkStart w:id="61" w:name="exm-bayes"/>
+    <w:bookmarkStart w:id="63" w:name="exm-bayes"/>
     <w:p>
       <w:pPr>
         <w:pStyle w:val="FirstParagraph"/>
@@ -13659,7 +14038,7 @@
           <w:b/>
           <w:bCs/>
         </w:rPr>
-        <w:t xml:space="preserve">Example 13 (Positive predictive value of a medical test)</w:t>
+        <w:t xml:space="preserve">Example 14 (Positive predictive value of a medical test)</w:t>
       </w:r>
       <w:r>
         <w:t xml:space="preserve"> </w:t>
@@ -14691,8 +15070,8 @@
         <w:t xml:space="preserve">because the disease prevalence is relatively low (7%).</w:t>
       </w:r>
     </w:p>
-    <w:bookmarkEnd w:id="61"/>
-    <w:bookmarkStart w:id="62" w:name="exr-bayes"/>
+    <w:bookmarkEnd w:id="63"/>
+    <w:bookmarkStart w:id="64" w:name="exr-bayes"/>
     <w:p>
       <w:pPr>
         <w:pStyle w:val="BodyText"/>
@@ -14712,7 +15091,7 @@
           <w:rPr>
             <w:rStyle w:val="Hyperlink"/>
           </w:rPr>
-          <w:t xml:space="preserve">Definition 9</w:t>
+          <w:t xml:space="preserve">Definition 10</w:t>
         </w:r>
       </w:hyperlink>
       <w:r>
@@ -15030,8 +15409,8 @@
         <w:t xml:space="preserve">, and none of them jointly.</w:t>
       </w:r>
     </w:p>
-    <w:bookmarkEnd w:id="62"/>
-    <w:bookmarkStart w:id="64" w:name="sol-bayes"/>
+    <w:bookmarkEnd w:id="64"/>
+    <w:bookmarkStart w:id="66" w:name="sol-bayes"/>
     <w:p>
       <w:pPr>
         <w:pStyle w:val="BodyText"/>
@@ -15057,7 +15436,7 @@
           <w:rPr>
             <w:rStyle w:val="Hyperlink"/>
           </w:rPr>
-          <w:t xml:space="preserve">Definition 9</w:t>
+          <w:t xml:space="preserve">Definition 10</w:t>
         </w:r>
       </w:hyperlink>
       <w:r>
@@ -15345,7 +15724,7 @@
       <w:pPr>
         <w:pStyle w:val="BodyText"/>
       </w:pPr>
-      <w:bookmarkStart w:id="63" w:name="eq-bayes"/>
+      <w:bookmarkStart w:id="65" w:name="eq-bayes"/>
       <m:oMathPara>
         <m:oMathParaPr>
           <m:jc m:val="center"/>
@@ -15491,7 +15870,7 @@
           </m:r>
         </m:oMath>
       </m:oMathPara>
-      <w:bookmarkEnd w:id="63"/>
+      <w:bookmarkEnd w:id="65"/>
     </w:p>
     <w:p>
       <w:pPr>
@@ -16072,8 +16451,8 @@
         <w:t xml:space="preserve">decreases it.</w:t>
       </w:r>
     </w:p>
-    <w:bookmarkEnd w:id="64"/>
-    <w:bookmarkStart w:id="65" w:name="exr-base-rate"/>
+    <w:bookmarkEnd w:id="66"/>
+    <w:bookmarkStart w:id="67" w:name="exr-base-rate"/>
     <w:p>
       <w:pPr>
         <w:pStyle w:val="BodyText"/>
@@ -16178,8 +16557,8 @@
         <w:t xml:space="preserve">.</w:t>
       </w:r>
     </w:p>
-    <w:bookmarkEnd w:id="65"/>
-    <w:bookmarkStart w:id="66" w:name="sol-base-rate"/>
+    <w:bookmarkEnd w:id="67"/>
+    <w:bookmarkStart w:id="68" w:name="sol-base-rate"/>
     <w:p>
       <w:pPr>
         <w:pStyle w:val="BodyText"/>
@@ -17144,7 +17523,7 @@
         <w:t xml:space="preserve">and it illustrates why raw accuracy can be misleading on rare events.</w:t>
       </w:r>
     </w:p>
-    <w:bookmarkEnd w:id="66"/>
+    <w:bookmarkEnd w:id="68"/>
     <w:tbl>
       <w:tblPr>
         <w:tblStyle w:val="Table"/>
@@ -17186,18 +17565,18 @@
                 <wp:inline>
                   <wp:extent cx="152400" cy="152400"/>
                   <wp:effectExtent b="0" l="0" r="0" t="0"/>
-                  <wp:docPr descr="" title="" id="68" name="Picture"/>
+                  <wp:docPr descr="" title="" id="70" name="Picture"/>
                   <a:graphic>
                     <a:graphicData uri="http://schemas.openxmlformats.org/drawingml/2006/picture">
                       <pic:pic>
                         <pic:nvPicPr>
-                          <pic:cNvPr descr="/opt/quarto/share/formats/docx/tip.png" id="69" name="Picture"/>
+                          <pic:cNvPr descr="/opt/quarto/share/formats/docx/tip.png" id="71" name="Picture"/>
                           <pic:cNvPicPr>
                             <a:picLocks noChangeArrowheads="1" noChangeAspect="1"/>
                           </pic:cNvPicPr>
                         </pic:nvPicPr>
                         <pic:blipFill>
-                          <a:blip r:embed="rId67"/>
+                          <a:blip r:embed="rId69"/>
                           <a:stretch>
                             <a:fillRect/>
                           </a:stretch>
@@ -17259,7 +17638,7 @@
             <w:r>
               <w:t xml:space="preserve"> </w:t>
             </w:r>
-            <w:hyperlink r:id="rId70">
+            <w:hyperlink r:id="rId72">
               <w:r>
                 <w:rPr>
                   <w:rStyle w:val="Hyperlink"/>
@@ -17303,7 +17682,7 @@
             <w:r>
               <w:t xml:space="preserve"> </w:t>
             </w:r>
-            <w:hyperlink r:id="rId71">
+            <w:hyperlink r:id="rId73">
               <w:r>
                 <w:rPr>
                   <w:rStyle w:val="Hyperlink"/>
@@ -17319,8 +17698,8 @@
         </w:tc>
       </w:tr>
     </w:tbl>
-    <w:bookmarkEnd w:id="72"/>
-    <w:bookmarkStart w:id="79" w:name="references"/>
+    <w:bookmarkEnd w:id="74"/>
+    <w:bookmarkStart w:id="83" w:name="references"/>
     <w:p>
       <w:pPr>
         <w:pStyle w:val="Heading2"/>
@@ -17329,8 +17708,45 @@
         <w:t xml:space="preserve">References</w:t>
       </w:r>
     </w:p>
-    <w:bookmarkStart w:id="78" w:name="refs"/>
-    <w:bookmarkStart w:id="73" w:name="ref-hutchinson2024data471"/>
+    <w:bookmarkStart w:id="82" w:name="refs"/>
+    <w:bookmarkStart w:id="76" w:name="ref-CaseBerg01"/>
+    <w:p>
+      <w:pPr>
+        <w:pStyle w:val="Bibliography"/>
+      </w:pPr>
+      <w:r>
+        <w:t xml:space="preserve">Casella, George, and Roger Berger. 2002.</w:t>
+      </w:r>
+      <w:r>
+        <w:t xml:space="preserve"> </w:t>
+      </w:r>
+      <w:r>
+        <w:rPr>
+          <w:i/>
+          <w:iCs/>
+        </w:rPr>
+        <w:t xml:space="preserve">Statistical Inference</w:t>
+      </w:r>
+      <w:r>
+        <w:t xml:space="preserve">. 2nd ed. Cengage Learning.</w:t>
+      </w:r>
+      <w:r>
+        <w:t xml:space="preserve"> </w:t>
+      </w:r>
+      <w:hyperlink r:id="rId75">
+        <w:r>
+          <w:rPr>
+            <w:rStyle w:val="Hyperlink"/>
+          </w:rPr>
+          <w:t xml:space="preserve">https://www.cengage.com/c/statistical-inference-2e-casella-berger/9780534243128/</w:t>
+        </w:r>
+      </w:hyperlink>
+      <w:r>
+        <w:t xml:space="preserve">.</w:t>
+      </w:r>
+    </w:p>
+    <w:bookmarkEnd w:id="76"/>
+    <w:bookmarkStart w:id="77" w:name="ref-hutchinson2024data471"/>
     <w:p>
       <w:pPr>
         <w:pStyle w:val="Bibliography"/>
@@ -17366,8 +17782,8 @@
         <w:t xml:space="preserve">. Western Washington University.</w:t>
       </w:r>
     </w:p>
-    <w:bookmarkEnd w:id="73"/>
-    <w:bookmarkStart w:id="75" w:name="ref-hutchinson_wwu_ml_videos"/>
+    <w:bookmarkEnd w:id="77"/>
+    <w:bookmarkStart w:id="79" w:name="ref-hutchinson_wwu_ml_videos"/>
     <w:p>
       <w:pPr>
         <w:pStyle w:val="Bibliography"/>
@@ -17433,7 +17849,7 @@
       <w:r>
         <w:t xml:space="preserve"> </w:t>
       </w:r>
-      <w:hyperlink r:id="rId74">
+      <w:hyperlink r:id="rId78">
         <w:r>
           <w:rPr>
             <w:rStyle w:val="Hyperlink"/>
@@ -17445,8 +17861,8 @@
         <w:t xml:space="preserve">.</w:t>
       </w:r>
     </w:p>
-    <w:bookmarkEnd w:id="75"/>
-    <w:bookmarkStart w:id="77" w:name="ref-ross-probsim"/>
+    <w:bookmarkEnd w:id="79"/>
+    <w:bookmarkStart w:id="81" w:name="ref-ross-probsim"/>
     <w:p>
       <w:pPr>
         <w:pStyle w:val="Bibliography"/>
@@ -17470,7 +17886,7 @@
       <w:r>
         <w:t xml:space="preserve"> </w:t>
       </w:r>
-      <w:hyperlink r:id="rId76">
+      <w:hyperlink r:id="rId80">
         <w:r>
           <w:rPr>
             <w:rStyle w:val="Hyperlink"/>
@@ -17482,9 +17898,9 @@
         <w:t xml:space="preserve">.</w:t>
       </w:r>
     </w:p>
-    <w:bookmarkEnd w:id="77"/>
-    <w:bookmarkEnd w:id="78"/>
-    <w:bookmarkEnd w:id="79"/>
+    <w:bookmarkEnd w:id="81"/>
+    <w:bookmarkEnd w:id="82"/>
+    <w:bookmarkEnd w:id="83"/>
     <w:sectPr>
       <w:footnotePr>
         <w:numRestart w:val="eachSect"/>

</xml_diff>

<commit_message>
Deploying to gh-pages from @ Morrison-Lab/pds@11f31d295e225266666c09402efad6e6e9d4079f 🚀
</commit_message>
<xml_diff>
--- a/probability-basics.docx
+++ b/probability-basics.docx
@@ -15,10 +15,10 @@
         <w:pStyle w:val="Date"/>
       </w:pPr>
       <w:r>
-        <w:t xml:space="preserve">Last modified: 2026-10-16 15:49:22 (PDT)</w:t>
+        <w:t xml:space="preserve">Last modified: 2026-10-17 00:26:45 (PDT)</w:t>
       </w:r>
     </w:p>
-    <w:bookmarkStart w:id="57" w:name="defining-probabilities"/>
+    <w:bookmarkStart w:id="64" w:name="defining-probabilities"/>
     <w:p>
       <w:pPr>
         <w:pStyle w:val="Heading2"/>
@@ -34,7 +34,7 @@
       <w:bookmarkStart w:id="9" w:name="sec-prob-axioms"/>
       <w:bookmarkEnd w:id="9"/>
     </w:p>
-    <w:bookmarkStart w:id="10" w:name="def-random-experiment"/>
+    <w:bookmarkStart w:id="10" w:name="def-step"/>
     <w:p>
       <w:pPr>
         <w:pStyle w:val="BodyText"/>
@@ -44,7 +44,340 @@
           <w:b/>
           <w:bCs/>
         </w:rPr>
-        <w:t xml:space="preserve">Definition 1 (Random experiment)</w:t>
+        <w:t xml:space="preserve">Definition 1 (Step)</w:t>
+      </w:r>
+      <w:r>
+        <w:t xml:space="preserve"> </w:t>
+      </w:r>
+      <w:r>
+        <w:t xml:space="preserve">A</w:t>
+      </w:r>
+      <w:r>
+        <w:t xml:space="preserve"> </w:t>
+      </w:r>
+      <w:r>
+        <w:rPr>
+          <w:b/>
+          <w:bCs/>
+        </w:rPr>
+        <w:t xml:space="preserve">step</w:t>
+      </w:r>
+      <w:r>
+        <w:t xml:space="preserve"> </w:t>
+      </w:r>
+      <w:r>
+        <w:t xml:space="preserve">is the carrying out of one instruction.</w:t>
+      </w:r>
+    </w:p>
+    <w:bookmarkEnd w:id="10"/>
+    <w:bookmarkStart w:id="11" w:name="exm-step"/>
+    <w:p>
+      <w:pPr>
+        <w:pStyle w:val="BodyText"/>
+      </w:pPr>
+      <w:r>
+        <w:rPr>
+          <w:b/>
+          <w:bCs/>
+        </w:rPr>
+        <w:t xml:space="preserve">Example 1 (Steps of a die roll)</w:t>
+      </w:r>
+      <w:r>
+        <w:t xml:space="preserve"> </w:t>
+      </w:r>
+      <w:r>
+        <w:t xml:space="preserve">Carrying out the instruction</w:t>
+      </w:r>
+      <w:r>
+        <w:t xml:space="preserve"> </w:t>
+      </w:r>
+      <w:r>
+        <w:t xml:space="preserve">“roll a six-sided die once”</w:t>
+      </w:r>
+      <w:r>
+        <w:t xml:space="preserve"> </w:t>
+      </w:r>
+      <w:r>
+        <w:t xml:space="preserve">is one step.</w:t>
+      </w:r>
+      <w:r>
+        <w:t xml:space="preserve"> </w:t>
+      </w:r>
+      <w:r>
+        <w:t xml:space="preserve">Carrying out the instruction</w:t>
+      </w:r>
+      <w:r>
+        <w:t xml:space="preserve"> </w:t>
+      </w:r>
+      <w:r>
+        <w:t xml:space="preserve">“read the number facing up”</w:t>
+      </w:r>
+      <w:r>
+        <w:t xml:space="preserve"> </w:t>
+      </w:r>
+      <w:r>
+        <w:t xml:space="preserve">is another step.</w:t>
+      </w:r>
+    </w:p>
+    <w:bookmarkEnd w:id="11"/>
+    <w:bookmarkStart w:id="12" w:name="def-procedure"/>
+    <w:p>
+      <w:pPr>
+        <w:pStyle w:val="BodyText"/>
+      </w:pPr>
+      <w:r>
+        <w:rPr>
+          <w:b/>
+          <w:bCs/>
+        </w:rPr>
+        <w:t xml:space="preserve">Definition 2 (Procedure)</w:t>
+      </w:r>
+      <w:r>
+        <w:t xml:space="preserve"> </w:t>
+      </w:r>
+      <w:r>
+        <w:t xml:space="preserve">A</w:t>
+      </w:r>
+      <w:r>
+        <w:t xml:space="preserve"> </w:t>
+      </w:r>
+      <w:r>
+        <w:rPr>
+          <w:b/>
+          <w:bCs/>
+        </w:rPr>
+        <w:t xml:space="preserve">procedure</w:t>
+      </w:r>
+      <w:r>
+        <w:t xml:space="preserve"> </w:t>
+      </w:r>
+      <w:r>
+        <w:t xml:space="preserve">is a list of instructions that can be followed, one</w:t>
+      </w:r>
+      <w:r>
+        <w:t xml:space="preserve"> </w:t>
+      </w:r>
+      <w:hyperlink w:anchor="def-step">
+        <w:r>
+          <w:rPr>
+            <w:rStyle w:val="Hyperlink"/>
+          </w:rPr>
+          <w:t xml:space="preserve">step</w:t>
+        </w:r>
+      </w:hyperlink>
+      <w:r>
+        <w:t xml:space="preserve"> </w:t>
+      </w:r>
+      <w:r>
+        <w:t xml:space="preserve">at a time, until they are finished.</w:t>
+      </w:r>
+    </w:p>
+    <w:bookmarkEnd w:id="12"/>
+    <w:bookmarkStart w:id="13" w:name="exm-procedure"/>
+    <w:p>
+      <w:pPr>
+        <w:pStyle w:val="BodyText"/>
+      </w:pPr>
+      <w:r>
+        <w:rPr>
+          <w:b/>
+          <w:bCs/>
+        </w:rPr>
+        <w:t xml:space="preserve">Example 2 (Rolling a die once)</w:t>
+      </w:r>
+      <w:r>
+        <w:t xml:space="preserve"> </w:t>
+      </w:r>
+      <w:r>
+        <w:t xml:space="preserve">The instructions</w:t>
+      </w:r>
+      <w:r>
+        <w:t xml:space="preserve"> </w:t>
+      </w:r>
+      <w:r>
+        <w:t xml:space="preserve">“roll a six-sided die once, then read the number facing up”</w:t>
+      </w:r>
+      <w:r>
+        <w:t xml:space="preserve"> </w:t>
+      </w:r>
+      <w:r>
+        <w:t xml:space="preserve">comprise a procedure.</w:t>
+      </w:r>
+      <w:r>
+        <w:t xml:space="preserve"> </w:t>
+      </w:r>
+      <w:r>
+        <w:t xml:space="preserve">Following the procedure takes the two</w:t>
+      </w:r>
+      <w:r>
+        <w:t xml:space="preserve"> </w:t>
+      </w:r>
+      <w:hyperlink w:anchor="def-step">
+        <w:r>
+          <w:rPr>
+            <w:rStyle w:val="Hyperlink"/>
+          </w:rPr>
+          <w:t xml:space="preserve">steps</w:t>
+        </w:r>
+      </w:hyperlink>
+      <w:r>
+        <w:t xml:space="preserve"> </w:t>
+      </w:r>
+      <w:r>
+        <w:t xml:space="preserve">in</w:t>
+      </w:r>
+      <w:r>
+        <w:t xml:space="preserve"> </w:t>
+      </w:r>
+      <w:hyperlink w:anchor="exm-step">
+        <w:r>
+          <w:rPr>
+            <w:rStyle w:val="Hyperlink"/>
+          </w:rPr>
+          <w:t xml:space="preserve">Example 1</w:t>
+        </w:r>
+      </w:hyperlink>
+      <w:r>
+        <w:t xml:space="preserve">, and then it is finished.</w:t>
+      </w:r>
+    </w:p>
+    <w:bookmarkEnd w:id="13"/>
+    <w:bookmarkStart w:id="14" w:name="def-experiment-outcome"/>
+    <w:p>
+      <w:pPr>
+        <w:pStyle w:val="BodyText"/>
+      </w:pPr>
+      <w:r>
+        <w:rPr>
+          <w:b/>
+          <w:bCs/>
+        </w:rPr>
+        <w:t xml:space="preserve">Definition 3 (Outcome)</w:t>
+      </w:r>
+      <w:r>
+        <w:t xml:space="preserve"> </w:t>
+      </w:r>
+      <w:r>
+        <w:t xml:space="preserve">An</w:t>
+      </w:r>
+      <w:r>
+        <w:t xml:space="preserve"> </w:t>
+      </w:r>
+      <w:r>
+        <w:rPr>
+          <w:b/>
+          <w:bCs/>
+        </w:rPr>
+        <w:t xml:space="preserve">outcome</w:t>
+      </w:r>
+      <w:r>
+        <w:t xml:space="preserve"> </w:t>
+      </w:r>
+      <w:r>
+        <w:t xml:space="preserve">is a single, fully specified way that a</w:t>
+      </w:r>
+      <w:r>
+        <w:t xml:space="preserve"> </w:t>
+      </w:r>
+      <w:hyperlink w:anchor="def-procedure">
+        <w:r>
+          <w:rPr>
+            <w:rStyle w:val="Hyperlink"/>
+          </w:rPr>
+          <w:t xml:space="preserve">procedure</w:t>
+        </w:r>
+      </w:hyperlink>
+      <w:r>
+        <w:t xml:space="preserve"> </w:t>
+      </w:r>
+      <w:r>
+        <w:t xml:space="preserve">can end,</w:t>
+      </w:r>
+      <w:r>
+        <w:t xml:space="preserve"> </w:t>
+      </w:r>
+      <w:r>
+        <w:t xml:space="preserve">recorded as one value.</w:t>
+      </w:r>
+    </w:p>
+    <w:bookmarkEnd w:id="14"/>
+    <w:bookmarkStart w:id="15" w:name="exm-experiment-outcome"/>
+    <w:p>
+      <w:pPr>
+        <w:pStyle w:val="BodyText"/>
+      </w:pPr>
+      <w:r>
+        <w:rPr>
+          <w:b/>
+          <w:bCs/>
+        </w:rPr>
+        <w:t xml:space="preserve">Example 3 (Outcomes of a die roll)</w:t>
+      </w:r>
+      <w:r>
+        <w:t xml:space="preserve"> </w:t>
+      </w:r>
+      <w:r>
+        <w:t xml:space="preserve">The</w:t>
+      </w:r>
+      <w:r>
+        <w:t xml:space="preserve"> </w:t>
+      </w:r>
+      <w:hyperlink w:anchor="def-procedure">
+        <w:r>
+          <w:rPr>
+            <w:rStyle w:val="Hyperlink"/>
+          </w:rPr>
+          <w:t xml:space="preserve">procedure</w:t>
+        </w:r>
+      </w:hyperlink>
+      <w:r>
+        <w:t xml:space="preserve"> </w:t>
+      </w:r>
+      <w:r>
+        <w:t xml:space="preserve">in</w:t>
+      </w:r>
+      <w:r>
+        <w:t xml:space="preserve"> </w:t>
+      </w:r>
+      <w:hyperlink w:anchor="exm-procedure">
+        <w:r>
+          <w:rPr>
+            <w:rStyle w:val="Hyperlink"/>
+          </w:rPr>
+          <w:t xml:space="preserve">Example 2</w:t>
+        </w:r>
+      </w:hyperlink>
+      <w:r>
+        <w:t xml:space="preserve"> </w:t>
+      </w:r>
+      <w:r>
+        <w:t xml:space="preserve">ends with one number facing up.</w:t>
+      </w:r>
+      <w:r>
+        <w:t xml:space="preserve"> </w:t>
+      </w:r>
+      <w:r>
+        <w:t xml:space="preserve">Each of the numbers 1, 2, 3, 4, 5 and 6 is an outcome,</w:t>
+      </w:r>
+      <w:r>
+        <w:t xml:space="preserve"> </w:t>
+      </w:r>
+      <w:r>
+        <w:t xml:space="preserve">and one roll ends in exactly one of them.</w:t>
+      </w:r>
+    </w:p>
+    <w:bookmarkEnd w:id="15"/>
+    <w:bookmarkStart w:id="16" w:name="def-random-experiment"/>
+    <w:p>
+      <w:pPr>
+        <w:pStyle w:val="BodyText"/>
+      </w:pPr>
+      <w:r>
+        <w:rPr>
+          <w:b/>
+          <w:bCs/>
+        </w:rPr>
+        <w:t xml:space="preserve">Definition 4 (Random experiment)</w:t>
       </w:r>
       <w:r>
         <w:t xml:space="preserve"> </w:t>
@@ -66,22 +399,44 @@
         <w:t xml:space="preserve"> </w:t>
       </w:r>
       <w:r>
-        <w:t xml:space="preserve">is a procedure that produces exactly one outcome</w:t>
-      </w:r>
-      <w:r>
-        <w:t xml:space="preserve"> </w:t>
-      </w:r>
-      <w:r>
-        <w:t xml:space="preserve">out of several possible outcomes,</w:t>
-      </w:r>
-      <w:r>
-        <w:t xml:space="preserve"> </w:t>
-      </w:r>
-      <w:r>
-        <w:t xml:space="preserve">where which outcome it will produce is not determined in advance.</w:t>
+        <w:t xml:space="preserve">is a</w:t>
+      </w:r>
+      <w:r>
+        <w:t xml:space="preserve"> </w:t>
+      </w:r>
+      <w:hyperlink w:anchor="def-procedure">
+        <w:r>
+          <w:rPr>
+            <w:rStyle w:val="Hyperlink"/>
+          </w:rPr>
+          <w:t xml:space="preserve">procedure</w:t>
+        </w:r>
+      </w:hyperlink>
+      <w:r>
+        <w:t xml:space="preserve"> </w:t>
+      </w:r>
+      <w:r>
+        <w:t xml:space="preserve">that ends in exactly one</w:t>
+      </w:r>
+      <w:r>
+        <w:t xml:space="preserve"> </w:t>
+      </w:r>
+      <w:hyperlink w:anchor="def-experiment-outcome">
+        <w:r>
+          <w:rPr>
+            <w:rStyle w:val="Hyperlink"/>
+          </w:rPr>
+          <w:t xml:space="preserve">outcome</w:t>
+        </w:r>
+      </w:hyperlink>
+      <w:r>
+        <w:t xml:space="preserve"> </w:t>
+      </w:r>
+      <w:r>
+        <w:t xml:space="preserve">that we have not determined in advance.</w:t>
       </w:r>
     </w:p>
-    <w:bookmarkEnd w:id="10"/>
+    <w:bookmarkEnd w:id="16"/>
     <w:p>
       <w:pPr>
         <w:pStyle w:val="BodyText"/>
@@ -126,7 +481,7 @@
         <w:t xml:space="preserve">such as picking a unit from a data set without looking, are both random experiments.</w:t>
       </w:r>
     </w:p>
-    <w:bookmarkStart w:id="13" w:name="exm-random-experiment"/>
+    <w:bookmarkStart w:id="17" w:name="exm-random-experiment-die"/>
     <w:p>
       <w:pPr>
         <w:pStyle w:val="BodyText"/>
@@ -136,7 +491,101 @@
           <w:b/>
           <w:bCs/>
         </w:rPr>
-        <w:t xml:space="preserve">Example 1 (Picking a car model from the Auto data)</w:t>
+        <w:t xml:space="preserve">Example 4 (Rolling a die as a random experiment)</w:t>
+      </w:r>
+      <w:r>
+        <w:t xml:space="preserve"> </w:t>
+      </w:r>
+      <w:r>
+        <w:t xml:space="preserve">The</w:t>
+      </w:r>
+      <w:r>
+        <w:t xml:space="preserve"> </w:t>
+      </w:r>
+      <w:hyperlink w:anchor="def-procedure">
+        <w:r>
+          <w:rPr>
+            <w:rStyle w:val="Hyperlink"/>
+          </w:rPr>
+          <w:t xml:space="preserve">procedure</w:t>
+        </w:r>
+      </w:hyperlink>
+      <w:r>
+        <w:t xml:space="preserve"> </w:t>
+      </w:r>
+      <w:r>
+        <w:t xml:space="preserve">in</w:t>
+      </w:r>
+      <w:r>
+        <w:t xml:space="preserve"> </w:t>
+      </w:r>
+      <w:hyperlink w:anchor="exm-procedure">
+        <w:r>
+          <w:rPr>
+            <w:rStyle w:val="Hyperlink"/>
+          </w:rPr>
+          <w:t xml:space="preserve">Example 2</w:t>
+        </w:r>
+      </w:hyperlink>
+      <w:r>
+        <w:t xml:space="preserve"> </w:t>
+      </w:r>
+      <w:r>
+        <w:t xml:space="preserve">is a random experiment:</w:t>
+      </w:r>
+      <w:r>
+        <w:t xml:space="preserve"> </w:t>
+      </w:r>
+      <w:r>
+        <w:t xml:space="preserve">it ends in exactly one of the</w:t>
+      </w:r>
+      <w:r>
+        <w:t xml:space="preserve"> </w:t>
+      </w:r>
+      <w:hyperlink w:anchor="def-experiment-outcome">
+        <w:r>
+          <w:rPr>
+            <w:rStyle w:val="Hyperlink"/>
+          </w:rPr>
+          <w:t xml:space="preserve">outcomes</w:t>
+        </w:r>
+      </w:hyperlink>
+      <w:r>
+        <w:t xml:space="preserve"> </w:t>
+      </w:r>
+      <w:r>
+        <w:t xml:space="preserve">1, 2, 3, 4, 5 or 6 (</w:t>
+      </w:r>
+      <w:hyperlink w:anchor="exm-experiment-outcome">
+        <w:r>
+          <w:rPr>
+            <w:rStyle w:val="Hyperlink"/>
+          </w:rPr>
+          <w:t xml:space="preserve">Example 3</w:t>
+        </w:r>
+      </w:hyperlink>
+      <w:r>
+        <w:t xml:space="preserve">),</w:t>
+      </w:r>
+      <w:r>
+        <w:t xml:space="preserve"> </w:t>
+      </w:r>
+      <w:r>
+        <w:t xml:space="preserve">and we do not determine in advance which outcome the procedure will produce.</w:t>
+      </w:r>
+    </w:p>
+    <w:bookmarkEnd w:id="17"/>
+    <w:bookmarkStart w:id="20" w:name="exm-random-experiment"/>
+    <w:p>
+      <w:pPr>
+        <w:pStyle w:val="BodyText"/>
+      </w:pPr>
+      <w:r>
+        <w:rPr>
+          <w:b/>
+          <w:bCs/>
+        </w:rPr>
+        <w:t xml:space="preserve">Example 5 (Picking a car model from the Auto data)</w:t>
       </w:r>
       <w:r>
         <w:t xml:space="preserve"> </w:t>
@@ -193,7 +642,7 @@
       <w:r>
         <w:t xml:space="preserve"> </w:t>
       </w:r>
-      <w:hyperlink r:id="rId11">
+      <w:hyperlink r:id="rId18">
         <w:r>
           <w:rPr>
             <w:rStyle w:val="VerbatimChar"/>
@@ -225,7 +674,7 @@
       <w:r>
         <w:t xml:space="preserve"> </w:t>
       </w:r>
-      <w:hyperlink r:id="rId12">
+      <w:hyperlink r:id="rId19">
         <w:r>
           <w:rPr>
             <w:rStyle w:val="VerbatimChar"/>
@@ -379,8 +828,8 @@
         <w:t xml:space="preserve">#&gt; [1] 3 4 5 6 8</w:t>
       </w:r>
     </w:p>
-    <w:bookmarkEnd w:id="13"/>
-    <w:bookmarkStart w:id="15" w:name="def-sample-space"/>
+    <w:bookmarkEnd w:id="20"/>
+    <w:bookmarkStart w:id="22" w:name="def-sample-space"/>
     <w:p>
       <w:pPr>
         <w:pStyle w:val="FirstParagraph"/>
@@ -390,7 +839,7 @@
           <w:b/>
           <w:bCs/>
         </w:rPr>
-        <w:t xml:space="preserve">Definition 2 (Sample space)</w:t>
+        <w:t xml:space="preserve">Definition 5 (Sample space)</w:t>
       </w:r>
       <w:r>
         <w:t xml:space="preserve"> </w:t>
@@ -451,7 +900,7 @@
       <w:r>
         <w:t xml:space="preserve"> </w:t>
       </w:r>
-      <w:hyperlink r:id="rId14">
+      <w:hyperlink r:id="rId21">
         <w:r>
           <w:rPr>
             <w:rStyle w:val="Hyperlink"/>
@@ -466,8 +915,8 @@
         <w:t xml:space="preserve">of all of its possible outcomes.</w:t>
       </w:r>
     </w:p>
-    <w:bookmarkEnd w:id="15"/>
-    <w:bookmarkStart w:id="16" w:name="exm-sample-space"/>
+    <w:bookmarkEnd w:id="22"/>
+    <w:bookmarkStart w:id="23" w:name="exm-sample-space"/>
     <w:p>
       <w:pPr>
         <w:pStyle w:val="BodyText"/>
@@ -477,7 +926,7 @@
           <w:b/>
           <w:bCs/>
         </w:rPr>
-        <w:t xml:space="preserve">Example 2 (Sample space of a die roll)</w:t>
+        <w:t xml:space="preserve">Example 6 (Sample space of a die roll)</w:t>
       </w:r>
       <w:r>
         <w:t xml:space="preserve"> </w:t>
@@ -570,8 +1019,8 @@
         <w:t xml:space="preserve">.</w:t>
       </w:r>
     </w:p>
-    <w:bookmarkEnd w:id="16"/>
-    <w:bookmarkStart w:id="17" w:name="def-event"/>
+    <w:bookmarkEnd w:id="23"/>
+    <w:bookmarkStart w:id="24" w:name="def-event"/>
     <w:p>
       <w:pPr>
         <w:pStyle w:val="BodyText"/>
@@ -581,7 +1030,7 @@
           <w:b/>
           <w:bCs/>
         </w:rPr>
-        <w:t xml:space="preserve">Definition 3 (Event)</w:t>
+        <w:t xml:space="preserve">Definition 6 (Event)</w:t>
       </w:r>
       <w:r>
         <w:t xml:space="preserve"> </w:t>
@@ -637,7 +1086,7 @@
         <w:t xml:space="preserve">a set of outcomes.</w:t>
       </w:r>
     </w:p>
-    <w:bookmarkEnd w:id="17"/>
+    <w:bookmarkEnd w:id="24"/>
     <w:p>
       <w:pPr>
         <w:pStyle w:val="BodyText"/>
@@ -681,7 +1130,7 @@
       <w:r>
         <w:t xml:space="preserve"> </w:t>
       </w:r>
-      <w:hyperlink r:id="rId18">
+      <w:hyperlink r:id="rId25">
         <m:oMath>
           <m:r>
             <m:t>σ</m:t>
@@ -812,7 +1261,7 @@
       <w:r>
         <w:t xml:space="preserve"> </w:t>
       </w:r>
-      <w:hyperlink r:id="rId19">
+      <w:hyperlink r:id="rId26">
         <w:r>
           <w:rPr>
             <w:rStyle w:val="Hyperlink"/>
@@ -886,7 +1335,7 @@
       <w:r>
         <w:t xml:space="preserve">(</w:t>
       </w:r>
-      <w:hyperlink r:id="rId20">
+      <w:hyperlink r:id="rId27">
         <w:r>
           <w:rPr>
             <w:rStyle w:val="Hyperlink"/>
@@ -923,7 +1372,7 @@
       <w:r>
         <w:t xml:space="preserve"> </w:t>
       </w:r>
-      <w:hyperlink r:id="rId21">
+      <w:hyperlink r:id="rId28">
         <m:oMath>
           <m:r>
             <m:t>σ</m:t>
@@ -940,7 +1389,7 @@
         <w:t xml:space="preserve">.</w:t>
       </w:r>
     </w:p>
-    <w:bookmarkStart w:id="22" w:name="exm-event"/>
+    <w:bookmarkStart w:id="29" w:name="exm-event"/>
     <w:p>
       <w:pPr>
         <w:pStyle w:val="BodyText"/>
@@ -950,7 +1399,7 @@
           <w:b/>
           <w:bCs/>
         </w:rPr>
-        <w:t xml:space="preserve">Example 3 (Rolling an even number)</w:t>
+        <w:t xml:space="preserve">Example 7 (Rolling an even number)</w:t>
       </w:r>
       <w:r>
         <w:t xml:space="preserve"> </w:t>
@@ -966,7 +1415,7 @@
           <w:rPr>
             <w:rStyle w:val="Hyperlink"/>
           </w:rPr>
-          <w:t xml:space="preserve">Example 2</w:t>
+          <w:t xml:space="preserve">Example 6</w:t>
         </w:r>
       </w:hyperlink>
       <w:r>
@@ -1045,8 +1494,8 @@
         <w:t xml:space="preserve">.</w:t>
       </w:r>
     </w:p>
-    <w:bookmarkEnd w:id="22"/>
-    <w:bookmarkStart w:id="23" w:name="def-occurs"/>
+    <w:bookmarkEnd w:id="29"/>
+    <w:bookmarkStart w:id="30" w:name="def-occurs"/>
     <w:p>
       <w:pPr>
         <w:pStyle w:val="BodyText"/>
@@ -1056,7 +1505,7 @@
           <w:b/>
           <w:bCs/>
         </w:rPr>
-        <w:t xml:space="preserve">Definition 4 (Occurrence of an event)</w:t>
+        <w:t xml:space="preserve">Definition 7 (Occurrence of an event)</w:t>
       </w:r>
       <w:r>
         <w:t xml:space="preserve"> </w:t>
@@ -1128,8 +1577,8 @@
         <w:t xml:space="preserve">.</w:t>
       </w:r>
     </w:p>
-    <w:bookmarkEnd w:id="23"/>
-    <w:bookmarkStart w:id="24" w:name="exm-occurs"/>
+    <w:bookmarkEnd w:id="30"/>
+    <w:bookmarkStart w:id="31" w:name="exm-occurs"/>
     <w:p>
       <w:pPr>
         <w:pStyle w:val="BodyText"/>
@@ -1139,7 +1588,7 @@
           <w:b/>
           <w:bCs/>
         </w:rPr>
-        <w:t xml:space="preserve">Example 4 (Rolling a 4)</w:t>
+        <w:t xml:space="preserve">Example 8 (Rolling a 4)</w:t>
       </w:r>
       <w:r>
         <w:t xml:space="preserve"> </w:t>
@@ -1155,7 +1604,7 @@
           <w:rPr>
             <w:rStyle w:val="Hyperlink"/>
           </w:rPr>
-          <w:t xml:space="preserve">Example 3</w:t>
+          <w:t xml:space="preserve">Example 7</w:t>
         </w:r>
       </w:hyperlink>
       <w:r>
@@ -1333,8 +1782,8 @@
         <w:t xml:space="preserve">, does not occur.</w:t>
       </w:r>
     </w:p>
-    <w:bookmarkEnd w:id="24"/>
-    <w:bookmarkStart w:id="25" w:name="def-complement"/>
+    <w:bookmarkEnd w:id="31"/>
+    <w:bookmarkStart w:id="32" w:name="def-complement"/>
     <w:p>
       <w:pPr>
         <w:pStyle w:val="BodyText"/>
@@ -1344,7 +1793,7 @@
           <w:b/>
           <w:bCs/>
         </w:rPr>
-        <w:t xml:space="preserve">Definition 5 (Complement of an event)</w:t>
+        <w:t xml:space="preserve">Definition 8 (Complement of an event)</w:t>
       </w:r>
       <w:r>
         <w:t xml:space="preserve"> </w:t>
@@ -1531,7 +1980,7 @@
         </m:oMath>
       </m:oMathPara>
     </w:p>
-    <w:bookmarkEnd w:id="25"/>
+    <w:bookmarkEnd w:id="32"/>
     <w:p>
       <w:pPr>
         <w:pStyle w:val="FirstParagraph"/>
@@ -1591,7 +2040,7 @@
         <w:t xml:space="preserve">.</w:t>
       </w:r>
     </w:p>
-    <w:bookmarkStart w:id="26" w:name="exm-complement"/>
+    <w:bookmarkStart w:id="33" w:name="exm-complement"/>
     <w:p>
       <w:pPr>
         <w:pStyle w:val="BodyText"/>
@@ -1601,7 +2050,7 @@
           <w:b/>
           <w:bCs/>
         </w:rPr>
-        <w:t xml:space="preserve">Example 5 (Rolling an odd number)</w:t>
+        <w:t xml:space="preserve">Example 9 (Rolling an odd number)</w:t>
       </w:r>
       <w:r>
         <w:t xml:space="preserve"> </w:t>
@@ -1617,7 +2066,7 @@
           <w:rPr>
             <w:rStyle w:val="Hyperlink"/>
           </w:rPr>
-          <w:t xml:space="preserve">Example 3</w:t>
+          <w:t xml:space="preserve">Example 7</w:t>
         </w:r>
       </w:hyperlink>
       <w:r>
@@ -1768,8 +2217,8 @@
         <w:t xml:space="preserve">.</w:t>
       </w:r>
     </w:p>
-    <w:bookmarkEnd w:id="26"/>
-    <w:bookmarkStart w:id="27" w:name="def-mutually-exclusive"/>
+    <w:bookmarkEnd w:id="33"/>
+    <w:bookmarkStart w:id="34" w:name="def-mutually-exclusive"/>
     <w:p>
       <w:pPr>
         <w:pStyle w:val="BodyText"/>
@@ -1779,7 +2228,7 @@
           <w:b/>
           <w:bCs/>
         </w:rPr>
-        <w:t xml:space="preserve">Definition 6 (Mutually exclusive events (disjoint, pairwise disjoint, mutually disjoint))</w:t>
+        <w:t xml:space="preserve">Definition 9 (Mutually exclusive events (disjoint, pairwise disjoint, mutually disjoint))</w:t>
       </w:r>
       <w:r>
         <w:t xml:space="preserve"> </w:t>
@@ -2001,7 +2450,7 @@
         </m:oMath>
       </m:oMathPara>
     </w:p>
-    <w:bookmarkEnd w:id="27"/>
+    <w:bookmarkEnd w:id="34"/>
     <w:p>
       <w:pPr>
         <w:pStyle w:val="FirstParagraph"/>
@@ -2028,7 +2477,7 @@
       <w:r>
         <w:t xml:space="preserve"> </w:t>
       </w:r>
-      <w:hyperlink r:id="rId28">
+      <w:hyperlink r:id="rId35">
         <w:r>
           <w:rPr>
             <w:rStyle w:val="Hyperlink"/>
@@ -2040,7 +2489,7 @@
         <w:t xml:space="preserve">.</w:t>
       </w:r>
     </w:p>
-    <w:bookmarkStart w:id="29" w:name="exm-mutually-exclusive"/>
+    <w:bookmarkStart w:id="36" w:name="exm-mutually-exclusive"/>
     <w:p>
       <w:pPr>
         <w:pStyle w:val="BodyText"/>
@@ -2050,7 +2499,7 @@
           <w:b/>
           <w:bCs/>
         </w:rPr>
-        <w:t xml:space="preserve">Example 6 (Low and high rolls)</w:t>
+        <w:t xml:space="preserve">Example 10 (Low and high rolls)</w:t>
       </w:r>
       <w:r>
         <w:t xml:space="preserve"> </w:t>
@@ -2066,7 +2515,7 @@
           <w:rPr>
             <w:rStyle w:val="Hyperlink"/>
           </w:rPr>
-          <w:t xml:space="preserve">Example 2</w:t>
+          <w:t xml:space="preserve">Example 6</w:t>
         </w:r>
       </w:hyperlink>
       <w:r>
@@ -2298,8 +2747,8 @@
         <w:t xml:space="preserve">are not mutually exclusive: a roll of 2 is in both.</w:t>
       </w:r>
     </w:p>
-    <w:bookmarkEnd w:id="29"/>
-    <w:bookmarkStart w:id="30" w:name="def-partition"/>
+    <w:bookmarkEnd w:id="36"/>
+    <w:bookmarkStart w:id="37" w:name="def-partition"/>
     <w:p>
       <w:pPr>
         <w:pStyle w:val="BodyText"/>
@@ -2309,7 +2758,7 @@
           <w:b/>
           <w:bCs/>
         </w:rPr>
-        <w:t xml:space="preserve">Definition 7 (Partition of an event)</w:t>
+        <w:t xml:space="preserve">Definition 10 (Partition of an event)</w:t>
       </w:r>
       <w:r>
         <w:t xml:space="preserve"> </w:t>
@@ -2558,8 +3007,8 @@
         <w:t xml:space="preserve">.</w:t>
       </w:r>
     </w:p>
-    <w:bookmarkEnd w:id="30"/>
-    <w:bookmarkStart w:id="31" w:name="rem-partition-sample-space"/>
+    <w:bookmarkEnd w:id="37"/>
+    <w:bookmarkStart w:id="38" w:name="rem-partition-sample-space"/>
     <w:p>
       <w:pPr>
         <w:pStyle w:val="FirstParagraph"/>
@@ -2618,7 +3067,7 @@
         <w:t xml:space="preserve">.</w:t>
       </w:r>
     </w:p>
-    <w:bookmarkEnd w:id="31"/>
+    <w:bookmarkEnd w:id="38"/>
     <w:p>
       <w:pPr>
         <w:pStyle w:val="BodyText"/>
@@ -2660,7 +3109,7 @@
         <w:t xml:space="preserve">to contain at least one outcome.</w:t>
       </w:r>
     </w:p>
-    <w:bookmarkStart w:id="32" w:name="exm-partition"/>
+    <w:bookmarkStart w:id="39" w:name="exm-partition"/>
     <w:p>
       <w:pPr>
         <w:pStyle w:val="BodyText"/>
@@ -2670,7 +3119,7 @@
           <w:b/>
           <w:bCs/>
         </w:rPr>
-        <w:t xml:space="preserve">Example 7 (Partitioning the die roll)</w:t>
+        <w:t xml:space="preserve">Example 11 (Partitioning the die roll)</w:t>
       </w:r>
       <w:r>
         <w:t xml:space="preserve"> </w:t>
@@ -2686,7 +3135,7 @@
           <w:rPr>
             <w:rStyle w:val="Hyperlink"/>
           </w:rPr>
-          <w:t xml:space="preserve">Example 2</w:t>
+          <w:t xml:space="preserve">Example 6</w:t>
         </w:r>
       </w:hyperlink>
       <w:r>
@@ -3025,7 +3474,7 @@
           <w:rPr>
             <w:rStyle w:val="Hyperlink"/>
           </w:rPr>
-          <w:t xml:space="preserve">Example 6</w:t>
+          <w:t xml:space="preserve">Example 10</w:t>
         </w:r>
       </w:hyperlink>
       <w:r>
@@ -3049,8 +3498,8 @@
         <w:t xml:space="preserve">: their union leaves out 3 and 4.</w:t>
       </w:r>
     </w:p>
-    <w:bookmarkEnd w:id="32"/>
-    <w:bookmarkStart w:id="34" w:name="def-probability"/>
+    <w:bookmarkEnd w:id="39"/>
+    <w:bookmarkStart w:id="41" w:name="def-probability"/>
     <w:p>
       <w:pPr>
         <w:pStyle w:val="BodyText"/>
@@ -3060,7 +3509,7 @@
           <w:b/>
           <w:bCs/>
         </w:rPr>
-        <w:t xml:space="preserve">Definition 8 (Probability measure)</w:t>
+        <w:t xml:space="preserve">Definition 11 (Probability measure)</w:t>
       </w:r>
       <w:r>
         <w:t xml:space="preserve"> </w:t>
@@ -3179,7 +3628,7 @@
       <w:r>
         <w:t xml:space="preserve"> </w:t>
       </w:r>
-      <w:hyperlink r:id="rId33">
+      <w:hyperlink r:id="rId40">
         <w:r>
           <w:rPr>
             <w:rStyle w:val="Hyperlink"/>
@@ -3273,7 +3722,7 @@
         </m:oMath>
       </m:oMathPara>
     </w:p>
-    <w:bookmarkEnd w:id="34"/>
+    <w:bookmarkEnd w:id="41"/>
     <w:p>
       <w:pPr>
         <w:pStyle w:val="FirstParagraph"/>
@@ -3317,7 +3766,7 @@
         <w:t xml:space="preserve">The two names mean the same thing.</w:t>
       </w:r>
     </w:p>
-    <w:bookmarkStart w:id="36" w:name="exm-probability"/>
+    <w:bookmarkStart w:id="43" w:name="exm-probability"/>
     <w:p>
       <w:pPr>
         <w:pStyle w:val="BodyText"/>
@@ -3327,7 +3776,7 @@
           <w:b/>
           <w:bCs/>
         </w:rPr>
-        <w:t xml:space="preserve">Example 8 (Probability measure for a fair die)</w:t>
+        <w:t xml:space="preserve">Example 12 (Probability measure for a fair die)</w:t>
       </w:r>
       <w:r>
         <w:t xml:space="preserve"> </w:t>
@@ -3343,7 +3792,7 @@
           <w:rPr>
             <w:rStyle w:val="Hyperlink"/>
           </w:rPr>
-          <w:t xml:space="preserve">Example 2</w:t>
+          <w:t xml:space="preserve">Example 6</w:t>
         </w:r>
       </w:hyperlink>
       <w:r>
@@ -3567,7 +4016,7 @@
       <w:r>
         <w:t xml:space="preserve">(</w:t>
       </w:r>
-      <w:hyperlink r:id="rId35">
+      <w:hyperlink r:id="rId42">
         <w:r>
           <w:rPr>
             <w:rStyle w:val="Hyperlink"/>
@@ -3587,7 +4036,7 @@
       <w:r>
         <w:t xml:space="preserve"> </w:t>
       </w:r>
-      <w:hyperlink r:id="rId33">
+      <w:hyperlink r:id="rId40">
         <w:r>
           <w:rPr>
             <w:rStyle w:val="Hyperlink"/>
@@ -3730,7 +4179,7 @@
           <w:rPr>
             <w:rStyle w:val="Hyperlink"/>
           </w:rPr>
-          <w:t xml:space="preserve">Example 3</w:t>
+          <w:t xml:space="preserve">Example 7</w:t>
         </w:r>
       </w:hyperlink>
       <w:r>
@@ -3861,8 +4310,8 @@
         </m:oMath>
       </m:oMathPara>
     </w:p>
-    <w:bookmarkEnd w:id="36"/>
-    <w:bookmarkStart w:id="38" w:name="cor-probability-finitely-additive"/>
+    <w:bookmarkEnd w:id="43"/>
+    <w:bookmarkStart w:id="45" w:name="cor-probability-finitely-additive"/>
     <w:p>
       <w:pPr>
         <w:pStyle w:val="FirstParagraph"/>
@@ -3900,7 +4349,7 @@
       <w:r>
         <w:t xml:space="preserve"> </w:t>
       </w:r>
-      <w:hyperlink r:id="rId37">
+      <w:hyperlink r:id="rId44">
         <w:r>
           <w:rPr>
             <w:rStyle w:val="Hyperlink"/>
@@ -4122,7 +4571,7 @@
         </m:oMath>
       </m:oMathPara>
     </w:p>
-    <w:bookmarkEnd w:id="38"/>
+    <w:bookmarkEnd w:id="45"/>
     <w:p>
       <w:pPr>
         <w:pStyle w:val="FirstParagraph"/>
@@ -4145,7 +4594,7 @@
           <w:rPr>
             <w:rStyle w:val="Hyperlink"/>
           </w:rPr>
-          <w:t xml:space="preserve">Definition 8</w:t>
+          <w:t xml:space="preserve">Definition 11</w:t>
         </w:r>
       </w:hyperlink>
       <w:r>
@@ -4160,7 +4609,7 @@
       <w:r>
         <w:t xml:space="preserve"> </w:t>
       </w:r>
-      <w:hyperlink r:id="rId39">
+      <w:hyperlink r:id="rId46">
         <w:r>
           <w:rPr>
             <w:rStyle w:val="Hyperlink"/>
@@ -4175,7 +4624,7 @@
         <w:t xml:space="preserve">applies to it.</w:t>
       </w:r>
     </w:p>
-    <w:bookmarkStart w:id="40" w:name="thm-continuity-probability"/>
+    <w:bookmarkStart w:id="47" w:name="thm-continuity-probability"/>
     <w:p>
       <w:pPr>
         <w:pStyle w:val="BodyText"/>
@@ -4401,7 +4850,7 @@
         </m:oMath>
       </m:oMathPara>
     </w:p>
-    <w:bookmarkEnd w:id="40"/>
+    <w:bookmarkEnd w:id="47"/>
     <w:p>
       <w:pPr>
         <w:pStyle w:val="FirstParagraph"/>
@@ -4673,7 +5122,7 @@
       <w:r>
         <w:t xml:space="preserve"> </w:t>
       </w:r>
-      <w:hyperlink r:id="rId41">
+      <w:hyperlink r:id="rId48">
         <w:r>
           <w:rPr>
             <w:rStyle w:val="Hyperlink"/>
@@ -7197,7 +7646,7 @@
         <w:t xml:space="preserve">valid.</w:t>
       </w:r>
     </w:p>
-    <w:bookmarkStart w:id="43" w:name="thm-kolmogorov-axioms"/>
+    <w:bookmarkStart w:id="50" w:name="thm-kolmogorov-axioms"/>
     <w:p>
       <w:pPr>
         <w:pStyle w:val="BodyText"/>
@@ -7467,7 +7916,7 @@
       <w:r>
         <w:t xml:space="preserve"> </w:t>
       </w:r>
-      <w:hyperlink r:id="rId42">
+      <w:hyperlink r:id="rId49">
         <w:r>
           <w:rPr>
             <w:rStyle w:val="Hyperlink"/>
@@ -7702,7 +8151,7 @@
         </m:oMath>
       </m:oMathPara>
     </w:p>
-    <w:bookmarkEnd w:id="43"/>
+    <w:bookmarkEnd w:id="50"/>
     <w:p>
       <w:pPr>
         <w:pStyle w:val="FirstParagraph"/>
@@ -7746,7 +8195,7 @@
       <w:r>
         <w:t xml:space="preserve"> </w:t>
       </w:r>
-      <w:hyperlink r:id="rId33">
+      <w:hyperlink r:id="rId40">
         <w:r>
           <w:rPr>
             <w:rStyle w:val="Hyperlink"/>
@@ -7760,7 +8209,7 @@
       <w:r>
         <w:t xml:space="preserve"> </w:t>
       </w:r>
-      <w:hyperlink r:id="rId44">
+      <w:hyperlink r:id="rId51">
         <w:r>
           <w:rPr>
             <w:rStyle w:val="Hyperlink"/>
@@ -7873,7 +8322,7 @@
           <w:rPr>
             <w:rStyle w:val="Hyperlink"/>
           </w:rPr>
-          <w:t xml:space="preserve">Definition 8</w:t>
+          <w:t xml:space="preserve">Definition 11</w:t>
         </w:r>
       </w:hyperlink>
       <w:r>
@@ -7988,7 +8437,7 @@
       <w:r>
         <w:t xml:space="preserve"> </w:t>
       </w:r>
-      <w:hyperlink r:id="rId42">
+      <w:hyperlink r:id="rId49">
         <w:r>
           <w:rPr>
             <w:rStyle w:val="Hyperlink"/>
@@ -8008,7 +8457,7 @@
       <w:r>
         <w:t xml:space="preserve"> </w:t>
       </w:r>
-      <w:hyperlink r:id="rId45">
+      <w:hyperlink r:id="rId52">
         <w:r>
           <w:rPr>
             <w:rStyle w:val="Hyperlink"/>
@@ -8170,7 +8619,7 @@
       <w:r>
         <w:t xml:space="preserve"> </w:t>
       </w:r>
-      <w:hyperlink r:id="rId33">
+      <w:hyperlink r:id="rId40">
         <w:r>
           <w:rPr>
             <w:rStyle w:val="Hyperlink"/>
@@ -8273,7 +8722,7 @@
           <w:rPr>
             <w:rStyle w:val="Hyperlink"/>
           </w:rPr>
-          <w:t xml:space="preserve">Definition 8</w:t>
+          <w:t xml:space="preserve">Definition 11</w:t>
         </w:r>
       </w:hyperlink>
       <w:r>
@@ -8324,7 +8773,7 @@
       <w:r>
         <w:t xml:space="preserve"> </w:t>
       </w:r>
-      <w:hyperlink r:id="rId46">
+      <w:hyperlink r:id="rId53">
         <w:r>
           <w:rPr>
             <w:rStyle w:val="Hyperlink"/>
@@ -8389,7 +8838,7 @@
         <w:t xml:space="preserve">the proof above derives it.</w:t>
       </w:r>
     </w:p>
-    <w:bookmarkStart w:id="47" w:name="thm-prob-subset"/>
+    <w:bookmarkStart w:id="54" w:name="thm-prob-subset"/>
     <w:p>
       <w:pPr>
         <w:pStyle w:val="BodyText"/>
@@ -8521,7 +8970,7 @@
         <w:t xml:space="preserve">.</w:t>
       </w:r>
     </w:p>
-    <w:bookmarkEnd w:id="47"/>
+    <w:bookmarkEnd w:id="54"/>
     <w:p>
       <w:pPr>
         <w:pStyle w:val="BodyText"/>
@@ -8685,7 +9134,7 @@
         <w:t xml:space="preserve">.</w:t>
       </w:r>
     </w:p>
-    <w:bookmarkStart w:id="48" w:name="thm-total-prob-1"/>
+    <w:bookmarkStart w:id="55" w:name="thm-total-prob-1"/>
     <w:p>
       <w:pPr>
         <w:pStyle w:val="BodyText"/>
@@ -8821,7 +9270,7 @@
         </m:oMath>
       </m:oMathPara>
     </w:p>
-    <w:bookmarkEnd w:id="48"/>
+    <w:bookmarkEnd w:id="55"/>
     <w:p>
       <w:pPr>
         <w:pStyle w:val="FirstParagraph"/>
@@ -9128,7 +9577,7 @@
         </m:oMath>
       </m:oMathPara>
     </w:p>
-    <w:bookmarkStart w:id="49" w:name="cor-p-neg0"/>
+    <w:bookmarkStart w:id="56" w:name="cor-p-neg0"/>
     <w:p>
       <w:pPr>
         <w:pStyle w:val="FirstParagraph"/>
@@ -9233,7 +9682,7 @@
         </m:oMath>
       </m:oMathPara>
     </w:p>
-    <w:bookmarkEnd w:id="49"/>
+    <w:bookmarkEnd w:id="56"/>
     <w:p>
       <w:pPr>
         <w:pStyle w:val="FirstParagraph"/>
@@ -9298,7 +9747,7 @@
         <w:t xml:space="preserve">.</w:t>
       </w:r>
     </w:p>
-    <w:bookmarkStart w:id="50" w:name="cor-p-neg"/>
+    <w:bookmarkStart w:id="57" w:name="cor-p-neg"/>
     <w:p>
       <w:pPr>
         <w:pStyle w:val="BodyText"/>
@@ -9458,7 +9907,7 @@
         </m:oMath>
       </m:oMathPara>
     </w:p>
-    <w:bookmarkEnd w:id="50"/>
+    <w:bookmarkEnd w:id="57"/>
     <w:p>
       <w:pPr>
         <w:pStyle w:val="FirstParagraph"/>
@@ -9642,7 +10091,7 @@
         </m:oMath>
       </m:oMathPara>
     </w:p>
-    <w:bookmarkStart w:id="51" w:name="exm-p-neg"/>
+    <w:bookmarkStart w:id="58" w:name="exm-p-neg"/>
     <w:p>
       <w:pPr>
         <w:pStyle w:val="FirstParagraph"/>
@@ -9652,7 +10101,7 @@
           <w:b/>
           <w:bCs/>
         </w:rPr>
-        <w:t xml:space="preserve">Example 9 (Probability of not rolling a six)</w:t>
+        <w:t xml:space="preserve">Example 13 (Probability of not rolling a six)</w:t>
       </w:r>
       <w:r>
         <w:t xml:space="preserve"> </w:t>
@@ -9772,8 +10221,8 @@
         <w:t xml:space="preserve">.</w:t>
       </w:r>
     </w:p>
-    <w:bookmarkEnd w:id="51"/>
-    <w:bookmarkStart w:id="53" w:name="def-random-choice"/>
+    <w:bookmarkEnd w:id="58"/>
+    <w:bookmarkStart w:id="60" w:name="def-random-choice"/>
     <w:p>
       <w:pPr>
         <w:pStyle w:val="BodyText"/>
@@ -9783,7 +10232,7 @@
           <w:b/>
           <w:bCs/>
         </w:rPr>
-        <w:t xml:space="preserve">Definition 9 (Choosing at random)</w:t>
+        <w:t xml:space="preserve">Definition 12 (Choosing at random)</w:t>
       </w:r>
       <w:r>
         <w:t xml:space="preserve"> </w:t>
@@ -9808,7 +10257,7 @@
       <w:r>
         <w:t xml:space="preserve"> </w:t>
       </w:r>
-      <w:hyperlink r:id="rId33">
+      <w:hyperlink r:id="rId40">
         <w:r>
           <w:rPr>
             <w:rStyle w:val="Hyperlink"/>
@@ -9993,7 +10442,7 @@
       <w:r>
         <w:t xml:space="preserve"> </w:t>
       </w:r>
-      <w:hyperlink r:id="rId52">
+      <w:hyperlink r:id="rId59">
         <w:r>
           <w:rPr>
             <w:rStyle w:val="Hyperlink"/>
@@ -10019,8 +10468,8 @@
         <w:t xml:space="preserve">.</w:t>
       </w:r>
     </w:p>
-    <w:bookmarkEnd w:id="53"/>
-    <w:bookmarkStart w:id="55" w:name="exm-random-choice-sets"/>
+    <w:bookmarkEnd w:id="60"/>
+    <w:bookmarkStart w:id="62" w:name="exm-random-choice-sets"/>
     <w:p>
       <w:pPr>
         <w:pStyle w:val="BodyText"/>
@@ -10030,7 +10479,7 @@
           <w:b/>
           <w:bCs/>
         </w:rPr>
-        <w:t xml:space="preserve">Example 10 (Choosing at random from a finite set and from an interval)</w:t>
+        <w:t xml:space="preserve">Example 14 (Choosing at random from a finite set and from an interval)</w:t>
       </w:r>
       <w:r>
         <w:t xml:space="preserve"> </w:t>
@@ -10106,7 +10555,7 @@
       <w:r>
         <w:t xml:space="preserve"> </w:t>
       </w:r>
-      <w:hyperlink r:id="rId35">
+      <w:hyperlink r:id="rId42">
         <w:r>
           <w:rPr>
             <w:rStyle w:val="Hyperlink"/>
@@ -10457,7 +10906,7 @@
       <w:r>
         <w:t xml:space="preserve"> </w:t>
       </w:r>
-      <w:hyperlink r:id="rId54">
+      <w:hyperlink r:id="rId61">
         <m:oMath>
           <m:r>
             <m:rPr>
@@ -10522,8 +10971,8 @@
         <w:t xml:space="preserve">so they have no choice at random in this sense.</w:t>
       </w:r>
     </w:p>
-    <w:bookmarkEnd w:id="55"/>
-    <w:bookmarkStart w:id="56" w:name="exm-random-choice-auto"/>
+    <w:bookmarkEnd w:id="62"/>
+    <w:bookmarkStart w:id="63" w:name="exm-random-choice-auto"/>
     <w:p>
       <w:pPr>
         <w:pStyle w:val="BodyText"/>
@@ -10533,7 +10982,7 @@
           <w:b/>
           <w:bCs/>
         </w:rPr>
-        <w:t xml:space="preserve">Example 11 (Choosing a car at random from the Auto data)</w:t>
+        <w:t xml:space="preserve">Example 15 (Choosing a car at random from the Auto data)</w:t>
       </w:r>
       <w:r>
         <w:t xml:space="preserve"> </w:t>
@@ -10549,7 +10998,7 @@
           <w:rPr>
             <w:rStyle w:val="Hyperlink"/>
           </w:rPr>
-          <w:t xml:space="preserve">Example 1</w:t>
+          <w:t xml:space="preserve">Example 5</w:t>
         </w:r>
       </w:hyperlink>
       <w:r>
@@ -10609,7 +11058,7 @@
           <w:rPr>
             <w:rStyle w:val="Hyperlink"/>
           </w:rPr>
-          <w:t xml:space="preserve">Definition 9</w:t>
+          <w:t xml:space="preserve">Definition 12</w:t>
         </w:r>
       </w:hyperlink>
       <w:r>
@@ -10822,9 +11271,9 @@
         <w:t xml:space="preserve">#&gt; [1] 0.5076531</w:t>
       </w:r>
     </w:p>
-    <w:bookmarkEnd w:id="56"/>
-    <w:bookmarkEnd w:id="57"/>
-    <w:bookmarkStart w:id="80" w:name="conditional-probability"/>
+    <w:bookmarkEnd w:id="63"/>
+    <w:bookmarkEnd w:id="64"/>
+    <w:bookmarkStart w:id="87" w:name="conditional-probability"/>
     <w:p>
       <w:pPr>
         <w:pStyle w:val="Heading2"/>
@@ -10833,7 +11282,7 @@
         <w:t xml:space="preserve">2 Conditional probability</w:t>
       </w:r>
     </w:p>
-    <w:bookmarkStart w:id="58" w:name="def-conditional-prob"/>
+    <w:bookmarkStart w:id="65" w:name="def-conditional-prob"/>
     <w:p>
       <w:pPr>
         <w:pStyle w:val="FirstParagraph"/>
@@ -10843,7 +11292,7 @@
           <w:b/>
           <w:bCs/>
         </w:rPr>
-        <w:t xml:space="preserve">Definition 10 (Conditional probability)</w:t>
+        <w:t xml:space="preserve">Definition 13 (Conditional probability)</w:t>
       </w:r>
       <w:r>
         <w:t xml:space="preserve"> </w:t>
@@ -11130,7 +11579,7 @@
         </m:oMath>
       </m:oMathPara>
     </w:p>
-    <w:bookmarkEnd w:id="58"/>
+    <w:bookmarkEnd w:id="65"/>
     <w:p>
       <w:pPr>
         <w:pStyle w:val="FirstParagraph"/>
@@ -11262,7 +11711,7 @@
         <w:t xml:space="preserve">.</w:t>
       </w:r>
     </w:p>
-    <w:bookmarkStart w:id="59" w:name="exm-conditional-prob"/>
+    <w:bookmarkStart w:id="66" w:name="exm-conditional-prob"/>
     <w:p>
       <w:pPr>
         <w:pStyle w:val="BodyText"/>
@@ -11272,7 +11721,7 @@
           <w:b/>
           <w:bCs/>
         </w:rPr>
-        <w:t xml:space="preserve">Example 12 (Rolling a six, given an even roll)</w:t>
+        <w:t xml:space="preserve">Example 16 (Rolling a six, given an even roll)</w:t>
       </w:r>
       <w:r>
         <w:t xml:space="preserve"> </w:t>
@@ -11285,7 +11734,7 @@
           <w:rPr>
             <w:rStyle w:val="Hyperlink"/>
           </w:rPr>
-          <w:t xml:space="preserve">Example 8</w:t>
+          <w:t xml:space="preserve">Example 12</w:t>
         </w:r>
       </w:hyperlink>
       <w:r>
@@ -11666,8 +12115,8 @@
         </m:oMath>
       </m:oMathPara>
     </w:p>
-    <w:bookmarkEnd w:id="59"/>
-    <w:bookmarkStart w:id="60" w:name="thm-law-conditional-prob"/>
+    <w:bookmarkEnd w:id="66"/>
+    <w:bookmarkStart w:id="67" w:name="thm-law-conditional-prob"/>
     <w:p>
       <w:pPr>
         <w:pStyle w:val="FirstParagraph"/>
@@ -11857,7 +12306,7 @@
         </m:oMath>
       </m:oMathPara>
     </w:p>
-    <w:bookmarkEnd w:id="60"/>
+    <w:bookmarkEnd w:id="67"/>
     <w:p>
       <w:pPr>
         <w:pStyle w:val="FirstParagraph"/>
@@ -11883,7 +12332,7 @@
           <w:rPr>
             <w:rStyle w:val="Hyperlink"/>
           </w:rPr>
-          <w:t xml:space="preserve">Definition 10</w:t>
+          <w:t xml:space="preserve">Definition 13</w:t>
         </w:r>
       </w:hyperlink>
       <w:r>
@@ -12157,7 +12606,7 @@
         </m:oMath>
       </m:oMathPara>
     </w:p>
-    <w:bookmarkStart w:id="61" w:name="exm-law-conditional-prob"/>
+    <w:bookmarkStart w:id="68" w:name="exm-law-conditional-prob"/>
     <w:p>
       <w:pPr>
         <w:pStyle w:val="FirstParagraph"/>
@@ -12167,7 +12616,7 @@
           <w:b/>
           <w:bCs/>
         </w:rPr>
-        <w:t xml:space="preserve">Example 13 (Applying the law of conditional probability)</w:t>
+        <w:t xml:space="preserve">Example 17 (Applying the law of conditional probability)</w:t>
       </w:r>
       <w:r>
         <w:t xml:space="preserve"> </w:t>
@@ -12489,8 +12938,8 @@
         </m:oMath>
       </m:oMathPara>
     </w:p>
-    <w:bookmarkEnd w:id="61"/>
-    <w:bookmarkStart w:id="62" w:name="thm-total-prob"/>
+    <w:bookmarkEnd w:id="68"/>
+    <w:bookmarkStart w:id="69" w:name="thm-total-prob"/>
     <w:p>
       <w:pPr>
         <w:pStyle w:val="FirstParagraph"/>
@@ -12809,7 +13258,7 @@
         </m:oMath>
       </m:oMathPara>
     </w:p>
-    <w:bookmarkEnd w:id="62"/>
+    <w:bookmarkEnd w:id="69"/>
     <w:p>
       <w:pPr>
         <w:pStyle w:val="FirstParagraph"/>
@@ -12983,7 +13432,7 @@
       <w:r>
         <w:t xml:space="preserve"> </w:t>
       </w:r>
-      <w:hyperlink r:id="rId42">
+      <w:hyperlink r:id="rId49">
         <w:r>
           <w:rPr>
             <w:rStyle w:val="Hyperlink"/>
@@ -13332,7 +13781,7 @@
         </m:oMath>
       </m:oMathPara>
     </w:p>
-    <w:bookmarkStart w:id="63" w:name="thm-bayes"/>
+    <w:bookmarkStart w:id="70" w:name="thm-bayes"/>
     <w:p>
       <w:pPr>
         <w:pStyle w:val="FirstParagraph"/>
@@ -13593,7 +14042,7 @@
         </m:oMath>
       </m:oMathPara>
     </w:p>
-    <w:bookmarkEnd w:id="63"/>
+    <w:bookmarkEnd w:id="70"/>
     <w:p>
       <w:pPr>
         <w:pStyle w:val="FirstParagraph"/>
@@ -13619,7 +14068,7 @@
           <w:rPr>
             <w:rStyle w:val="Hyperlink"/>
           </w:rPr>
-          <w:t xml:space="preserve">Definition 10</w:t>
+          <w:t xml:space="preserve">Definition 13</w:t>
         </w:r>
       </w:hyperlink>
       <w:r>
@@ -14040,7 +14489,7 @@
         </m:oMath>
       </m:oMathPara>
     </w:p>
-    <w:bookmarkStart w:id="64" w:name="exm-bayes"/>
+    <w:bookmarkStart w:id="71" w:name="exm-bayes"/>
     <w:p>
       <w:pPr>
         <w:pStyle w:val="FirstParagraph"/>
@@ -14050,7 +14499,7 @@
           <w:b/>
           <w:bCs/>
         </w:rPr>
-        <w:t xml:space="preserve">Example 14 (Positive predictive value of a medical test)</w:t>
+        <w:t xml:space="preserve">Example 18 (Positive predictive value of a medical test)</w:t>
       </w:r>
       <w:r>
         <w:t xml:space="preserve"> </w:t>
@@ -15082,8 +15531,8 @@
         <w:t xml:space="preserve">because the disease prevalence is relatively low (7%).</w:t>
       </w:r>
     </w:p>
-    <w:bookmarkEnd w:id="64"/>
-    <w:bookmarkStart w:id="65" w:name="exr-bayes"/>
+    <w:bookmarkEnd w:id="71"/>
+    <w:bookmarkStart w:id="72" w:name="exr-bayes"/>
     <w:p>
       <w:pPr>
         <w:pStyle w:val="BodyText"/>
@@ -15103,7 +15552,7 @@
           <w:rPr>
             <w:rStyle w:val="Hyperlink"/>
           </w:rPr>
-          <w:t xml:space="preserve">Definition 10</w:t>
+          <w:t xml:space="preserve">Definition 13</w:t>
         </w:r>
       </w:hyperlink>
       <w:r>
@@ -15421,8 +15870,8 @@
         <w:t xml:space="preserve">, and none of them jointly.</w:t>
       </w:r>
     </w:p>
-    <w:bookmarkEnd w:id="65"/>
-    <w:bookmarkStart w:id="67" w:name="sol-bayes"/>
+    <w:bookmarkEnd w:id="72"/>
+    <w:bookmarkStart w:id="74" w:name="sol-bayes"/>
     <w:p>
       <w:pPr>
         <w:pStyle w:val="BodyText"/>
@@ -15448,7 +15897,7 @@
           <w:rPr>
             <w:rStyle w:val="Hyperlink"/>
           </w:rPr>
-          <w:t xml:space="preserve">Definition 10</w:t>
+          <w:t xml:space="preserve">Definition 13</w:t>
         </w:r>
       </w:hyperlink>
       <w:r>
@@ -15736,7 +16185,7 @@
       <w:pPr>
         <w:pStyle w:val="BodyText"/>
       </w:pPr>
-      <w:bookmarkStart w:id="66" w:name="eq-bayes"/>
+      <w:bookmarkStart w:id="73" w:name="eq-bayes"/>
       <m:oMathPara>
         <m:oMathParaPr>
           <m:jc m:val="center"/>
@@ -15882,7 +16331,7 @@
           </m:r>
         </m:oMath>
       </m:oMathPara>
-      <w:bookmarkEnd w:id="66"/>
+      <w:bookmarkEnd w:id="73"/>
     </w:p>
     <w:p>
       <w:pPr>
@@ -16463,8 +16912,8 @@
         <w:t xml:space="preserve">decreases it.</w:t>
       </w:r>
     </w:p>
-    <w:bookmarkEnd w:id="67"/>
-    <w:bookmarkStart w:id="68" w:name="exr-base-rate"/>
+    <w:bookmarkEnd w:id="74"/>
+    <w:bookmarkStart w:id="75" w:name="exr-base-rate"/>
     <w:p>
       <w:pPr>
         <w:pStyle w:val="BodyText"/>
@@ -16569,8 +17018,8 @@
         <w:t xml:space="preserve">.</w:t>
       </w:r>
     </w:p>
-    <w:bookmarkEnd w:id="68"/>
-    <w:bookmarkStart w:id="69" w:name="sol-base-rate"/>
+    <w:bookmarkEnd w:id="75"/>
+    <w:bookmarkStart w:id="76" w:name="sol-base-rate"/>
     <w:p>
       <w:pPr>
         <w:pStyle w:val="BodyText"/>
@@ -17535,7 +17984,7 @@
         <w:t xml:space="preserve">and it illustrates why raw accuracy can be misleading on rare events.</w:t>
       </w:r>
     </w:p>
-    <w:bookmarkEnd w:id="69"/>
+    <w:bookmarkEnd w:id="76"/>
     <w:tbl>
       <w:tblPr>
         <w:tblStyle w:val="Table"/>
@@ -17577,18 +18026,18 @@
                 <wp:inline>
                   <wp:extent cx="152400" cy="152400"/>
                   <wp:effectExtent b="0" l="0" r="0" t="0"/>
-                  <wp:docPr descr="" title="" id="71" name="Picture"/>
+                  <wp:docPr descr="" title="" id="78" name="Picture"/>
                   <a:graphic>
                     <a:graphicData uri="http://schemas.openxmlformats.org/drawingml/2006/picture">
                       <pic:pic>
                         <pic:nvPicPr>
-                          <pic:cNvPr descr="/opt/quarto/share/formats/docx/tip.png" id="72" name="Picture"/>
+                          <pic:cNvPr descr="/opt/quarto/share/formats/docx/tip.png" id="79" name="Picture"/>
                           <pic:cNvPicPr>
                             <a:picLocks noChangeArrowheads="1" noChangeAspect="1"/>
                           </pic:cNvPicPr>
                         </pic:nvPicPr>
                         <pic:blipFill>
-                          <a:blip r:embed="rId70"/>
+                          <a:blip r:embed="rId77"/>
                           <a:stretch>
                             <a:fillRect/>
                           </a:stretch>
@@ -17650,7 +18099,7 @@
             <w:r>
               <w:t xml:space="preserve"> </w:t>
             </w:r>
-            <w:hyperlink r:id="rId73">
+            <w:hyperlink r:id="rId80">
               <w:r>
                 <w:rPr>
                   <w:rStyle w:val="Hyperlink"/>
@@ -17694,7 +18143,7 @@
             <w:r>
               <w:t xml:space="preserve"> </w:t>
             </w:r>
-            <w:hyperlink r:id="rId74">
+            <w:hyperlink r:id="rId81">
               <w:r>
                 <w:rPr>
                   <w:rStyle w:val="Hyperlink"/>
@@ -17759,18 +18208,18 @@
                 <wp:inline>
                   <wp:extent cx="152400" cy="152400"/>
                   <wp:effectExtent b="0" l="0" r="0" t="0"/>
-                  <wp:docPr descr="" title="" id="75" name="Picture"/>
+                  <wp:docPr descr="" title="" id="82" name="Picture"/>
                   <a:graphic>
                     <a:graphicData uri="http://schemas.openxmlformats.org/drawingml/2006/picture">
                       <pic:pic>
                         <pic:nvPicPr>
-                          <pic:cNvPr descr="/opt/quarto/share/formats/docx/tip.png" id="76" name="Picture"/>
+                          <pic:cNvPr descr="/opt/quarto/share/formats/docx/tip.png" id="83" name="Picture"/>
                           <pic:cNvPicPr>
                             <a:picLocks noChangeArrowheads="1" noChangeAspect="1"/>
                           </pic:cNvPicPr>
                         </pic:nvPicPr>
                         <pic:blipFill>
-                          <a:blip r:embed="rId70"/>
+                          <a:blip r:embed="rId77"/>
                           <a:stretch>
                             <a:fillRect/>
                           </a:stretch>
@@ -17832,7 +18281,7 @@
             <w:r>
               <w:t xml:space="preserve"> </w:t>
             </w:r>
-            <w:hyperlink r:id="rId77">
+            <w:hyperlink r:id="rId84">
               <w:r>
                 <w:rPr>
                   <w:rStyle w:val="Hyperlink"/>
@@ -17882,7 +18331,7 @@
       <w:r>
         <w:t xml:space="preserve"> </w:t>
       </w:r>
-      <w:hyperlink r:id="rId78">
+      <w:hyperlink r:id="rId85">
         <w:r>
           <w:rPr>
             <w:rStyle w:val="Hyperlink"/>
@@ -17899,7 +18348,7 @@
       <w:r>
         <w:t xml:space="preserve"> </w:t>
       </w:r>
-      <w:hyperlink r:id="rId79">
+      <w:hyperlink r:id="rId86">
         <w:r>
           <w:rPr>
             <w:rStyle w:val="Hyperlink"/>
@@ -17911,8 +18360,8 @@
         <w:t xml:space="preserve">.</w:t>
       </w:r>
     </w:p>
-    <w:bookmarkEnd w:id="80"/>
-    <w:bookmarkStart w:id="91" w:name="references"/>
+    <w:bookmarkEnd w:id="87"/>
+    <w:bookmarkStart w:id="98" w:name="references"/>
     <w:p>
       <w:pPr>
         <w:pStyle w:val="Heading2"/>
@@ -17921,8 +18370,8 @@
         <w:t xml:space="preserve">References</w:t>
       </w:r>
     </w:p>
-    <w:bookmarkStart w:id="90" w:name="refs"/>
-    <w:bookmarkStart w:id="82" w:name="ref-fiveminuteai_probstat"/>
+    <w:bookmarkStart w:id="97" w:name="refs"/>
+    <w:bookmarkStart w:id="89" w:name="ref-fiveminuteai_probstat"/>
     <w:p>
       <w:pPr>
         <w:pStyle w:val="Bibliography"/>
@@ -17946,7 +18395,7 @@
       <w:r>
         <w:t xml:space="preserve"> </w:t>
       </w:r>
-      <w:hyperlink r:id="rId81">
+      <w:hyperlink r:id="rId88">
         <w:r>
           <w:rPr>
             <w:rStyle w:val="Hyperlink"/>
@@ -17958,8 +18407,8 @@
         <w:t xml:space="preserve">.</w:t>
       </w:r>
     </w:p>
-    <w:bookmarkEnd w:id="82"/>
-    <w:bookmarkStart w:id="84" w:name="ref-CaseBerg01"/>
+    <w:bookmarkEnd w:id="89"/>
+    <w:bookmarkStart w:id="91" w:name="ref-CaseBerg01"/>
     <w:p>
       <w:pPr>
         <w:pStyle w:val="Bibliography"/>
@@ -17983,7 +18432,7 @@
       <w:r>
         <w:t xml:space="preserve"> </w:t>
       </w:r>
-      <w:hyperlink r:id="rId83">
+      <w:hyperlink r:id="rId90">
         <w:r>
           <w:rPr>
             <w:rStyle w:val="Hyperlink"/>
@@ -17995,8 +18444,8 @@
         <w:t xml:space="preserve">.</w:t>
       </w:r>
     </w:p>
-    <w:bookmarkEnd w:id="84"/>
-    <w:bookmarkStart w:id="85" w:name="ref-hutchinson2024data471"/>
+    <w:bookmarkEnd w:id="91"/>
+    <w:bookmarkStart w:id="92" w:name="ref-hutchinson2024data471"/>
     <w:p>
       <w:pPr>
         <w:pStyle w:val="Bibliography"/>
@@ -18032,8 +18481,8 @@
         <w:t xml:space="preserve">. Western Washington University.</w:t>
       </w:r>
     </w:p>
-    <w:bookmarkEnd w:id="85"/>
-    <w:bookmarkStart w:id="87" w:name="ref-hutchinson_wwu_ml_videos"/>
+    <w:bookmarkEnd w:id="92"/>
+    <w:bookmarkStart w:id="94" w:name="ref-hutchinson_wwu_ml_videos"/>
     <w:p>
       <w:pPr>
         <w:pStyle w:val="Bibliography"/>
@@ -18099,7 +18548,7 @@
       <w:r>
         <w:t xml:space="preserve"> </w:t>
       </w:r>
-      <w:hyperlink r:id="rId86">
+      <w:hyperlink r:id="rId93">
         <w:r>
           <w:rPr>
             <w:rStyle w:val="Hyperlink"/>
@@ -18111,8 +18560,8 @@
         <w:t xml:space="preserve">.</w:t>
       </w:r>
     </w:p>
-    <w:bookmarkEnd w:id="87"/>
-    <w:bookmarkStart w:id="89" w:name="ref-ross-probsim"/>
+    <w:bookmarkEnd w:id="94"/>
+    <w:bookmarkStart w:id="96" w:name="ref-ross-probsim"/>
     <w:p>
       <w:pPr>
         <w:pStyle w:val="Bibliography"/>
@@ -18136,7 +18585,7 @@
       <w:r>
         <w:t xml:space="preserve"> </w:t>
       </w:r>
-      <w:hyperlink r:id="rId88">
+      <w:hyperlink r:id="rId95">
         <w:r>
           <w:rPr>
             <w:rStyle w:val="Hyperlink"/>
@@ -18148,9 +18597,9 @@
         <w:t xml:space="preserve">.</w:t>
       </w:r>
     </w:p>
-    <w:bookmarkEnd w:id="89"/>
-    <w:bookmarkEnd w:id="90"/>
-    <w:bookmarkEnd w:id="91"/>
+    <w:bookmarkEnd w:id="96"/>
+    <w:bookmarkEnd w:id="97"/>
+    <w:bookmarkEnd w:id="98"/>
     <w:sectPr>
       <w:footnotePr>
         <w:numRestart w:val="eachSect"/>

</xml_diff>

<commit_message>
Deploying to gh-pages from @ Morrison-Lab/pds@e14486907e1c391b2ba6e374441cc2ccacb2272e 🚀
</commit_message>
<xml_diff>
--- a/probability-basics.docx
+++ b/probability-basics.docx
@@ -15,10 +15,10 @@
         <w:pStyle w:val="Date"/>
       </w:pPr>
       <w:r>
-        <w:t xml:space="preserve">Last modified: 2026-10-17 02:53:21 (PDT)</w:t>
+        <w:t xml:space="preserve">Last modified: 2026-10-17 13:34:44 (PDT)</w:t>
       </w:r>
     </w:p>
-    <w:bookmarkStart w:id="64" w:name="defining-probabilities"/>
+    <w:bookmarkStart w:id="63" w:name="defining-probabilities"/>
     <w:p>
       <w:pPr>
         <w:pStyle w:val="Heading2"/>
@@ -433,7 +433,16 @@
         <w:t xml:space="preserve"> </w:t>
       </w:r>
       <w:r>
-        <w:t xml:space="preserve">that we have not determined in advance.</w:t>
+        <w:t xml:space="preserve">that we have not determined in advance</w:t>
+      </w:r>
+      <w:r>
+        <w:t xml:space="preserve"> </w:t>
+      </w:r>
+      <w:r>
+        <w:t xml:space="preserve">(Wikipedia contributors 2026e)</w:t>
+      </w:r>
+      <w:r>
+        <w:t xml:space="preserve">.</w:t>
       </w:r>
     </w:p>
     <w:bookmarkEnd w:id="16"/>
@@ -912,7 +921,16 @@
         <w:t xml:space="preserve"> </w:t>
       </w:r>
       <w:r>
-        <w:t xml:space="preserve">of all of its possible outcomes.</w:t>
+        <w:t xml:space="preserve">of all of its possible outcomes</w:t>
+      </w:r>
+      <w:r>
+        <w:t xml:space="preserve"> </w:t>
+      </w:r>
+      <w:r>
+        <w:t xml:space="preserve">(Wikipedia contributors 2026i)</w:t>
+      </w:r>
+      <w:r>
+        <w:t xml:space="preserve">.</w:t>
       </w:r>
     </w:p>
     <w:bookmarkEnd w:id="22"/>
@@ -1076,6 +1094,12 @@
           <m:t>Ω</m:t>
         </m:r>
       </m:oMath>
+      <w:r>
+        <w:t xml:space="preserve"> </w:t>
+      </w:r>
+      <w:r>
+        <w:t xml:space="preserve">(Wikipedia contributors 2026d)</w:t>
+      </w:r>
       <w:r>
         <w:t xml:space="preserve">:</w:t>
       </w:r>
@@ -3674,7 +3698,16 @@
         <w:t xml:space="preserve"> </w:t>
       </w:r>
       <w:r>
-        <w:t xml:space="preserve">that gives the whole sample space probability 1:</w:t>
+        <w:t xml:space="preserve">that gives the whole sample space probability 1</w:t>
+      </w:r>
+      <w:r>
+        <w:t xml:space="preserve"> </w:t>
+      </w:r>
+      <w:r>
+        <w:t xml:space="preserve">(Wikipedia contributors 2026h)</w:t>
+      </w:r>
+      <w:r>
+        <w:t xml:space="preserve">:</w:t>
       </w:r>
     </w:p>
     <w:p>
@@ -8768,21 +8801,10 @@
         <w:t xml:space="preserve"> </w:t>
       </w:r>
       <w:r>
-        <w:t xml:space="preserve">(see</w:t>
-      </w:r>
-      <w:r>
-        <w:t xml:space="preserve"> </w:t>
-      </w:r>
-      <w:hyperlink r:id="rId53">
-        <w:r>
-          <w:rPr>
-            <w:rStyle w:val="Hyperlink"/>
-          </w:rPr>
-          <w:t xml:space="preserve">Wikipedia: Probability axioms</w:t>
-        </w:r>
-      </w:hyperlink>
-      <w:r>
-        <w:t xml:space="preserve">).</w:t>
+        <w:t xml:space="preserve">(Wikipedia contributors 2026g)</w:t>
+      </w:r>
+      <w:r>
+        <w:t xml:space="preserve">.</w:t>
       </w:r>
       <w:r>
         <w:t xml:space="preserve"> </w:t>
@@ -8838,7 +8860,7 @@
         <w:t xml:space="preserve">the proof above derives it.</w:t>
       </w:r>
     </w:p>
-    <w:bookmarkStart w:id="54" w:name="thm-prob-subset"/>
+    <w:bookmarkStart w:id="53" w:name="thm-prob-subset"/>
     <w:p>
       <w:pPr>
         <w:pStyle w:val="BodyText"/>
@@ -8970,7 +8992,7 @@
         <w:t xml:space="preserve">.</w:t>
       </w:r>
     </w:p>
-    <w:bookmarkEnd w:id="54"/>
+    <w:bookmarkEnd w:id="53"/>
     <w:p>
       <w:pPr>
         <w:pStyle w:val="BodyText"/>
@@ -9134,7 +9156,7 @@
         <w:t xml:space="preserve">.</w:t>
       </w:r>
     </w:p>
-    <w:bookmarkStart w:id="55" w:name="thm-total-prob-1"/>
+    <w:bookmarkStart w:id="54" w:name="thm-total-prob-1"/>
     <w:p>
       <w:pPr>
         <w:pStyle w:val="BodyText"/>
@@ -9270,7 +9292,7 @@
         </m:oMath>
       </m:oMathPara>
     </w:p>
-    <w:bookmarkEnd w:id="55"/>
+    <w:bookmarkEnd w:id="54"/>
     <w:p>
       <w:pPr>
         <w:pStyle w:val="FirstParagraph"/>
@@ -9577,7 +9599,7 @@
         </m:oMath>
       </m:oMathPara>
     </w:p>
-    <w:bookmarkStart w:id="56" w:name="cor-p-neg0"/>
+    <w:bookmarkStart w:id="55" w:name="cor-p-neg0"/>
     <w:p>
       <w:pPr>
         <w:pStyle w:val="FirstParagraph"/>
@@ -9682,7 +9704,7 @@
         </m:oMath>
       </m:oMathPara>
     </w:p>
-    <w:bookmarkEnd w:id="56"/>
+    <w:bookmarkEnd w:id="55"/>
     <w:p>
       <w:pPr>
         <w:pStyle w:val="FirstParagraph"/>
@@ -9747,7 +9769,7 @@
         <w:t xml:space="preserve">.</w:t>
       </w:r>
     </w:p>
-    <w:bookmarkStart w:id="57" w:name="cor-p-neg"/>
+    <w:bookmarkStart w:id="56" w:name="cor-p-neg"/>
     <w:p>
       <w:pPr>
         <w:pStyle w:val="BodyText"/>
@@ -9907,7 +9929,7 @@
         </m:oMath>
       </m:oMathPara>
     </w:p>
-    <w:bookmarkEnd w:id="57"/>
+    <w:bookmarkEnd w:id="56"/>
     <w:p>
       <w:pPr>
         <w:pStyle w:val="FirstParagraph"/>
@@ -10091,7 +10113,7 @@
         </m:oMath>
       </m:oMathPara>
     </w:p>
-    <w:bookmarkStart w:id="58" w:name="exm-p-neg"/>
+    <w:bookmarkStart w:id="57" w:name="exm-p-neg"/>
     <w:p>
       <w:pPr>
         <w:pStyle w:val="FirstParagraph"/>
@@ -10221,8 +10243,8 @@
         <w:t xml:space="preserve">.</w:t>
       </w:r>
     </w:p>
-    <w:bookmarkEnd w:id="58"/>
-    <w:bookmarkStart w:id="60" w:name="def-random-choice"/>
+    <w:bookmarkEnd w:id="57"/>
+    <w:bookmarkStart w:id="59" w:name="def-random-choice"/>
     <w:p>
       <w:pPr>
         <w:pStyle w:val="BodyText"/>
@@ -10442,7 +10464,7 @@
       <w:r>
         <w:t xml:space="preserve"> </w:t>
       </w:r>
-      <w:hyperlink r:id="rId59">
+      <w:hyperlink r:id="rId58">
         <w:r>
           <w:rPr>
             <w:rStyle w:val="Hyperlink"/>
@@ -10468,8 +10490,8 @@
         <w:t xml:space="preserve">.</w:t>
       </w:r>
     </w:p>
-    <w:bookmarkEnd w:id="60"/>
-    <w:bookmarkStart w:id="62" w:name="exm-random-choice-sets"/>
+    <w:bookmarkEnd w:id="59"/>
+    <w:bookmarkStart w:id="61" w:name="exm-random-choice-sets"/>
     <w:p>
       <w:pPr>
         <w:pStyle w:val="BodyText"/>
@@ -10906,7 +10928,7 @@
       <w:r>
         <w:t xml:space="preserve"> </w:t>
       </w:r>
-      <w:hyperlink r:id="rId61">
+      <w:hyperlink r:id="rId60">
         <m:oMath>
           <m:r>
             <m:rPr>
@@ -10971,8 +10993,8 @@
         <w:t xml:space="preserve">so they have no choice at random in this sense.</w:t>
       </w:r>
     </w:p>
-    <w:bookmarkEnd w:id="62"/>
-    <w:bookmarkStart w:id="63" w:name="exm-random-choice-auto"/>
+    <w:bookmarkEnd w:id="61"/>
+    <w:bookmarkStart w:id="62" w:name="exm-random-choice-auto"/>
     <w:p>
       <w:pPr>
         <w:pStyle w:val="BodyText"/>
@@ -11271,9 +11293,9 @@
         <w:t xml:space="preserve">#&gt; [1] 0.5076531</w:t>
       </w:r>
     </w:p>
+    <w:bookmarkEnd w:id="62"/>
     <w:bookmarkEnd w:id="63"/>
-    <w:bookmarkEnd w:id="64"/>
-    <w:bookmarkStart w:id="87" w:name="conditional-probability"/>
+    <w:bookmarkStart w:id="86" w:name="conditional-probability"/>
     <w:p>
       <w:pPr>
         <w:pStyle w:val="Heading2"/>
@@ -11282,7 +11304,7 @@
         <w:t xml:space="preserve">2 Conditional probability</w:t>
       </w:r>
     </w:p>
-    <w:bookmarkStart w:id="65" w:name="def-conditional-prob"/>
+    <w:bookmarkStart w:id="64" w:name="def-conditional-prob"/>
     <w:p>
       <w:pPr>
         <w:pStyle w:val="FirstParagraph"/>
@@ -11410,6 +11432,12 @@
           <m:t>B</m:t>
         </m:r>
       </m:oMath>
+      <w:r>
+        <w:t xml:space="preserve"> </w:t>
+      </w:r>
+      <w:r>
+        <w:t xml:space="preserve">(Wikipedia contributors 2026c)</w:t>
+      </w:r>
       <w:r>
         <w:t xml:space="preserve">,</w:t>
       </w:r>
@@ -11579,7 +11607,7 @@
         </m:oMath>
       </m:oMathPara>
     </w:p>
-    <w:bookmarkEnd w:id="65"/>
+    <w:bookmarkEnd w:id="64"/>
     <w:p>
       <w:pPr>
         <w:pStyle w:val="FirstParagraph"/>
@@ -11711,7 +11739,7 @@
         <w:t xml:space="preserve">.</w:t>
       </w:r>
     </w:p>
-    <w:bookmarkStart w:id="66" w:name="exm-conditional-prob"/>
+    <w:bookmarkStart w:id="65" w:name="exm-conditional-prob"/>
     <w:p>
       <w:pPr>
         <w:pStyle w:val="BodyText"/>
@@ -12115,8 +12143,8 @@
         </m:oMath>
       </m:oMathPara>
     </w:p>
-    <w:bookmarkEnd w:id="66"/>
-    <w:bookmarkStart w:id="67" w:name="thm-law-conditional-prob"/>
+    <w:bookmarkEnd w:id="65"/>
+    <w:bookmarkStart w:id="66" w:name="thm-law-conditional-prob"/>
     <w:p>
       <w:pPr>
         <w:pStyle w:val="FirstParagraph"/>
@@ -12306,7 +12334,7 @@
         </m:oMath>
       </m:oMathPara>
     </w:p>
-    <w:bookmarkEnd w:id="67"/>
+    <w:bookmarkEnd w:id="66"/>
     <w:p>
       <w:pPr>
         <w:pStyle w:val="FirstParagraph"/>
@@ -12606,7 +12634,7 @@
         </m:oMath>
       </m:oMathPara>
     </w:p>
-    <w:bookmarkStart w:id="68" w:name="exm-law-conditional-prob"/>
+    <w:bookmarkStart w:id="67" w:name="exm-law-conditional-prob"/>
     <w:p>
       <w:pPr>
         <w:pStyle w:val="FirstParagraph"/>
@@ -12938,8 +12966,8 @@
         </m:oMath>
       </m:oMathPara>
     </w:p>
-    <w:bookmarkEnd w:id="68"/>
-    <w:bookmarkStart w:id="69" w:name="thm-total-prob"/>
+    <w:bookmarkEnd w:id="67"/>
+    <w:bookmarkStart w:id="68" w:name="thm-total-prob"/>
     <w:p>
       <w:pPr>
         <w:pStyle w:val="FirstParagraph"/>
@@ -13108,6 +13136,12 @@
           <m:t>A</m:t>
         </m:r>
       </m:oMath>
+      <w:r>
+        <w:t xml:space="preserve"> </w:t>
+      </w:r>
+      <w:r>
+        <w:t xml:space="preserve">(Wikipedia contributors 2026f)</w:t>
+      </w:r>
       <w:r>
         <w:t xml:space="preserve">:</w:t>
       </w:r>
@@ -13258,7 +13292,7 @@
         </m:oMath>
       </m:oMathPara>
     </w:p>
-    <w:bookmarkEnd w:id="69"/>
+    <w:bookmarkEnd w:id="68"/>
     <w:p>
       <w:pPr>
         <w:pStyle w:val="FirstParagraph"/>
@@ -13781,7 +13815,7 @@
         </m:oMath>
       </m:oMathPara>
     </w:p>
-    <w:bookmarkStart w:id="70" w:name="thm-bayes"/>
+    <w:bookmarkStart w:id="69" w:name="thm-bayes"/>
     <w:p>
       <w:pPr>
         <w:pStyle w:val="FirstParagraph"/>
@@ -13903,6 +13937,12 @@
           <m:t>0</m:t>
         </m:r>
       </m:oMath>
+      <w:r>
+        <w:t xml:space="preserve"> </w:t>
+      </w:r>
+      <w:r>
+        <w:t xml:space="preserve">(Wikipedia contributors 2026b)</w:t>
+      </w:r>
       <w:r>
         <w:t xml:space="preserve">:</w:t>
       </w:r>
@@ -14042,7 +14082,7 @@
         </m:oMath>
       </m:oMathPara>
     </w:p>
-    <w:bookmarkEnd w:id="70"/>
+    <w:bookmarkEnd w:id="69"/>
     <w:p>
       <w:pPr>
         <w:pStyle w:val="FirstParagraph"/>
@@ -14489,7 +14529,7 @@
         </m:oMath>
       </m:oMathPara>
     </w:p>
-    <w:bookmarkStart w:id="71" w:name="exm-bayes"/>
+    <w:bookmarkStart w:id="70" w:name="exm-bayes"/>
     <w:p>
       <w:pPr>
         <w:pStyle w:val="FirstParagraph"/>
@@ -15531,8 +15571,8 @@
         <w:t xml:space="preserve">because the disease prevalence is relatively low (7%).</w:t>
       </w:r>
     </w:p>
-    <w:bookmarkEnd w:id="71"/>
-    <w:bookmarkStart w:id="72" w:name="exr-bayes"/>
+    <w:bookmarkEnd w:id="70"/>
+    <w:bookmarkStart w:id="71" w:name="exr-bayes"/>
     <w:p>
       <w:pPr>
         <w:pStyle w:val="BodyText"/>
@@ -15870,8 +15910,8 @@
         <w:t xml:space="preserve">, and none of them jointly.</w:t>
       </w:r>
     </w:p>
-    <w:bookmarkEnd w:id="72"/>
-    <w:bookmarkStart w:id="74" w:name="sol-bayes"/>
+    <w:bookmarkEnd w:id="71"/>
+    <w:bookmarkStart w:id="73" w:name="sol-bayes"/>
     <w:p>
       <w:pPr>
         <w:pStyle w:val="BodyText"/>
@@ -16185,7 +16225,7 @@
       <w:pPr>
         <w:pStyle w:val="BodyText"/>
       </w:pPr>
-      <w:bookmarkStart w:id="73" w:name="eq-bayes"/>
+      <w:bookmarkStart w:id="72" w:name="eq-bayes"/>
       <m:oMathPara>
         <m:oMathParaPr>
           <m:jc m:val="center"/>
@@ -16331,7 +16371,7 @@
           </m:r>
         </m:oMath>
       </m:oMathPara>
-      <w:bookmarkEnd w:id="73"/>
+      <w:bookmarkEnd w:id="72"/>
     </w:p>
     <w:p>
       <w:pPr>
@@ -16912,8 +16952,8 @@
         <w:t xml:space="preserve">decreases it.</w:t>
       </w:r>
     </w:p>
-    <w:bookmarkEnd w:id="74"/>
-    <w:bookmarkStart w:id="75" w:name="exr-base-rate"/>
+    <w:bookmarkEnd w:id="73"/>
+    <w:bookmarkStart w:id="74" w:name="exr-base-rate"/>
     <w:p>
       <w:pPr>
         <w:pStyle w:val="BodyText"/>
@@ -17018,8 +17058,8 @@
         <w:t xml:space="preserve">.</w:t>
       </w:r>
     </w:p>
-    <w:bookmarkEnd w:id="75"/>
-    <w:bookmarkStart w:id="76" w:name="sol-base-rate"/>
+    <w:bookmarkEnd w:id="74"/>
+    <w:bookmarkStart w:id="75" w:name="sol-base-rate"/>
     <w:p>
       <w:pPr>
         <w:pStyle w:val="BodyText"/>
@@ -17984,7 +18024,7 @@
         <w:t xml:space="preserve">and it illustrates why raw accuracy can be misleading on rare events.</w:t>
       </w:r>
     </w:p>
-    <w:bookmarkEnd w:id="76"/>
+    <w:bookmarkEnd w:id="75"/>
     <w:tbl>
       <w:tblPr>
         <w:tblStyle w:val="Table"/>
@@ -18026,18 +18066,18 @@
                 <wp:inline>
                   <wp:extent cx="152400" cy="152400"/>
                   <wp:effectExtent b="0" l="0" r="0" t="0"/>
-                  <wp:docPr descr="" title="" id="78" name="Picture"/>
+                  <wp:docPr descr="" title="" id="77" name="Picture"/>
                   <a:graphic>
                     <a:graphicData uri="http://schemas.openxmlformats.org/drawingml/2006/picture">
                       <pic:pic>
                         <pic:nvPicPr>
-                          <pic:cNvPr descr="/opt/quarto/share/formats/docx/tip.png" id="79" name="Picture"/>
+                          <pic:cNvPr descr="/opt/quarto/share/formats/docx/tip.png" id="78" name="Picture"/>
                           <pic:cNvPicPr>
                             <a:picLocks noChangeArrowheads="1" noChangeAspect="1"/>
                           </pic:cNvPicPr>
                         </pic:nvPicPr>
                         <pic:blipFill>
-                          <a:blip r:embed="rId77"/>
+                          <a:blip r:embed="rId76"/>
                           <a:stretch>
                             <a:fillRect/>
                           </a:stretch>
@@ -18099,7 +18139,7 @@
             <w:r>
               <w:t xml:space="preserve"> </w:t>
             </w:r>
-            <w:hyperlink r:id="rId80">
+            <w:hyperlink r:id="rId79">
               <w:r>
                 <w:rPr>
                   <w:rStyle w:val="Hyperlink"/>
@@ -18143,7 +18183,7 @@
             <w:r>
               <w:t xml:space="preserve"> </w:t>
             </w:r>
-            <w:hyperlink r:id="rId81">
+            <w:hyperlink r:id="rId80">
               <w:r>
                 <w:rPr>
                   <w:rStyle w:val="Hyperlink"/>
@@ -18208,18 +18248,18 @@
                 <wp:inline>
                   <wp:extent cx="152400" cy="152400"/>
                   <wp:effectExtent b="0" l="0" r="0" t="0"/>
-                  <wp:docPr descr="" title="" id="82" name="Picture"/>
+                  <wp:docPr descr="" title="" id="81" name="Picture"/>
                   <a:graphic>
                     <a:graphicData uri="http://schemas.openxmlformats.org/drawingml/2006/picture">
                       <pic:pic>
                         <pic:nvPicPr>
-                          <pic:cNvPr descr="/opt/quarto/share/formats/docx/tip.png" id="83" name="Picture"/>
+                          <pic:cNvPr descr="/opt/quarto/share/formats/docx/tip.png" id="82" name="Picture"/>
                           <pic:cNvPicPr>
                             <a:picLocks noChangeArrowheads="1" noChangeAspect="1"/>
                           </pic:cNvPicPr>
                         </pic:nvPicPr>
                         <pic:blipFill>
-                          <a:blip r:embed="rId77"/>
+                          <a:blip r:embed="rId76"/>
                           <a:stretch>
                             <a:fillRect/>
                           </a:stretch>
@@ -18281,7 +18321,7 @@
             <w:r>
               <w:t xml:space="preserve"> </w:t>
             </w:r>
-            <w:hyperlink r:id="rId84">
+            <w:hyperlink r:id="rId83">
               <w:r>
                 <w:rPr>
                   <w:rStyle w:val="Hyperlink"/>
@@ -18331,7 +18371,7 @@
       <w:r>
         <w:t xml:space="preserve"> </w:t>
       </w:r>
-      <w:hyperlink r:id="rId85">
+      <w:hyperlink r:id="rId84">
         <w:r>
           <w:rPr>
             <w:rStyle w:val="Hyperlink"/>
@@ -18348,7 +18388,7 @@
       <w:r>
         <w:t xml:space="preserve"> </w:t>
       </w:r>
-      <w:hyperlink r:id="rId86">
+      <w:hyperlink r:id="rId85">
         <w:r>
           <w:rPr>
             <w:rStyle w:val="Hyperlink"/>
@@ -18360,17 +18400,129 @@
         <w:t xml:space="preserve">.</w:t>
       </w:r>
     </w:p>
-    <w:bookmarkEnd w:id="87"/>
-    <w:bookmarkStart w:id="98" w:name="references"/>
+    <w:bookmarkEnd w:id="86"/>
+    <w:bookmarkStart w:id="87" w:name="further-reading"/>
     <w:p>
       <w:pPr>
         <w:pStyle w:val="Heading2"/>
       </w:pPr>
       <w:r>
+        <w:t xml:space="preserve">Further reading</w:t>
+      </w:r>
+    </w:p>
+    <w:p>
+      <w:pPr>
+        <w:numPr>
+          <w:ilvl w:val="0"/>
+          <w:numId w:val="1005"/>
+        </w:numPr>
+      </w:pPr>
+      <w:r>
+        <w:t xml:space="preserve">Wikipedia contributors (2026i)</w:t>
+      </w:r>
+      <w:r>
+        <w:t xml:space="preserve"> </w:t>
+      </w:r>
+      <w:r>
+        <w:t xml:space="preserve">— sample spaces and events, with examples</w:t>
+      </w:r>
+    </w:p>
+    <w:p>
+      <w:pPr>
+        <w:numPr>
+          <w:ilvl w:val="0"/>
+          <w:numId w:val="1005"/>
+        </w:numPr>
+      </w:pPr>
+      <w:r>
+        <w:t xml:space="preserve">Wikipedia contributors (2026h)</w:t>
+      </w:r>
+      <w:r>
+        <w:t xml:space="preserve"> </w:t>
+      </w:r>
+      <w:r>
+        <w:t xml:space="preserve">— the sample space, events and probability measure together</w:t>
+      </w:r>
+    </w:p>
+    <w:p>
+      <w:pPr>
+        <w:numPr>
+          <w:ilvl w:val="0"/>
+          <w:numId w:val="1005"/>
+        </w:numPr>
+      </w:pPr>
+      <w:r>
+        <w:t xml:space="preserve">Wikipedia contributors (2026c)</w:t>
+      </w:r>
+      <w:r>
+        <w:t xml:space="preserve"> </w:t>
+      </w:r>
+      <w:r>
+        <w:t xml:space="preserve">— the definition, with common misreadings</w:t>
+      </w:r>
+    </w:p>
+    <w:p>
+      <w:pPr>
+        <w:numPr>
+          <w:ilvl w:val="0"/>
+          <w:numId w:val="1005"/>
+        </w:numPr>
+      </w:pPr>
+      <w:r>
+        <w:t xml:space="preserve">Wikipedia contributors (2026f)</w:t>
+      </w:r>
+      <w:r>
+        <w:t xml:space="preserve"> </w:t>
+      </w:r>
+      <w:r>
+        <w:t xml:space="preserve">— the law, with examples</w:t>
+      </w:r>
+    </w:p>
+    <w:p>
+      <w:pPr>
+        <w:numPr>
+          <w:ilvl w:val="0"/>
+          <w:numId w:val="1005"/>
+        </w:numPr>
+      </w:pPr>
+      <w:r>
+        <w:t xml:space="preserve">Wikipedia contributors (2026b)</w:t>
+      </w:r>
+      <w:r>
+        <w:t xml:space="preserve"> </w:t>
+      </w:r>
+      <w:r>
+        <w:t xml:space="preserve">— the theorem, its proof and its uses</w:t>
+      </w:r>
+    </w:p>
+    <w:p>
+      <w:pPr>
+        <w:numPr>
+          <w:ilvl w:val="0"/>
+          <w:numId w:val="1005"/>
+        </w:numPr>
+      </w:pPr>
+      <w:r>
+        <w:t xml:space="preserve">Wikipedia contributors (2026a)</w:t>
+      </w:r>
+      <w:r>
+        <w:t xml:space="preserve"> </w:t>
+      </w:r>
+      <w:r>
+        <w:t xml:space="preserve">— why ignoring the base rate misleads</w:t>
+      </w:r>
+    </w:p>
+    <w:bookmarkEnd w:id="87"/>
+    <w:bookmarkStart w:id="116" w:name="references"/>
+    <w:p>
+      <w:pPr>
+        <w:pStyle w:val="Heading2"/>
+      </w:pPr>
+      <w:r>
         <w:t xml:space="preserve">References</w:t>
       </w:r>
     </w:p>
-    <w:bookmarkStart w:id="97" w:name="refs"/>
+    <w:bookmarkStart w:id="115" w:name="refs"/>
     <w:bookmarkStart w:id="89" w:name="ref-fiveminuteai_probstat"/>
     <w:p>
       <w:pPr>
@@ -18598,8 +18750,656 @@
       </w:r>
     </w:p>
     <w:bookmarkEnd w:id="96"/>
-    <w:bookmarkEnd w:id="97"/>
+    <w:bookmarkStart w:id="98" w:name="ref-wikipedia_base_rate_fallacy"/>
+    <w:p>
+      <w:pPr>
+        <w:pStyle w:val="Bibliography"/>
+      </w:pPr>
+      <w:r>
+        <w:t xml:space="preserve">Wikipedia contributors. 2026a.</w:t>
+      </w:r>
+      <w:r>
+        <w:t xml:space="preserve"> </w:t>
+      </w:r>
+      <w:r>
+        <w:rPr>
+          <w:i/>
+          <w:iCs/>
+        </w:rPr>
+        <w:t xml:space="preserve">Base Rate Fallacy —</w:t>
+      </w:r>
+      <w:r>
+        <w:rPr>
+          <w:i/>
+          <w:iCs/>
+        </w:rPr>
+        <w:t xml:space="preserve"> </w:t>
+      </w:r>
+      <w:r>
+        <w:rPr>
+          <w:i/>
+          <w:iCs/>
+        </w:rPr>
+        <w:t xml:space="preserve">Wikipedia</w:t>
+      </w:r>
+      <w:r>
+        <w:rPr>
+          <w:i/>
+          <w:iCs/>
+        </w:rPr>
+        <w:t xml:space="preserve">,</w:t>
+      </w:r>
+      <w:r>
+        <w:rPr>
+          <w:i/>
+          <w:iCs/>
+        </w:rPr>
+        <w:t xml:space="preserve"> </w:t>
+      </w:r>
+      <w:r>
+        <w:rPr>
+          <w:i/>
+          <w:iCs/>
+        </w:rPr>
+        <w:t xml:space="preserve">the Free Encyclopedia</w:t>
+      </w:r>
+      <w:r>
+        <w:t xml:space="preserve">.</w:t>
+      </w:r>
+      <w:r>
+        <w:t xml:space="preserve"> </w:t>
+      </w:r>
+      <w:hyperlink r:id="rId97">
+        <w:r>
+          <w:rPr>
+            <w:rStyle w:val="Hyperlink"/>
+          </w:rPr>
+          <w:t xml:space="preserve">https://en.wikipedia.org/wiki/Base_rate_fallacy</w:t>
+        </w:r>
+      </w:hyperlink>
+      <w:r>
+        <w:t xml:space="preserve">.</w:t>
+      </w:r>
+    </w:p>
     <w:bookmarkEnd w:id="98"/>
+    <w:bookmarkStart w:id="100" w:name="ref-wikipedia_bayes_theorem"/>
+    <w:p>
+      <w:pPr>
+        <w:pStyle w:val="Bibliography"/>
+      </w:pPr>
+      <w:r>
+        <w:t xml:space="preserve">Wikipedia contributors. 2026b.</w:t>
+      </w:r>
+      <w:r>
+        <w:t xml:space="preserve"> </w:t>
+      </w:r>
+      <w:r>
+        <w:rPr>
+          <w:i/>
+          <w:iCs/>
+        </w:rPr>
+        <w:t xml:space="preserve">Bayes’ Theorem —</w:t>
+      </w:r>
+      <w:r>
+        <w:rPr>
+          <w:i/>
+          <w:iCs/>
+        </w:rPr>
+        <w:t xml:space="preserve"> </w:t>
+      </w:r>
+      <w:r>
+        <w:rPr>
+          <w:i/>
+          <w:iCs/>
+        </w:rPr>
+        <w:t xml:space="preserve">Wikipedia</w:t>
+      </w:r>
+      <w:r>
+        <w:rPr>
+          <w:i/>
+          <w:iCs/>
+        </w:rPr>
+        <w:t xml:space="preserve">,</w:t>
+      </w:r>
+      <w:r>
+        <w:rPr>
+          <w:i/>
+          <w:iCs/>
+        </w:rPr>
+        <w:t xml:space="preserve"> </w:t>
+      </w:r>
+      <w:r>
+        <w:rPr>
+          <w:i/>
+          <w:iCs/>
+        </w:rPr>
+        <w:t xml:space="preserve">the Free Encyclopedia</w:t>
+      </w:r>
+      <w:r>
+        <w:t xml:space="preserve">.</w:t>
+      </w:r>
+      <w:r>
+        <w:t xml:space="preserve"> </w:t>
+      </w:r>
+      <w:hyperlink r:id="rId99">
+        <w:r>
+          <w:rPr>
+            <w:rStyle w:val="Hyperlink"/>
+          </w:rPr>
+          <w:t xml:space="preserve">https://en.wikipedia.org/wiki/Bayes%27_theorem</w:t>
+        </w:r>
+      </w:hyperlink>
+      <w:r>
+        <w:t xml:space="preserve">.</w:t>
+      </w:r>
+    </w:p>
+    <w:bookmarkEnd w:id="100"/>
+    <w:bookmarkStart w:id="102" w:name="ref-wikipedia_conditional_probability"/>
+    <w:p>
+      <w:pPr>
+        <w:pStyle w:val="Bibliography"/>
+      </w:pPr>
+      <w:r>
+        <w:t xml:space="preserve">Wikipedia contributors. 2026c.</w:t>
+      </w:r>
+      <w:r>
+        <w:t xml:space="preserve"> </w:t>
+      </w:r>
+      <w:r>
+        <w:rPr>
+          <w:i/>
+          <w:iCs/>
+        </w:rPr>
+        <w:t xml:space="preserve">Conditional Probability —</w:t>
+      </w:r>
+      <w:r>
+        <w:rPr>
+          <w:i/>
+          <w:iCs/>
+        </w:rPr>
+        <w:t xml:space="preserve"> </w:t>
+      </w:r>
+      <w:r>
+        <w:rPr>
+          <w:i/>
+          <w:iCs/>
+        </w:rPr>
+        <w:t xml:space="preserve">Wikipedia</w:t>
+      </w:r>
+      <w:r>
+        <w:rPr>
+          <w:i/>
+          <w:iCs/>
+        </w:rPr>
+        <w:t xml:space="preserve">,</w:t>
+      </w:r>
+      <w:r>
+        <w:rPr>
+          <w:i/>
+          <w:iCs/>
+        </w:rPr>
+        <w:t xml:space="preserve"> </w:t>
+      </w:r>
+      <w:r>
+        <w:rPr>
+          <w:i/>
+          <w:iCs/>
+        </w:rPr>
+        <w:t xml:space="preserve">the Free Encyclopedia</w:t>
+      </w:r>
+      <w:r>
+        <w:t xml:space="preserve">.</w:t>
+      </w:r>
+      <w:r>
+        <w:t xml:space="preserve"> </w:t>
+      </w:r>
+      <w:hyperlink r:id="rId101">
+        <w:r>
+          <w:rPr>
+            <w:rStyle w:val="Hyperlink"/>
+          </w:rPr>
+          <w:t xml:space="preserve">https://en.wikipedia.org/wiki/Conditional_probability</w:t>
+        </w:r>
+      </w:hyperlink>
+      <w:r>
+        <w:t xml:space="preserve">.</w:t>
+      </w:r>
+    </w:p>
+    <w:bookmarkEnd w:id="102"/>
+    <w:bookmarkStart w:id="104" w:name="ref-wikipedia_event_probability_theory"/>
+    <w:p>
+      <w:pPr>
+        <w:pStyle w:val="Bibliography"/>
+      </w:pPr>
+      <w:r>
+        <w:t xml:space="preserve">Wikipedia contributors. 2026d.</w:t>
+      </w:r>
+      <w:r>
+        <w:t xml:space="preserve"> </w:t>
+      </w:r>
+      <w:r>
+        <w:rPr>
+          <w:i/>
+          <w:iCs/>
+        </w:rPr>
+        <w:t xml:space="preserve">Event (Probability Theory) —</w:t>
+      </w:r>
+      <w:r>
+        <w:rPr>
+          <w:i/>
+          <w:iCs/>
+        </w:rPr>
+        <w:t xml:space="preserve"> </w:t>
+      </w:r>
+      <w:r>
+        <w:rPr>
+          <w:i/>
+          <w:iCs/>
+        </w:rPr>
+        <w:t xml:space="preserve">Wikipedia</w:t>
+      </w:r>
+      <w:r>
+        <w:rPr>
+          <w:i/>
+          <w:iCs/>
+        </w:rPr>
+        <w:t xml:space="preserve">,</w:t>
+      </w:r>
+      <w:r>
+        <w:rPr>
+          <w:i/>
+          <w:iCs/>
+        </w:rPr>
+        <w:t xml:space="preserve"> </w:t>
+      </w:r>
+      <w:r>
+        <w:rPr>
+          <w:i/>
+          <w:iCs/>
+        </w:rPr>
+        <w:t xml:space="preserve">the Free Encyclopedia</w:t>
+      </w:r>
+      <w:r>
+        <w:t xml:space="preserve">.</w:t>
+      </w:r>
+      <w:r>
+        <w:t xml:space="preserve"> </w:t>
+      </w:r>
+      <w:hyperlink r:id="rId103">
+        <w:r>
+          <w:rPr>
+            <w:rStyle w:val="Hyperlink"/>
+          </w:rPr>
+          <w:t xml:space="preserve">https://en.wikipedia.org/wiki/Event_(probability_theory)</w:t>
+        </w:r>
+      </w:hyperlink>
+      <w:r>
+        <w:t xml:space="preserve">.</w:t>
+      </w:r>
+    </w:p>
+    <w:bookmarkEnd w:id="104"/>
+    <w:bookmarkStart w:id="106" w:name="X0323630174b5cbd87b45a7fef24ef56ec3bdd6b"/>
+    <w:p>
+      <w:pPr>
+        <w:pStyle w:val="Bibliography"/>
+      </w:pPr>
+      <w:r>
+        <w:t xml:space="preserve">Wikipedia contributors. 2026e.</w:t>
+      </w:r>
+      <w:r>
+        <w:t xml:space="preserve"> </w:t>
+      </w:r>
+      <w:r>
+        <w:rPr>
+          <w:i/>
+          <w:iCs/>
+        </w:rPr>
+        <w:t xml:space="preserve">Experiment (Probability Theory) —</w:t>
+      </w:r>
+      <w:r>
+        <w:rPr>
+          <w:i/>
+          <w:iCs/>
+        </w:rPr>
+        <w:t xml:space="preserve"> </w:t>
+      </w:r>
+      <w:r>
+        <w:rPr>
+          <w:i/>
+          <w:iCs/>
+        </w:rPr>
+        <w:t xml:space="preserve">Wikipedia</w:t>
+      </w:r>
+      <w:r>
+        <w:rPr>
+          <w:i/>
+          <w:iCs/>
+        </w:rPr>
+        <w:t xml:space="preserve">,</w:t>
+      </w:r>
+      <w:r>
+        <w:rPr>
+          <w:i/>
+          <w:iCs/>
+        </w:rPr>
+        <w:t xml:space="preserve"> </w:t>
+      </w:r>
+      <w:r>
+        <w:rPr>
+          <w:i/>
+          <w:iCs/>
+        </w:rPr>
+        <w:t xml:space="preserve">the Free Encyclopedia</w:t>
+      </w:r>
+      <w:r>
+        <w:t xml:space="preserve">.</w:t>
+      </w:r>
+      <w:r>
+        <w:t xml:space="preserve"> </w:t>
+      </w:r>
+      <w:hyperlink r:id="rId105">
+        <w:r>
+          <w:rPr>
+            <w:rStyle w:val="Hyperlink"/>
+          </w:rPr>
+          <w:t xml:space="preserve">https://en.wikipedia.org/wiki/Experiment_(probability_theory)</w:t>
+        </w:r>
+      </w:hyperlink>
+      <w:r>
+        <w:t xml:space="preserve">.</w:t>
+      </w:r>
+    </w:p>
+    <w:bookmarkEnd w:id="106"/>
+    <w:bookmarkStart w:id="108" w:name="ref-wikipedia_law_of_total_probability"/>
+    <w:p>
+      <w:pPr>
+        <w:pStyle w:val="Bibliography"/>
+      </w:pPr>
+      <w:r>
+        <w:t xml:space="preserve">Wikipedia contributors. 2026f.</w:t>
+      </w:r>
+      <w:r>
+        <w:t xml:space="preserve"> </w:t>
+      </w:r>
+      <w:r>
+        <w:rPr>
+          <w:i/>
+          <w:iCs/>
+        </w:rPr>
+        <w:t xml:space="preserve">Law of Total Probability —</w:t>
+      </w:r>
+      <w:r>
+        <w:rPr>
+          <w:i/>
+          <w:iCs/>
+        </w:rPr>
+        <w:t xml:space="preserve"> </w:t>
+      </w:r>
+      <w:r>
+        <w:rPr>
+          <w:i/>
+          <w:iCs/>
+        </w:rPr>
+        <w:t xml:space="preserve">Wikipedia</w:t>
+      </w:r>
+      <w:r>
+        <w:rPr>
+          <w:i/>
+          <w:iCs/>
+        </w:rPr>
+        <w:t xml:space="preserve">,</w:t>
+      </w:r>
+      <w:r>
+        <w:rPr>
+          <w:i/>
+          <w:iCs/>
+        </w:rPr>
+        <w:t xml:space="preserve"> </w:t>
+      </w:r>
+      <w:r>
+        <w:rPr>
+          <w:i/>
+          <w:iCs/>
+        </w:rPr>
+        <w:t xml:space="preserve">the Free Encyclopedia</w:t>
+      </w:r>
+      <w:r>
+        <w:t xml:space="preserve">.</w:t>
+      </w:r>
+      <w:r>
+        <w:t xml:space="preserve"> </w:t>
+      </w:r>
+      <w:hyperlink r:id="rId107">
+        <w:r>
+          <w:rPr>
+            <w:rStyle w:val="Hyperlink"/>
+          </w:rPr>
+          <w:t xml:space="preserve">https://en.wikipedia.org/wiki/Law_of_total_probability</w:t>
+        </w:r>
+      </w:hyperlink>
+      <w:r>
+        <w:t xml:space="preserve">.</w:t>
+      </w:r>
+    </w:p>
+    <w:bookmarkEnd w:id="108"/>
+    <w:bookmarkStart w:id="110" w:name="ref-wikipedia_probability_axioms"/>
+    <w:p>
+      <w:pPr>
+        <w:pStyle w:val="Bibliography"/>
+      </w:pPr>
+      <w:r>
+        <w:t xml:space="preserve">Wikipedia contributors. 2026g.</w:t>
+      </w:r>
+      <w:r>
+        <w:t xml:space="preserve"> </w:t>
+      </w:r>
+      <w:r>
+        <w:rPr>
+          <w:i/>
+          <w:iCs/>
+        </w:rPr>
+        <w:t xml:space="preserve">Probability Axioms —</w:t>
+      </w:r>
+      <w:r>
+        <w:rPr>
+          <w:i/>
+          <w:iCs/>
+        </w:rPr>
+        <w:t xml:space="preserve"> </w:t>
+      </w:r>
+      <w:r>
+        <w:rPr>
+          <w:i/>
+          <w:iCs/>
+        </w:rPr>
+        <w:t xml:space="preserve">Wikipedia</w:t>
+      </w:r>
+      <w:r>
+        <w:rPr>
+          <w:i/>
+          <w:iCs/>
+        </w:rPr>
+        <w:t xml:space="preserve">,</w:t>
+      </w:r>
+      <w:r>
+        <w:rPr>
+          <w:i/>
+          <w:iCs/>
+        </w:rPr>
+        <w:t xml:space="preserve"> </w:t>
+      </w:r>
+      <w:r>
+        <w:rPr>
+          <w:i/>
+          <w:iCs/>
+        </w:rPr>
+        <w:t xml:space="preserve">the Free Encyclopedia</w:t>
+      </w:r>
+      <w:r>
+        <w:t xml:space="preserve">.</w:t>
+      </w:r>
+      <w:r>
+        <w:t xml:space="preserve"> </w:t>
+      </w:r>
+      <w:hyperlink r:id="rId109">
+        <w:r>
+          <w:rPr>
+            <w:rStyle w:val="Hyperlink"/>
+          </w:rPr>
+          <w:t xml:space="preserve">https://en.wikipedia.org/wiki/Probability_axioms</w:t>
+        </w:r>
+      </w:hyperlink>
+      <w:r>
+        <w:t xml:space="preserve">.</w:t>
+      </w:r>
+    </w:p>
+    <w:bookmarkEnd w:id="110"/>
+    <w:bookmarkStart w:id="112" w:name="ref-wikipedia_probability_space"/>
+    <w:p>
+      <w:pPr>
+        <w:pStyle w:val="Bibliography"/>
+      </w:pPr>
+      <w:r>
+        <w:t xml:space="preserve">Wikipedia contributors. 2026h.</w:t>
+      </w:r>
+      <w:r>
+        <w:t xml:space="preserve"> </w:t>
+      </w:r>
+      <w:r>
+        <w:rPr>
+          <w:i/>
+          <w:iCs/>
+        </w:rPr>
+        <w:t xml:space="preserve">Probability Space —</w:t>
+      </w:r>
+      <w:r>
+        <w:rPr>
+          <w:i/>
+          <w:iCs/>
+        </w:rPr>
+        <w:t xml:space="preserve"> </w:t>
+      </w:r>
+      <w:r>
+        <w:rPr>
+          <w:i/>
+          <w:iCs/>
+        </w:rPr>
+        <w:t xml:space="preserve">Wikipedia</w:t>
+      </w:r>
+      <w:r>
+        <w:rPr>
+          <w:i/>
+          <w:iCs/>
+        </w:rPr>
+        <w:t xml:space="preserve">,</w:t>
+      </w:r>
+      <w:r>
+        <w:rPr>
+          <w:i/>
+          <w:iCs/>
+        </w:rPr>
+        <w:t xml:space="preserve"> </w:t>
+      </w:r>
+      <w:r>
+        <w:rPr>
+          <w:i/>
+          <w:iCs/>
+        </w:rPr>
+        <w:t xml:space="preserve">the Free Encyclopedia</w:t>
+      </w:r>
+      <w:r>
+        <w:t xml:space="preserve">.</w:t>
+      </w:r>
+      <w:r>
+        <w:t xml:space="preserve"> </w:t>
+      </w:r>
+      <w:hyperlink r:id="rId111">
+        <w:r>
+          <w:rPr>
+            <w:rStyle w:val="Hyperlink"/>
+          </w:rPr>
+          <w:t xml:space="preserve">https://en.wikipedia.org/wiki/Probability_space</w:t>
+        </w:r>
+      </w:hyperlink>
+      <w:r>
+        <w:t xml:space="preserve">.</w:t>
+      </w:r>
+    </w:p>
+    <w:bookmarkEnd w:id="112"/>
+    <w:bookmarkStart w:id="114" w:name="ref-wikipedia_sample_space"/>
+    <w:p>
+      <w:pPr>
+        <w:pStyle w:val="Bibliography"/>
+      </w:pPr>
+      <w:r>
+        <w:t xml:space="preserve">Wikipedia contributors. 2026i.</w:t>
+      </w:r>
+      <w:r>
+        <w:t xml:space="preserve"> </w:t>
+      </w:r>
+      <w:r>
+        <w:rPr>
+          <w:i/>
+          <w:iCs/>
+        </w:rPr>
+        <w:t xml:space="preserve">Sample Space —</w:t>
+      </w:r>
+      <w:r>
+        <w:rPr>
+          <w:i/>
+          <w:iCs/>
+        </w:rPr>
+        <w:t xml:space="preserve"> </w:t>
+      </w:r>
+      <w:r>
+        <w:rPr>
+          <w:i/>
+          <w:iCs/>
+        </w:rPr>
+        <w:t xml:space="preserve">Wikipedia</w:t>
+      </w:r>
+      <w:r>
+        <w:rPr>
+          <w:i/>
+          <w:iCs/>
+        </w:rPr>
+        <w:t xml:space="preserve">,</w:t>
+      </w:r>
+      <w:r>
+        <w:rPr>
+          <w:i/>
+          <w:iCs/>
+        </w:rPr>
+        <w:t xml:space="preserve"> </w:t>
+      </w:r>
+      <w:r>
+        <w:rPr>
+          <w:i/>
+          <w:iCs/>
+        </w:rPr>
+        <w:t xml:space="preserve">the Free Encyclopedia</w:t>
+      </w:r>
+      <w:r>
+        <w:t xml:space="preserve">.</w:t>
+      </w:r>
+      <w:r>
+        <w:t xml:space="preserve"> </w:t>
+      </w:r>
+      <w:hyperlink r:id="rId113">
+        <w:r>
+          <w:rPr>
+            <w:rStyle w:val="Hyperlink"/>
+          </w:rPr>
+          <w:t xml:space="preserve">https://en.wikipedia.org/wiki/Sample_space</w:t>
+        </w:r>
+      </w:hyperlink>
+      <w:r>
+        <w:t xml:space="preserve">.</w:t>
+      </w:r>
+    </w:p>
+    <w:bookmarkEnd w:id="114"/>
+    <w:bookmarkEnd w:id="115"/>
+    <w:bookmarkEnd w:id="116"/>
     <w:sectPr>
       <w:footnotePr>
         <w:numRestart w:val="eachSect"/>
@@ -18938,6 +19738,9 @@
     <w:abstractNumId w:val="991"/>
   </w:num>
   <w:num w:numId="1004">
+    <w:abstractNumId w:val="991"/>
+  </w:num>
+  <w:num w:numId="1005">
     <w:abstractNumId w:val="991"/>
   </w:num>
 </w:numbering>

</xml_diff>

<commit_message>
Deploying to gh-pages from @ Morrison-Lab/pds@b8414518f3ac7293e391fa28091ea2c0aa6cbe4b 🚀
</commit_message>
<xml_diff>
--- a/probability-basics.docx
+++ b/probability-basics.docx
@@ -15,7 +15,7 @@
         <w:pStyle w:val="Date"/>
       </w:pPr>
       <w:r>
-        <w:t xml:space="preserve">Last modified: 2026-10-19 00:13:33 (PDT)</w:t>
+        <w:t xml:space="preserve">Last modified: 2026-10-19 03:40:33 (PDT)</w:t>
       </w:r>
     </w:p>
     <w:bookmarkStart w:id="63" w:name="defining-probabilities"/>
@@ -11295,16 +11295,16 @@
     </w:p>
     <w:bookmarkEnd w:id="62"/>
     <w:bookmarkEnd w:id="63"/>
-    <w:bookmarkStart w:id="86" w:name="conditional-probability"/>
+    <w:bookmarkStart w:id="68" w:name="odds"/>
     <w:p>
       <w:pPr>
         <w:pStyle w:val="Heading2"/>
       </w:pPr>
       <w:r>
-        <w:t xml:space="preserve">2 Conditional probability</w:t>
+        <w:t xml:space="preserve">2 Odds</w:t>
       </w:r>
     </w:p>
-    <w:bookmarkStart w:id="64" w:name="def-conditional-prob"/>
+    <w:bookmarkStart w:id="64" w:name="def-odds"/>
     <w:p>
       <w:pPr>
         <w:pStyle w:val="FirstParagraph"/>
@@ -11314,13 +11314,13 @@
           <w:b/>
           <w:bCs/>
         </w:rPr>
-        <w:t xml:space="preserve">Definition 13 (Conditional probability)</w:t>
-      </w:r>
-      <w:r>
-        <w:t xml:space="preserve"> </w:t>
-      </w:r>
-      <w:r>
-        <w:t xml:space="preserve">For two events</w:t>
+        <w:t xml:space="preserve">Definition 13 (Odds)</w:t>
+      </w:r>
+      <w:r>
+        <w:t xml:space="preserve"> </w:t>
+      </w:r>
+      <w:r>
+        <w:t xml:space="preserve">Let</w:t>
       </w:r>
       <w:r>
         <w:t xml:space="preserve"> </w:t>
@@ -11334,16 +11334,19 @@
         <w:t xml:space="preserve"> </w:t>
       </w:r>
       <w:r>
-        <w:t xml:space="preserve">and</w:t>
-      </w:r>
-      <w:r>
-        <w:t xml:space="preserve"> </w:t>
-      </w:r>
-      <m:oMath>
-        <m:r>
-          <m:t>B</m:t>
-        </m:r>
-      </m:oMath>
+        <w:t xml:space="preserve">be an</w:t>
+      </w:r>
+      <w:r>
+        <w:t xml:space="preserve"> </w:t>
+      </w:r>
+      <w:hyperlink w:anchor="def-event">
+        <w:r>
+          <w:rPr>
+            <w:rStyle w:val="Hyperlink"/>
+          </w:rPr>
+          <w:t xml:space="preserve">event</w:t>
+        </w:r>
+      </w:hyperlink>
       <w:r>
         <w:t xml:space="preserve"> </w:t>
       </w:r>
@@ -11353,12 +11356,23 @@
       <w:r>
         <w:t xml:space="preserve"> </w:t>
       </w:r>
-      <m:oMath>
-        <m:r>
-          <m:rPr>
-            <m:sty m:val="p"/>
-          </m:rPr>
-          <m:t>Pr</m:t>
+      <w:hyperlink w:anchor="def-probability">
+        <w:r>
+          <w:rPr>
+            <w:rStyle w:val="Hyperlink"/>
+          </w:rPr>
+          <w:t xml:space="preserve">probability</w:t>
+        </w:r>
+      </w:hyperlink>
+      <w:r>
+        <w:t xml:space="preserve"> </w:t>
+      </w:r>
+      <m:oMath>
+        <m:r>
+          <m:rPr>
+            <m:sty m:val="p"/>
+          </m:rPr>
+          <m:t>P</m:t>
         </m:r>
         <m:r>
           <m:rPr>
@@ -11367,7 +11381,7 @@
           <m:t>(</m:t>
         </m:r>
         <m:r>
-          <m:t>B</m:t>
+          <m:t>A</m:t>
         </m:r>
         <m:r>
           <m:rPr>
@@ -11379,20 +11393,41 @@
           <m:rPr>
             <m:sty m:val="p"/>
           </m:rPr>
-          <m:t>&gt;</m:t>
+          <m:t>∈</m:t>
+        </m:r>
+        <m:r>
+          <m:rPr>
+            <m:sty m:val="p"/>
+          </m:rPr>
+          <m:t>(</m:t>
         </m:r>
         <m:r>
           <m:t>0</m:t>
         </m:r>
-      </m:oMath>
-      <w:r>
-        <w:t xml:space="preserve">,</w:t>
-      </w:r>
-      <w:r>
-        <w:t xml:space="preserve"> </w:t>
-      </w:r>
-      <w:r>
-        <w:t xml:space="preserve">the</w:t>
+        <m:r>
+          <m:rPr>
+            <m:sty m:val="p"/>
+          </m:rPr>
+          <m:t>,</m:t>
+        </m:r>
+        <m:r>
+          <m:t>1</m:t>
+        </m:r>
+        <m:r>
+          <m:rPr>
+            <m:sty m:val="p"/>
+          </m:rPr>
+          <m:t>)</m:t>
+        </m:r>
+      </m:oMath>
+      <w:r>
+        <w:t xml:space="preserve">.</w:t>
+      </w:r>
+      <w:r>
+        <w:t xml:space="preserve"> </w:t>
+      </w:r>
+      <w:r>
+        <w:t xml:space="preserve">The</w:t>
       </w:r>
       <w:r>
         <w:t xml:space="preserve"> </w:t>
@@ -11402,7 +11437,7 @@
           <w:b/>
           <w:bCs/>
         </w:rPr>
-        <w:t xml:space="preserve">conditional probability</w:t>
+        <w:t xml:space="preserve">odds</w:t>
       </w:r>
       <w:r>
         <w:t xml:space="preserve"> </w:t>
@@ -11422,68 +11457,13 @@
         <w:t xml:space="preserve"> </w:t>
       </w:r>
       <w:r>
-        <w:t xml:space="preserve">given</w:t>
-      </w:r>
-      <w:r>
-        <w:t xml:space="preserve"> </w:t>
-      </w:r>
-      <m:oMath>
-        <m:r>
-          <m:t>B</m:t>
-        </m:r>
-      </m:oMath>
+        <w:t xml:space="preserve">are</w:t>
+      </w:r>
       <w:r>
         <w:t xml:space="preserve"> </w:t>
       </w:r>
       <w:r>
         <w:t xml:space="preserve">[7]</w:t>
-      </w:r>
-      <w:r>
-        <w:t xml:space="preserve">,</w:t>
-      </w:r>
-      <w:r>
-        <w:t xml:space="preserve"> </w:t>
-      </w:r>
-      <w:r>
-        <w:t xml:space="preserve">denoted</w:t>
-      </w:r>
-      <w:r>
-        <w:t xml:space="preserve"> </w:t>
-      </w:r>
-      <m:oMath>
-        <m:r>
-          <m:rPr>
-            <m:sty m:val="p"/>
-          </m:rPr>
-          <m:t>Pr</m:t>
-        </m:r>
-        <m:r>
-          <m:rPr>
-            <m:sty m:val="p"/>
-          </m:rPr>
-          <m:t>(</m:t>
-        </m:r>
-        <m:r>
-          <m:t>A</m:t>
-        </m:r>
-        <m:r>
-          <m:rPr>
-            <m:sty m:val="p"/>
-          </m:rPr>
-          <m:t>∣</m:t>
-        </m:r>
-        <m:r>
-          <m:t>B</m:t>
-        </m:r>
-        <m:r>
-          <m:rPr>
-            <m:sty m:val="p"/>
-          </m:rPr>
-          <m:t>)</m:t>
-        </m:r>
-      </m:oMath>
-      <w:r>
-        <w:t xml:space="preserve">, is:</w:t>
       </w:r>
     </w:p>
     <w:p>
@@ -11496,34 +11476,7 @@
         </m:oMathParaPr>
         <m:oMath>
           <m:r>
-            <m:rPr>
-              <m:sty m:val="p"/>
-            </m:rPr>
-            <m:t>Pr</m:t>
-          </m:r>
-          <m:r>
-            <m:rPr>
-              <m:sty m:val="p"/>
-            </m:rPr>
-            <m:t>(</m:t>
-          </m:r>
-          <m:r>
-            <m:t>A</m:t>
-          </m:r>
-          <m:r>
-            <m:rPr>
-              <m:sty m:val="p"/>
-            </m:rPr>
-            <m:t>∣</m:t>
-          </m:r>
-          <m:r>
-            <m:t>B</m:t>
-          </m:r>
-          <m:r>
-            <m:rPr>
-              <m:sty m:val="p"/>
-            </m:rPr>
-            <m:t>)</m:t>
+            <m:t>ω</m:t>
           </m:r>
           <m:limUpp>
             <m:e>
@@ -11553,6 +11506,1296 @@
                 <m:rPr>
                   <m:sty m:val="p"/>
                 </m:rPr>
+                <m:t>P</m:t>
+              </m:r>
+              <m:r>
+                <m:rPr>
+                  <m:sty m:val="p"/>
+                </m:rPr>
+                <m:t>(</m:t>
+              </m:r>
+              <m:r>
+                <m:t>A</m:t>
+              </m:r>
+              <m:r>
+                <m:rPr>
+                  <m:sty m:val="p"/>
+                </m:rPr>
+                <m:t>)</m:t>
+              </m:r>
+            </m:num>
+            <m:den>
+              <m:r>
+                <m:t>1</m:t>
+              </m:r>
+              <m:r>
+                <m:rPr>
+                  <m:sty m:val="p"/>
+                </m:rPr>
+                <m:t>−</m:t>
+              </m:r>
+              <m:r>
+                <m:rPr>
+                  <m:sty m:val="p"/>
+                </m:rPr>
+                <m:t>P</m:t>
+              </m:r>
+              <m:r>
+                <m:rPr>
+                  <m:sty m:val="p"/>
+                </m:rPr>
+                <m:t>(</m:t>
+              </m:r>
+              <m:r>
+                <m:t>A</m:t>
+              </m:r>
+              <m:r>
+                <m:rPr>
+                  <m:sty m:val="p"/>
+                </m:rPr>
+                <m:t>)</m:t>
+              </m:r>
+            </m:den>
+          </m:f>
+          <m:r>
+            <m:rPr>
+              <m:sty m:val="p"/>
+            </m:rPr>
+            <m:t>∈</m:t>
+          </m:r>
+          <m:r>
+            <m:rPr>
+              <m:sty m:val="p"/>
+            </m:rPr>
+            <m:t>(</m:t>
+          </m:r>
+          <m:r>
+            <m:t>0</m:t>
+          </m:r>
+          <m:r>
+            <m:rPr>
+              <m:sty m:val="p"/>
+            </m:rPr>
+            <m:t>,</m:t>
+          </m:r>
+          <m:r>
+            <m:rPr>
+              <m:sty m:val="p"/>
+            </m:rPr>
+            <m:t>∞</m:t>
+          </m:r>
+          <m:r>
+            <m:rPr>
+              <m:sty m:val="p"/>
+            </m:rPr>
+            <m:t>)</m:t>
+          </m:r>
+          <m:r>
+            <m:rPr>
+              <m:sty m:val="p"/>
+            </m:rPr>
+            <m:t>.</m:t>
+          </m:r>
+        </m:oMath>
+      </m:oMathPara>
+    </w:p>
+    <w:bookmarkEnd w:id="64"/>
+    <w:bookmarkStart w:id="65" w:name="exm-odds-auto"/>
+    <w:p>
+      <w:pPr>
+        <w:pStyle w:val="FirstParagraph"/>
+      </w:pPr>
+      <w:r>
+        <w:rPr>
+          <w:b/>
+          <w:bCs/>
+        </w:rPr>
+        <w:t xml:space="preserve">Example 16 (Odds that a car in the Auto data is American)</w:t>
+      </w:r>
+      <w:r>
+        <w:t xml:space="preserve"> </w:t>
+      </w:r>
+      <w:r>
+        <w:t xml:space="preserve">In the Auto data of</w:t>
+      </w:r>
+      <w:r>
+        <w:t xml:space="preserve"> </w:t>
+      </w:r>
+      <w:hyperlink w:anchor="exm-random-experiment">
+        <w:r>
+          <w:rPr>
+            <w:rStyle w:val="Hyperlink"/>
+          </w:rPr>
+          <w:t xml:space="preserve">Example 5</w:t>
+        </w:r>
+      </w:hyperlink>
+      <w:r>
+        <w:t xml:space="preserve">,</w:t>
+      </w:r>
+      <w:r>
+        <w:t xml:space="preserve"> </w:t>
+      </w:r>
+      <w:r>
+        <w:t xml:space="preserve">let</w:t>
+      </w:r>
+      <w:r>
+        <w:t xml:space="preserve"> </w:t>
+      </w:r>
+      <m:oMath>
+        <m:r>
+          <m:t>A</m:t>
+        </m:r>
+      </m:oMath>
+      <w:r>
+        <w:t xml:space="preserve"> </w:t>
+      </w:r>
+      <w:r>
+        <w:t xml:space="preserve">be the</w:t>
+      </w:r>
+      <w:r>
+        <w:t xml:space="preserve"> </w:t>
+      </w:r>
+      <w:hyperlink w:anchor="def-event">
+        <w:r>
+          <w:rPr>
+            <w:rStyle w:val="Hyperlink"/>
+          </w:rPr>
+          <w:t xml:space="preserve">event</w:t>
+        </w:r>
+      </w:hyperlink>
+      <w:r>
+        <w:t xml:space="preserve"> </w:t>
+      </w:r>
+      <w:r>
+        <w:t xml:space="preserve">that a car</w:t>
+      </w:r>
+      <w:r>
+        <w:t xml:space="preserve"> </w:t>
+      </w:r>
+      <w:hyperlink w:anchor="def-random-choice">
+        <w:r>
+          <w:rPr>
+            <w:rStyle w:val="Hyperlink"/>
+          </w:rPr>
+          <w:t xml:space="preserve">chosen at random</w:t>
+        </w:r>
+      </w:hyperlink>
+      <w:r>
+        <w:t xml:space="preserve"> </w:t>
+      </w:r>
+      <w:r>
+        <w:t xml:space="preserve">is American,</w:t>
+      </w:r>
+      <w:r>
+        <w:t xml:space="preserve"> </w:t>
+      </w:r>
+      <w:r>
+        <w:t xml:space="preserve">which the data code as</w:t>
+      </w:r>
+      <w:r>
+        <w:t xml:space="preserve"> </w:t>
+      </w:r>
+      <w:r>
+        <w:rPr>
+          <w:rStyle w:val="VerbatimChar"/>
+        </w:rPr>
+        <w:t xml:space="preserve">origin == 1</w:t>
+      </w:r>
+      <w:r>
+        <w:t xml:space="preserve">.</w:t>
+      </w:r>
+      <w:r>
+        <w:t xml:space="preserve"> </w:t>
+      </w:r>
+      <w:r>
+        <w:t xml:space="preserve">Its</w:t>
+      </w:r>
+      <w:r>
+        <w:t xml:space="preserve"> </w:t>
+      </w:r>
+      <w:hyperlink w:anchor="def-probability">
+        <w:r>
+          <w:rPr>
+            <w:rStyle w:val="Hyperlink"/>
+          </w:rPr>
+          <w:t xml:space="preserve">probability</w:t>
+        </w:r>
+      </w:hyperlink>
+      <w:r>
+        <w:t xml:space="preserve"> </w:t>
+      </w:r>
+      <w:r>
+        <w:t xml:space="preserve">is the fraction of American cars,</w:t>
+      </w:r>
+      <w:r>
+        <w:t xml:space="preserve"> </w:t>
+      </w:r>
+      <w:r>
+        <w:t xml:space="preserve">as in</w:t>
+      </w:r>
+      <w:r>
+        <w:t xml:space="preserve"> </w:t>
+      </w:r>
+      <w:hyperlink w:anchor="exm-random-choice-auto">
+        <w:r>
+          <w:rPr>
+            <w:rStyle w:val="Hyperlink"/>
+          </w:rPr>
+          <w:t xml:space="preserve">Example 15</w:t>
+        </w:r>
+      </w:hyperlink>
+      <w:r>
+        <w:t xml:space="preserve">,</w:t>
+      </w:r>
+      <w:r>
+        <w:t xml:space="preserve"> </w:t>
+      </w:r>
+      <w:r>
+        <w:t xml:space="preserve">and its</w:t>
+      </w:r>
+      <w:r>
+        <w:t xml:space="preserve"> </w:t>
+      </w:r>
+      <w:hyperlink w:anchor="def-odds">
+        <w:r>
+          <w:rPr>
+            <w:rStyle w:val="Hyperlink"/>
+          </w:rPr>
+          <w:t xml:space="preserve">odds</w:t>
+        </w:r>
+      </w:hyperlink>
+      <w:r>
+        <w:t xml:space="preserve"> </w:t>
+      </w:r>
+      <w:r>
+        <w:t xml:space="preserve">follow from</w:t>
+      </w:r>
+      <w:r>
+        <w:t xml:space="preserve"> </w:t>
+      </w:r>
+      <w:hyperlink w:anchor="def-odds">
+        <w:r>
+          <w:rPr>
+            <w:rStyle w:val="Hyperlink"/>
+          </w:rPr>
+          <w:t xml:space="preserve">Definition 13</w:t>
+        </w:r>
+      </w:hyperlink>
+      <w:r>
+        <w:t xml:space="preserve">:</w:t>
+      </w:r>
+    </w:p>
+    <w:p>
+      <w:pPr>
+        <w:pStyle w:val="SourceCode"/>
+      </w:pPr>
+      <w:r>
+        <w:rPr>
+          <w:rStyle w:val="NormalTok"/>
+        </w:rPr>
+        <w:t xml:space="preserve">auto </w:t>
+      </w:r>
+      <w:r>
+        <w:rPr>
+          <w:rStyle w:val="OtherTok"/>
+        </w:rPr>
+        <w:t xml:space="preserve">&lt;-</w:t>
+      </w:r>
+      <w:r>
+        <w:rPr>
+          <w:rStyle w:val="NormalTok"/>
+        </w:rPr>
+        <w:t xml:space="preserve"> </w:t>
+      </w:r>
+      <w:r>
+        <w:rPr>
+          <w:rStyle w:val="FunctionTok"/>
+        </w:rPr>
+        <w:t xml:space="preserve">read.csv</w:t>
+      </w:r>
+      <w:r>
+        <w:rPr>
+          <w:rStyle w:val="NormalTok"/>
+        </w:rPr>
+        <w:t xml:space="preserve">(</w:t>
+      </w:r>
+      <w:r>
+        <w:rPr>
+          <w:rStyle w:val="StringTok"/>
+        </w:rPr>
+        <w:t xml:space="preserve">"data/auto.csv"</w:t>
+      </w:r>
+      <w:r>
+        <w:rPr>
+          <w:rStyle w:val="NormalTok"/>
+        </w:rPr>
+        <w:t xml:space="preserve">)</w:t>
+      </w:r>
+      <w:r>
+        <w:br/>
+      </w:r>
+      <w:r>
+        <w:rPr>
+          <w:rStyle w:val="NormalTok"/>
+        </w:rPr>
+        <w:t xml:space="preserve">p_american </w:t>
+      </w:r>
+      <w:r>
+        <w:rPr>
+          <w:rStyle w:val="OtherTok"/>
+        </w:rPr>
+        <w:t xml:space="preserve">&lt;-</w:t>
+      </w:r>
+      <w:r>
+        <w:rPr>
+          <w:rStyle w:val="NormalTok"/>
+        </w:rPr>
+        <w:t xml:space="preserve"> </w:t>
+      </w:r>
+      <w:r>
+        <w:rPr>
+          <w:rStyle w:val="FunctionTok"/>
+        </w:rPr>
+        <w:t xml:space="preserve">mean</w:t>
+      </w:r>
+      <w:r>
+        <w:rPr>
+          <w:rStyle w:val="NormalTok"/>
+        </w:rPr>
+        <w:t xml:space="preserve">(auto</w:t>
+      </w:r>
+      <w:r>
+        <w:rPr>
+          <w:rStyle w:val="SpecialCharTok"/>
+        </w:rPr>
+        <w:t xml:space="preserve">$</w:t>
+      </w:r>
+      <w:r>
+        <w:rPr>
+          <w:rStyle w:val="NormalTok"/>
+        </w:rPr>
+        <w:t xml:space="preserve">origin </w:t>
+      </w:r>
+      <w:r>
+        <w:rPr>
+          <w:rStyle w:val="SpecialCharTok"/>
+        </w:rPr>
+        <w:t xml:space="preserve">==</w:t>
+      </w:r>
+      <w:r>
+        <w:rPr>
+          <w:rStyle w:val="NormalTok"/>
+        </w:rPr>
+        <w:t xml:space="preserve"> </w:t>
+      </w:r>
+      <w:r>
+        <w:rPr>
+          <w:rStyle w:val="DecValTok"/>
+        </w:rPr>
+        <w:t xml:space="preserve">1</w:t>
+      </w:r>
+      <w:r>
+        <w:rPr>
+          <w:rStyle w:val="NormalTok"/>
+        </w:rPr>
+        <w:t xml:space="preserve">)</w:t>
+      </w:r>
+      <w:r>
+        <w:br/>
+      </w:r>
+      <w:r>
+        <w:rPr>
+          <w:rStyle w:val="FunctionTok"/>
+        </w:rPr>
+        <w:t xml:space="preserve">c</w:t>
+      </w:r>
+      <w:r>
+        <w:rPr>
+          <w:rStyle w:val="NormalTok"/>
+        </w:rPr>
+        <w:t xml:space="preserve">(</w:t>
+      </w:r>
+      <w:r>
+        <w:rPr>
+          <w:rStyle w:val="AttributeTok"/>
+        </w:rPr>
+        <w:t xml:space="preserve">probability =</w:t>
+      </w:r>
+      <w:r>
+        <w:rPr>
+          <w:rStyle w:val="NormalTok"/>
+        </w:rPr>
+        <w:t xml:space="preserve"> p_american, </w:t>
+      </w:r>
+      <w:r>
+        <w:rPr>
+          <w:rStyle w:val="AttributeTok"/>
+        </w:rPr>
+        <w:t xml:space="preserve">odds =</w:t>
+      </w:r>
+      <w:r>
+        <w:rPr>
+          <w:rStyle w:val="NormalTok"/>
+        </w:rPr>
+        <w:t xml:space="preserve"> p_american </w:t>
+      </w:r>
+      <w:r>
+        <w:rPr>
+          <w:rStyle w:val="SpecialCharTok"/>
+        </w:rPr>
+        <w:t xml:space="preserve">/</w:t>
+      </w:r>
+      <w:r>
+        <w:rPr>
+          <w:rStyle w:val="NormalTok"/>
+        </w:rPr>
+        <w:t xml:space="preserve"> (</w:t>
+      </w:r>
+      <w:r>
+        <w:rPr>
+          <w:rStyle w:val="DecValTok"/>
+        </w:rPr>
+        <w:t xml:space="preserve">1</w:t>
+      </w:r>
+      <w:r>
+        <w:rPr>
+          <w:rStyle w:val="NormalTok"/>
+        </w:rPr>
+        <w:t xml:space="preserve"> </w:t>
+      </w:r>
+      <w:r>
+        <w:rPr>
+          <w:rStyle w:val="SpecialCharTok"/>
+        </w:rPr>
+        <w:t xml:space="preserve">-</w:t>
+      </w:r>
+      <w:r>
+        <w:rPr>
+          <w:rStyle w:val="NormalTok"/>
+        </w:rPr>
+        <w:t xml:space="preserve"> p_american))</w:t>
+      </w:r>
+      <w:r>
+        <w:br/>
+      </w:r>
+      <w:r>
+        <w:rPr>
+          <w:rStyle w:val="CommentTok"/>
+        </w:rPr>
+        <w:t xml:space="preserve">#&gt; probability        odds </w:t>
+      </w:r>
+      <w:r>
+        <w:br/>
+      </w:r>
+      <w:r>
+        <w:rPr>
+          <w:rStyle w:val="CommentTok"/>
+        </w:rPr>
+        <w:t xml:space="preserve">#&gt;    0.625000    1.666667</w:t>
+      </w:r>
+    </w:p>
+    <w:p>
+      <w:pPr>
+        <w:pStyle w:val="FirstParagraph"/>
+      </w:pPr>
+      <w:r>
+        <w:t xml:space="preserve">The odds 1.67 say that</w:t>
+      </w:r>
+      <w:r>
+        <w:t xml:space="preserve"> </w:t>
+      </w:r>
+      <w:r>
+        <w:t xml:space="preserve">an American car is about 1.7 times as likely</w:t>
+      </w:r>
+      <w:r>
+        <w:t xml:space="preserve"> </w:t>
+      </w:r>
+      <w:r>
+        <w:t xml:space="preserve">as a car of non-American origin.</w:t>
+      </w:r>
+    </w:p>
+    <w:bookmarkEnd w:id="65"/>
+    <w:bookmarkStart w:id="66" w:name="def-log-odds"/>
+    <w:p>
+      <w:pPr>
+        <w:pStyle w:val="BodyText"/>
+      </w:pPr>
+      <w:r>
+        <w:rPr>
+          <w:b/>
+          <w:bCs/>
+        </w:rPr>
+        <w:t xml:space="preserve">Definition 14 (Log-odds (also called the logit))</w:t>
+      </w:r>
+      <w:r>
+        <w:t xml:space="preserve"> </w:t>
+      </w:r>
+      <w:r>
+        <w:t xml:space="preserve">The</w:t>
+      </w:r>
+      <w:r>
+        <w:t xml:space="preserve"> </w:t>
+      </w:r>
+      <w:r>
+        <w:rPr>
+          <w:b/>
+          <w:bCs/>
+        </w:rPr>
+        <w:t xml:space="preserve">log-odds</w:t>
+      </w:r>
+      <w:r>
+        <w:t xml:space="preserve">, also called the</w:t>
+      </w:r>
+      <w:r>
+        <w:t xml:space="preserve"> </w:t>
+      </w:r>
+      <w:r>
+        <w:rPr>
+          <w:b/>
+          <w:bCs/>
+        </w:rPr>
+        <w:t xml:space="preserve">logit</w:t>
+      </w:r>
+      <w:r>
+        <w:t xml:space="preserve">, of an</w:t>
+      </w:r>
+      <w:r>
+        <w:t xml:space="preserve"> </w:t>
+      </w:r>
+      <w:hyperlink w:anchor="def-event">
+        <w:r>
+          <w:rPr>
+            <w:rStyle w:val="Hyperlink"/>
+          </w:rPr>
+          <w:t xml:space="preserve">event</w:t>
+        </w:r>
+      </w:hyperlink>
+      <w:r>
+        <w:t xml:space="preserve"> </w:t>
+      </w:r>
+      <m:oMath>
+        <m:r>
+          <m:t>A</m:t>
+        </m:r>
+      </m:oMath>
+      <w:r>
+        <w:t xml:space="preserve"> </w:t>
+      </w:r>
+      <w:r>
+        <w:t xml:space="preserve">with</w:t>
+      </w:r>
+      <w:r>
+        <w:t xml:space="preserve"> </w:t>
+      </w:r>
+      <w:hyperlink w:anchor="def-probability">
+        <w:r>
+          <w:rPr>
+            <w:rStyle w:val="Hyperlink"/>
+          </w:rPr>
+          <w:t xml:space="preserve">probability</w:t>
+        </w:r>
+      </w:hyperlink>
+      <w:r>
+        <w:t xml:space="preserve"> </w:t>
+      </w:r>
+      <m:oMath>
+        <m:r>
+          <m:rPr>
+            <m:sty m:val="p"/>
+          </m:rPr>
+          <m:t>P</m:t>
+        </m:r>
+        <m:r>
+          <m:rPr>
+            <m:sty m:val="p"/>
+          </m:rPr>
+          <m:t>(</m:t>
+        </m:r>
+        <m:r>
+          <m:t>A</m:t>
+        </m:r>
+        <m:r>
+          <m:rPr>
+            <m:sty m:val="p"/>
+          </m:rPr>
+          <m:t>)</m:t>
+        </m:r>
+        <m:r>
+          <m:rPr>
+            <m:sty m:val="p"/>
+          </m:rPr>
+          <m:t>∈</m:t>
+        </m:r>
+        <m:r>
+          <m:rPr>
+            <m:sty m:val="p"/>
+          </m:rPr>
+          <m:t>(</m:t>
+        </m:r>
+        <m:r>
+          <m:t>0</m:t>
+        </m:r>
+        <m:r>
+          <m:rPr>
+            <m:sty m:val="p"/>
+          </m:rPr>
+          <m:t>,</m:t>
+        </m:r>
+        <m:r>
+          <m:t>1</m:t>
+        </m:r>
+        <m:r>
+          <m:rPr>
+            <m:sty m:val="p"/>
+          </m:rPr>
+          <m:t>)</m:t>
+        </m:r>
+      </m:oMath>
+      <w:r>
+        <w:t xml:space="preserve"> </w:t>
+      </w:r>
+      <w:r>
+        <w:t xml:space="preserve">are the natural logarithm of its</w:t>
+      </w:r>
+      <w:r>
+        <w:t xml:space="preserve"> </w:t>
+      </w:r>
+      <w:hyperlink w:anchor="def-odds">
+        <w:r>
+          <w:rPr>
+            <w:rStyle w:val="Hyperlink"/>
+          </w:rPr>
+          <w:t xml:space="preserve">odds</w:t>
+        </w:r>
+      </w:hyperlink>
+      <w:r>
+        <w:t xml:space="preserve"> </w:t>
+      </w:r>
+      <w:r>
+        <w:t xml:space="preserve">[8]</w:t>
+      </w:r>
+      <w:r>
+        <w:t xml:space="preserve">:</w:t>
+      </w:r>
+    </w:p>
+    <w:p>
+      <w:pPr>
+        <w:pStyle w:val="BodyText"/>
+      </w:pPr>
+      <m:oMathPara>
+        <m:oMathParaPr>
+          <m:jc m:val="center"/>
+        </m:oMathParaPr>
+        <m:oMath>
+          <m:r>
+            <m:t>η</m:t>
+          </m:r>
+          <m:limUpp>
+            <m:e>
+              <m:r>
+                <m:rPr>
+                  <m:sty m:val="p"/>
+                </m:rPr>
+                <m:t>=</m:t>
+              </m:r>
+            </m:e>
+            <m:lim>
+              <m:r>
+                <m:rPr>
+                  <m:nor/>
+                  <m:sty m:val="p"/>
+                </m:rPr>
+                <m:t>def</m:t>
+              </m:r>
+            </m:lim>
+          </m:limUpp>
+          <m:r>
+            <m:rPr>
+              <m:sty m:val="p"/>
+            </m:rPr>
+            <m:t>log</m:t>
+          </m:r>
+          <m:r>
+            <m:t>​</m:t>
+          </m:r>
+          <m:d>
+            <m:dPr>
+              <m:begChr m:val="{"/>
+              <m:sepChr m:val=""/>
+              <m:endChr m:val="}"/>
+              <m:grow/>
+            </m:dPr>
+            <m:e>
+              <m:r>
+                <m:t>ω</m:t>
+              </m:r>
+            </m:e>
+          </m:d>
+          <m:r>
+            <m:t>​</m:t>
+          </m:r>
+          <m:r>
+            <m:rPr>
+              <m:sty m:val="p"/>
+            </m:rPr>
+            <m:t>=</m:t>
+          </m:r>
+          <m:r>
+            <m:rPr>
+              <m:sty m:val="p"/>
+            </m:rPr>
+            <m:t>log</m:t>
+          </m:r>
+          <m:r>
+            <m:t>​</m:t>
+          </m:r>
+          <m:d>
+            <m:dPr>
+              <m:begChr m:val="{"/>
+              <m:sepChr m:val=""/>
+              <m:endChr m:val="}"/>
+              <m:grow/>
+            </m:dPr>
+            <m:e>
+              <m:f>
+                <m:fPr>
+                  <m:type m:val="bar"/>
+                </m:fPr>
+                <m:num>
+                  <m:r>
+                    <m:rPr>
+                      <m:sty m:val="p"/>
+                    </m:rPr>
+                    <m:t>P</m:t>
+                  </m:r>
+                  <m:r>
+                    <m:rPr>
+                      <m:sty m:val="p"/>
+                    </m:rPr>
+                    <m:t>(</m:t>
+                  </m:r>
+                  <m:r>
+                    <m:t>A</m:t>
+                  </m:r>
+                  <m:r>
+                    <m:rPr>
+                      <m:sty m:val="p"/>
+                    </m:rPr>
+                    <m:t>)</m:t>
+                  </m:r>
+                </m:num>
+                <m:den>
+                  <m:r>
+                    <m:t>1</m:t>
+                  </m:r>
+                  <m:r>
+                    <m:rPr>
+                      <m:sty m:val="p"/>
+                    </m:rPr>
+                    <m:t>−</m:t>
+                  </m:r>
+                  <m:r>
+                    <m:rPr>
+                      <m:sty m:val="p"/>
+                    </m:rPr>
+                    <m:t>P</m:t>
+                  </m:r>
+                  <m:r>
+                    <m:rPr>
+                      <m:sty m:val="p"/>
+                    </m:rPr>
+                    <m:t>(</m:t>
+                  </m:r>
+                  <m:r>
+                    <m:t>A</m:t>
+                  </m:r>
+                  <m:r>
+                    <m:rPr>
+                      <m:sty m:val="p"/>
+                    </m:rPr>
+                    <m:t>)</m:t>
+                  </m:r>
+                </m:den>
+              </m:f>
+            </m:e>
+          </m:d>
+          <m:r>
+            <m:t>​</m:t>
+          </m:r>
+          <m:r>
+            <m:rPr>
+              <m:sty m:val="p"/>
+            </m:rPr>
+            <m:t>∈</m:t>
+          </m:r>
+          <m:r>
+            <m:rPr>
+              <m:scr m:val="double-struck"/>
+              <m:sty m:val="p"/>
+            </m:rPr>
+            <m:t>R</m:t>
+          </m:r>
+          <m:r>
+            <m:rPr>
+              <m:sty m:val="p"/>
+            </m:rPr>
+            <m:t>.</m:t>
+          </m:r>
+        </m:oMath>
+      </m:oMathPara>
+    </w:p>
+    <w:bookmarkEnd w:id="66"/>
+    <w:bookmarkStart w:id="67" w:name="exm-log-odds-auto"/>
+    <w:p>
+      <w:pPr>
+        <w:pStyle w:val="FirstParagraph"/>
+      </w:pPr>
+      <w:r>
+        <w:rPr>
+          <w:b/>
+          <w:bCs/>
+        </w:rPr>
+        <w:t xml:space="preserve">Example 17 (Log-odds that a car in the Auto data is American)</w:t>
+      </w:r>
+      <w:r>
+        <w:t xml:space="preserve"> </w:t>
+      </w:r>
+      <w:r>
+        <w:t xml:space="preserve">For the</w:t>
+      </w:r>
+      <w:r>
+        <w:t xml:space="preserve"> </w:t>
+      </w:r>
+      <w:hyperlink w:anchor="def-event">
+        <w:r>
+          <w:rPr>
+            <w:rStyle w:val="Hyperlink"/>
+          </w:rPr>
+          <w:t xml:space="preserve">event</w:t>
+        </w:r>
+      </w:hyperlink>
+      <w:r>
+        <w:t xml:space="preserve"> </w:t>
+      </w:r>
+      <m:oMath>
+        <m:r>
+          <m:t>A</m:t>
+        </m:r>
+      </m:oMath>
+      <w:r>
+        <w:t xml:space="preserve"> </w:t>
+      </w:r>
+      <w:r>
+        <w:t xml:space="preserve">of</w:t>
+      </w:r>
+      <w:r>
+        <w:t xml:space="preserve"> </w:t>
+      </w:r>
+      <w:hyperlink w:anchor="exm-odds-auto">
+        <w:r>
+          <w:rPr>
+            <w:rStyle w:val="Hyperlink"/>
+          </w:rPr>
+          <w:t xml:space="preserve">Example 16</w:t>
+        </w:r>
+      </w:hyperlink>
+      <w:r>
+        <w:t xml:space="preserve">,</w:t>
+      </w:r>
+      <w:r>
+        <w:t xml:space="preserve"> </w:t>
+      </w:r>
+      <w:r>
+        <w:t xml:space="preserve">the</w:t>
+      </w:r>
+      <w:r>
+        <w:t xml:space="preserve"> </w:t>
+      </w:r>
+      <w:hyperlink w:anchor="def-log-odds">
+        <w:r>
+          <w:rPr>
+            <w:rStyle w:val="Hyperlink"/>
+          </w:rPr>
+          <w:t xml:space="preserve">log-odds</w:t>
+        </w:r>
+      </w:hyperlink>
+      <w:r>
+        <w:t xml:space="preserve"> </w:t>
+      </w:r>
+      <w:r>
+        <w:t xml:space="preserve">of</w:t>
+      </w:r>
+      <w:r>
+        <w:t xml:space="preserve"> </w:t>
+      </w:r>
+      <w:hyperlink w:anchor="def-log-odds">
+        <w:r>
+          <w:rPr>
+            <w:rStyle w:val="Hyperlink"/>
+          </w:rPr>
+          <w:t xml:space="preserve">Definition 14</w:t>
+        </w:r>
+      </w:hyperlink>
+      <w:r>
+        <w:t xml:space="preserve"> </w:t>
+      </w:r>
+      <w:r>
+        <w:t xml:space="preserve">are:</w:t>
+      </w:r>
+    </w:p>
+    <w:p>
+      <w:pPr>
+        <w:pStyle w:val="SourceCode"/>
+      </w:pPr>
+      <w:r>
+        <w:rPr>
+          <w:rStyle w:val="FunctionTok"/>
+        </w:rPr>
+        <w:t xml:space="preserve">log</w:t>
+      </w:r>
+      <w:r>
+        <w:rPr>
+          <w:rStyle w:val="NormalTok"/>
+        </w:rPr>
+        <w:t xml:space="preserve">(p_american </w:t>
+      </w:r>
+      <w:r>
+        <w:rPr>
+          <w:rStyle w:val="SpecialCharTok"/>
+        </w:rPr>
+        <w:t xml:space="preserve">/</w:t>
+      </w:r>
+      <w:r>
+        <w:rPr>
+          <w:rStyle w:val="NormalTok"/>
+        </w:rPr>
+        <w:t xml:space="preserve"> (</w:t>
+      </w:r>
+      <w:r>
+        <w:rPr>
+          <w:rStyle w:val="DecValTok"/>
+        </w:rPr>
+        <w:t xml:space="preserve">1</w:t>
+      </w:r>
+      <w:r>
+        <w:rPr>
+          <w:rStyle w:val="NormalTok"/>
+        </w:rPr>
+        <w:t xml:space="preserve"> </w:t>
+      </w:r>
+      <w:r>
+        <w:rPr>
+          <w:rStyle w:val="SpecialCharTok"/>
+        </w:rPr>
+        <w:t xml:space="preserve">-</w:t>
+      </w:r>
+      <w:r>
+        <w:rPr>
+          <w:rStyle w:val="NormalTok"/>
+        </w:rPr>
+        <w:t xml:space="preserve"> p_american))</w:t>
+      </w:r>
+      <w:r>
+        <w:br/>
+      </w:r>
+      <w:r>
+        <w:rPr>
+          <w:rStyle w:val="CommentTok"/>
+        </w:rPr>
+        <w:t xml:space="preserve">#&gt; [1] 0.5108256</w:t>
+      </w:r>
+    </w:p>
+    <w:p>
+      <w:pPr>
+        <w:pStyle w:val="FirstParagraph"/>
+      </w:pPr>
+      <w:r>
+        <w:t xml:space="preserve">The log-odds are positive because the</w:t>
+      </w:r>
+      <w:r>
+        <w:t xml:space="preserve"> </w:t>
+      </w:r>
+      <w:hyperlink w:anchor="def-odds">
+        <w:r>
+          <w:rPr>
+            <w:rStyle w:val="Hyperlink"/>
+          </w:rPr>
+          <w:t xml:space="preserve">odds</w:t>
+        </w:r>
+      </w:hyperlink>
+      <w:r>
+        <w:t xml:space="preserve"> </w:t>
+      </w:r>
+      <w:r>
+        <w:t xml:space="preserve">exceed 1:</w:t>
+      </w:r>
+      <w:r>
+        <w:t xml:space="preserve"> </w:t>
+      </w:r>
+      <w:r>
+        <w:t xml:space="preserve">an American car is more likely than not.</w:t>
+      </w:r>
+    </w:p>
+    <w:bookmarkEnd w:id="67"/>
+    <w:bookmarkEnd w:id="68"/>
+    <w:bookmarkStart w:id="91" w:name="conditional-probability"/>
+    <w:p>
+      <w:pPr>
+        <w:pStyle w:val="Heading2"/>
+      </w:pPr>
+      <w:r>
+        <w:t xml:space="preserve">3 Conditional probability</w:t>
+      </w:r>
+    </w:p>
+    <w:bookmarkStart w:id="69" w:name="def-conditional-prob"/>
+    <w:p>
+      <w:pPr>
+        <w:pStyle w:val="FirstParagraph"/>
+      </w:pPr>
+      <w:r>
+        <w:rPr>
+          <w:b/>
+          <w:bCs/>
+        </w:rPr>
+        <w:t xml:space="preserve">Definition 15 (Conditional probability)</w:t>
+      </w:r>
+      <w:r>
+        <w:t xml:space="preserve"> </w:t>
+      </w:r>
+      <w:r>
+        <w:t xml:space="preserve">For two events</w:t>
+      </w:r>
+      <w:r>
+        <w:t xml:space="preserve"> </w:t>
+      </w:r>
+      <m:oMath>
+        <m:r>
+          <m:t>A</m:t>
+        </m:r>
+      </m:oMath>
+      <w:r>
+        <w:t xml:space="preserve"> </w:t>
+      </w:r>
+      <w:r>
+        <w:t xml:space="preserve">and</w:t>
+      </w:r>
+      <w:r>
+        <w:t xml:space="preserve"> </w:t>
+      </w:r>
+      <m:oMath>
+        <m:r>
+          <m:t>B</m:t>
+        </m:r>
+      </m:oMath>
+      <w:r>
+        <w:t xml:space="preserve"> </w:t>
+      </w:r>
+      <w:r>
+        <w:t xml:space="preserve">with</w:t>
+      </w:r>
+      <w:r>
+        <w:t xml:space="preserve"> </w:t>
+      </w:r>
+      <m:oMath>
+        <m:r>
+          <m:rPr>
+            <m:sty m:val="p"/>
+          </m:rPr>
+          <m:t>Pr</m:t>
+        </m:r>
+        <m:r>
+          <m:rPr>
+            <m:sty m:val="p"/>
+          </m:rPr>
+          <m:t>(</m:t>
+        </m:r>
+        <m:r>
+          <m:t>B</m:t>
+        </m:r>
+        <m:r>
+          <m:rPr>
+            <m:sty m:val="p"/>
+          </m:rPr>
+          <m:t>)</m:t>
+        </m:r>
+        <m:r>
+          <m:rPr>
+            <m:sty m:val="p"/>
+          </m:rPr>
+          <m:t>&gt;</m:t>
+        </m:r>
+        <m:r>
+          <m:t>0</m:t>
+        </m:r>
+      </m:oMath>
+      <w:r>
+        <w:t xml:space="preserve">,</w:t>
+      </w:r>
+      <w:r>
+        <w:t xml:space="preserve"> </w:t>
+      </w:r>
+      <w:r>
+        <w:t xml:space="preserve">the</w:t>
+      </w:r>
+      <w:r>
+        <w:t xml:space="preserve"> </w:t>
+      </w:r>
+      <w:r>
+        <w:rPr>
+          <w:b/>
+          <w:bCs/>
+        </w:rPr>
+        <w:t xml:space="preserve">conditional probability</w:t>
+      </w:r>
+      <w:r>
+        <w:t xml:space="preserve"> </w:t>
+      </w:r>
+      <w:r>
+        <w:t xml:space="preserve">of</w:t>
+      </w:r>
+      <w:r>
+        <w:t xml:space="preserve"> </w:t>
+      </w:r>
+      <m:oMath>
+        <m:r>
+          <m:t>A</m:t>
+        </m:r>
+      </m:oMath>
+      <w:r>
+        <w:t xml:space="preserve"> </w:t>
+      </w:r>
+      <w:r>
+        <w:t xml:space="preserve">given</w:t>
+      </w:r>
+      <w:r>
+        <w:t xml:space="preserve"> </w:t>
+      </w:r>
+      <m:oMath>
+        <m:r>
+          <m:t>B</m:t>
+        </m:r>
+      </m:oMath>
+      <w:r>
+        <w:t xml:space="preserve"> </w:t>
+      </w:r>
+      <w:r>
+        <w:t xml:space="preserve">[9]</w:t>
+      </w:r>
+      <w:r>
+        <w:t xml:space="preserve">,</w:t>
+      </w:r>
+      <w:r>
+        <w:t xml:space="preserve"> </w:t>
+      </w:r>
+      <w:r>
+        <w:t xml:space="preserve">denoted</w:t>
+      </w:r>
+      <w:r>
+        <w:t xml:space="preserve"> </w:t>
+      </w:r>
+      <m:oMath>
+        <m:r>
+          <m:rPr>
+            <m:sty m:val="p"/>
+          </m:rPr>
+          <m:t>Pr</m:t>
+        </m:r>
+        <m:r>
+          <m:rPr>
+            <m:sty m:val="p"/>
+          </m:rPr>
+          <m:t>(</m:t>
+        </m:r>
+        <m:r>
+          <m:t>A</m:t>
+        </m:r>
+        <m:r>
+          <m:rPr>
+            <m:sty m:val="p"/>
+          </m:rPr>
+          <m:t>∣</m:t>
+        </m:r>
+        <m:r>
+          <m:t>B</m:t>
+        </m:r>
+        <m:r>
+          <m:rPr>
+            <m:sty m:val="p"/>
+          </m:rPr>
+          <m:t>)</m:t>
+        </m:r>
+      </m:oMath>
+      <w:r>
+        <w:t xml:space="preserve">, is:</w:t>
+      </w:r>
+    </w:p>
+    <w:p>
+      <w:pPr>
+        <w:pStyle w:val="BodyText"/>
+      </w:pPr>
+      <m:oMathPara>
+        <m:oMathParaPr>
+          <m:jc m:val="center"/>
+        </m:oMathParaPr>
+        <m:oMath>
+          <m:r>
+            <m:rPr>
+              <m:sty m:val="p"/>
+            </m:rPr>
+            <m:t>Pr</m:t>
+          </m:r>
+          <m:r>
+            <m:rPr>
+              <m:sty m:val="p"/>
+            </m:rPr>
+            <m:t>(</m:t>
+          </m:r>
+          <m:r>
+            <m:t>A</m:t>
+          </m:r>
+          <m:r>
+            <m:rPr>
+              <m:sty m:val="p"/>
+            </m:rPr>
+            <m:t>∣</m:t>
+          </m:r>
+          <m:r>
+            <m:t>B</m:t>
+          </m:r>
+          <m:r>
+            <m:rPr>
+              <m:sty m:val="p"/>
+            </m:rPr>
+            <m:t>)</m:t>
+          </m:r>
+          <m:limUpp>
+            <m:e>
+              <m:r>
+                <m:rPr>
+                  <m:sty m:val="p"/>
+                </m:rPr>
+                <m:t>=</m:t>
+              </m:r>
+            </m:e>
+            <m:lim>
+              <m:r>
+                <m:rPr>
+                  <m:nor/>
+                  <m:sty m:val="p"/>
+                </m:rPr>
+                <m:t>def</m:t>
+              </m:r>
+            </m:lim>
+          </m:limUpp>
+          <m:f>
+            <m:fPr>
+              <m:type m:val="bar"/>
+            </m:fPr>
+            <m:num>
+              <m:r>
+                <m:rPr>
+                  <m:sty m:val="p"/>
+                </m:rPr>
                 <m:t>Pr</m:t>
               </m:r>
               <m:r>
@@ -11607,7 +12850,7 @@
         </m:oMath>
       </m:oMathPara>
     </w:p>
-    <w:bookmarkEnd w:id="64"/>
+    <w:bookmarkEnd w:id="69"/>
     <w:p>
       <w:pPr>
         <w:pStyle w:val="FirstParagraph"/>
@@ -11733,13 +12976,13 @@
         <w:t xml:space="preserve"> </w:t>
       </w:r>
       <w:r>
-        <w:t xml:space="preserve">[8, Sec. 2.7.4]</w:t>
+        <w:t xml:space="preserve">[10, Sec. 2.7.4]</w:t>
       </w:r>
       <w:r>
         <w:t xml:space="preserve">.</w:t>
       </w:r>
     </w:p>
-    <w:bookmarkStart w:id="65" w:name="exm-conditional-prob"/>
+    <w:bookmarkStart w:id="70" w:name="exm-conditional-prob"/>
     <w:p>
       <w:pPr>
         <w:pStyle w:val="BodyText"/>
@@ -11749,7 +12992,7 @@
           <w:b/>
           <w:bCs/>
         </w:rPr>
-        <w:t xml:space="preserve">Example 16 (Rolling a six, given an even roll)</w:t>
+        <w:t xml:space="preserve">Example 18 (Rolling a six, given an even roll)</w:t>
       </w:r>
       <w:r>
         <w:t xml:space="preserve"> </w:t>
@@ -12143,8 +13386,8 @@
         </m:oMath>
       </m:oMathPara>
     </w:p>
-    <w:bookmarkEnd w:id="65"/>
-    <w:bookmarkStart w:id="66" w:name="thm-law-conditional-prob"/>
+    <w:bookmarkEnd w:id="70"/>
+    <w:bookmarkStart w:id="71" w:name="thm-law-conditional-prob"/>
     <w:p>
       <w:pPr>
         <w:pStyle w:val="FirstParagraph"/>
@@ -12334,7 +13577,7 @@
         </m:oMath>
       </m:oMathPara>
     </w:p>
-    <w:bookmarkEnd w:id="66"/>
+    <w:bookmarkEnd w:id="71"/>
     <w:p>
       <w:pPr>
         <w:pStyle w:val="FirstParagraph"/>
@@ -12360,7 +13603,7 @@
           <w:rPr>
             <w:rStyle w:val="Hyperlink"/>
           </w:rPr>
-          <w:t xml:space="preserve">Definition 13</w:t>
+          <w:t xml:space="preserve">Definition 15</w:t>
         </w:r>
       </w:hyperlink>
       <w:r>
@@ -12634,7 +13877,7 @@
         </m:oMath>
       </m:oMathPara>
     </w:p>
-    <w:bookmarkStart w:id="67" w:name="exm-law-conditional-prob"/>
+    <w:bookmarkStart w:id="72" w:name="exm-law-conditional-prob"/>
     <w:p>
       <w:pPr>
         <w:pStyle w:val="FirstParagraph"/>
@@ -12644,7 +13887,7 @@
           <w:b/>
           <w:bCs/>
         </w:rPr>
-        <w:t xml:space="preserve">Example 17 (Applying the law of conditional probability)</w:t>
+        <w:t xml:space="preserve">Example 19 (Applying the law of conditional probability)</w:t>
       </w:r>
       <w:r>
         <w:t xml:space="preserve"> </w:t>
@@ -12966,8 +14209,8 @@
         </m:oMath>
       </m:oMathPara>
     </w:p>
-    <w:bookmarkEnd w:id="67"/>
-    <w:bookmarkStart w:id="68" w:name="thm-total-prob"/>
+    <w:bookmarkEnd w:id="72"/>
+    <w:bookmarkStart w:id="73" w:name="thm-total-prob"/>
     <w:p>
       <w:pPr>
         <w:pStyle w:val="FirstParagraph"/>
@@ -13140,7 +14383,7 @@
         <w:t xml:space="preserve"> </w:t>
       </w:r>
       <w:r>
-        <w:t xml:space="preserve">[9]</w:t>
+        <w:t xml:space="preserve">[11]</w:t>
       </w:r>
       <w:r>
         <w:t xml:space="preserve">:</w:t>
@@ -13292,7 +14535,7 @@
         </m:oMath>
       </m:oMathPara>
     </w:p>
-    <w:bookmarkEnd w:id="68"/>
+    <w:bookmarkEnd w:id="73"/>
     <w:p>
       <w:pPr>
         <w:pStyle w:val="FirstParagraph"/>
@@ -13815,7 +15058,7 @@
         </m:oMath>
       </m:oMathPara>
     </w:p>
-    <w:bookmarkStart w:id="69" w:name="thm-bayes"/>
+    <w:bookmarkStart w:id="74" w:name="thm-bayes"/>
     <w:p>
       <w:pPr>
         <w:pStyle w:val="FirstParagraph"/>
@@ -13941,7 +15184,7 @@
         <w:t xml:space="preserve"> </w:t>
       </w:r>
       <w:r>
-        <w:t xml:space="preserve">[10]</w:t>
+        <w:t xml:space="preserve">[12]</w:t>
       </w:r>
       <w:r>
         <w:t xml:space="preserve">:</w:t>
@@ -14082,7 +15325,7 @@
         </m:oMath>
       </m:oMathPara>
     </w:p>
-    <w:bookmarkEnd w:id="69"/>
+    <w:bookmarkEnd w:id="74"/>
     <w:p>
       <w:pPr>
         <w:pStyle w:val="FirstParagraph"/>
@@ -14108,7 +15351,7 @@
           <w:rPr>
             <w:rStyle w:val="Hyperlink"/>
           </w:rPr>
-          <w:t xml:space="preserve">Definition 13</w:t>
+          <w:t xml:space="preserve">Definition 15</w:t>
         </w:r>
       </w:hyperlink>
       <w:r>
@@ -14529,7 +15772,7 @@
         </m:oMath>
       </m:oMathPara>
     </w:p>
-    <w:bookmarkStart w:id="70" w:name="exm-bayes"/>
+    <w:bookmarkStart w:id="75" w:name="exm-bayes"/>
     <w:p>
       <w:pPr>
         <w:pStyle w:val="FirstParagraph"/>
@@ -14539,7 +15782,7 @@
           <w:b/>
           <w:bCs/>
         </w:rPr>
-        <w:t xml:space="preserve">Example 18 (Positive predictive value of a medical test)</w:t>
+        <w:t xml:space="preserve">Example 20 (Positive predictive value of a medical test)</w:t>
       </w:r>
       <w:r>
         <w:t xml:space="preserve"> </w:t>
@@ -15571,8 +16814,8 @@
         <w:t xml:space="preserve">because the disease prevalence is relatively low (7%).</w:t>
       </w:r>
     </w:p>
-    <w:bookmarkEnd w:id="70"/>
-    <w:bookmarkStart w:id="71" w:name="exr-bayes"/>
+    <w:bookmarkEnd w:id="75"/>
+    <w:bookmarkStart w:id="76" w:name="exr-bayes"/>
     <w:p>
       <w:pPr>
         <w:pStyle w:val="BodyText"/>
@@ -15592,7 +16835,7 @@
           <w:rPr>
             <w:rStyle w:val="Hyperlink"/>
           </w:rPr>
-          <w:t xml:space="preserve">Definition 13</w:t>
+          <w:t xml:space="preserve">Definition 15</w:t>
         </w:r>
       </w:hyperlink>
       <w:r>
@@ -15910,8 +17153,8 @@
         <w:t xml:space="preserve">, and none of them jointly.</w:t>
       </w:r>
     </w:p>
-    <w:bookmarkEnd w:id="71"/>
-    <w:bookmarkStart w:id="73" w:name="sol-bayes"/>
+    <w:bookmarkEnd w:id="76"/>
+    <w:bookmarkStart w:id="78" w:name="sol-bayes"/>
     <w:p>
       <w:pPr>
         <w:pStyle w:val="BodyText"/>
@@ -15937,7 +17180,7 @@
           <w:rPr>
             <w:rStyle w:val="Hyperlink"/>
           </w:rPr>
-          <w:t xml:space="preserve">Definition 13</w:t>
+          <w:t xml:space="preserve">Definition 15</w:t>
         </w:r>
       </w:hyperlink>
       <w:r>
@@ -16225,7 +17468,7 @@
       <w:pPr>
         <w:pStyle w:val="BodyText"/>
       </w:pPr>
-      <w:bookmarkStart w:id="72" w:name="eq-bayes"/>
+      <w:bookmarkStart w:id="77" w:name="eq-bayes"/>
       <m:oMathPara>
         <m:oMathParaPr>
           <m:jc m:val="center"/>
@@ -16371,7 +17614,7 @@
           </m:r>
         </m:oMath>
       </m:oMathPara>
-      <w:bookmarkEnd w:id="72"/>
+      <w:bookmarkEnd w:id="77"/>
     </w:p>
     <w:p>
       <w:pPr>
@@ -16477,7 +17720,7 @@
         <w:t xml:space="preserve"> </w:t>
       </w:r>
       <w:r>
-        <w:t xml:space="preserve">[11]</w:t>
+        <w:t xml:space="preserve">[13]</w:t>
       </w:r>
       <w:r>
         <w:t xml:space="preserve">, each component carries standard Bayesian terminology:</w:t>
@@ -16952,8 +18195,8 @@
         <w:t xml:space="preserve">decreases it.</w:t>
       </w:r>
     </w:p>
-    <w:bookmarkEnd w:id="73"/>
-    <w:bookmarkStart w:id="74" w:name="exr-base-rate"/>
+    <w:bookmarkEnd w:id="78"/>
+    <w:bookmarkStart w:id="79" w:name="exr-base-rate"/>
     <w:p>
       <w:pPr>
         <w:pStyle w:val="BodyText"/>
@@ -17058,8 +18301,8 @@
         <w:t xml:space="preserve">.</w:t>
       </w:r>
     </w:p>
-    <w:bookmarkEnd w:id="74"/>
-    <w:bookmarkStart w:id="75" w:name="sol-base-rate"/>
+    <w:bookmarkEnd w:id="79"/>
+    <w:bookmarkStart w:id="80" w:name="sol-base-rate"/>
     <w:p>
       <w:pPr>
         <w:pStyle w:val="BodyText"/>
@@ -17892,7 +19135,7 @@
         <w:t xml:space="preserve"> </w:t>
       </w:r>
       <w:r>
-        <w:t xml:space="preserve">[12]</w:t>
+        <w:t xml:space="preserve">[14]</w:t>
       </w:r>
       <w:r>
         <w:t xml:space="preserve">.</w:t>
@@ -18030,7 +19273,7 @@
         <w:t xml:space="preserve">and it illustrates why raw accuracy can be misleading on rare events.</w:t>
       </w:r>
     </w:p>
-    <w:bookmarkEnd w:id="75"/>
+    <w:bookmarkEnd w:id="80"/>
     <w:tbl>
       <w:tblPr>
         <w:tblStyle w:val="Table"/>
@@ -18072,18 +19315,18 @@
                 <wp:inline>
                   <wp:extent cx="152400" cy="152400"/>
                   <wp:effectExtent b="0" l="0" r="0" t="0"/>
-                  <wp:docPr descr="" title="" id="77" name="Picture"/>
+                  <wp:docPr descr="" title="" id="82" name="Picture"/>
                   <a:graphic>
                     <a:graphicData uri="http://schemas.openxmlformats.org/drawingml/2006/picture">
                       <pic:pic>
                         <pic:nvPicPr>
-                          <pic:cNvPr descr="/opt/quarto/share/formats/docx/tip.png" id="78" name="Picture"/>
+                          <pic:cNvPr descr="/opt/quarto/share/formats/docx/tip.png" id="83" name="Picture"/>
                           <pic:cNvPicPr>
                             <a:picLocks noChangeArrowheads="1" noChangeAspect="1"/>
                           </pic:cNvPicPr>
                         </pic:nvPicPr>
                         <pic:blipFill>
-                          <a:blip r:embed="rId76"/>
+                          <a:blip r:embed="rId81"/>
                           <a:stretch>
                             <a:fillRect/>
                           </a:stretch>
@@ -18145,7 +19388,7 @@
             <w:r>
               <w:t xml:space="preserve"> </w:t>
             </w:r>
-            <w:hyperlink r:id="rId79">
+            <w:hyperlink r:id="rId84">
               <w:r>
                 <w:rPr>
                   <w:rStyle w:val="Hyperlink"/>
@@ -18175,7 +19418,7 @@
               <w:t xml:space="preserve"> </w:t>
             </w:r>
             <w:r>
-              <w:t xml:space="preserve">[13]</w:t>
+              <w:t xml:space="preserve">[15]</w:t>
             </w:r>
             <w:r>
               <w:t xml:space="preserve">.</w:t>
@@ -18189,7 +19432,7 @@
             <w:r>
               <w:t xml:space="preserve"> </w:t>
             </w:r>
-            <w:hyperlink r:id="rId80">
+            <w:hyperlink r:id="rId85">
               <w:r>
                 <w:rPr>
                   <w:rStyle w:val="Hyperlink"/>
@@ -18254,18 +19497,18 @@
                 <wp:inline>
                   <wp:extent cx="152400" cy="152400"/>
                   <wp:effectExtent b="0" l="0" r="0" t="0"/>
-                  <wp:docPr descr="" title="" id="81" name="Picture"/>
+                  <wp:docPr descr="" title="" id="86" name="Picture"/>
                   <a:graphic>
                     <a:graphicData uri="http://schemas.openxmlformats.org/drawingml/2006/picture">
                       <pic:pic>
                         <pic:nvPicPr>
-                          <pic:cNvPr descr="/opt/quarto/share/formats/docx/tip.png" id="82" name="Picture"/>
+                          <pic:cNvPr descr="/opt/quarto/share/formats/docx/tip.png" id="87" name="Picture"/>
                           <pic:cNvPicPr>
                             <a:picLocks noChangeArrowheads="1" noChangeAspect="1"/>
                           </pic:cNvPicPr>
                         </pic:nvPicPr>
                         <pic:blipFill>
-                          <a:blip r:embed="rId76"/>
+                          <a:blip r:embed="rId81"/>
                           <a:stretch>
                             <a:fillRect/>
                           </a:stretch>
@@ -18327,7 +19570,7 @@
             <w:r>
               <w:t xml:space="preserve"> </w:t>
             </w:r>
-            <w:hyperlink r:id="rId83">
+            <w:hyperlink r:id="rId88">
               <w:r>
                 <w:rPr>
                   <w:rStyle w:val="Hyperlink"/>
@@ -18369,7 +19612,7 @@
         <w:t xml:space="preserve"> </w:t>
       </w:r>
       <w:r>
-        <w:t xml:space="preserve">[14]</w:t>
+        <w:t xml:space="preserve">[16]</w:t>
       </w:r>
       <w:r>
         <w:t xml:space="preserve">:</w:t>
@@ -18377,7 +19620,7 @@
       <w:r>
         <w:t xml:space="preserve"> </w:t>
       </w:r>
-      <w:hyperlink r:id="rId84">
+      <w:hyperlink r:id="rId89">
         <w:r>
           <w:rPr>
             <w:rStyle w:val="Hyperlink"/>
@@ -18394,7 +19637,7 @@
       <w:r>
         <w:t xml:space="preserve"> </w:t>
       </w:r>
-      <w:hyperlink r:id="rId85">
+      <w:hyperlink r:id="rId90">
         <w:r>
           <w:rPr>
             <w:rStyle w:val="Hyperlink"/>
@@ -18406,8 +19649,8 @@
         <w:t xml:space="preserve">.</w:t>
       </w:r>
     </w:p>
-    <w:bookmarkEnd w:id="86"/>
-    <w:bookmarkStart w:id="115" w:name="references"/>
+    <w:bookmarkEnd w:id="91"/>
+    <w:bookmarkStart w:id="124" w:name="references"/>
     <w:p>
       <w:pPr>
         <w:pStyle w:val="Heading2"/>
@@ -18416,8 +19659,8 @@
         <w:t xml:space="preserve">References</w:t>
       </w:r>
     </w:p>
-    <w:bookmarkStart w:id="114" w:name="refs"/>
-    <w:bookmarkStart w:id="88" w:name="X0323630174b5cbd87b45a7fef24ef56ec3bdd6b"/>
+    <w:bookmarkStart w:id="123" w:name="refs"/>
+    <w:bookmarkStart w:id="93" w:name="X0323630174b5cbd87b45a7fef24ef56ec3bdd6b"/>
     <w:p>
       <w:pPr>
         <w:pStyle w:val="Bibliography"/>
@@ -18464,7 +19707,7 @@
       <w:r>
         <w:t xml:space="preserve"> </w:t>
       </w:r>
-      <w:hyperlink r:id="rId87">
+      <w:hyperlink r:id="rId92">
         <w:r>
           <w:rPr>
             <w:rStyle w:val="Hyperlink"/>
@@ -18473,8 +19716,8 @@
         </w:r>
       </w:hyperlink>
     </w:p>
-    <w:bookmarkEnd w:id="88"/>
-    <w:bookmarkStart w:id="90" w:name="ref-wikipedia_sample_space"/>
+    <w:bookmarkEnd w:id="93"/>
+    <w:bookmarkStart w:id="95" w:name="ref-wikipedia_sample_space"/>
     <w:p>
       <w:pPr>
         <w:pStyle w:val="Bibliography"/>
@@ -18521,7 +19764,7 @@
       <w:r>
         <w:t xml:space="preserve"> </w:t>
       </w:r>
-      <w:hyperlink r:id="rId89">
+      <w:hyperlink r:id="rId94">
         <w:r>
           <w:rPr>
             <w:rStyle w:val="Hyperlink"/>
@@ -18530,8 +19773,8 @@
         </w:r>
       </w:hyperlink>
     </w:p>
-    <w:bookmarkEnd w:id="90"/>
-    <w:bookmarkStart w:id="92" w:name="ref-wikipedia_event_probability_theory"/>
+    <w:bookmarkEnd w:id="95"/>
+    <w:bookmarkStart w:id="97" w:name="ref-wikipedia_event_probability_theory"/>
     <w:p>
       <w:pPr>
         <w:pStyle w:val="Bibliography"/>
@@ -18578,7 +19821,7 @@
       <w:r>
         <w:t xml:space="preserve"> </w:t>
       </w:r>
-      <w:hyperlink r:id="rId91">
+      <w:hyperlink r:id="rId96">
         <w:r>
           <w:rPr>
             <w:rStyle w:val="Hyperlink"/>
@@ -18587,8 +19830,8 @@
         </w:r>
       </w:hyperlink>
     </w:p>
-    <w:bookmarkEnd w:id="92"/>
-    <w:bookmarkStart w:id="94" w:name="ref-CaseBerg01"/>
+    <w:bookmarkEnd w:id="97"/>
+    <w:bookmarkStart w:id="99" w:name="ref-CaseBerg01"/>
     <w:p>
       <w:pPr>
         <w:pStyle w:val="Bibliography"/>
@@ -18621,7 +19864,7 @@
       <w:r>
         <w:t xml:space="preserve"> </w:t>
       </w:r>
-      <w:hyperlink r:id="rId93">
+      <w:hyperlink r:id="rId98">
         <w:r>
           <w:rPr>
             <w:rStyle w:val="Hyperlink"/>
@@ -18630,8 +19873,8 @@
         </w:r>
       </w:hyperlink>
     </w:p>
-    <w:bookmarkEnd w:id="94"/>
-    <w:bookmarkStart w:id="96" w:name="ref-wikipedia_probability_space"/>
+    <w:bookmarkEnd w:id="99"/>
+    <w:bookmarkStart w:id="101" w:name="ref-wikipedia_probability_space"/>
     <w:p>
       <w:pPr>
         <w:pStyle w:val="Bibliography"/>
@@ -18678,7 +19921,7 @@
       <w:r>
         <w:t xml:space="preserve"> </w:t>
       </w:r>
-      <w:hyperlink r:id="rId95">
+      <w:hyperlink r:id="rId100">
         <w:r>
           <w:rPr>
             <w:rStyle w:val="Hyperlink"/>
@@ -18687,8 +19930,8 @@
         </w:r>
       </w:hyperlink>
     </w:p>
-    <w:bookmarkEnd w:id="96"/>
-    <w:bookmarkStart w:id="98" w:name="ref-wikipedia_probability_axioms"/>
+    <w:bookmarkEnd w:id="101"/>
+    <w:bookmarkStart w:id="103" w:name="ref-wikipedia_probability_axioms"/>
     <w:p>
       <w:pPr>
         <w:pStyle w:val="Bibliography"/>
@@ -18735,7 +19978,7 @@
       <w:r>
         <w:t xml:space="preserve"> </w:t>
       </w:r>
-      <w:hyperlink r:id="rId97">
+      <w:hyperlink r:id="rId102">
         <w:r>
           <w:rPr>
             <w:rStyle w:val="Hyperlink"/>
@@ -18744,8 +19987,8 @@
         </w:r>
       </w:hyperlink>
     </w:p>
-    <w:bookmarkEnd w:id="98"/>
-    <w:bookmarkStart w:id="100" w:name="ref-wikipedia_conditional_probability"/>
+    <w:bookmarkEnd w:id="103"/>
+    <w:bookmarkStart w:id="105" w:name="ref-wikipedia_odds"/>
     <w:p>
       <w:pPr>
         <w:pStyle w:val="Bibliography"/>
@@ -18766,6 +20009,120 @@
         <w:t xml:space="preserve"> </w:t>
       </w:r>
       <w:r>
+        <w:t xml:space="preserve">“Odds —</w:t>
+      </w:r>
+      <w:r>
+        <w:t xml:space="preserve"> </w:t>
+      </w:r>
+      <w:r>
+        <w:t xml:space="preserve">Wikipedia</w:t>
+      </w:r>
+      <w:r>
+        <w:t xml:space="preserve">,</w:t>
+      </w:r>
+      <w:r>
+        <w:t xml:space="preserve"> </w:t>
+      </w:r>
+      <w:r>
+        <w:t xml:space="preserve">the free encyclopedia.”</w:t>
+      </w:r>
+      <w:r>
+        <w:t xml:space="preserve"> </w:t>
+      </w:r>
+      <w:r>
+        <w:t xml:space="preserve">2026. Available:</w:t>
+      </w:r>
+      <w:r>
+        <w:t xml:space="preserve"> </w:t>
+      </w:r>
+      <w:hyperlink r:id="rId104">
+        <w:r>
+          <w:rPr>
+            <w:rStyle w:val="Hyperlink"/>
+          </w:rPr>
+          <w:t xml:space="preserve">https://en.wikipedia.org/wiki/Odds</w:t>
+        </w:r>
+      </w:hyperlink>
+    </w:p>
+    <w:bookmarkEnd w:id="105"/>
+    <w:bookmarkStart w:id="107" w:name="ref-wikipedia_logit"/>
+    <w:p>
+      <w:pPr>
+        <w:pStyle w:val="Bibliography"/>
+      </w:pPr>
+      <w:r>
+        <w:t xml:space="preserve">[8]</w:t>
+      </w:r>
+      <w:r>
+        <w:t xml:space="preserve"> </w:t>
+      </w:r>
+      <w:r>
+        <w:t xml:space="preserve">	</w:t>
+      </w:r>
+      <w:r>
+        <w:t xml:space="preserve">Wikipedia contributors,</w:t>
+      </w:r>
+      <w:r>
+        <w:t xml:space="preserve"> </w:t>
+      </w:r>
+      <w:r>
+        <w:t xml:space="preserve">“Logit —</w:t>
+      </w:r>
+      <w:r>
+        <w:t xml:space="preserve"> </w:t>
+      </w:r>
+      <w:r>
+        <w:t xml:space="preserve">Wikipedia</w:t>
+      </w:r>
+      <w:r>
+        <w:t xml:space="preserve">,</w:t>
+      </w:r>
+      <w:r>
+        <w:t xml:space="preserve"> </w:t>
+      </w:r>
+      <w:r>
+        <w:t xml:space="preserve">the free encyclopedia.”</w:t>
+      </w:r>
+      <w:r>
+        <w:t xml:space="preserve"> </w:t>
+      </w:r>
+      <w:r>
+        <w:t xml:space="preserve">2026. Available:</w:t>
+      </w:r>
+      <w:r>
+        <w:t xml:space="preserve"> </w:t>
+      </w:r>
+      <w:hyperlink r:id="rId106">
+        <w:r>
+          <w:rPr>
+            <w:rStyle w:val="Hyperlink"/>
+          </w:rPr>
+          <w:t xml:space="preserve">https://en.wikipedia.org/wiki/Logit</w:t>
+        </w:r>
+      </w:hyperlink>
+    </w:p>
+    <w:bookmarkEnd w:id="107"/>
+    <w:bookmarkStart w:id="109" w:name="ref-wikipedia_conditional_probability"/>
+    <w:p>
+      <w:pPr>
+        <w:pStyle w:val="Bibliography"/>
+      </w:pPr>
+      <w:r>
+        <w:t xml:space="preserve">[9]</w:t>
+      </w:r>
+      <w:r>
+        <w:t xml:space="preserve"> </w:t>
+      </w:r>
+      <w:r>
+        <w:t xml:space="preserve">	</w:t>
+      </w:r>
+      <w:r>
+        <w:t xml:space="preserve">Wikipedia contributors,</w:t>
+      </w:r>
+      <w:r>
+        <w:t xml:space="preserve"> </w:t>
+      </w:r>
+      <w:r>
         <w:t xml:space="preserve">“Conditional probability —</w:t>
       </w:r>
       <w:r>
@@ -18792,7 +20149,7 @@
       <w:r>
         <w:t xml:space="preserve"> </w:t>
       </w:r>
-      <w:hyperlink r:id="rId99">
+      <w:hyperlink r:id="rId108">
         <w:r>
           <w:rPr>
             <w:rStyle w:val="Hyperlink"/>
@@ -18801,14 +20158,14 @@
         </w:r>
       </w:hyperlink>
     </w:p>
-    <w:bookmarkEnd w:id="100"/>
-    <w:bookmarkStart w:id="102" w:name="ref-ross-probsim"/>
+    <w:bookmarkEnd w:id="109"/>
+    <w:bookmarkStart w:id="111" w:name="ref-ross-probsim"/>
     <w:p>
       <w:pPr>
         <w:pStyle w:val="Bibliography"/>
       </w:pPr>
       <w:r>
-        <w:t xml:space="preserve">[8]</w:t>
+        <w:t xml:space="preserve">[10]</w:t>
       </w:r>
       <w:r>
         <w:t xml:space="preserve"> </w:t>
@@ -18834,7 +20191,7 @@
       <w:r>
         <w:t xml:space="preserve"> </w:t>
       </w:r>
-      <w:hyperlink r:id="rId101">
+      <w:hyperlink r:id="rId110">
         <w:r>
           <w:rPr>
             <w:rStyle w:val="Hyperlink"/>
@@ -18843,14 +20200,14 @@
         </w:r>
       </w:hyperlink>
     </w:p>
-    <w:bookmarkEnd w:id="102"/>
-    <w:bookmarkStart w:id="104" w:name="ref-wikipedia_law_of_total_probability"/>
+    <w:bookmarkEnd w:id="111"/>
+    <w:bookmarkStart w:id="113" w:name="ref-wikipedia_law_of_total_probability"/>
     <w:p>
       <w:pPr>
         <w:pStyle w:val="Bibliography"/>
       </w:pPr>
       <w:r>
-        <w:t xml:space="preserve">[9]</w:t>
+        <w:t xml:space="preserve">[11]</w:t>
       </w:r>
       <w:r>
         <w:t xml:space="preserve"> </w:t>
@@ -18891,7 +20248,7 @@
       <w:r>
         <w:t xml:space="preserve"> </w:t>
       </w:r>
-      <w:hyperlink r:id="rId103">
+      <w:hyperlink r:id="rId112">
         <w:r>
           <w:rPr>
             <w:rStyle w:val="Hyperlink"/>
@@ -18900,14 +20257,14 @@
         </w:r>
       </w:hyperlink>
     </w:p>
-    <w:bookmarkEnd w:id="104"/>
-    <w:bookmarkStart w:id="106" w:name="ref-wikipedia_bayes_theorem"/>
+    <w:bookmarkEnd w:id="113"/>
+    <w:bookmarkStart w:id="115" w:name="ref-wikipedia_bayes_theorem"/>
     <w:p>
       <w:pPr>
         <w:pStyle w:val="Bibliography"/>
       </w:pPr>
       <w:r>
-        <w:t xml:space="preserve">[10]</w:t>
+        <w:t xml:space="preserve">[12]</w:t>
       </w:r>
       <w:r>
         <w:t xml:space="preserve"> </w:t>
@@ -18948,7 +20305,7 @@
       <w:r>
         <w:t xml:space="preserve"> </w:t>
       </w:r>
-      <w:hyperlink r:id="rId105">
+      <w:hyperlink r:id="rId114">
         <w:r>
           <w:rPr>
             <w:rStyle w:val="Hyperlink"/>
@@ -18957,14 +20314,14 @@
         </w:r>
       </w:hyperlink>
     </w:p>
-    <w:bookmarkEnd w:id="106"/>
-    <w:bookmarkStart w:id="107" w:name="ref-hutchinson2024data471"/>
+    <w:bookmarkEnd w:id="115"/>
+    <w:bookmarkStart w:id="116" w:name="ref-hutchinson2024data471"/>
     <w:p>
       <w:pPr>
         <w:pStyle w:val="Bibliography"/>
       </w:pPr>
       <w:r>
-        <w:t xml:space="preserve">[11]</w:t>
+        <w:t xml:space="preserve">[13]</w:t>
       </w:r>
       <w:r>
         <w:t xml:space="preserve"> </w:t>
@@ -18997,14 +20354,14 @@
         <w:t xml:space="preserve">Western Washington University, 2024.</w:t>
       </w:r>
     </w:p>
-    <w:bookmarkEnd w:id="107"/>
-    <w:bookmarkStart w:id="109" w:name="ref-wikipedia_base_rate_fallacy"/>
+    <w:bookmarkEnd w:id="116"/>
+    <w:bookmarkStart w:id="118" w:name="ref-wikipedia_base_rate_fallacy"/>
     <w:p>
       <w:pPr>
         <w:pStyle w:val="Bibliography"/>
       </w:pPr>
       <w:r>
-        <w:t xml:space="preserve">[12]</w:t>
+        <w:t xml:space="preserve">[14]</w:t>
       </w:r>
       <w:r>
         <w:t xml:space="preserve"> </w:t>
@@ -19045,7 +20402,7 @@
       <w:r>
         <w:t xml:space="preserve"> </w:t>
       </w:r>
-      <w:hyperlink r:id="rId108">
+      <w:hyperlink r:id="rId117">
         <w:r>
           <w:rPr>
             <w:rStyle w:val="Hyperlink"/>
@@ -19054,14 +20411,14 @@
         </w:r>
       </w:hyperlink>
     </w:p>
-    <w:bookmarkEnd w:id="109"/>
-    <w:bookmarkStart w:id="111" w:name="ref-hutchinson_wwu_ml_videos"/>
+    <w:bookmarkEnd w:id="118"/>
+    <w:bookmarkStart w:id="120" w:name="ref-hutchinson_wwu_ml_videos"/>
     <w:p>
       <w:pPr>
         <w:pStyle w:val="Bibliography"/>
       </w:pPr>
       <w:r>
-        <w:t xml:space="preserve">[13]</w:t>
+        <w:t xml:space="preserve">[15]</w:t>
       </w:r>
       <w:r>
         <w:t xml:space="preserve"> </w:t>
@@ -19108,7 +20465,7 @@
       <w:r>
         <w:t xml:space="preserve"> </w:t>
       </w:r>
-      <w:hyperlink r:id="rId110">
+      <w:hyperlink r:id="rId119">
         <w:r>
           <w:rPr>
             <w:rStyle w:val="Hyperlink"/>
@@ -19117,14 +20474,14 @@
         </w:r>
       </w:hyperlink>
     </w:p>
-    <w:bookmarkEnd w:id="111"/>
-    <w:bookmarkStart w:id="113" w:name="ref-fiveminuteai_probstat"/>
+    <w:bookmarkEnd w:id="120"/>
+    <w:bookmarkStart w:id="122" w:name="ref-fiveminuteai_probstat"/>
     <w:p>
       <w:pPr>
         <w:pStyle w:val="Bibliography"/>
       </w:pPr>
       <w:r>
-        <w:t xml:space="preserve">[14]</w:t>
+        <w:t xml:space="preserve">[16]</w:t>
       </w:r>
       <w:r>
         <w:t xml:space="preserve"> </w:t>
@@ -19150,7 +20507,7 @@
       <w:r>
         <w:t xml:space="preserve"> </w:t>
       </w:r>
-      <w:hyperlink r:id="rId112">
+      <w:hyperlink r:id="rId121">
         <w:r>
           <w:rPr>
             <w:rStyle w:val="Hyperlink"/>
@@ -19159,9 +20516,9 @@
         </w:r>
       </w:hyperlink>
     </w:p>
-    <w:bookmarkEnd w:id="113"/>
-    <w:bookmarkEnd w:id="114"/>
-    <w:bookmarkEnd w:id="115"/>
+    <w:bookmarkEnd w:id="122"/>
+    <w:bookmarkEnd w:id="123"/>
+    <w:bookmarkEnd w:id="124"/>
     <w:sectPr>
       <w:footnotePr>
         <w:numRestart w:val="eachSect"/>

</xml_diff>

<commit_message>
Deploying to gh-pages from @ Morrison-Lab/pds@54ff6567d8f80f4fff1af503be8951ac4d734870 🚀
</commit_message>
<xml_diff>
--- a/probability-basics.docx
+++ b/probability-basics.docx
@@ -15,7 +15,7 @@
         <w:pStyle w:val="Date"/>
       </w:pPr>
       <w:r>
-        <w:t xml:space="preserve">Last modified: 2026-10-19 04:07:38 (PDT)</w:t>
+        <w:t xml:space="preserve">Last modified: 2026-10-19 04:35:15 (PDT)</w:t>
       </w:r>
     </w:p>
     <w:bookmarkStart w:id="63" w:name="defining-probabilities"/>
@@ -3533,7 +3533,7 @@
           <w:b/>
           <w:bCs/>
         </w:rPr>
-        <w:t xml:space="preserve">Definition 11 (Probability measure)</w:t>
+        <w:t xml:space="preserve">Definition 11 (Probability measure (probability function))</w:t>
       </w:r>
       <w:r>
         <w:t xml:space="preserve"> </w:t>
@@ -3550,6 +3550,31 @@
           <w:bCs/>
         </w:rPr>
         <w:t xml:space="preserve">probability measure</w:t>
+      </w:r>
+      <w:r>
+        <w:t xml:space="preserve"> </w:t>
+      </w:r>
+      <w:r>
+        <w:t xml:space="preserve">(also called a</w:t>
+      </w:r>
+      <w:r>
+        <w:t xml:space="preserve"> </w:t>
+      </w:r>
+      <w:r>
+        <w:rPr>
+          <w:b/>
+          <w:bCs/>
+        </w:rPr>
+        <w:t xml:space="preserve">probability function</w:t>
+      </w:r>
+      <w:r>
+        <w:t xml:space="preserve"> </w:t>
+      </w:r>
+      <w:r>
+        <w:t xml:space="preserve">[4], Definition 1.2.4</w:t>
+      </w:r>
+      <w:r>
+        <w:t xml:space="preserve">)</w:t>
       </w:r>
       <w:r>
         <w:t xml:space="preserve"> </w:t>
@@ -3756,53 +3781,10 @@
       </m:oMathPara>
     </w:p>
     <w:bookmarkEnd w:id="41"/>
+    <w:bookmarkStart w:id="43" w:name="exm-probability"/>
     <w:p>
       <w:pPr>
         <w:pStyle w:val="FirstParagraph"/>
-      </w:pPr>
-      <w:r>
-        <w:rPr>
-          <w:i/>
-          <w:iCs/>
-        </w:rPr>
-        <w:t xml:space="preserve">Remark</w:t>
-      </w:r>
-      <w:r>
-        <w:t xml:space="preserve">. </w:t>
-      </w:r>
-      <w:r>
-        <w:t xml:space="preserve">Other sources call a probability measure a</w:t>
-      </w:r>
-      <w:r>
-        <w:t xml:space="preserve"> </w:t>
-      </w:r>
-      <w:r>
-        <w:rPr>
-          <w:b/>
-          <w:bCs/>
-        </w:rPr>
-        <w:t xml:space="preserve">probability function</w:t>
-      </w:r>
-      <w:r>
-        <w:t xml:space="preserve"> </w:t>
-      </w:r>
-      <w:r>
-        <w:t xml:space="preserve">[4], Def. 1.2.4</w:t>
-      </w:r>
-      <w:r>
-        <w:t xml:space="preserve">.</w:t>
-      </w:r>
-      <w:r>
-        <w:t xml:space="preserve"> </w:t>
-      </w:r>
-      <w:r>
-        <w:t xml:space="preserve">The two names mean the same thing.</w:t>
-      </w:r>
-    </w:p>
-    <w:bookmarkStart w:id="43" w:name="exm-probability"/>
-    <w:p>
-      <w:pPr>
-        <w:pStyle w:val="BodyText"/>
       </w:pPr>
       <w:r>
         <w:rPr>

</xml_diff>

<commit_message>
Deploying to gh-pages from @ Morrison-Lab/pds@f24a97dce671b43417547311ea88e2928483927d 🚀
</commit_message>
<xml_diff>
--- a/probability-basics.docx
+++ b/probability-basics.docx
@@ -15,7 +15,7 @@
         <w:pStyle w:val="Date"/>
       </w:pPr>
       <w:r>
-        <w:t xml:space="preserve">Last modified: 2026-10-24 20:18:53 (PDT)</w:t>
+        <w:t xml:space="preserve">Last modified: 2026-10-26 09:08:35 (PDT)</w:t>
       </w:r>
     </w:p>
     <w:bookmarkStart w:id="63" w:name="defining-probabilities"/>
@@ -12527,7 +12527,7 @@
     </w:p>
     <w:bookmarkEnd w:id="67"/>
     <w:bookmarkEnd w:id="68"/>
-    <w:bookmarkStart w:id="91" w:name="conditional-probability"/>
+    <w:bookmarkStart w:id="94" w:name="conditional-probability"/>
     <w:p>
       <w:pPr>
         <w:pStyle w:val="Heading2"/>
@@ -19632,8 +19632,193 @@
         <w:t xml:space="preserve">.</w:t>
       </w:r>
     </w:p>
-    <w:bookmarkEnd w:id="91"/>
-    <w:bookmarkStart w:id="124" w:name="references"/>
+    <w:tbl>
+      <w:tblPr>
+        <w:tblStyle w:val="Table"/>
+        <w:tblLook w:firstRow="0" w:lastRow="0" w:firstColumn="0" w:lastColumn="0" w:noHBand="0" w:noVBand="0" w:val="0000"/>
+        <w:tblBorders>
+          <w:top w:val="single" w:sz="4" w:space="0" w:color="00A047"/>
+          <w:left w:val="single" w:sz="24" w:space="0" w:color="00A047"/>
+          <w:bottom w:val="single" w:sz="4" w:space="0" w:color="00A047"/>
+          <w:right w:val="single" w:sz="4" w:space="0" w:color="00A047"/>
+        </w:tblBorders>
+        <w:tblCellMar>
+          <w:left w:w="144" w:type="dxa"/>
+          <w:right w:w="144" w:type="dxa"/>
+        </w:tblCellMar>
+        <w:tblLook w:firstRow="0" w:lastRow="0" w:firstColumn="0" w:lastColumn="0" w:noHBand="0" w:noVBand="0" w:val="0000"/>
+      </w:tblPr>
+      <w:tr>
+        <w:trPr>
+          <w:cantSplit/>
+        </w:trPr>
+        <w:tc>
+          <w:tcPr>
+            <w:shd w:color="auto" w:fill="ccf1e3" w:val="clear"/>
+            <w:tcMar>
+              <w:top w:w="92" w:type="dxa"/>
+              <w:bottom w:w="92" w:type="dxa"/>
+            </w:tcMar>
+          </w:tcPr>
+          <w:p>
+            <w:pPr>
+              <w:pStyle w:val="BodyText"/>
+            </w:pPr>
+            <w:pPr>
+              <w:spacing w:before="0" w:after="0"/>
+              <w:textAlignment w:val="center"/>
+            </w:pPr>
+            <w:r>
+              <w:drawing>
+                <wp:inline>
+                  <wp:extent cx="152400" cy="152400"/>
+                  <wp:effectExtent b="0" l="0" r="0" t="0"/>
+                  <wp:docPr descr="" title="" id="91" name="Picture"/>
+                  <a:graphic>
+                    <a:graphicData uri="http://schemas.openxmlformats.org/drawingml/2006/picture">
+                      <pic:pic>
+                        <pic:nvPicPr>
+                          <pic:cNvPr descr="/opt/quarto/share/formats/docx/tip.png" id="92" name="Picture"/>
+                          <pic:cNvPicPr>
+                            <a:picLocks noChangeArrowheads="1" noChangeAspect="1"/>
+                          </pic:cNvPicPr>
+                        </pic:nvPicPr>
+                        <pic:blipFill>
+                          <a:blip r:embed="rId81"/>
+                          <a:stretch>
+                            <a:fillRect/>
+                          </a:stretch>
+                        </pic:blipFill>
+                        <pic:spPr bwMode="auto">
+                          <a:xfrm>
+                            <a:off x="0" y="0"/>
+                            <a:ext cx="152400" cy="152400"/>
+                          </a:xfrm>
+                          <a:prstGeom prst="rect">
+                            <a:avLst/>
+                          </a:prstGeom>
+                          <a:noFill/>
+                          <a:ln w="9525">
+                            <a:noFill/>
+                            <a:headEnd/>
+                            <a:tailEnd/>
+                          </a:ln>
+                        </pic:spPr>
+                      </pic:pic>
+                    </a:graphicData>
+                  </a:graphic>
+                </wp:inline>
+              </w:drawing>
+            </w:r>
+            <w:r>
+              <w:t xml:space="preserve"> </w:t>
+            </w:r>
+            <w:r>
+              <w:t xml:space="preserve"> </w:t>
+            </w:r>
+            <w:r>
+              <w:t xml:space="preserve">Another explanation</w:t>
+            </w:r>
+          </w:p>
+        </w:tc>
+      </w:tr>
+      <w:tr>
+        <w:trPr>
+          <w:cantSplit/>
+        </w:trPr>
+        <w:tc>
+          <w:tcPr>
+            <w:tcMar>
+              <w:top w:w="108" w:type="dxa"/>
+              <w:bottom w:w="108" w:type="dxa"/>
+            </w:tcMar>
+          </w:tcPr>
+          <w:p>
+            <w:pPr>
+              <w:pStyle w:val="BodyText"/>
+            </w:pPr>
+            <w:pPr>
+              <w:spacing w:before="16" w:after="16"/>
+            </w:pPr>
+            <w:r>
+              <w:t xml:space="preserve">Lange’s textbook</w:t>
+            </w:r>
+            <w:r>
+              <w:t xml:space="preserve"> </w:t>
+            </w:r>
+            <w:r>
+              <w:t xml:space="preserve">[17]</w:t>
+            </w:r>
+            <w:r>
+              <w:t xml:space="preserve"> </w:t>
+            </w:r>
+            <w:r>
+              <w:t xml:space="preserve">reviews</w:t>
+            </w:r>
+            <w:r>
+              <w:t xml:space="preserve"> </w:t>
+            </w:r>
+            <w:hyperlink w:anchor="def-probability">
+              <w:r>
+                <w:rPr>
+                  <w:rStyle w:val="Hyperlink"/>
+                </w:rPr>
+                <w:t xml:space="preserve">probability</w:t>
+              </w:r>
+            </w:hyperlink>
+            <w:r>
+              <w:t xml:space="preserve"> </w:t>
+            </w:r>
+            <w:r>
+              <w:t xml:space="preserve">and</w:t>
+            </w:r>
+            <w:r>
+              <w:t xml:space="preserve"> </w:t>
+            </w:r>
+            <w:hyperlink r:id="rId93">
+              <w:r>
+                <w:rPr>
+                  <w:rStyle w:val="Hyperlink"/>
+                </w:rPr>
+                <w:t xml:space="preserve">expectation</w:t>
+              </w:r>
+            </w:hyperlink>
+            <w:r>
+              <w:t xml:space="preserve"> </w:t>
+            </w:r>
+            <w:r>
+              <w:t xml:space="preserve">in Section 1.2</w:t>
+            </w:r>
+            <w:r>
+              <w:t xml:space="preserve"> </w:t>
+            </w:r>
+            <w:r>
+              <w:t xml:space="preserve">and</w:t>
+            </w:r>
+            <w:r>
+              <w:t xml:space="preserve"> </w:t>
+            </w:r>
+            <w:hyperlink w:anchor="def-conditional-prob">
+              <w:r>
+                <w:rPr>
+                  <w:rStyle w:val="Hyperlink"/>
+                </w:rPr>
+                <w:t xml:space="preserve">conditional probability</w:t>
+              </w:r>
+            </w:hyperlink>
+            <w:r>
+              <w:t xml:space="preserve"> </w:t>
+            </w:r>
+            <w:r>
+              <w:t xml:space="preserve">in Section 1.3.</w:t>
+            </w:r>
+          </w:p>
+          <w:p/>
+        </w:tc>
+      </w:tr>
+    </w:tbl>
+    <w:bookmarkEnd w:id="94"/>
+    <w:bookmarkStart w:id="129" w:name="references"/>
     <w:p>
       <w:pPr>
         <w:pStyle w:val="Heading2"/>
@@ -19642,8 +19827,8 @@
         <w:t xml:space="preserve">References</w:t>
       </w:r>
     </w:p>
-    <w:bookmarkStart w:id="123" w:name="refs"/>
-    <w:bookmarkStart w:id="93" w:name="X0323630174b5cbd87b45a7fef24ef56ec3bdd6b"/>
+    <w:bookmarkStart w:id="128" w:name="refs"/>
+    <w:bookmarkStart w:id="96" w:name="X0323630174b5cbd87b45a7fef24ef56ec3bdd6b"/>
     <w:p>
       <w:pPr>
         <w:pStyle w:val="Bibliography"/>
@@ -19690,7 +19875,7 @@
       <w:r>
         <w:t xml:space="preserve"> </w:t>
       </w:r>
-      <w:hyperlink r:id="rId92">
+      <w:hyperlink r:id="rId95">
         <w:r>
           <w:rPr>
             <w:rStyle w:val="Hyperlink"/>
@@ -19699,8 +19884,8 @@
         </w:r>
       </w:hyperlink>
     </w:p>
-    <w:bookmarkEnd w:id="93"/>
-    <w:bookmarkStart w:id="95" w:name="ref-wikipedia_sample_space"/>
+    <w:bookmarkEnd w:id="96"/>
+    <w:bookmarkStart w:id="98" w:name="ref-wikipedia_sample_space"/>
     <w:p>
       <w:pPr>
         <w:pStyle w:val="Bibliography"/>
@@ -19747,7 +19932,7 @@
       <w:r>
         <w:t xml:space="preserve"> </w:t>
       </w:r>
-      <w:hyperlink r:id="rId94">
+      <w:hyperlink r:id="rId97">
         <w:r>
           <w:rPr>
             <w:rStyle w:val="Hyperlink"/>
@@ -19756,8 +19941,8 @@
         </w:r>
       </w:hyperlink>
     </w:p>
-    <w:bookmarkEnd w:id="95"/>
-    <w:bookmarkStart w:id="97" w:name="ref-wikipedia_event_probability_theory"/>
+    <w:bookmarkEnd w:id="98"/>
+    <w:bookmarkStart w:id="100" w:name="ref-wikipedia_event_probability_theory"/>
     <w:p>
       <w:pPr>
         <w:pStyle w:val="Bibliography"/>
@@ -19804,7 +19989,7 @@
       <w:r>
         <w:t xml:space="preserve"> </w:t>
       </w:r>
-      <w:hyperlink r:id="rId96">
+      <w:hyperlink r:id="rId99">
         <w:r>
           <w:rPr>
             <w:rStyle w:val="Hyperlink"/>
@@ -19813,8 +19998,8 @@
         </w:r>
       </w:hyperlink>
     </w:p>
-    <w:bookmarkEnd w:id="97"/>
-    <w:bookmarkStart w:id="99" w:name="ref-CaseBerg01"/>
+    <w:bookmarkEnd w:id="100"/>
+    <w:bookmarkStart w:id="102" w:name="ref-CaseBerg01"/>
     <w:p>
       <w:pPr>
         <w:pStyle w:val="Bibliography"/>
@@ -19847,7 +20032,7 @@
       <w:r>
         <w:t xml:space="preserve"> </w:t>
       </w:r>
-      <w:hyperlink r:id="rId98">
+      <w:hyperlink r:id="rId101">
         <w:r>
           <w:rPr>
             <w:rStyle w:val="Hyperlink"/>
@@ -19856,8 +20041,8 @@
         </w:r>
       </w:hyperlink>
     </w:p>
-    <w:bookmarkEnd w:id="99"/>
-    <w:bookmarkStart w:id="101" w:name="ref-wikipedia_probability_space"/>
+    <w:bookmarkEnd w:id="102"/>
+    <w:bookmarkStart w:id="104" w:name="ref-wikipedia_probability_space"/>
     <w:p>
       <w:pPr>
         <w:pStyle w:val="Bibliography"/>
@@ -19904,7 +20089,7 @@
       <w:r>
         <w:t xml:space="preserve"> </w:t>
       </w:r>
-      <w:hyperlink r:id="rId100">
+      <w:hyperlink r:id="rId103">
         <w:r>
           <w:rPr>
             <w:rStyle w:val="Hyperlink"/>
@@ -19913,8 +20098,8 @@
         </w:r>
       </w:hyperlink>
     </w:p>
-    <w:bookmarkEnd w:id="101"/>
-    <w:bookmarkStart w:id="103" w:name="ref-wikipedia_probability_axioms"/>
+    <w:bookmarkEnd w:id="104"/>
+    <w:bookmarkStart w:id="106" w:name="ref-wikipedia_probability_axioms"/>
     <w:p>
       <w:pPr>
         <w:pStyle w:val="Bibliography"/>
@@ -19961,7 +20146,7 @@
       <w:r>
         <w:t xml:space="preserve"> </w:t>
       </w:r>
-      <w:hyperlink r:id="rId102">
+      <w:hyperlink r:id="rId105">
         <w:r>
           <w:rPr>
             <w:rStyle w:val="Hyperlink"/>
@@ -19970,8 +20155,8 @@
         </w:r>
       </w:hyperlink>
     </w:p>
-    <w:bookmarkEnd w:id="103"/>
-    <w:bookmarkStart w:id="105" w:name="ref-wikipedia_odds"/>
+    <w:bookmarkEnd w:id="106"/>
+    <w:bookmarkStart w:id="108" w:name="ref-wikipedia_odds"/>
     <w:p>
       <w:pPr>
         <w:pStyle w:val="Bibliography"/>
@@ -20018,7 +20203,7 @@
       <w:r>
         <w:t xml:space="preserve"> </w:t>
       </w:r>
-      <w:hyperlink r:id="rId104">
+      <w:hyperlink r:id="rId107">
         <w:r>
           <w:rPr>
             <w:rStyle w:val="Hyperlink"/>
@@ -20027,8 +20212,8 @@
         </w:r>
       </w:hyperlink>
     </w:p>
-    <w:bookmarkEnd w:id="105"/>
-    <w:bookmarkStart w:id="107" w:name="ref-wikipedia_logit"/>
+    <w:bookmarkEnd w:id="108"/>
+    <w:bookmarkStart w:id="110" w:name="ref-wikipedia_logit"/>
     <w:p>
       <w:pPr>
         <w:pStyle w:val="Bibliography"/>
@@ -20075,7 +20260,7 @@
       <w:r>
         <w:t xml:space="preserve"> </w:t>
       </w:r>
-      <w:hyperlink r:id="rId106">
+      <w:hyperlink r:id="rId109">
         <w:r>
           <w:rPr>
             <w:rStyle w:val="Hyperlink"/>
@@ -20084,8 +20269,8 @@
         </w:r>
       </w:hyperlink>
     </w:p>
-    <w:bookmarkEnd w:id="107"/>
-    <w:bookmarkStart w:id="109" w:name="ref-wikipedia_conditional_probability"/>
+    <w:bookmarkEnd w:id="110"/>
+    <w:bookmarkStart w:id="112" w:name="ref-wikipedia_conditional_probability"/>
     <w:p>
       <w:pPr>
         <w:pStyle w:val="Bibliography"/>
@@ -20132,7 +20317,7 @@
       <w:r>
         <w:t xml:space="preserve"> </w:t>
       </w:r>
-      <w:hyperlink r:id="rId108">
+      <w:hyperlink r:id="rId111">
         <w:r>
           <w:rPr>
             <w:rStyle w:val="Hyperlink"/>
@@ -20141,8 +20326,8 @@
         </w:r>
       </w:hyperlink>
     </w:p>
-    <w:bookmarkEnd w:id="109"/>
-    <w:bookmarkStart w:id="111" w:name="ref-ross-probsim"/>
+    <w:bookmarkEnd w:id="112"/>
+    <w:bookmarkStart w:id="114" w:name="ref-ross-probsim"/>
     <w:p>
       <w:pPr>
         <w:pStyle w:val="Bibliography"/>
@@ -20174,7 +20359,7 @@
       <w:r>
         <w:t xml:space="preserve"> </w:t>
       </w:r>
-      <w:hyperlink r:id="rId110">
+      <w:hyperlink r:id="rId113">
         <w:r>
           <w:rPr>
             <w:rStyle w:val="Hyperlink"/>
@@ -20183,8 +20368,8 @@
         </w:r>
       </w:hyperlink>
     </w:p>
-    <w:bookmarkEnd w:id="111"/>
-    <w:bookmarkStart w:id="113" w:name="ref-wikipedia_law_of_total_probability"/>
+    <w:bookmarkEnd w:id="114"/>
+    <w:bookmarkStart w:id="116" w:name="ref-wikipedia_law_of_total_probability"/>
     <w:p>
       <w:pPr>
         <w:pStyle w:val="Bibliography"/>
@@ -20231,7 +20416,7 @@
       <w:r>
         <w:t xml:space="preserve"> </w:t>
       </w:r>
-      <w:hyperlink r:id="rId112">
+      <w:hyperlink r:id="rId115">
         <w:r>
           <w:rPr>
             <w:rStyle w:val="Hyperlink"/>
@@ -20240,8 +20425,8 @@
         </w:r>
       </w:hyperlink>
     </w:p>
-    <w:bookmarkEnd w:id="113"/>
-    <w:bookmarkStart w:id="115" w:name="ref-wikipedia_bayes_theorem"/>
+    <w:bookmarkEnd w:id="116"/>
+    <w:bookmarkStart w:id="118" w:name="ref-wikipedia_bayes_theorem"/>
     <w:p>
       <w:pPr>
         <w:pStyle w:val="Bibliography"/>
@@ -20288,7 +20473,7 @@
       <w:r>
         <w:t xml:space="preserve"> </w:t>
       </w:r>
-      <w:hyperlink r:id="rId114">
+      <w:hyperlink r:id="rId117">
         <w:r>
           <w:rPr>
             <w:rStyle w:val="Hyperlink"/>
@@ -20297,8 +20482,8 @@
         </w:r>
       </w:hyperlink>
     </w:p>
-    <w:bookmarkEnd w:id="115"/>
-    <w:bookmarkStart w:id="116" w:name="ref-hutchinson2024data471"/>
+    <w:bookmarkEnd w:id="118"/>
+    <w:bookmarkStart w:id="119" w:name="ref-hutchinson2024data471"/>
     <w:p>
       <w:pPr>
         <w:pStyle w:val="Bibliography"/>
@@ -20337,8 +20522,8 @@
         <w:t xml:space="preserve">Western Washington University, 2024.</w:t>
       </w:r>
     </w:p>
-    <w:bookmarkEnd w:id="116"/>
-    <w:bookmarkStart w:id="118" w:name="ref-wikipedia_base_rate_fallacy"/>
+    <w:bookmarkEnd w:id="119"/>
+    <w:bookmarkStart w:id="121" w:name="ref-wikipedia_base_rate_fallacy"/>
     <w:p>
       <w:pPr>
         <w:pStyle w:val="Bibliography"/>
@@ -20385,7 +20570,7 @@
       <w:r>
         <w:t xml:space="preserve"> </w:t>
       </w:r>
-      <w:hyperlink r:id="rId117">
+      <w:hyperlink r:id="rId120">
         <w:r>
           <w:rPr>
             <w:rStyle w:val="Hyperlink"/>
@@ -20394,8 +20579,8 @@
         </w:r>
       </w:hyperlink>
     </w:p>
-    <w:bookmarkEnd w:id="118"/>
-    <w:bookmarkStart w:id="120" w:name="ref-hutchinson_wwu_ml_videos"/>
+    <w:bookmarkEnd w:id="121"/>
+    <w:bookmarkStart w:id="123" w:name="ref-hutchinson_wwu_ml_videos"/>
     <w:p>
       <w:pPr>
         <w:pStyle w:val="Bibliography"/>
@@ -20448,7 +20633,7 @@
       <w:r>
         <w:t xml:space="preserve"> </w:t>
       </w:r>
-      <w:hyperlink r:id="rId119">
+      <w:hyperlink r:id="rId122">
         <w:r>
           <w:rPr>
             <w:rStyle w:val="Hyperlink"/>
@@ -20457,8 +20642,8 @@
         </w:r>
       </w:hyperlink>
     </w:p>
-    <w:bookmarkEnd w:id="120"/>
-    <w:bookmarkStart w:id="122" w:name="ref-fiveminuteai_probstat"/>
+    <w:bookmarkEnd w:id="123"/>
+    <w:bookmarkStart w:id="125" w:name="ref-fiveminuteai_probstat"/>
     <w:p>
       <w:pPr>
         <w:pStyle w:val="Bibliography"/>
@@ -20490,7 +20675,7 @@
       <w:r>
         <w:t xml:space="preserve"> </w:t>
       </w:r>
-      <w:hyperlink r:id="rId121">
+      <w:hyperlink r:id="rId124">
         <w:r>
           <w:rPr>
             <w:rStyle w:val="Hyperlink"/>
@@ -20499,9 +20684,55 @@
         </w:r>
       </w:hyperlink>
     </w:p>
-    <w:bookmarkEnd w:id="122"/>
-    <w:bookmarkEnd w:id="123"/>
-    <w:bookmarkEnd w:id="124"/>
+    <w:bookmarkEnd w:id="125"/>
+    <w:bookmarkStart w:id="127" w:name="ref-lange2024applied"/>
+    <w:p>
+      <w:pPr>
+        <w:pStyle w:val="Bibliography"/>
+      </w:pPr>
+      <w:r>
+        <w:t xml:space="preserve">[17]</w:t>
+      </w:r>
+      <w:r>
+        <w:t xml:space="preserve"> </w:t>
+      </w:r>
+      <w:r>
+        <w:t xml:space="preserve">	</w:t>
+      </w:r>
+      <w:r>
+        <w:t xml:space="preserve">K. Lange,</w:t>
+      </w:r>
+      <w:r>
+        <w:t xml:space="preserve"> </w:t>
+      </w:r>
+      <w:r>
+        <w:rPr>
+          <w:i/>
+          <w:iCs/>
+        </w:rPr>
+        <w:t xml:space="preserve">Applied probability</w:t>
+      </w:r>
+      <w:r>
+        <w:t xml:space="preserve">, 3rd ed. in Springer texts in statistics. Springer, 2024. doi:</w:t>
+      </w:r>
+      <w:r>
+        <w:t xml:space="preserve"> </w:t>
+      </w:r>
+      <w:hyperlink r:id="rId126">
+        <w:r>
+          <w:rPr>
+            <w:rStyle w:val="Hyperlink"/>
+          </w:rPr>
+          <w:t xml:space="preserve">10.1007/978-1-0716-4172-9</w:t>
+        </w:r>
+      </w:hyperlink>
+      <w:r>
+        <w:t xml:space="preserve">.</w:t>
+      </w:r>
+    </w:p>
+    <w:bookmarkEnd w:id="127"/>
+    <w:bookmarkEnd w:id="128"/>
+    <w:bookmarkEnd w:id="129"/>
     <w:sectPr>
       <w:footnotePr>
         <w:numRestart w:val="eachSect"/>

</xml_diff>

<commit_message>
Deploying to gh-pages from @ Morrison-Lab/pds@c3e25032322e9848ff01eaa42babfeb87668159d 🚀
</commit_message>
<xml_diff>
--- a/probability-basics.docx
+++ b/probability-basics.docx
@@ -15,10 +15,10 @@
         <w:pStyle w:val="Date"/>
       </w:pPr>
       <w:r>
-        <w:t xml:space="preserve">Last modified: 2026-10-29 13:28:09 (PDT)</w:t>
+        <w:t xml:space="preserve">Last modified: 2026-10-29 13:42:11 (PDT)</w:t>
       </w:r>
     </w:p>
-    <w:bookmarkStart w:id="63" w:name="defining-probabilities"/>
+    <w:bookmarkStart w:id="68" w:name="defining-probabilities"/>
     <w:p>
       <w:pPr>
         <w:pStyle w:val="Heading2"/>
@@ -1519,7 +1519,7 @@
       </w:r>
     </w:p>
     <w:bookmarkEnd w:id="29"/>
-    <w:bookmarkStart w:id="30" w:name="def-occurs"/>
+    <w:bookmarkStart w:id="30" w:name="lem-sample-space-event"/>
     <w:p>
       <w:pPr>
         <w:pStyle w:val="BodyText"/>
@@ -1529,13 +1529,35 @@
           <w:b/>
           <w:bCs/>
         </w:rPr>
-        <w:t xml:space="preserve">Definition 7 (Occurrence of an event)</w:t>
-      </w:r>
-      <w:r>
-        <w:t xml:space="preserve"> </w:t>
-      </w:r>
-      <w:r>
-        <w:t xml:space="preserve">An</w:t>
+        <w:t xml:space="preserve">Lemma 1 (The sample space is an event)</w:t>
+      </w:r>
+      <w:r>
+        <w:t xml:space="preserve"> </w:t>
+      </w:r>
+      <w:hyperlink w:anchor="def-sample-space">
+        <w:r>
+          <w:rPr>
+            <w:rStyle w:val="Hyperlink"/>
+          </w:rPr>
+          <w:t xml:space="preserve">The sample space</w:t>
+        </w:r>
+      </w:hyperlink>
+      <w:r>
+        <w:t xml:space="preserve"> </w:t>
+      </w:r>
+      <m:oMath>
+        <m:r>
+          <m:rPr>
+            <m:sty m:val="p"/>
+          </m:rPr>
+          <m:t>Ω</m:t>
+        </m:r>
+      </m:oMath>
+      <w:r>
+        <w:t xml:space="preserve"> </w:t>
+      </w:r>
+      <w:r>
+        <w:t xml:space="preserve">is an</w:t>
       </w:r>
       <w:r>
         <w:t xml:space="preserve"> </w:t>
@@ -1549,6 +1571,367 @@
         </w:r>
       </w:hyperlink>
       <w:r>
+        <w:t xml:space="preserve">.</w:t>
+      </w:r>
+    </w:p>
+    <w:bookmarkEnd w:id="30"/>
+    <w:p>
+      <w:pPr>
+        <w:pStyle w:val="BodyText"/>
+      </w:pPr>
+      <w:r>
+        <w:rPr>
+          <w:i/>
+          <w:iCs/>
+        </w:rPr>
+        <w:t xml:space="preserve">Proof</w:t>
+      </w:r>
+      <w:r>
+        <w:t xml:space="preserve">. </w:t>
+      </w:r>
+      <w:r>
+        <w:t xml:space="preserve">The sample space is a subset of itself,</w:t>
+      </w:r>
+      <w:r>
+        <w:t xml:space="preserve"> </w:t>
+      </w:r>
+      <m:oMath>
+        <m:r>
+          <m:rPr>
+            <m:sty m:val="p"/>
+          </m:rPr>
+          <m:t>Ω</m:t>
+        </m:r>
+        <m:r>
+          <m:rPr>
+            <m:sty m:val="p"/>
+          </m:rPr>
+          <m:t>⊆</m:t>
+        </m:r>
+        <m:r>
+          <m:rPr>
+            <m:sty m:val="p"/>
+          </m:rPr>
+          <m:t>Ω</m:t>
+        </m:r>
+      </m:oMath>
+      <w:r>
+        <w:t xml:space="preserve">.</w:t>
+      </w:r>
+      <w:r>
+        <w:t xml:space="preserve"> </w:t>
+      </w:r>
+      <w:r>
+        <w:t xml:space="preserve">When every subset of</w:t>
+      </w:r>
+      <w:r>
+        <w:t xml:space="preserve"> </w:t>
+      </w:r>
+      <m:oMath>
+        <m:r>
+          <m:rPr>
+            <m:sty m:val="p"/>
+          </m:rPr>
+          <m:t>Ω</m:t>
+        </m:r>
+      </m:oMath>
+      <w:r>
+        <w:t xml:space="preserve"> </w:t>
+      </w:r>
+      <w:r>
+        <w:t xml:space="preserve">can be an event,</w:t>
+      </w:r>
+      <w:r>
+        <w:t xml:space="preserve"> </w:t>
+      </w:r>
+      <w:r>
+        <w:t xml:space="preserve">that is enough.</w:t>
+      </w:r>
+      <w:r>
+        <w:t xml:space="preserve"> </w:t>
+      </w:r>
+      <w:r>
+        <w:t xml:space="preserve">Otherwise the events are the subsets in a</w:t>
+      </w:r>
+      <w:r>
+        <w:t xml:space="preserve"> </w:t>
+      </w:r>
+      <w:hyperlink r:id="rId25">
+        <m:oMath>
+          <m:r>
+            <m:t>σ</m:t>
+          </m:r>
+        </m:oMath>
+        <w:r>
+          <w:rPr>
+            <w:rStyle w:val="Hyperlink"/>
+          </w:rPr>
+          <w:t xml:space="preserve">-algebra</w:t>
+        </w:r>
+      </w:hyperlink>
+      <w:r>
+        <w:t xml:space="preserve"> </w:t>
+      </w:r>
+      <m:oMath>
+        <m:r>
+          <m:rPr>
+            <m:scr m:val="script"/>
+            <m:sty m:val="p"/>
+          </m:rPr>
+          <m:t>S</m:t>
+        </m:r>
+      </m:oMath>
+      <w:r>
+        <w:t xml:space="preserve"> </w:t>
+      </w:r>
+      <w:r>
+        <w:t xml:space="preserve">on</w:t>
+      </w:r>
+      <w:r>
+        <w:t xml:space="preserve"> </w:t>
+      </w:r>
+      <m:oMath>
+        <m:r>
+          <m:rPr>
+            <m:sty m:val="p"/>
+          </m:rPr>
+          <m:t>Ω</m:t>
+        </m:r>
+      </m:oMath>
+      <w:r>
+        <w:t xml:space="preserve">,</w:t>
+      </w:r>
+      <w:r>
+        <w:t xml:space="preserve"> </w:t>
+      </w:r>
+      <w:r>
+        <w:t xml:space="preserve">and by its definition</w:t>
+      </w:r>
+      <w:r>
+        <w:t xml:space="preserve"> </w:t>
+      </w:r>
+      <m:oMath>
+        <m:r>
+          <m:rPr>
+            <m:scr m:val="script"/>
+            <m:sty m:val="p"/>
+          </m:rPr>
+          <m:t>S</m:t>
+        </m:r>
+      </m:oMath>
+      <w:r>
+        <w:t xml:space="preserve"> </w:t>
+      </w:r>
+      <w:r>
+        <w:t xml:space="preserve">contains</w:t>
+      </w:r>
+      <w:r>
+        <w:t xml:space="preserve"> </w:t>
+      </w:r>
+      <m:oMath>
+        <m:r>
+          <m:rPr>
+            <m:sty m:val="p"/>
+          </m:rPr>
+          <m:t>Ω</m:t>
+        </m:r>
+      </m:oMath>
+      <w:r>
+        <w:t xml:space="preserve"> </w:t>
+      </w:r>
+      <w:r>
+        <w:t xml:space="preserve">itself.</w:t>
+      </w:r>
+    </w:p>
+    <w:bookmarkStart w:id="31" w:name="exm-sample-space-event"/>
+    <w:p>
+      <w:pPr>
+        <w:pStyle w:val="BodyText"/>
+      </w:pPr>
+      <w:r>
+        <w:rPr>
+          <w:b/>
+          <w:bCs/>
+        </w:rPr>
+        <w:t xml:space="preserve">Example 8 (The die roll’s sample space as an event)</w:t>
+      </w:r>
+      <w:r>
+        <w:t xml:space="preserve"> </w:t>
+      </w:r>
+      <w:r>
+        <w:t xml:space="preserve">In</w:t>
+      </w:r>
+      <w:r>
+        <w:t xml:space="preserve"> </w:t>
+      </w:r>
+      <w:hyperlink w:anchor="exm-sample-space">
+        <w:r>
+          <w:rPr>
+            <w:rStyle w:val="Hyperlink"/>
+          </w:rPr>
+          <w:t xml:space="preserve">Example 6</w:t>
+        </w:r>
+      </w:hyperlink>
+      <w:r>
+        <w:t xml:space="preserve">, every subset of</w:t>
+      </w:r>
+      <w:r>
+        <w:t xml:space="preserve"> </w:t>
+      </w:r>
+      <m:oMath>
+        <m:r>
+          <m:rPr>
+            <m:sty m:val="p"/>
+          </m:rPr>
+          <m:t>Ω</m:t>
+        </m:r>
+        <m:r>
+          <m:rPr>
+            <m:sty m:val="p"/>
+          </m:rPr>
+          <m:t>=</m:t>
+        </m:r>
+        <m:r>
+          <m:t>​</m:t>
+        </m:r>
+        <m:d>
+          <m:dPr>
+            <m:begChr m:val="{"/>
+            <m:sepChr m:val=""/>
+            <m:endChr m:val="}"/>
+            <m:grow/>
+          </m:dPr>
+          <m:e>
+            <m:r>
+              <m:t>1</m:t>
+            </m:r>
+            <m:r>
+              <m:rPr>
+                <m:sty m:val="p"/>
+              </m:rPr>
+              <m:t>,</m:t>
+            </m:r>
+            <m:r>
+              <m:t>2</m:t>
+            </m:r>
+            <m:r>
+              <m:rPr>
+                <m:sty m:val="p"/>
+              </m:rPr>
+              <m:t>,</m:t>
+            </m:r>
+            <m:r>
+              <m:t>3</m:t>
+            </m:r>
+            <m:r>
+              <m:rPr>
+                <m:sty m:val="p"/>
+              </m:rPr>
+              <m:t>,</m:t>
+            </m:r>
+            <m:r>
+              <m:t>4</m:t>
+            </m:r>
+            <m:r>
+              <m:rPr>
+                <m:sty m:val="p"/>
+              </m:rPr>
+              <m:t>,</m:t>
+            </m:r>
+            <m:r>
+              <m:t>5</m:t>
+            </m:r>
+            <m:r>
+              <m:rPr>
+                <m:sty m:val="p"/>
+              </m:rPr>
+              <m:t>,</m:t>
+            </m:r>
+            <m:r>
+              <m:t>6</m:t>
+            </m:r>
+          </m:e>
+        </m:d>
+        <m:r>
+          <m:t>​</m:t>
+        </m:r>
+      </m:oMath>
+      <w:r>
+        <w:t xml:space="preserve"> </w:t>
+      </w:r>
+      <w:r>
+        <w:t xml:space="preserve">can be an event,</w:t>
+      </w:r>
+      <w:r>
+        <w:t xml:space="preserve"> </w:t>
+      </w:r>
+      <w:r>
+        <w:t xml:space="preserve">including</w:t>
+      </w:r>
+      <w:r>
+        <w:t xml:space="preserve"> </w:t>
+      </w:r>
+      <m:oMath>
+        <m:r>
+          <m:rPr>
+            <m:sty m:val="p"/>
+          </m:rPr>
+          <m:t>Ω</m:t>
+        </m:r>
+      </m:oMath>
+      <w:r>
+        <w:t xml:space="preserve"> </w:t>
+      </w:r>
+      <w:r>
+        <w:t xml:space="preserve">itself:</w:t>
+      </w:r>
+      <w:r>
+        <w:t xml:space="preserve"> </w:t>
+      </w:r>
+      <w:r>
+        <w:t xml:space="preserve">the event</w:t>
+      </w:r>
+      <w:r>
+        <w:t xml:space="preserve"> </w:t>
+      </w:r>
+      <w:r>
+        <w:t xml:space="preserve">“the roll is any of 1 through 6”</w:t>
+      </w:r>
+      <w:r>
+        <w:t xml:space="preserve">, which always occurs.</w:t>
+      </w:r>
+    </w:p>
+    <w:bookmarkEnd w:id="31"/>
+    <w:bookmarkStart w:id="32" w:name="def-occurs"/>
+    <w:p>
+      <w:pPr>
+        <w:pStyle w:val="BodyText"/>
+      </w:pPr>
+      <w:r>
+        <w:rPr>
+          <w:b/>
+          <w:bCs/>
+        </w:rPr>
+        <w:t xml:space="preserve">Definition 7 (Occurrence of an event)</w:t>
+      </w:r>
+      <w:r>
+        <w:t xml:space="preserve"> </w:t>
+      </w:r>
+      <w:r>
+        <w:t xml:space="preserve">An</w:t>
+      </w:r>
+      <w:r>
+        <w:t xml:space="preserve"> </w:t>
+      </w:r>
+      <w:hyperlink w:anchor="def-event">
+        <w:r>
+          <w:rPr>
+            <w:rStyle w:val="Hyperlink"/>
+          </w:rPr>
+          <w:t xml:space="preserve">event</w:t>
+        </w:r>
+      </w:hyperlink>
+      <w:r>
         <w:t xml:space="preserve"> </w:t>
       </w:r>
       <m:oMath>
@@ -1601,8 +1984,8 @@
         <w:t xml:space="preserve">.</w:t>
       </w:r>
     </w:p>
-    <w:bookmarkEnd w:id="30"/>
-    <w:bookmarkStart w:id="31" w:name="exm-occurs"/>
+    <w:bookmarkEnd w:id="32"/>
+    <w:bookmarkStart w:id="33" w:name="exm-occurs"/>
     <w:p>
       <w:pPr>
         <w:pStyle w:val="BodyText"/>
@@ -1612,7 +1995,7 @@
           <w:b/>
           <w:bCs/>
         </w:rPr>
-        <w:t xml:space="preserve">Example 8 (Rolling a 4)</w:t>
+        <w:t xml:space="preserve">Example 9 (Rolling a 4)</w:t>
       </w:r>
       <w:r>
         <w:t xml:space="preserve"> </w:t>
@@ -1806,8 +2189,8 @@
         <w:t xml:space="preserve">, does not occur.</w:t>
       </w:r>
     </w:p>
-    <w:bookmarkEnd w:id="31"/>
-    <w:bookmarkStart w:id="32" w:name="def-complement"/>
+    <w:bookmarkEnd w:id="33"/>
+    <w:bookmarkStart w:id="34" w:name="def-complement"/>
     <w:p>
       <w:pPr>
         <w:pStyle w:val="BodyText"/>
@@ -2004,7 +2387,7 @@
         </m:oMath>
       </m:oMathPara>
     </w:p>
-    <w:bookmarkEnd w:id="32"/>
+    <w:bookmarkEnd w:id="34"/>
     <w:p>
       <w:pPr>
         <w:pStyle w:val="FirstParagraph"/>
@@ -2064,7 +2447,7 @@
         <w:t xml:space="preserve">.</w:t>
       </w:r>
     </w:p>
-    <w:bookmarkStart w:id="33" w:name="exm-complement"/>
+    <w:bookmarkStart w:id="35" w:name="exm-complement"/>
     <w:p>
       <w:pPr>
         <w:pStyle w:val="BodyText"/>
@@ -2074,7 +2457,7 @@
           <w:b/>
           <w:bCs/>
         </w:rPr>
-        <w:t xml:space="preserve">Example 9 (Rolling an odd number)</w:t>
+        <w:t xml:space="preserve">Example 10 (Rolling an odd number)</w:t>
       </w:r>
       <w:r>
         <w:t xml:space="preserve"> </w:t>
@@ -2241,8 +2624,8 @@
         <w:t xml:space="preserve">.</w:t>
       </w:r>
     </w:p>
-    <w:bookmarkEnd w:id="33"/>
-    <w:bookmarkStart w:id="34" w:name="def-mutually-exclusive"/>
+    <w:bookmarkEnd w:id="35"/>
+    <w:bookmarkStart w:id="36" w:name="def-mutually-exclusive"/>
     <w:p>
       <w:pPr>
         <w:pStyle w:val="BodyText"/>
@@ -2474,7 +2857,7 @@
         </m:oMath>
       </m:oMathPara>
     </w:p>
-    <w:bookmarkEnd w:id="34"/>
+    <w:bookmarkEnd w:id="36"/>
     <w:p>
       <w:pPr>
         <w:pStyle w:val="FirstParagraph"/>
@@ -2501,7 +2884,7 @@
       <w:r>
         <w:t xml:space="preserve"> </w:t>
       </w:r>
-      <w:hyperlink r:id="rId35">
+      <w:hyperlink r:id="rId37">
         <w:r>
           <w:rPr>
             <w:rStyle w:val="Hyperlink"/>
@@ -2513,7 +2896,7 @@
         <w:t xml:space="preserve">.</w:t>
       </w:r>
     </w:p>
-    <w:bookmarkStart w:id="36" w:name="exm-mutually-exclusive"/>
+    <w:bookmarkStart w:id="38" w:name="exm-mutually-exclusive"/>
     <w:p>
       <w:pPr>
         <w:pStyle w:val="BodyText"/>
@@ -2523,7 +2906,7 @@
           <w:b/>
           <w:bCs/>
         </w:rPr>
-        <w:t xml:space="preserve">Example 10 (Low and high rolls)</w:t>
+        <w:t xml:space="preserve">Example 11 (Low and high rolls)</w:t>
       </w:r>
       <w:r>
         <w:t xml:space="preserve"> </w:t>
@@ -2771,8 +3154,8 @@
         <w:t xml:space="preserve">are not mutually exclusive: a roll of 2 is in both.</w:t>
       </w:r>
     </w:p>
-    <w:bookmarkEnd w:id="36"/>
-    <w:bookmarkStart w:id="37" w:name="def-partition"/>
+    <w:bookmarkEnd w:id="38"/>
+    <w:bookmarkStart w:id="39" w:name="def-partition"/>
     <w:p>
       <w:pPr>
         <w:pStyle w:val="BodyText"/>
@@ -3031,8 +3414,8 @@
         <w:t xml:space="preserve">.</w:t>
       </w:r>
     </w:p>
-    <w:bookmarkEnd w:id="37"/>
-    <w:bookmarkStart w:id="38" w:name="rem-partition-sample-space"/>
+    <w:bookmarkEnd w:id="39"/>
+    <w:bookmarkStart w:id="40" w:name="rem-partition-sample-space"/>
     <w:p>
       <w:pPr>
         <w:pStyle w:val="FirstParagraph"/>
@@ -3088,10 +3471,44 @@
         </m:r>
       </m:oMath>
       <w:r>
-        <w:t xml:space="preserve">.</w:t>
+        <w:t xml:space="preserve">,</w:t>
+      </w:r>
+      <w:r>
+        <w:t xml:space="preserve"> </w:t>
+      </w:r>
+      <w:r>
+        <w:t xml:space="preserve">which is allowed because</w:t>
+      </w:r>
+      <w:r>
+        <w:t xml:space="preserve"> </w:t>
+      </w:r>
+      <m:oMath>
+        <m:r>
+          <m:rPr>
+            <m:sty m:val="p"/>
+          </m:rPr>
+          <m:t>Ω</m:t>
+        </m:r>
+      </m:oMath>
+      <w:r>
+        <w:t xml:space="preserve"> </w:t>
+      </w:r>
+      <w:r>
+        <w:t xml:space="preserve">is an event (</w:t>
+      </w:r>
+      <w:hyperlink w:anchor="lem-sample-space-event">
+        <w:r>
+          <w:rPr>
+            <w:rStyle w:val="Hyperlink"/>
+          </w:rPr>
+          <w:t xml:space="preserve">Lemma 1</w:t>
+        </w:r>
+      </w:hyperlink>
+      <w:r>
+        <w:t xml:space="preserve">).</w:t>
       </w:r>
     </w:p>
-    <w:bookmarkEnd w:id="38"/>
+    <w:bookmarkEnd w:id="40"/>
     <w:p>
       <w:pPr>
         <w:pStyle w:val="BodyText"/>
@@ -3133,7 +3550,7 @@
         <w:t xml:space="preserve">to contain at least one outcome.</w:t>
       </w:r>
     </w:p>
-    <w:bookmarkStart w:id="39" w:name="exm-partition"/>
+    <w:bookmarkStart w:id="41" w:name="exm-partition"/>
     <w:p>
       <w:pPr>
         <w:pStyle w:val="BodyText"/>
@@ -3143,7 +3560,7 @@
           <w:b/>
           <w:bCs/>
         </w:rPr>
-        <w:t xml:space="preserve">Example 11 (Partitioning the die roll)</w:t>
+        <w:t xml:space="preserve">Example 12 (Partitioning the die roll)</w:t>
       </w:r>
       <w:r>
         <w:t xml:space="preserve"> </w:t>
@@ -3498,7 +3915,7 @@
           <w:rPr>
             <w:rStyle w:val="Hyperlink"/>
           </w:rPr>
-          <w:t xml:space="preserve">Example 10</w:t>
+          <w:t xml:space="preserve">Example 11</w:t>
         </w:r>
       </w:hyperlink>
       <w:r>
@@ -3522,8 +3939,8 @@
         <w:t xml:space="preserve">: their union leaves out 3 and 4.</w:t>
       </w:r>
     </w:p>
-    <w:bookmarkEnd w:id="39"/>
-    <w:bookmarkStart w:id="41" w:name="def-probability"/>
+    <w:bookmarkEnd w:id="41"/>
+    <w:bookmarkStart w:id="42" w:name="prp-complement-partition"/>
     <w:p>
       <w:pPr>
         <w:pStyle w:val="BodyText"/>
@@ -3533,54 +3950,103 @@
           <w:b/>
           <w:bCs/>
         </w:rPr>
-        <w:t xml:space="preserve">Definition 11 (Probability measure (probability function))</w:t>
-      </w:r>
-      <w:r>
-        <w:t xml:space="preserve"> </w:t>
-      </w:r>
-      <w:r>
-        <w:t xml:space="preserve">A</w:t>
-      </w:r>
-      <w:r>
-        <w:t xml:space="preserve"> </w:t>
-      </w:r>
-      <w:r>
-        <w:rPr>
-          <w:b/>
-          <w:bCs/>
-        </w:rPr>
-        <w:t xml:space="preserve">probability measure</w:t>
-      </w:r>
-      <w:r>
-        <w:t xml:space="preserve"> </w:t>
-      </w:r>
-      <w:r>
-        <w:t xml:space="preserve">(also called a</w:t>
-      </w:r>
-      <w:r>
-        <w:t xml:space="preserve"> </w:t>
-      </w:r>
-      <w:r>
-        <w:rPr>
-          <w:b/>
-          <w:bCs/>
-        </w:rPr>
-        <w:t xml:space="preserve">probability function</w:t>
-      </w:r>
-      <w:r>
-        <w:t xml:space="preserve"> </w:t>
-      </w:r>
-      <w:r>
-        <w:t xml:space="preserve">[4], Definition 1.2.4</w:t>
-      </w:r>
-      <w:r>
-        <w:t xml:space="preserve">)</w:t>
-      </w:r>
-      <w:r>
-        <w:t xml:space="preserve"> </w:t>
-      </w:r>
-      <w:r>
-        <w:t xml:space="preserve">on a</w:t>
+        <w:t xml:space="preserve">Proposition 1 (An event and its complement partition the sample space)</w:t>
+      </w:r>
+      <w:r>
+        <w:t xml:space="preserve"> </w:t>
+      </w:r>
+      <w:r>
+        <w:t xml:space="preserve">For any</w:t>
+      </w:r>
+      <w:r>
+        <w:t xml:space="preserve"> </w:t>
+      </w:r>
+      <w:hyperlink w:anchor="def-event">
+        <w:r>
+          <w:rPr>
+            <w:rStyle w:val="Hyperlink"/>
+          </w:rPr>
+          <w:t xml:space="preserve">event</w:t>
+        </w:r>
+      </w:hyperlink>
+      <w:r>
+        <w:t xml:space="preserve"> </w:t>
+      </w:r>
+      <m:oMath>
+        <m:r>
+          <m:t>A</m:t>
+        </m:r>
+      </m:oMath>
+      <w:r>
+        <w:t xml:space="preserve">,</w:t>
+      </w:r>
+      <w:r>
+        <w:t xml:space="preserve"> </w:t>
+      </w:r>
+      <w:r>
+        <w:t xml:space="preserve">the events</w:t>
+      </w:r>
+      <w:r>
+        <w:t xml:space="preserve"> </w:t>
+      </w:r>
+      <m:oMath>
+        <m:r>
+          <m:t>A</m:t>
+        </m:r>
+      </m:oMath>
+      <w:r>
+        <w:t xml:space="preserve"> </w:t>
+      </w:r>
+      <w:r>
+        <w:t xml:space="preserve">and its</w:t>
+      </w:r>
+      <w:r>
+        <w:t xml:space="preserve"> </w:t>
+      </w:r>
+      <w:hyperlink w:anchor="def-complement">
+        <w:r>
+          <w:rPr>
+            <w:rStyle w:val="Hyperlink"/>
+          </w:rPr>
+          <w:t xml:space="preserve">complement</w:t>
+        </w:r>
+      </w:hyperlink>
+      <w:r>
+        <w:t xml:space="preserve"> </w:t>
+      </w:r>
+      <m:oMath>
+        <m:r>
+          <m:rPr>
+            <m:sty m:val="p"/>
+          </m:rPr>
+          <m:t>¬</m:t>
+        </m:r>
+        <m:r>
+          <m:t>A</m:t>
+        </m:r>
+      </m:oMath>
+      <w:r>
+        <w:t xml:space="preserve"> </w:t>
+      </w:r>
+      <w:r>
+        <w:t xml:space="preserve">are a</w:t>
+      </w:r>
+      <w:r>
+        <w:t xml:space="preserve"> </w:t>
+      </w:r>
+      <w:hyperlink w:anchor="def-partition">
+        <w:r>
+          <w:rPr>
+            <w:rStyle w:val="Hyperlink"/>
+          </w:rPr>
+          <w:t xml:space="preserve">partition</w:t>
+        </w:r>
+      </w:hyperlink>
+      <w:r>
+        <w:t xml:space="preserve"> </w:t>
+      </w:r>
+      <w:r>
+        <w:t xml:space="preserve">of the</w:t>
       </w:r>
       <w:r>
         <w:t xml:space="preserve"> </w:t>
@@ -3605,12 +4071,693 @@
         </m:r>
       </m:oMath>
       <w:r>
+        <w:t xml:space="preserve">.</w:t>
+      </w:r>
+    </w:p>
+    <w:bookmarkEnd w:id="42"/>
+    <w:p>
+      <w:pPr>
+        <w:pStyle w:val="BodyText"/>
+      </w:pPr>
+      <w:r>
+        <w:rPr>
+          <w:i/>
+          <w:iCs/>
+        </w:rPr>
+        <w:t xml:space="preserve">Proof</w:t>
+      </w:r>
+      <w:r>
+        <w:t xml:space="preserve">. </w:t>
+      </w:r>
+      <w:r>
+        <w:t xml:space="preserve">The sample space</w:t>
+      </w:r>
+      <w:r>
+        <w:t xml:space="preserve"> </w:t>
+      </w:r>
+      <m:oMath>
+        <m:r>
+          <m:rPr>
+            <m:sty m:val="p"/>
+          </m:rPr>
+          <m:t>Ω</m:t>
+        </m:r>
+      </m:oMath>
+      <w:r>
+        <w:t xml:space="preserve"> </w:t>
+      </w:r>
+      <w:r>
+        <w:t xml:space="preserve">is an event (</w:t>
+      </w:r>
+      <w:hyperlink w:anchor="lem-sample-space-event">
+        <w:r>
+          <w:rPr>
+            <w:rStyle w:val="Hyperlink"/>
+          </w:rPr>
+          <w:t xml:space="preserve">Lemma 1</w:t>
+        </w:r>
+      </w:hyperlink>
+      <w:r>
+        <w:t xml:space="preserve">),</w:t>
+      </w:r>
+      <w:r>
+        <w:t xml:space="preserve"> </w:t>
+      </w:r>
+      <w:r>
+        <w:t xml:space="preserve">so a partition of it is defined.</w:t>
+      </w:r>
+      <w:r>
+        <w:t xml:space="preserve"> </w:t>
+      </w:r>
+      <w:r>
+        <w:t xml:space="preserve">The complement</w:t>
+      </w:r>
+      <w:r>
+        <w:t xml:space="preserve"> </w:t>
+      </w:r>
+      <m:oMath>
+        <m:r>
+          <m:rPr>
+            <m:sty m:val="p"/>
+          </m:rPr>
+          <m:t>¬</m:t>
+        </m:r>
+        <m:r>
+          <m:t>A</m:t>
+        </m:r>
+      </m:oMath>
+      <w:r>
+        <w:t xml:space="preserve"> </w:t>
+      </w:r>
+      <w:r>
+        <w:t xml:space="preserve">is the</w:t>
+      </w:r>
+      <w:r>
+        <w:t xml:space="preserve"> </w:t>
+      </w:r>
+      <w:hyperlink r:id="rId43">
+        <w:r>
+          <w:rPr>
+            <w:rStyle w:val="Hyperlink"/>
+          </w:rPr>
+          <w:t xml:space="preserve">set difference</w:t>
+        </w:r>
+      </w:hyperlink>
+      <w:r>
+        <w:t xml:space="preserve"> </w:t>
+      </w:r>
+      <m:oMath>
+        <m:r>
+          <m:rPr>
+            <m:sty m:val="p"/>
+          </m:rPr>
+          <m:t>Ω</m:t>
+        </m:r>
+        <m:r>
+          <m:rPr>
+            <m:sty m:val="p"/>
+          </m:rPr>
+          <m:t>\</m:t>
+        </m:r>
+        <m:r>
+          <m:t>A</m:t>
+        </m:r>
+      </m:oMath>
+      <w:r>
         <w:t xml:space="preserve">,</w:t>
       </w:r>
       <w:r>
         <w:t xml:space="preserve"> </w:t>
       </w:r>
       <w:r>
+        <w:t xml:space="preserve">which is an event</w:t>
+      </w:r>
+      <w:r>
+        <w:t xml:space="preserve"> </w:t>
+      </w:r>
+      <w:r>
+        <w:t xml:space="preserve">because the events are closed under complements in</w:t>
+      </w:r>
+      <w:r>
+        <w:t xml:space="preserve"> </w:t>
+      </w:r>
+      <m:oMath>
+        <m:r>
+          <m:rPr>
+            <m:sty m:val="p"/>
+          </m:rPr>
+          <m:t>Ω</m:t>
+        </m:r>
+      </m:oMath>
+      <w:r>
+        <w:t xml:space="preserve">,</w:t>
+      </w:r>
+      <w:r>
+        <w:t xml:space="preserve"> </w:t>
+      </w:r>
+      <w:r>
+        <w:t xml:space="preserve">by the complement requirement of a</w:t>
+      </w:r>
+      <w:r>
+        <w:t xml:space="preserve"> </w:t>
+      </w:r>
+      <w:hyperlink r:id="rId25">
+        <m:oMath>
+          <m:r>
+            <m:t>σ</m:t>
+          </m:r>
+        </m:oMath>
+        <w:r>
+          <w:rPr>
+            <w:rStyle w:val="Hyperlink"/>
+          </w:rPr>
+          <w:t xml:space="preserve">-algebra</w:t>
+        </w:r>
+      </w:hyperlink>
+      <w:r>
+        <w:t xml:space="preserve">.</w:t>
+      </w:r>
+      <w:r>
+        <w:t xml:space="preserve"> </w:t>
+      </w:r>
+      <w:r>
+        <w:t xml:space="preserve">The events</w:t>
+      </w:r>
+      <w:r>
+        <w:t xml:space="preserve"> </w:t>
+      </w:r>
+      <m:oMath>
+        <m:r>
+          <m:t>A</m:t>
+        </m:r>
+      </m:oMath>
+      <w:r>
+        <w:t xml:space="preserve"> </w:t>
+      </w:r>
+      <w:r>
+        <w:t xml:space="preserve">and</w:t>
+      </w:r>
+      <w:r>
+        <w:t xml:space="preserve"> </w:t>
+      </w:r>
+      <m:oMath>
+        <m:r>
+          <m:rPr>
+            <m:sty m:val="p"/>
+          </m:rPr>
+          <m:t>¬</m:t>
+        </m:r>
+        <m:r>
+          <m:t>A</m:t>
+        </m:r>
+      </m:oMath>
+      <w:r>
+        <w:t xml:space="preserve"> </w:t>
+      </w:r>
+      <w:r>
+        <w:t xml:space="preserve">are mutually exclusive,</w:t>
+      </w:r>
+      <w:r>
+        <w:t xml:space="preserve"> </w:t>
+      </w:r>
+      <w:r>
+        <w:t xml:space="preserve">because</w:t>
+      </w:r>
+      <w:r>
+        <w:t xml:space="preserve"> </w:t>
+      </w:r>
+      <m:oMath>
+        <m:r>
+          <m:rPr>
+            <m:sty m:val="p"/>
+          </m:rPr>
+          <m:t>¬</m:t>
+        </m:r>
+        <m:r>
+          <m:t>A</m:t>
+        </m:r>
+      </m:oMath>
+      <w:r>
+        <w:t xml:space="preserve"> </w:t>
+      </w:r>
+      <w:r>
+        <w:t xml:space="preserve">contains only elements not in</w:t>
+      </w:r>
+      <w:r>
+        <w:t xml:space="preserve"> </w:t>
+      </w:r>
+      <m:oMath>
+        <m:r>
+          <m:t>A</m:t>
+        </m:r>
+      </m:oMath>
+      <w:r>
+        <w:t xml:space="preserve">.</w:t>
+      </w:r>
+      <w:r>
+        <w:t xml:space="preserve"> </w:t>
+      </w:r>
+      <w:r>
+        <w:t xml:space="preserve">Their union is</w:t>
+      </w:r>
+      <w:r>
+        <w:t xml:space="preserve"> </w:t>
+      </w:r>
+      <m:oMath>
+        <m:r>
+          <m:rPr>
+            <m:sty m:val="p"/>
+          </m:rPr>
+          <m:t>Ω</m:t>
+        </m:r>
+      </m:oMath>
+      <w:r>
+        <w:t xml:space="preserve">,</w:t>
+      </w:r>
+      <w:r>
+        <w:t xml:space="preserve"> </w:t>
+      </w:r>
+      <w:r>
+        <w:t xml:space="preserve">because each element of</w:t>
+      </w:r>
+      <w:r>
+        <w:t xml:space="preserve"> </w:t>
+      </w:r>
+      <m:oMath>
+        <m:r>
+          <m:rPr>
+            <m:sty m:val="p"/>
+          </m:rPr>
+          <m:t>Ω</m:t>
+        </m:r>
+      </m:oMath>
+      <w:r>
+        <w:t xml:space="preserve"> </w:t>
+      </w:r>
+      <w:r>
+        <w:t xml:space="preserve">is either in</w:t>
+      </w:r>
+      <w:r>
+        <w:t xml:space="preserve"> </w:t>
+      </w:r>
+      <m:oMath>
+        <m:r>
+          <m:t>A</m:t>
+        </m:r>
+      </m:oMath>
+      <w:r>
+        <w:t xml:space="preserve"> </w:t>
+      </w:r>
+      <w:r>
+        <w:t xml:space="preserve">or not in</w:t>
+      </w:r>
+      <w:r>
+        <w:t xml:space="preserve"> </w:t>
+      </w:r>
+      <m:oMath>
+        <m:r>
+          <m:t>A</m:t>
+        </m:r>
+      </m:oMath>
+      <w:r>
+        <w:t xml:space="preserve">.</w:t>
+      </w:r>
+    </w:p>
+    <w:bookmarkStart w:id="44" w:name="exm-complement-partition"/>
+    <w:p>
+      <w:pPr>
+        <w:pStyle w:val="BodyText"/>
+      </w:pPr>
+      <w:r>
+        <w:rPr>
+          <w:b/>
+          <w:bCs/>
+        </w:rPr>
+        <w:t xml:space="preserve">Example 13 (Even and odd rolls)</w:t>
+      </w:r>
+      <w:r>
+        <w:t xml:space="preserve"> </w:t>
+      </w:r>
+      <w:r>
+        <w:t xml:space="preserve">In</w:t>
+      </w:r>
+      <w:r>
+        <w:t xml:space="preserve"> </w:t>
+      </w:r>
+      <w:hyperlink w:anchor="exm-event">
+        <w:r>
+          <w:rPr>
+            <w:rStyle w:val="Hyperlink"/>
+          </w:rPr>
+          <w:t xml:space="preserve">Example 7</w:t>
+        </w:r>
+      </w:hyperlink>
+      <w:r>
+        <w:t xml:space="preserve"> </w:t>
+      </w:r>
+      <w:r>
+        <w:t xml:space="preserve">and</w:t>
+      </w:r>
+      <w:r>
+        <w:t xml:space="preserve"> </w:t>
+      </w:r>
+      <w:hyperlink w:anchor="exm-complement">
+        <w:r>
+          <w:rPr>
+            <w:rStyle w:val="Hyperlink"/>
+          </w:rPr>
+          <w:t xml:space="preserve">Example 10</w:t>
+        </w:r>
+      </w:hyperlink>
+      <w:r>
+        <w:t xml:space="preserve">,</w:t>
+      </w:r>
+      <w:r>
+        <w:t xml:space="preserve"> </w:t>
+      </w:r>
+      <w:r>
+        <w:t xml:space="preserve">the event</w:t>
+      </w:r>
+      <w:r>
+        <w:t xml:space="preserve"> </w:t>
+      </w:r>
+      <m:oMath>
+        <m:r>
+          <m:t>A</m:t>
+        </m:r>
+        <m:r>
+          <m:rPr>
+            <m:sty m:val="p"/>
+          </m:rPr>
+          <m:t>=</m:t>
+        </m:r>
+        <m:r>
+          <m:t>​</m:t>
+        </m:r>
+        <m:d>
+          <m:dPr>
+            <m:begChr m:val="{"/>
+            <m:sepChr m:val=""/>
+            <m:endChr m:val="}"/>
+            <m:grow/>
+          </m:dPr>
+          <m:e>
+            <m:r>
+              <m:t>2</m:t>
+            </m:r>
+            <m:r>
+              <m:rPr>
+                <m:sty m:val="p"/>
+              </m:rPr>
+              <m:t>,</m:t>
+            </m:r>
+            <m:r>
+              <m:t>4</m:t>
+            </m:r>
+            <m:r>
+              <m:rPr>
+                <m:sty m:val="p"/>
+              </m:rPr>
+              <m:t>,</m:t>
+            </m:r>
+            <m:r>
+              <m:t>6</m:t>
+            </m:r>
+          </m:e>
+        </m:d>
+        <m:r>
+          <m:t>​</m:t>
+        </m:r>
+      </m:oMath>
+      <w:r>
+        <w:t xml:space="preserve"> </w:t>
+      </w:r>
+      <w:r>
+        <w:t xml:space="preserve">and its complement</w:t>
+      </w:r>
+      <w:r>
+        <w:t xml:space="preserve"> </w:t>
+      </w:r>
+      <m:oMath>
+        <m:r>
+          <m:rPr>
+            <m:sty m:val="p"/>
+          </m:rPr>
+          <m:t>¬</m:t>
+        </m:r>
+        <m:r>
+          <m:t>A</m:t>
+        </m:r>
+        <m:r>
+          <m:rPr>
+            <m:sty m:val="p"/>
+          </m:rPr>
+          <m:t>=</m:t>
+        </m:r>
+        <m:r>
+          <m:t>​</m:t>
+        </m:r>
+        <m:d>
+          <m:dPr>
+            <m:begChr m:val="{"/>
+            <m:sepChr m:val=""/>
+            <m:endChr m:val="}"/>
+            <m:grow/>
+          </m:dPr>
+          <m:e>
+            <m:r>
+              <m:t>1</m:t>
+            </m:r>
+            <m:r>
+              <m:rPr>
+                <m:sty m:val="p"/>
+              </m:rPr>
+              <m:t>,</m:t>
+            </m:r>
+            <m:r>
+              <m:t>3</m:t>
+            </m:r>
+            <m:r>
+              <m:rPr>
+                <m:sty m:val="p"/>
+              </m:rPr>
+              <m:t>,</m:t>
+            </m:r>
+            <m:r>
+              <m:t>5</m:t>
+            </m:r>
+          </m:e>
+        </m:d>
+        <m:r>
+          <m:t>​</m:t>
+        </m:r>
+      </m:oMath>
+      <w:r>
+        <w:t xml:space="preserve"> </w:t>
+      </w:r>
+      <w:r>
+        <w:t xml:space="preserve">are mutually exclusive,</w:t>
+      </w:r>
+      <w:r>
+        <w:t xml:space="preserve"> </w:t>
+      </w:r>
+      <w:r>
+        <w:t xml:space="preserve">and their union is</w:t>
+      </w:r>
+      <w:r>
+        <w:t xml:space="preserve"> </w:t>
+      </w:r>
+      <m:oMath>
+        <m:r>
+          <m:rPr>
+            <m:sty m:val="p"/>
+          </m:rPr>
+          <m:t>Ω</m:t>
+        </m:r>
+        <m:r>
+          <m:rPr>
+            <m:sty m:val="p"/>
+          </m:rPr>
+          <m:t>=</m:t>
+        </m:r>
+        <m:r>
+          <m:t>​</m:t>
+        </m:r>
+        <m:d>
+          <m:dPr>
+            <m:begChr m:val="{"/>
+            <m:sepChr m:val=""/>
+            <m:endChr m:val="}"/>
+            <m:grow/>
+          </m:dPr>
+          <m:e>
+            <m:r>
+              <m:t>1</m:t>
+            </m:r>
+            <m:r>
+              <m:rPr>
+                <m:sty m:val="p"/>
+              </m:rPr>
+              <m:t>,</m:t>
+            </m:r>
+            <m:r>
+              <m:t>2</m:t>
+            </m:r>
+            <m:r>
+              <m:rPr>
+                <m:sty m:val="p"/>
+              </m:rPr>
+              <m:t>,</m:t>
+            </m:r>
+            <m:r>
+              <m:t>3</m:t>
+            </m:r>
+            <m:r>
+              <m:rPr>
+                <m:sty m:val="p"/>
+              </m:rPr>
+              <m:t>,</m:t>
+            </m:r>
+            <m:r>
+              <m:t>4</m:t>
+            </m:r>
+            <m:r>
+              <m:rPr>
+                <m:sty m:val="p"/>
+              </m:rPr>
+              <m:t>,</m:t>
+            </m:r>
+            <m:r>
+              <m:t>5</m:t>
+            </m:r>
+            <m:r>
+              <m:rPr>
+                <m:sty m:val="p"/>
+              </m:rPr>
+              <m:t>,</m:t>
+            </m:r>
+            <m:r>
+              <m:t>6</m:t>
+            </m:r>
+          </m:e>
+        </m:d>
+        <m:r>
+          <m:t>​</m:t>
+        </m:r>
+      </m:oMath>
+      <w:r>
+        <w:t xml:space="preserve">,</w:t>
+      </w:r>
+      <w:r>
+        <w:t xml:space="preserve"> </w:t>
+      </w:r>
+      <w:r>
+        <w:t xml:space="preserve">so they partition</w:t>
+      </w:r>
+      <w:r>
+        <w:t xml:space="preserve"> </w:t>
+      </w:r>
+      <m:oMath>
+        <m:r>
+          <m:rPr>
+            <m:sty m:val="p"/>
+          </m:rPr>
+          <m:t>Ω</m:t>
+        </m:r>
+      </m:oMath>
+      <w:r>
+        <w:t xml:space="preserve">.</w:t>
+      </w:r>
+    </w:p>
+    <w:bookmarkEnd w:id="44"/>
+    <w:bookmarkStart w:id="46" w:name="def-probability"/>
+    <w:p>
+      <w:pPr>
+        <w:pStyle w:val="BodyText"/>
+      </w:pPr>
+      <w:r>
+        <w:rPr>
+          <w:b/>
+          <w:bCs/>
+        </w:rPr>
+        <w:t xml:space="preserve">Definition 11 (Probability measure (probability function))</w:t>
+      </w:r>
+      <w:r>
+        <w:t xml:space="preserve"> </w:t>
+      </w:r>
+      <w:r>
+        <w:t xml:space="preserve">A</w:t>
+      </w:r>
+      <w:r>
+        <w:t xml:space="preserve"> </w:t>
+      </w:r>
+      <w:r>
+        <w:rPr>
+          <w:b/>
+          <w:bCs/>
+        </w:rPr>
+        <w:t xml:space="preserve">probability measure</w:t>
+      </w:r>
+      <w:r>
+        <w:t xml:space="preserve"> </w:t>
+      </w:r>
+      <w:r>
+        <w:t xml:space="preserve">(also called a</w:t>
+      </w:r>
+      <w:r>
+        <w:t xml:space="preserve"> </w:t>
+      </w:r>
+      <w:r>
+        <w:rPr>
+          <w:b/>
+          <w:bCs/>
+        </w:rPr>
+        <w:t xml:space="preserve">probability function</w:t>
+      </w:r>
+      <w:r>
+        <w:t xml:space="preserve"> </w:t>
+      </w:r>
+      <w:r>
+        <w:t xml:space="preserve">[4], Definition 1.2.4</w:t>
+      </w:r>
+      <w:r>
+        <w:t xml:space="preserve">)</w:t>
+      </w:r>
+      <w:r>
+        <w:t xml:space="preserve"> </w:t>
+      </w:r>
+      <w:r>
+        <w:t xml:space="preserve">on a</w:t>
+      </w:r>
+      <w:r>
+        <w:t xml:space="preserve"> </w:t>
+      </w:r>
+      <w:hyperlink w:anchor="def-sample-space">
+        <w:r>
+          <w:rPr>
+            <w:rStyle w:val="Hyperlink"/>
+          </w:rPr>
+          <w:t xml:space="preserve">sample space</w:t>
+        </w:r>
+      </w:hyperlink>
+      <w:r>
+        <w:t xml:space="preserve"> </w:t>
+      </w:r>
+      <m:oMath>
+        <m:r>
+          <m:rPr>
+            <m:sty m:val="p"/>
+          </m:rPr>
+          <m:t>Ω</m:t>
+        </m:r>
+      </m:oMath>
+      <w:r>
+        <w:t xml:space="preserve">,</w:t>
+      </w:r>
+      <w:r>
+        <w:t xml:space="preserve"> </w:t>
+      </w:r>
+      <w:r>
         <w:t xml:space="preserve">often denoted</w:t>
       </w:r>
       <w:r>
@@ -3678,7 +4825,7 @@
       <w:r>
         <w:t xml:space="preserve"> </w:t>
       </w:r>
-      <w:hyperlink r:id="rId40">
+      <w:hyperlink r:id="rId45">
         <w:r>
           <w:rPr>
             <w:rStyle w:val="Hyperlink"/>
@@ -3781,8 +4928,8 @@
         </m:oMath>
       </m:oMathPara>
     </w:p>
-    <w:bookmarkEnd w:id="41"/>
-    <w:bookmarkStart w:id="43" w:name="exm-probability"/>
+    <w:bookmarkEnd w:id="46"/>
+    <w:bookmarkStart w:id="48" w:name="exm-probability"/>
     <w:p>
       <w:pPr>
         <w:pStyle w:val="FirstParagraph"/>
@@ -3792,7 +4939,7 @@
           <w:b/>
           <w:bCs/>
         </w:rPr>
-        <w:t xml:space="preserve">Example 12 (Probability measure for a fair die)</w:t>
+        <w:t xml:space="preserve">Example 14 (Probability measure for a fair die)</w:t>
       </w:r>
       <w:r>
         <w:t xml:space="preserve"> </w:t>
@@ -4032,7 +5179,7 @@
       <w:r>
         <w:t xml:space="preserve">(</w:t>
       </w:r>
-      <w:hyperlink r:id="rId42">
+      <w:hyperlink r:id="rId47">
         <w:r>
           <w:rPr>
             <w:rStyle w:val="Hyperlink"/>
@@ -4052,7 +5199,7 @@
       <w:r>
         <w:t xml:space="preserve"> </w:t>
       </w:r>
-      <w:hyperlink r:id="rId40">
+      <w:hyperlink r:id="rId45">
         <w:r>
           <w:rPr>
             <w:rStyle w:val="Hyperlink"/>
@@ -4326,8 +5473,8 @@
         </m:oMath>
       </m:oMathPara>
     </w:p>
-    <w:bookmarkEnd w:id="43"/>
-    <w:bookmarkStart w:id="45" w:name="cor-probability-finitely-additive"/>
+    <w:bookmarkEnd w:id="48"/>
+    <w:bookmarkStart w:id="50" w:name="cor-probability-finitely-additive"/>
     <w:p>
       <w:pPr>
         <w:pStyle w:val="FirstParagraph"/>
@@ -4365,7 +5512,7 @@
       <w:r>
         <w:t xml:space="preserve"> </w:t>
       </w:r>
-      <w:hyperlink r:id="rId44">
+      <w:hyperlink r:id="rId49">
         <w:r>
           <w:rPr>
             <w:rStyle w:val="Hyperlink"/>
@@ -4587,7 +5734,7 @@
         </m:oMath>
       </m:oMathPara>
     </w:p>
-    <w:bookmarkEnd w:id="45"/>
+    <w:bookmarkEnd w:id="50"/>
     <w:p>
       <w:pPr>
         <w:pStyle w:val="FirstParagraph"/>
@@ -4625,7 +5772,7 @@
       <w:r>
         <w:t xml:space="preserve"> </w:t>
       </w:r>
-      <w:hyperlink r:id="rId46">
+      <w:hyperlink r:id="rId51">
         <w:r>
           <w:rPr>
             <w:rStyle w:val="Hyperlink"/>
@@ -4640,7 +5787,7 @@
         <w:t xml:space="preserve">applies to it.</w:t>
       </w:r>
     </w:p>
-    <w:bookmarkStart w:id="47" w:name="thm-continuity-probability"/>
+    <w:bookmarkStart w:id="52" w:name="thm-continuity-probability"/>
     <w:p>
       <w:pPr>
         <w:pStyle w:val="BodyText"/>
@@ -4866,7 +6013,7 @@
         </m:oMath>
       </m:oMathPara>
     </w:p>
-    <w:bookmarkEnd w:id="47"/>
+    <w:bookmarkEnd w:id="52"/>
     <w:p>
       <w:pPr>
         <w:pStyle w:val="FirstParagraph"/>
@@ -5138,7 +6285,7 @@
       <w:r>
         <w:t xml:space="preserve"> </w:t>
       </w:r>
-      <w:hyperlink r:id="rId48">
+      <w:hyperlink r:id="rId53">
         <w:r>
           <w:rPr>
             <w:rStyle w:val="Hyperlink"/>
@@ -7662,7 +8809,7 @@
         <w:t xml:space="preserve">valid.</w:t>
       </w:r>
     </w:p>
-    <w:bookmarkStart w:id="50" w:name="thm-kolmogorov-axioms"/>
+    <w:bookmarkStart w:id="55" w:name="thm-kolmogorov-axioms"/>
     <w:p>
       <w:pPr>
         <w:pStyle w:val="BodyText"/>
@@ -7932,7 +9079,7 @@
       <w:r>
         <w:t xml:space="preserve"> </w:t>
       </w:r>
-      <w:hyperlink r:id="rId49">
+      <w:hyperlink r:id="rId54">
         <w:r>
           <w:rPr>
             <w:rStyle w:val="Hyperlink"/>
@@ -8167,7 +9314,7 @@
         </m:oMath>
       </m:oMathPara>
     </w:p>
-    <w:bookmarkEnd w:id="50"/>
+    <w:bookmarkEnd w:id="55"/>
     <w:p>
       <w:pPr>
         <w:pStyle w:val="FirstParagraph"/>
@@ -8211,7 +9358,7 @@
       <w:r>
         <w:t xml:space="preserve"> </w:t>
       </w:r>
-      <w:hyperlink r:id="rId40">
+      <w:hyperlink r:id="rId45">
         <w:r>
           <w:rPr>
             <w:rStyle w:val="Hyperlink"/>
@@ -8225,7 +9372,7 @@
       <w:r>
         <w:t xml:space="preserve"> </w:t>
       </w:r>
-      <w:hyperlink r:id="rId51">
+      <w:hyperlink r:id="rId56">
         <w:r>
           <w:rPr>
             <w:rStyle w:val="Hyperlink"/>
@@ -8453,7 +9600,7 @@
       <w:r>
         <w:t xml:space="preserve"> </w:t>
       </w:r>
-      <w:hyperlink r:id="rId49">
+      <w:hyperlink r:id="rId54">
         <w:r>
           <w:rPr>
             <w:rStyle w:val="Hyperlink"/>
@@ -8473,7 +9620,7 @@
       <w:r>
         <w:t xml:space="preserve"> </w:t>
       </w:r>
-      <w:hyperlink r:id="rId52">
+      <w:hyperlink r:id="rId57">
         <w:r>
           <w:rPr>
             <w:rStyle w:val="Hyperlink"/>
@@ -8635,7 +9782,7 @@
       <w:r>
         <w:t xml:space="preserve"> </w:t>
       </w:r>
-      <w:hyperlink r:id="rId40">
+      <w:hyperlink r:id="rId45">
         <w:r>
           <w:rPr>
             <w:rStyle w:val="Hyperlink"/>
@@ -8843,7 +9990,7 @@
         <w:t xml:space="preserve">the proof above derives it.</w:t>
       </w:r>
     </w:p>
-    <w:bookmarkStart w:id="53" w:name="thm-prob-subset"/>
+    <w:bookmarkStart w:id="58" w:name="thm-prob-subset"/>
     <w:p>
       <w:pPr>
         <w:pStyle w:val="BodyText"/>
@@ -8975,7 +10122,7 @@
         <w:t xml:space="preserve">.</w:t>
       </w:r>
     </w:p>
-    <w:bookmarkEnd w:id="53"/>
+    <w:bookmarkEnd w:id="58"/>
     <w:p>
       <w:pPr>
         <w:pStyle w:val="BodyText"/>
@@ -9139,7 +10286,7 @@
         <w:t xml:space="preserve">.</w:t>
       </w:r>
     </w:p>
-    <w:bookmarkStart w:id="54" w:name="thm-total-prob-1"/>
+    <w:bookmarkStart w:id="59" w:name="thm-total-prob-1"/>
     <w:p>
       <w:pPr>
         <w:pStyle w:val="BodyText"/>
@@ -9275,7 +10422,7 @@
         </m:oMath>
       </m:oMathPara>
     </w:p>
-    <w:bookmarkEnd w:id="54"/>
+    <w:bookmarkEnd w:id="59"/>
     <w:p>
       <w:pPr>
         <w:pStyle w:val="FirstParagraph"/>
@@ -9582,7 +10729,7 @@
         </m:oMath>
       </m:oMathPara>
     </w:p>
-    <w:bookmarkStart w:id="55" w:name="cor-p-neg0"/>
+    <w:bookmarkStart w:id="60" w:name="cor-p-neg0"/>
     <w:p>
       <w:pPr>
         <w:pStyle w:val="FirstParagraph"/>
@@ -9687,7 +10834,7 @@
         </m:oMath>
       </m:oMathPara>
     </w:p>
-    <w:bookmarkEnd w:id="55"/>
+    <w:bookmarkEnd w:id="60"/>
     <w:p>
       <w:pPr>
         <w:pStyle w:val="FirstParagraph"/>
@@ -9752,7 +10899,7 @@
         <w:t xml:space="preserve">.</w:t>
       </w:r>
     </w:p>
-    <w:bookmarkStart w:id="56" w:name="cor-p-neg"/>
+    <w:bookmarkStart w:id="61" w:name="cor-p-neg"/>
     <w:p>
       <w:pPr>
         <w:pStyle w:val="BodyText"/>
@@ -9912,7 +11059,7 @@
         </m:oMath>
       </m:oMathPara>
     </w:p>
-    <w:bookmarkEnd w:id="56"/>
+    <w:bookmarkEnd w:id="61"/>
     <w:p>
       <w:pPr>
         <w:pStyle w:val="FirstParagraph"/>
@@ -10096,7 +11243,7 @@
         </m:oMath>
       </m:oMathPara>
     </w:p>
-    <w:bookmarkStart w:id="57" w:name="exm-p-neg"/>
+    <w:bookmarkStart w:id="62" w:name="exm-p-neg"/>
     <w:p>
       <w:pPr>
         <w:pStyle w:val="FirstParagraph"/>
@@ -10106,7 +11253,7 @@
           <w:b/>
           <w:bCs/>
         </w:rPr>
-        <w:t xml:space="preserve">Example 13 (Probability of not rolling a six)</w:t>
+        <w:t xml:space="preserve">Example 15 (Probability of not rolling a six)</w:t>
       </w:r>
       <w:r>
         <w:t xml:space="preserve"> </w:t>
@@ -10226,8 +11373,8 @@
         <w:t xml:space="preserve">.</w:t>
       </w:r>
     </w:p>
-    <w:bookmarkEnd w:id="57"/>
-    <w:bookmarkStart w:id="59" w:name="def-random-choice"/>
+    <w:bookmarkEnd w:id="62"/>
+    <w:bookmarkStart w:id="64" w:name="def-random-choice"/>
     <w:p>
       <w:pPr>
         <w:pStyle w:val="BodyText"/>
@@ -10262,7 +11409,7 @@
       <w:r>
         <w:t xml:space="preserve"> </w:t>
       </w:r>
-      <w:hyperlink r:id="rId40">
+      <w:hyperlink r:id="rId45">
         <w:r>
           <w:rPr>
             <w:rStyle w:val="Hyperlink"/>
@@ -10447,7 +11594,7 @@
       <w:r>
         <w:t xml:space="preserve"> </w:t>
       </w:r>
-      <w:hyperlink r:id="rId58">
+      <w:hyperlink r:id="rId63">
         <w:r>
           <w:rPr>
             <w:rStyle w:val="Hyperlink"/>
@@ -10473,8 +11620,8 @@
         <w:t xml:space="preserve">.</w:t>
       </w:r>
     </w:p>
-    <w:bookmarkEnd w:id="59"/>
-    <w:bookmarkStart w:id="61" w:name="exm-random-choice-sets"/>
+    <w:bookmarkEnd w:id="64"/>
+    <w:bookmarkStart w:id="66" w:name="exm-random-choice-sets"/>
     <w:p>
       <w:pPr>
         <w:pStyle w:val="BodyText"/>
@@ -10484,7 +11631,7 @@
           <w:b/>
           <w:bCs/>
         </w:rPr>
-        <w:t xml:space="preserve">Example 14 (Choosing at random from a finite set and from an interval)</w:t>
+        <w:t xml:space="preserve">Example 16 (Choosing at random from a finite set and from an interval)</w:t>
       </w:r>
       <w:r>
         <w:t xml:space="preserve"> </w:t>
@@ -10560,7 +11707,7 @@
       <w:r>
         <w:t xml:space="preserve"> </w:t>
       </w:r>
-      <w:hyperlink r:id="rId42">
+      <w:hyperlink r:id="rId47">
         <w:r>
           <w:rPr>
             <w:rStyle w:val="Hyperlink"/>
@@ -10911,7 +12058,7 @@
       <w:r>
         <w:t xml:space="preserve"> </w:t>
       </w:r>
-      <w:hyperlink r:id="rId60">
+      <w:hyperlink r:id="rId65">
         <m:oMath>
           <m:r>
             <m:rPr>
@@ -10976,8 +12123,8 @@
         <w:t xml:space="preserve">so they have no choice at random in this sense.</w:t>
       </w:r>
     </w:p>
-    <w:bookmarkEnd w:id="61"/>
-    <w:bookmarkStart w:id="62" w:name="exm-random-choice-auto"/>
+    <w:bookmarkEnd w:id="66"/>
+    <w:bookmarkStart w:id="67" w:name="exm-random-choice-auto"/>
     <w:p>
       <w:pPr>
         <w:pStyle w:val="BodyText"/>
@@ -10987,7 +12134,7 @@
           <w:b/>
           <w:bCs/>
         </w:rPr>
-        <w:t xml:space="preserve">Example 15 (Choosing a car at random from the Auto data)</w:t>
+        <w:t xml:space="preserve">Example 17 (Choosing a car at random from the Auto data)</w:t>
       </w:r>
       <w:r>
         <w:t xml:space="preserve"> </w:t>
@@ -11276,9 +12423,9 @@
         <w:t xml:space="preserve">#&gt; [1] 0.5076531</w:t>
       </w:r>
     </w:p>
-    <w:bookmarkEnd w:id="62"/>
-    <w:bookmarkEnd w:id="63"/>
-    <w:bookmarkStart w:id="68" w:name="odds"/>
+    <w:bookmarkEnd w:id="67"/>
+    <w:bookmarkEnd w:id="68"/>
+    <w:bookmarkStart w:id="73" w:name="odds"/>
     <w:p>
       <w:pPr>
         <w:pStyle w:val="Heading2"/>
@@ -11287,7 +12434,7 @@
         <w:t xml:space="preserve">2 Odds</w:t>
       </w:r>
     </w:p>
-    <w:bookmarkStart w:id="64" w:name="def-odds"/>
+    <w:bookmarkStart w:id="69" w:name="def-odds"/>
     <w:p>
       <w:pPr>
         <w:pStyle w:val="FirstParagraph"/>
@@ -11585,8 +12732,8 @@
         </m:oMath>
       </m:oMathPara>
     </w:p>
-    <w:bookmarkEnd w:id="64"/>
-    <w:bookmarkStart w:id="65" w:name="exm-odds-auto"/>
+    <w:bookmarkEnd w:id="69"/>
+    <w:bookmarkStart w:id="70" w:name="exm-odds-auto"/>
     <w:p>
       <w:pPr>
         <w:pStyle w:val="FirstParagraph"/>
@@ -11596,7 +12743,7 @@
           <w:b/>
           <w:bCs/>
         </w:rPr>
-        <w:t xml:space="preserve">Example 16 (Odds that a car in the Auto data is American)</w:t>
+        <w:t xml:space="preserve">Example 18 (Odds that a car in the Auto data is American)</w:t>
       </w:r>
       <w:r>
         <w:t xml:space="preserve"> </w:t>
@@ -11727,7 +12874,7 @@
           <w:rPr>
             <w:rStyle w:val="Hyperlink"/>
           </w:rPr>
-          <w:t xml:space="preserve">Example 15</w:t>
+          <w:t xml:space="preserve">Example 17</w:t>
         </w:r>
       </w:hyperlink>
       <w:r>
@@ -12000,8 +13147,8 @@
         <w:t xml:space="preserve">as a car of non-American origin.</w:t>
       </w:r>
     </w:p>
-    <w:bookmarkEnd w:id="65"/>
-    <w:bookmarkStart w:id="66" w:name="def-log-odds"/>
+    <w:bookmarkEnd w:id="70"/>
+    <w:bookmarkStart w:id="71" w:name="def-log-odds"/>
     <w:p>
       <w:pPr>
         <w:pStyle w:val="BodyText"/>
@@ -12333,8 +13480,8 @@
         </m:oMath>
       </m:oMathPara>
     </w:p>
-    <w:bookmarkEnd w:id="66"/>
-    <w:bookmarkStart w:id="67" w:name="exm-log-odds-auto"/>
+    <w:bookmarkEnd w:id="71"/>
+    <w:bookmarkStart w:id="72" w:name="exm-log-odds-auto"/>
     <w:p>
       <w:pPr>
         <w:pStyle w:val="FirstParagraph"/>
@@ -12344,7 +13491,7 @@
           <w:b/>
           <w:bCs/>
         </w:rPr>
-        <w:t xml:space="preserve">Example 17 (Log-odds that a car in the Auto data is American)</w:t>
+        <w:t xml:space="preserve">Example 19 (Log-odds that a car in the Auto data is American)</w:t>
       </w:r>
       <w:r>
         <w:t xml:space="preserve"> </w:t>
@@ -12385,7 +13532,7 @@
           <w:rPr>
             <w:rStyle w:val="Hyperlink"/>
           </w:rPr>
-          <w:t xml:space="preserve">Example 16</w:t>
+          <w:t xml:space="preserve">Example 18</w:t>
         </w:r>
       </w:hyperlink>
       <w:r>
@@ -12525,9 +13672,9 @@
         <w:t xml:space="preserve">an American car is more likely than not.</w:t>
       </w:r>
     </w:p>
-    <w:bookmarkEnd w:id="67"/>
-    <w:bookmarkEnd w:id="68"/>
-    <w:bookmarkStart w:id="94" w:name="conditional-probability"/>
+    <w:bookmarkEnd w:id="72"/>
+    <w:bookmarkEnd w:id="73"/>
+    <w:bookmarkStart w:id="99" w:name="conditional-probability"/>
     <w:p>
       <w:pPr>
         <w:pStyle w:val="Heading2"/>
@@ -12536,7 +13683,7 @@
         <w:t xml:space="preserve">3 Conditional probability</w:t>
       </w:r>
     </w:p>
-    <w:bookmarkStart w:id="69" w:name="def-conditional-prob"/>
+    <w:bookmarkStart w:id="74" w:name="def-conditional-prob"/>
     <w:p>
       <w:pPr>
         <w:pStyle w:val="FirstParagraph"/>
@@ -12839,7 +13986,7 @@
         </m:oMath>
       </m:oMathPara>
     </w:p>
-    <w:bookmarkEnd w:id="69"/>
+    <w:bookmarkEnd w:id="74"/>
     <w:p>
       <w:pPr>
         <w:pStyle w:val="FirstParagraph"/>
@@ -12971,7 +14118,7 @@
         <w:t xml:space="preserve">.</w:t>
       </w:r>
     </w:p>
-    <w:bookmarkStart w:id="70" w:name="exm-conditional-prob"/>
+    <w:bookmarkStart w:id="75" w:name="exm-conditional-prob"/>
     <w:p>
       <w:pPr>
         <w:pStyle w:val="BodyText"/>
@@ -12981,7 +14128,7 @@
           <w:b/>
           <w:bCs/>
         </w:rPr>
-        <w:t xml:space="preserve">Example 18 (Rolling a six, given an even roll)</w:t>
+        <w:t xml:space="preserve">Example 20 (Rolling a six, given an even roll)</w:t>
       </w:r>
       <w:r>
         <w:t xml:space="preserve"> </w:t>
@@ -12994,7 +14141,7 @@
           <w:rPr>
             <w:rStyle w:val="Hyperlink"/>
           </w:rPr>
-          <w:t xml:space="preserve">Example 12</w:t>
+          <w:t xml:space="preserve">Example 14</w:t>
         </w:r>
       </w:hyperlink>
       <w:r>
@@ -13375,8 +14522,8 @@
         </m:oMath>
       </m:oMathPara>
     </w:p>
-    <w:bookmarkEnd w:id="70"/>
-    <w:bookmarkStart w:id="71" w:name="thm-law-conditional-prob"/>
+    <w:bookmarkEnd w:id="75"/>
+    <w:bookmarkStart w:id="76" w:name="thm-law-conditional-prob"/>
     <w:p>
       <w:pPr>
         <w:pStyle w:val="FirstParagraph"/>
@@ -13566,7 +14713,7 @@
         </m:oMath>
       </m:oMathPara>
     </w:p>
-    <w:bookmarkEnd w:id="71"/>
+    <w:bookmarkEnd w:id="76"/>
     <w:p>
       <w:pPr>
         <w:pStyle w:val="FirstParagraph"/>
@@ -13866,7 +15013,7 @@
         </m:oMath>
       </m:oMathPara>
     </w:p>
-    <w:bookmarkStart w:id="72" w:name="exm-law-conditional-prob"/>
+    <w:bookmarkStart w:id="77" w:name="exm-law-conditional-prob"/>
     <w:p>
       <w:pPr>
         <w:pStyle w:val="FirstParagraph"/>
@@ -13876,7 +15023,7 @@
           <w:b/>
           <w:bCs/>
         </w:rPr>
-        <w:t xml:space="preserve">Example 19 (Applying the law of conditional probability)</w:t>
+        <w:t xml:space="preserve">Example 21 (Applying the law of conditional probability)</w:t>
       </w:r>
       <w:r>
         <w:t xml:space="preserve"> </w:t>
@@ -14198,8 +15345,8 @@
         </m:oMath>
       </m:oMathPara>
     </w:p>
-    <w:bookmarkEnd w:id="72"/>
-    <w:bookmarkStart w:id="73" w:name="thm-total-prob"/>
+    <w:bookmarkEnd w:id="77"/>
+    <w:bookmarkStart w:id="78" w:name="thm-total-prob"/>
     <w:p>
       <w:pPr>
         <w:pStyle w:val="FirstParagraph"/>
@@ -14524,7 +15671,7 @@
         </m:oMath>
       </m:oMathPara>
     </w:p>
-    <w:bookmarkEnd w:id="73"/>
+    <w:bookmarkEnd w:id="78"/>
     <w:p>
       <w:pPr>
         <w:pStyle w:val="FirstParagraph"/>
@@ -14698,7 +15845,7 @@
       <w:r>
         <w:t xml:space="preserve"> </w:t>
       </w:r>
-      <w:hyperlink r:id="rId49">
+      <w:hyperlink r:id="rId54">
         <w:r>
           <w:rPr>
             <w:rStyle w:val="Hyperlink"/>
@@ -15047,7 +16194,7 @@
         </m:oMath>
       </m:oMathPara>
     </w:p>
-    <w:bookmarkStart w:id="74" w:name="thm-bayes"/>
+    <w:bookmarkStart w:id="79" w:name="thm-bayes"/>
     <w:p>
       <w:pPr>
         <w:pStyle w:val="FirstParagraph"/>
@@ -15314,7 +16461,7 @@
         </m:oMath>
       </m:oMathPara>
     </w:p>
-    <w:bookmarkEnd w:id="74"/>
+    <w:bookmarkEnd w:id="79"/>
     <w:p>
       <w:pPr>
         <w:pStyle w:val="FirstParagraph"/>
@@ -15761,7 +16908,7 @@
         </m:oMath>
       </m:oMathPara>
     </w:p>
-    <w:bookmarkStart w:id="75" w:name="exm-bayes"/>
+    <w:bookmarkStart w:id="80" w:name="exm-bayes"/>
     <w:p>
       <w:pPr>
         <w:pStyle w:val="FirstParagraph"/>
@@ -15771,7 +16918,7 @@
           <w:b/>
           <w:bCs/>
         </w:rPr>
-        <w:t xml:space="preserve">Example 20 (Positive predictive value of a medical test)</w:t>
+        <w:t xml:space="preserve">Example 22 (Positive predictive value of a medical test)</w:t>
       </w:r>
       <w:r>
         <w:t xml:space="preserve"> </w:t>
@@ -16797,8 +17944,8 @@
         <w:t xml:space="preserve">because the disease prevalence is relatively low (7%).</w:t>
       </w:r>
     </w:p>
-    <w:bookmarkEnd w:id="75"/>
-    <w:bookmarkStart w:id="76" w:name="exr-bayes"/>
+    <w:bookmarkEnd w:id="80"/>
+    <w:bookmarkStart w:id="81" w:name="exr-bayes"/>
     <w:p>
       <w:pPr>
         <w:pStyle w:val="BodyText"/>
@@ -17136,8 +18283,8 @@
         <w:t xml:space="preserve">, and none of them jointly.</w:t>
       </w:r>
     </w:p>
-    <w:bookmarkEnd w:id="76"/>
-    <w:bookmarkStart w:id="78" w:name="sol-bayes"/>
+    <w:bookmarkEnd w:id="81"/>
+    <w:bookmarkStart w:id="83" w:name="sol-bayes"/>
     <w:p>
       <w:pPr>
         <w:pStyle w:val="BodyText"/>
@@ -17451,7 +18598,7 @@
       <w:pPr>
         <w:pStyle w:val="BodyText"/>
       </w:pPr>
-      <w:bookmarkStart w:id="77" w:name="eq-bayes"/>
+      <w:bookmarkStart w:id="82" w:name="eq-bayes"/>
       <m:oMathPara>
         <m:oMathParaPr>
           <m:jc m:val="center"/>
@@ -17597,7 +18744,7 @@
           </m:r>
         </m:oMath>
       </m:oMathPara>
-      <w:bookmarkEnd w:id="77"/>
+      <w:bookmarkEnd w:id="82"/>
     </w:p>
     <w:p>
       <w:pPr>
@@ -18178,8 +19325,8 @@
         <w:t xml:space="preserve">decreases it.</w:t>
       </w:r>
     </w:p>
-    <w:bookmarkEnd w:id="78"/>
-    <w:bookmarkStart w:id="79" w:name="exr-base-rate"/>
+    <w:bookmarkEnd w:id="83"/>
+    <w:bookmarkStart w:id="84" w:name="exr-base-rate"/>
     <w:p>
       <w:pPr>
         <w:pStyle w:val="BodyText"/>
@@ -18284,8 +19431,8 @@
         <w:t xml:space="preserve">.</w:t>
       </w:r>
     </w:p>
-    <w:bookmarkEnd w:id="79"/>
-    <w:bookmarkStart w:id="80" w:name="sol-base-rate"/>
+    <w:bookmarkEnd w:id="84"/>
+    <w:bookmarkStart w:id="85" w:name="sol-base-rate"/>
     <w:p>
       <w:pPr>
         <w:pStyle w:val="BodyText"/>
@@ -19256,7 +20403,7 @@
         <w:t xml:space="preserve">and it illustrates why raw accuracy can be misleading on rare events.</w:t>
       </w:r>
     </w:p>
-    <w:bookmarkEnd w:id="80"/>
+    <w:bookmarkEnd w:id="85"/>
     <w:tbl>
       <w:tblPr>
         <w:tblStyle w:val="Table"/>
@@ -19298,18 +20445,18 @@
                 <wp:inline>
                   <wp:extent cx="152400" cy="152400"/>
                   <wp:effectExtent b="0" l="0" r="0" t="0"/>
-                  <wp:docPr descr="" title="" id="82" name="Picture"/>
+                  <wp:docPr descr="" title="" id="87" name="Picture"/>
                   <a:graphic>
                     <a:graphicData uri="http://schemas.openxmlformats.org/drawingml/2006/picture">
                       <pic:pic>
                         <pic:nvPicPr>
-                          <pic:cNvPr descr="/opt/quarto/share/formats/docx/tip.png" id="83" name="Picture"/>
+                          <pic:cNvPr descr="/opt/quarto/share/formats/docx/tip.png" id="88" name="Picture"/>
                           <pic:cNvPicPr>
                             <a:picLocks noChangeArrowheads="1" noChangeAspect="1"/>
                           </pic:cNvPicPr>
                         </pic:nvPicPr>
                         <pic:blipFill>
-                          <a:blip r:embed="rId81"/>
+                          <a:blip r:embed="rId86"/>
                           <a:stretch>
                             <a:fillRect/>
                           </a:stretch>
@@ -19371,7 +20518,7 @@
             <w:r>
               <w:t xml:space="preserve"> </w:t>
             </w:r>
-            <w:hyperlink r:id="rId84">
+            <w:hyperlink r:id="rId89">
               <w:r>
                 <w:rPr>
                   <w:rStyle w:val="Hyperlink"/>
@@ -19415,7 +20562,7 @@
             <w:r>
               <w:t xml:space="preserve"> </w:t>
             </w:r>
-            <w:hyperlink r:id="rId85">
+            <w:hyperlink r:id="rId90">
               <w:r>
                 <w:rPr>
                   <w:rStyle w:val="Hyperlink"/>
@@ -19480,18 +20627,18 @@
                 <wp:inline>
                   <wp:extent cx="152400" cy="152400"/>
                   <wp:effectExtent b="0" l="0" r="0" t="0"/>
-                  <wp:docPr descr="" title="" id="86" name="Picture"/>
+                  <wp:docPr descr="" title="" id="91" name="Picture"/>
                   <a:graphic>
                     <a:graphicData uri="http://schemas.openxmlformats.org/drawingml/2006/picture">
                       <pic:pic>
                         <pic:nvPicPr>
-                          <pic:cNvPr descr="/opt/quarto/share/formats/docx/tip.png" id="87" name="Picture"/>
+                          <pic:cNvPr descr="/opt/quarto/share/formats/docx/tip.png" id="92" name="Picture"/>
                           <pic:cNvPicPr>
                             <a:picLocks noChangeArrowheads="1" noChangeAspect="1"/>
                           </pic:cNvPicPr>
                         </pic:nvPicPr>
                         <pic:blipFill>
-                          <a:blip r:embed="rId81"/>
+                          <a:blip r:embed="rId86"/>
                           <a:stretch>
                             <a:fillRect/>
                           </a:stretch>
@@ -19553,7 +20700,7 @@
             <w:r>
               <w:t xml:space="preserve"> </w:t>
             </w:r>
-            <w:hyperlink r:id="rId88">
+            <w:hyperlink r:id="rId93">
               <w:r>
                 <w:rPr>
                   <w:rStyle w:val="Hyperlink"/>
@@ -19603,7 +20750,7 @@
       <w:r>
         <w:t xml:space="preserve"> </w:t>
       </w:r>
-      <w:hyperlink r:id="rId89">
+      <w:hyperlink r:id="rId94">
         <w:r>
           <w:rPr>
             <w:rStyle w:val="Hyperlink"/>
@@ -19620,7 +20767,7 @@
       <w:r>
         <w:t xml:space="preserve"> </w:t>
       </w:r>
-      <w:hyperlink r:id="rId90">
+      <w:hyperlink r:id="rId95">
         <w:r>
           <w:rPr>
             <w:rStyle w:val="Hyperlink"/>
@@ -19673,18 +20820,18 @@
                 <wp:inline>
                   <wp:extent cx="152400" cy="152400"/>
                   <wp:effectExtent b="0" l="0" r="0" t="0"/>
-                  <wp:docPr descr="" title="" id="91" name="Picture"/>
+                  <wp:docPr descr="" title="" id="96" name="Picture"/>
                   <a:graphic>
                     <a:graphicData uri="http://schemas.openxmlformats.org/drawingml/2006/picture">
                       <pic:pic>
                         <pic:nvPicPr>
-                          <pic:cNvPr descr="/opt/quarto/share/formats/docx/tip.png" id="92" name="Picture"/>
+                          <pic:cNvPr descr="/opt/quarto/share/formats/docx/tip.png" id="97" name="Picture"/>
                           <pic:cNvPicPr>
                             <a:picLocks noChangeArrowheads="1" noChangeAspect="1"/>
                           </pic:cNvPicPr>
                         </pic:nvPicPr>
                         <pic:blipFill>
-                          <a:blip r:embed="rId81"/>
+                          <a:blip r:embed="rId86"/>
                           <a:stretch>
                             <a:fillRect/>
                           </a:stretch>
@@ -19775,7 +20922,7 @@
             <w:r>
               <w:t xml:space="preserve"> </w:t>
             </w:r>
-            <w:hyperlink r:id="rId93">
+            <w:hyperlink r:id="rId98">
               <w:r>
                 <w:rPr>
                   <w:rStyle w:val="Hyperlink"/>
@@ -19817,8 +20964,8 @@
         </w:tc>
       </w:tr>
     </w:tbl>
-    <w:bookmarkEnd w:id="94"/>
-    <w:bookmarkStart w:id="129" w:name="references"/>
+    <w:bookmarkEnd w:id="99"/>
+    <w:bookmarkStart w:id="134" w:name="references"/>
     <w:p>
       <w:pPr>
         <w:pStyle w:val="Heading2"/>
@@ -19827,8 +20974,8 @@
         <w:t xml:space="preserve">References</w:t>
       </w:r>
     </w:p>
-    <w:bookmarkStart w:id="128" w:name="refs"/>
-    <w:bookmarkStart w:id="96" w:name="X0323630174b5cbd87b45a7fef24ef56ec3bdd6b"/>
+    <w:bookmarkStart w:id="133" w:name="refs"/>
+    <w:bookmarkStart w:id="101" w:name="X0323630174b5cbd87b45a7fef24ef56ec3bdd6b"/>
     <w:p>
       <w:pPr>
         <w:pStyle w:val="Bibliography"/>
@@ -19875,7 +21022,7 @@
       <w:r>
         <w:t xml:space="preserve"> </w:t>
       </w:r>
-      <w:hyperlink r:id="rId95">
+      <w:hyperlink r:id="rId100">
         <w:r>
           <w:rPr>
             <w:rStyle w:val="Hyperlink"/>
@@ -19884,8 +21031,8 @@
         </w:r>
       </w:hyperlink>
     </w:p>
-    <w:bookmarkEnd w:id="96"/>
-    <w:bookmarkStart w:id="98" w:name="ref-wikipedia_sample_space"/>
+    <w:bookmarkEnd w:id="101"/>
+    <w:bookmarkStart w:id="103" w:name="ref-wikipedia_sample_space"/>
     <w:p>
       <w:pPr>
         <w:pStyle w:val="Bibliography"/>
@@ -19932,7 +21079,7 @@
       <w:r>
         <w:t xml:space="preserve"> </w:t>
       </w:r>
-      <w:hyperlink r:id="rId97">
+      <w:hyperlink r:id="rId102">
         <w:r>
           <w:rPr>
             <w:rStyle w:val="Hyperlink"/>
@@ -19941,8 +21088,8 @@
         </w:r>
       </w:hyperlink>
     </w:p>
-    <w:bookmarkEnd w:id="98"/>
-    <w:bookmarkStart w:id="100" w:name="ref-wikipedia_event_probability_theory"/>
+    <w:bookmarkEnd w:id="103"/>
+    <w:bookmarkStart w:id="105" w:name="ref-wikipedia_event_probability_theory"/>
     <w:p>
       <w:pPr>
         <w:pStyle w:val="Bibliography"/>
@@ -19989,7 +21136,7 @@
       <w:r>
         <w:t xml:space="preserve"> </w:t>
       </w:r>
-      <w:hyperlink r:id="rId99">
+      <w:hyperlink r:id="rId104">
         <w:r>
           <w:rPr>
             <w:rStyle w:val="Hyperlink"/>
@@ -19998,8 +21145,8 @@
         </w:r>
       </w:hyperlink>
     </w:p>
-    <w:bookmarkEnd w:id="100"/>
-    <w:bookmarkStart w:id="102" w:name="ref-CaseBerg01"/>
+    <w:bookmarkEnd w:id="105"/>
+    <w:bookmarkStart w:id="107" w:name="ref-CaseBerg01"/>
     <w:p>
       <w:pPr>
         <w:pStyle w:val="Bibliography"/>
@@ -20032,7 +21179,7 @@
       <w:r>
         <w:t xml:space="preserve"> </w:t>
       </w:r>
-      <w:hyperlink r:id="rId101">
+      <w:hyperlink r:id="rId106">
         <w:r>
           <w:rPr>
             <w:rStyle w:val="Hyperlink"/>
@@ -20041,8 +21188,8 @@
         </w:r>
       </w:hyperlink>
     </w:p>
-    <w:bookmarkEnd w:id="102"/>
-    <w:bookmarkStart w:id="104" w:name="ref-wikipedia_probability_space"/>
+    <w:bookmarkEnd w:id="107"/>
+    <w:bookmarkStart w:id="109" w:name="ref-wikipedia_probability_space"/>
     <w:p>
       <w:pPr>
         <w:pStyle w:val="Bibliography"/>
@@ -20089,7 +21236,7 @@
       <w:r>
         <w:t xml:space="preserve"> </w:t>
       </w:r>
-      <w:hyperlink r:id="rId103">
+      <w:hyperlink r:id="rId108">
         <w:r>
           <w:rPr>
             <w:rStyle w:val="Hyperlink"/>
@@ -20098,8 +21245,8 @@
         </w:r>
       </w:hyperlink>
     </w:p>
-    <w:bookmarkEnd w:id="104"/>
-    <w:bookmarkStart w:id="106" w:name="ref-wikipedia_probability_axioms"/>
+    <w:bookmarkEnd w:id="109"/>
+    <w:bookmarkStart w:id="111" w:name="ref-wikipedia_probability_axioms"/>
     <w:p>
       <w:pPr>
         <w:pStyle w:val="Bibliography"/>
@@ -20146,7 +21293,7 @@
       <w:r>
         <w:t xml:space="preserve"> </w:t>
       </w:r>
-      <w:hyperlink r:id="rId105">
+      <w:hyperlink r:id="rId110">
         <w:r>
           <w:rPr>
             <w:rStyle w:val="Hyperlink"/>
@@ -20155,8 +21302,8 @@
         </w:r>
       </w:hyperlink>
     </w:p>
-    <w:bookmarkEnd w:id="106"/>
-    <w:bookmarkStart w:id="108" w:name="ref-wikipedia_odds"/>
+    <w:bookmarkEnd w:id="111"/>
+    <w:bookmarkStart w:id="113" w:name="ref-wikipedia_odds"/>
     <w:p>
       <w:pPr>
         <w:pStyle w:val="Bibliography"/>
@@ -20203,7 +21350,7 @@
       <w:r>
         <w:t xml:space="preserve"> </w:t>
       </w:r>
-      <w:hyperlink r:id="rId107">
+      <w:hyperlink r:id="rId112">
         <w:r>
           <w:rPr>
             <w:rStyle w:val="Hyperlink"/>
@@ -20212,8 +21359,8 @@
         </w:r>
       </w:hyperlink>
     </w:p>
-    <w:bookmarkEnd w:id="108"/>
-    <w:bookmarkStart w:id="110" w:name="ref-wikipedia_logit"/>
+    <w:bookmarkEnd w:id="113"/>
+    <w:bookmarkStart w:id="115" w:name="ref-wikipedia_logit"/>
     <w:p>
       <w:pPr>
         <w:pStyle w:val="Bibliography"/>
@@ -20260,7 +21407,7 @@
       <w:r>
         <w:t xml:space="preserve"> </w:t>
       </w:r>
-      <w:hyperlink r:id="rId109">
+      <w:hyperlink r:id="rId114">
         <w:r>
           <w:rPr>
             <w:rStyle w:val="Hyperlink"/>
@@ -20269,8 +21416,8 @@
         </w:r>
       </w:hyperlink>
     </w:p>
-    <w:bookmarkEnd w:id="110"/>
-    <w:bookmarkStart w:id="112" w:name="ref-wikipedia_conditional_probability"/>
+    <w:bookmarkEnd w:id="115"/>
+    <w:bookmarkStart w:id="117" w:name="ref-wikipedia_conditional_probability"/>
     <w:p>
       <w:pPr>
         <w:pStyle w:val="Bibliography"/>
@@ -20317,7 +21464,7 @@
       <w:r>
         <w:t xml:space="preserve"> </w:t>
       </w:r>
-      <w:hyperlink r:id="rId111">
+      <w:hyperlink r:id="rId116">
         <w:r>
           <w:rPr>
             <w:rStyle w:val="Hyperlink"/>
@@ -20326,8 +21473,8 @@
         </w:r>
       </w:hyperlink>
     </w:p>
-    <w:bookmarkEnd w:id="112"/>
-    <w:bookmarkStart w:id="114" w:name="ref-ross-probsim"/>
+    <w:bookmarkEnd w:id="117"/>
+    <w:bookmarkStart w:id="119" w:name="ref-ross-probsim"/>
     <w:p>
       <w:pPr>
         <w:pStyle w:val="Bibliography"/>
@@ -20359,7 +21506,7 @@
       <w:r>
         <w:t xml:space="preserve"> </w:t>
       </w:r>
-      <w:hyperlink r:id="rId113">
+      <w:hyperlink r:id="rId118">
         <w:r>
           <w:rPr>
             <w:rStyle w:val="Hyperlink"/>
@@ -20368,8 +21515,8 @@
         </w:r>
       </w:hyperlink>
     </w:p>
-    <w:bookmarkEnd w:id="114"/>
-    <w:bookmarkStart w:id="116" w:name="ref-wikipedia_law_of_total_probability"/>
+    <w:bookmarkEnd w:id="119"/>
+    <w:bookmarkStart w:id="121" w:name="ref-wikipedia_law_of_total_probability"/>
     <w:p>
       <w:pPr>
         <w:pStyle w:val="Bibliography"/>
@@ -20416,7 +21563,7 @@
       <w:r>
         <w:t xml:space="preserve"> </w:t>
       </w:r>
-      <w:hyperlink r:id="rId115">
+      <w:hyperlink r:id="rId120">
         <w:r>
           <w:rPr>
             <w:rStyle w:val="Hyperlink"/>
@@ -20425,8 +21572,8 @@
         </w:r>
       </w:hyperlink>
     </w:p>
-    <w:bookmarkEnd w:id="116"/>
-    <w:bookmarkStart w:id="118" w:name="ref-wikipedia_bayes_theorem"/>
+    <w:bookmarkEnd w:id="121"/>
+    <w:bookmarkStart w:id="123" w:name="ref-wikipedia_bayes_theorem"/>
     <w:p>
       <w:pPr>
         <w:pStyle w:val="Bibliography"/>
@@ -20473,7 +21620,7 @@
       <w:r>
         <w:t xml:space="preserve"> </w:t>
       </w:r>
-      <w:hyperlink r:id="rId117">
+      <w:hyperlink r:id="rId122">
         <w:r>
           <w:rPr>
             <w:rStyle w:val="Hyperlink"/>
@@ -20482,8 +21629,8 @@
         </w:r>
       </w:hyperlink>
     </w:p>
-    <w:bookmarkEnd w:id="118"/>
-    <w:bookmarkStart w:id="119" w:name="ref-hutchinson2024data471"/>
+    <w:bookmarkEnd w:id="123"/>
+    <w:bookmarkStart w:id="124" w:name="ref-hutchinson2024data471"/>
     <w:p>
       <w:pPr>
         <w:pStyle w:val="Bibliography"/>
@@ -20522,8 +21669,8 @@
         <w:t xml:space="preserve">Western Washington University, 2024.</w:t>
       </w:r>
     </w:p>
-    <w:bookmarkEnd w:id="119"/>
-    <w:bookmarkStart w:id="121" w:name="ref-wikipedia_base_rate_fallacy"/>
+    <w:bookmarkEnd w:id="124"/>
+    <w:bookmarkStart w:id="126" w:name="ref-wikipedia_base_rate_fallacy"/>
     <w:p>
       <w:pPr>
         <w:pStyle w:val="Bibliography"/>
@@ -20570,7 +21717,7 @@
       <w:r>
         <w:t xml:space="preserve"> </w:t>
       </w:r>
-      <w:hyperlink r:id="rId120">
+      <w:hyperlink r:id="rId125">
         <w:r>
           <w:rPr>
             <w:rStyle w:val="Hyperlink"/>
@@ -20579,8 +21726,8 @@
         </w:r>
       </w:hyperlink>
     </w:p>
-    <w:bookmarkEnd w:id="121"/>
-    <w:bookmarkStart w:id="123" w:name="ref-hutchinson_wwu_ml_videos"/>
+    <w:bookmarkEnd w:id="126"/>
+    <w:bookmarkStart w:id="128" w:name="ref-hutchinson_wwu_ml_videos"/>
     <w:p>
       <w:pPr>
         <w:pStyle w:val="Bibliography"/>
@@ -20633,7 +21780,7 @@
       <w:r>
         <w:t xml:space="preserve"> </w:t>
       </w:r>
-      <w:hyperlink r:id="rId122">
+      <w:hyperlink r:id="rId127">
         <w:r>
           <w:rPr>
             <w:rStyle w:val="Hyperlink"/>
@@ -20642,8 +21789,8 @@
         </w:r>
       </w:hyperlink>
     </w:p>
-    <w:bookmarkEnd w:id="123"/>
-    <w:bookmarkStart w:id="125" w:name="ref-fiveminuteai_probstat"/>
+    <w:bookmarkEnd w:id="128"/>
+    <w:bookmarkStart w:id="130" w:name="ref-fiveminuteai_probstat"/>
     <w:p>
       <w:pPr>
         <w:pStyle w:val="Bibliography"/>
@@ -20675,7 +21822,7 @@
       <w:r>
         <w:t xml:space="preserve"> </w:t>
       </w:r>
-      <w:hyperlink r:id="rId124">
+      <w:hyperlink r:id="rId129">
         <w:r>
           <w:rPr>
             <w:rStyle w:val="Hyperlink"/>
@@ -20684,8 +21831,8 @@
         </w:r>
       </w:hyperlink>
     </w:p>
-    <w:bookmarkEnd w:id="125"/>
-    <w:bookmarkStart w:id="127" w:name="ref-lange2024applied"/>
+    <w:bookmarkEnd w:id="130"/>
+    <w:bookmarkStart w:id="132" w:name="ref-lange2024applied"/>
     <w:p>
       <w:pPr>
         <w:pStyle w:val="Bibliography"/>
@@ -20718,7 +21865,7 @@
       <w:r>
         <w:t xml:space="preserve"> </w:t>
       </w:r>
-      <w:hyperlink r:id="rId126">
+      <w:hyperlink r:id="rId131">
         <w:r>
           <w:rPr>
             <w:rStyle w:val="Hyperlink"/>
@@ -20730,9 +21877,9 @@
         <w:t xml:space="preserve">.</w:t>
       </w:r>
     </w:p>
-    <w:bookmarkEnd w:id="127"/>
-    <w:bookmarkEnd w:id="128"/>
-    <w:bookmarkEnd w:id="129"/>
+    <w:bookmarkEnd w:id="132"/>
+    <w:bookmarkEnd w:id="133"/>
+    <w:bookmarkEnd w:id="134"/>
     <w:sectPr>
       <w:footnotePr>
         <w:numRestart w:val="eachSect"/>

</xml_diff>

<commit_message>
Deploying to gh-pages from @ Morrison-Lab/pds@6367b9ba4437e60d76d0807ec6ccc6b216d75fb8 🚀
</commit_message>
<xml_diff>
--- a/probability-basics.docx
+++ b/probability-basics.docx
@@ -15,7 +15,7 @@
         <w:pStyle w:val="Date"/>
       </w:pPr>
       <w:r>
-        <w:t xml:space="preserve">Last modified: 2026-10-29 13:42:11 (PDT)</w:t>
+        <w:t xml:space="preserve">Last modified: 2026-10-29 13:56:59 (PDT)</w:t>
       </w:r>
     </w:p>
     <w:bookmarkStart w:id="68" w:name="defining-probabilities"/>
@@ -2190,7 +2190,7 @@
       </w:r>
     </w:p>
     <w:bookmarkEnd w:id="33"/>
-    <w:bookmarkStart w:id="34" w:name="def-complement"/>
+    <w:bookmarkStart w:id="35" w:name="def-complement"/>
     <w:p>
       <w:pPr>
         <w:pStyle w:val="BodyText"/>
@@ -2301,7 +2301,38 @@
         <w:t xml:space="preserve"> </w:t>
       </w:r>
       <w:r>
-        <w:t xml:space="preserve">the set of outcomes in the sample space</w:t>
+        <w:t xml:space="preserve">the</w:t>
+      </w:r>
+      <w:r>
+        <w:t xml:space="preserve"> </w:t>
+      </w:r>
+      <w:hyperlink r:id="rId21">
+        <w:r>
+          <w:rPr>
+            <w:rStyle w:val="Hyperlink"/>
+          </w:rPr>
+          <w:t xml:space="preserve">set</w:t>
+        </w:r>
+      </w:hyperlink>
+      <w:r>
+        <w:t xml:space="preserve"> </w:t>
+      </w:r>
+      <w:r>
+        <w:t xml:space="preserve">of elements</w:t>
+      </w:r>
+      <w:r>
+        <w:t xml:space="preserve"> </w:t>
+      </w:r>
+      <m:oMath>
+        <m:r>
+          <m:t>ω</m:t>
+        </m:r>
+      </m:oMath>
+      <w:r>
+        <w:t xml:space="preserve"> </w:t>
+      </w:r>
+      <w:r>
+        <w:t xml:space="preserve">of the sample space</w:t>
       </w:r>
       <w:r>
         <w:t xml:space="preserve"> </w:t>
@@ -2329,7 +2360,53 @@
         </m:r>
       </m:oMath>
       <w:r>
-        <w:t xml:space="preserve">.</w:t>
+        <w:t xml:space="preserve">,</w:t>
+      </w:r>
+      <w:r>
+        <w:t xml:space="preserve"> </w:t>
+      </w:r>
+      <w:r>
+        <w:t xml:space="preserve">or equivalently,</w:t>
+      </w:r>
+      <w:r>
+        <w:t xml:space="preserve"> </w:t>
+      </w:r>
+      <w:r>
+        <w:t xml:space="preserve">the</w:t>
+      </w:r>
+      <w:r>
+        <w:t xml:space="preserve"> </w:t>
+      </w:r>
+      <w:hyperlink r:id="rId34">
+        <w:r>
+          <w:rPr>
+            <w:rStyle w:val="Hyperlink"/>
+          </w:rPr>
+          <w:t xml:space="preserve">set difference</w:t>
+        </w:r>
+      </w:hyperlink>
+      <w:r>
+        <w:t xml:space="preserve"> </w:t>
+      </w:r>
+      <m:oMath>
+        <m:r>
+          <m:rPr>
+            <m:sty m:val="p"/>
+          </m:rPr>
+          <m:t>Ω</m:t>
+        </m:r>
+        <m:r>
+          <m:rPr>
+            <m:sty m:val="p"/>
+          </m:rPr>
+          <m:t>\</m:t>
+        </m:r>
+        <m:r>
+          <m:t>A</m:t>
+        </m:r>
+      </m:oMath>
+      <w:r>
+        <w:t xml:space="preserve">:</w:t>
       </w:r>
     </w:p>
     <w:p>
@@ -2341,53 +2418,120 @@
           <m:jc m:val="center"/>
         </m:oMathParaPr>
         <m:oMath>
-          <m:r>
-            <m:rPr>
-              <m:sty m:val="p"/>
-            </m:rPr>
-            <m:t>¬</m:t>
-          </m:r>
-          <m:r>
-            <m:t>A</m:t>
-          </m:r>
-          <m:limUpp>
+          <m:eqArr>
             <m:e>
               <m:r>
                 <m:rPr>
                   <m:sty m:val="p"/>
                 </m:rPr>
+                <m:t>¬</m:t>
+              </m:r>
+              <m:r>
+                <m:t>A</m:t>
+              </m:r>
+              <m:r>
+                <m:t>&amp;</m:t>
+              </m:r>
+              <m:limUpp>
+                <m:e>
+                  <m:r>
+                    <m:rPr>
+                      <m:sty m:val="p"/>
+                    </m:rPr>
+                    <m:t>=</m:t>
+                  </m:r>
+                </m:e>
+                <m:lim>
+                  <m:r>
+                    <m:rPr>
+                      <m:nor/>
+                      <m:sty m:val="p"/>
+                    </m:rPr>
+                    <m:t>def</m:t>
+                  </m:r>
+                </m:lim>
+              </m:limUpp>
+              <m:r>
+                <m:t>​</m:t>
+              </m:r>
+              <m:d>
+                <m:dPr>
+                  <m:begChr m:val="{"/>
+                  <m:sepChr m:val=""/>
+                  <m:endChr m:val="}"/>
+                  <m:grow/>
+                </m:dPr>
+                <m:e>
+                  <m:r>
+                    <m:t>ω</m:t>
+                  </m:r>
+                  <m:r>
+                    <m:rPr>
+                      <m:sty m:val="p"/>
+                    </m:rPr>
+                    <m:t>∈</m:t>
+                  </m:r>
+                  <m:r>
+                    <m:rPr>
+                      <m:sty m:val="p"/>
+                    </m:rPr>
+                    <m:t>Ω</m:t>
+                  </m:r>
+                  <m:r>
+                    <m:rPr>
+                      <m:sty m:val="p"/>
+                    </m:rPr>
+                    <m:t>:</m:t>
+                  </m:r>
+                  <m:r>
+                    <m:t>ω</m:t>
+                  </m:r>
+                  <m:r>
+                    <m:rPr>
+                      <m:sty m:val="p"/>
+                    </m:rPr>
+                    <m:t>∉</m:t>
+                  </m:r>
+                  <m:r>
+                    <m:t>A</m:t>
+                  </m:r>
+                </m:e>
+              </m:d>
+              <m:r>
+                <m:t>​</m:t>
+              </m:r>
+            </m:e>
+            <m:e>
+              <m:r>
+                <m:t>&amp;</m:t>
+              </m:r>
+              <m:r>
+                <m:rPr>
+                  <m:sty m:val="p"/>
+                </m:rPr>
                 <m:t>=</m:t>
               </m:r>
+              <m:r>
+                <m:rPr>
+                  <m:sty m:val="p"/>
+                </m:rPr>
+                <m:t>Ω</m:t>
+              </m:r>
+              <m:r>
+                <m:rPr>
+                  <m:sty m:val="p"/>
+                </m:rPr>
+                <m:t>\</m:t>
+              </m:r>
+              <m:r>
+                <m:t>A</m:t>
+              </m:r>
             </m:e>
-            <m:lim>
-              <m:r>
-                <m:rPr>
-                  <m:nor/>
-                  <m:sty m:val="p"/>
-                </m:rPr>
-                <m:t>def</m:t>
-              </m:r>
-            </m:lim>
-          </m:limUpp>
-          <m:r>
-            <m:rPr>
-              <m:sty m:val="p"/>
-            </m:rPr>
-            <m:t>Ω</m:t>
-          </m:r>
-          <m:r>
-            <m:rPr>
-              <m:sty m:val="p"/>
-            </m:rPr>
-            <m:t>\</m:t>
-          </m:r>
-          <m:r>
-            <m:t>A</m:t>
-          </m:r>
+          </m:eqArr>
         </m:oMath>
       </m:oMathPara>
     </w:p>
-    <w:bookmarkEnd w:id="34"/>
+    <w:bookmarkEnd w:id="35"/>
     <w:p>
       <w:pPr>
         <w:pStyle w:val="FirstParagraph"/>
@@ -2447,7 +2591,7 @@
         <w:t xml:space="preserve">.</w:t>
       </w:r>
     </w:p>
-    <w:bookmarkStart w:id="35" w:name="exm-complement"/>
+    <w:bookmarkStart w:id="36" w:name="exm-complement"/>
     <w:p>
       <w:pPr>
         <w:pStyle w:val="BodyText"/>
@@ -2624,8 +2768,8 @@
         <w:t xml:space="preserve">.</w:t>
       </w:r>
     </w:p>
-    <w:bookmarkEnd w:id="35"/>
-    <w:bookmarkStart w:id="36" w:name="def-mutually-exclusive"/>
+    <w:bookmarkEnd w:id="36"/>
+    <w:bookmarkStart w:id="37" w:name="def-mutually-exclusive"/>
     <w:p>
       <w:pPr>
         <w:pStyle w:val="BodyText"/>
@@ -2857,7 +3001,7 @@
         </m:oMath>
       </m:oMathPara>
     </w:p>
-    <w:bookmarkEnd w:id="36"/>
+    <w:bookmarkEnd w:id="37"/>
     <w:p>
       <w:pPr>
         <w:pStyle w:val="FirstParagraph"/>
@@ -2884,7 +3028,7 @@
       <w:r>
         <w:t xml:space="preserve"> </w:t>
       </w:r>
-      <w:hyperlink r:id="rId37">
+      <w:hyperlink r:id="rId38">
         <w:r>
           <w:rPr>
             <w:rStyle w:val="Hyperlink"/>
@@ -2896,7 +3040,7 @@
         <w:t xml:space="preserve">.</w:t>
       </w:r>
     </w:p>
-    <w:bookmarkStart w:id="38" w:name="exm-mutually-exclusive"/>
+    <w:bookmarkStart w:id="39" w:name="exm-mutually-exclusive"/>
     <w:p>
       <w:pPr>
         <w:pStyle w:val="BodyText"/>
@@ -3154,8 +3298,8 @@
         <w:t xml:space="preserve">are not mutually exclusive: a roll of 2 is in both.</w:t>
       </w:r>
     </w:p>
-    <w:bookmarkEnd w:id="38"/>
-    <w:bookmarkStart w:id="39" w:name="def-partition"/>
+    <w:bookmarkEnd w:id="39"/>
+    <w:bookmarkStart w:id="40" w:name="def-partition"/>
     <w:p>
       <w:pPr>
         <w:pStyle w:val="BodyText"/>
@@ -3414,8 +3558,8 @@
         <w:t xml:space="preserve">.</w:t>
       </w:r>
     </w:p>
-    <w:bookmarkEnd w:id="39"/>
-    <w:bookmarkStart w:id="40" w:name="rem-partition-sample-space"/>
+    <w:bookmarkEnd w:id="40"/>
+    <w:bookmarkStart w:id="41" w:name="rem-partition-sample-space"/>
     <w:p>
       <w:pPr>
         <w:pStyle w:val="FirstParagraph"/>
@@ -3508,7 +3652,7 @@
         <w:t xml:space="preserve">).</w:t>
       </w:r>
     </w:p>
-    <w:bookmarkEnd w:id="40"/>
+    <w:bookmarkEnd w:id="41"/>
     <w:p>
       <w:pPr>
         <w:pStyle w:val="BodyText"/>
@@ -3550,7 +3694,7 @@
         <w:t xml:space="preserve">to contain at least one outcome.</w:t>
       </w:r>
     </w:p>
-    <w:bookmarkStart w:id="41" w:name="exm-partition"/>
+    <w:bookmarkStart w:id="42" w:name="exm-partition"/>
     <w:p>
       <w:pPr>
         <w:pStyle w:val="BodyText"/>
@@ -3939,8 +4083,8 @@
         <w:t xml:space="preserve">: their union leaves out 3 and 4.</w:t>
       </w:r>
     </w:p>
-    <w:bookmarkEnd w:id="41"/>
-    <w:bookmarkStart w:id="42" w:name="prp-complement-partition"/>
+    <w:bookmarkEnd w:id="42"/>
+    <w:bookmarkStart w:id="43" w:name="prp-complement-partition"/>
     <w:p>
       <w:pPr>
         <w:pStyle w:val="BodyText"/>
@@ -4074,7 +4218,7 @@
         <w:t xml:space="preserve">.</w:t>
       </w:r>
     </w:p>
-    <w:bookmarkEnd w:id="42"/>
+    <w:bookmarkEnd w:id="43"/>
     <w:p>
       <w:pPr>
         <w:pStyle w:val="BodyText"/>
@@ -4155,7 +4299,7 @@
       <w:r>
         <w:t xml:space="preserve"> </w:t>
       </w:r>
-      <w:hyperlink r:id="rId43">
+      <w:hyperlink r:id="rId34">
         <w:r>
           <w:rPr>
             <w:rStyle w:val="Hyperlink"/>

</xml_diff>